<commit_message>
Added  'all' to location selector.
</commit_message>
<xml_diff>
--- a/CK.SqlServer.Transform/Data Definition Manipulation Language.docx
+++ b/CK.SqlServer.Transform/Data Definition Manipulation Language.docx
@@ -360,57 +360,149 @@
         </w:rPr>
         <w:t>[-N]</w:t>
       </w:r>
+      <w:r>
+        <w:rPr>
+          <w:lang w:val="en-US"/>
+        </w:rPr>
+        <w:t xml:space="preserve"> R</w:t>
+      </w:r>
+    </w:p>
+    <w:p>
+      <w:pPr>
+        <w:rPr>
+          <w:lang w:val="en-US"/>
+        </w:rPr>
+      </w:pPr>
+      <w:r>
+        <w:rPr>
+          <w:lang w:val="en-US"/>
+        </w:rPr>
+        <w:tab/>
+        <w:t xml:space="preserve">| in </w:t>
+      </w:r>
+      <w:proofErr w:type="spellStart"/>
+      <w:r>
+        <w:rPr>
+          <w:lang w:val="en-US"/>
+        </w:rPr>
+        <w:t>NodePredicate</w:t>
+      </w:r>
+      <w:proofErr w:type="spellEnd"/>
+    </w:p>
+    <w:p>
+      <w:pPr>
+        <w:rPr>
+          <w:lang w:val="en-US"/>
+        </w:rPr>
+      </w:pPr>
+      <w:r>
+        <w:rPr>
+          <w:lang w:val="en-US"/>
+        </w:rPr>
+        <w:tab/>
+        <w:t>| `&lt;token&gt;</w:t>
+      </w:r>
+    </w:p>
+    <w:p>
+      <w:pPr>
+        <w:rPr>
+          <w:lang w:val="en-US"/>
+        </w:rPr>
+      </w:pPr>
+    </w:p>
+    <w:p>
+      <w:pPr>
+        <w:rPr>
+          <w:lang w:val="en-US"/>
+        </w:rPr>
+      </w:pPr>
+      <w:r>
+        <w:rPr>
+          <w:lang w:val="en-US"/>
+        </w:rPr>
+        <w:t xml:space="preserve">(select ?? from </w:t>
+      </w:r>
+      <w:proofErr w:type="spellStart"/>
+      <w:proofErr w:type="gramStart"/>
+      <w:r>
+        <w:rPr>
+          <w:lang w:val="en-US"/>
+        </w:rPr>
+        <w:t>CK.tTable</w:t>
+      </w:r>
+      <w:proofErr w:type="spellEnd"/>
+      <w:proofErr w:type="gramEnd"/>
+      <w:r>
+        <w:rPr>
+          <w:lang w:val="en-US"/>
+        </w:rPr>
+        <w:t xml:space="preserve"> ???) &gt; (</w:t>
+      </w:r>
+      <w:proofErr w:type="spellStart"/>
+      <w:r>
+        <w:rPr>
+          <w:lang w:val="en-US"/>
+        </w:rPr>
+        <w:t>ActorId</w:t>
+      </w:r>
+      <w:proofErr w:type="spellEnd"/>
+      <w:r>
+        <w:rPr>
+          <w:lang w:val="en-US"/>
+        </w:rPr>
+        <w:t xml:space="preserve"> = </w:t>
+      </w:r>
+      <w:proofErr w:type="spellStart"/>
+      <w:proofErr w:type="gramStart"/>
+      <w:r>
+        <w:rPr>
+          <w:lang w:val="en-US"/>
+        </w:rPr>
+        <w:t>k.UserId</w:t>
+      </w:r>
+      <w:proofErr w:type="spellEnd"/>
+      <w:proofErr w:type="gramEnd"/>
+      <w:r>
+        <w:rPr>
+          <w:lang w:val="en-US"/>
+        </w:rPr>
+        <w:t>)</w:t>
+      </w:r>
+    </w:p>
+    <w:p>
+      <w:pPr>
+        <w:rPr>
+          <w:lang w:val="en-US"/>
+        </w:rPr>
+      </w:pPr>
+      <w:r>
+        <w:rPr>
+          <w:lang w:val="en-US"/>
+        </w:rPr>
+        <w:t>Goal: No dependency on the actual AST</w:t>
+      </w:r>
+    </w:p>
+    <w:p>
+      <w:pPr>
+        <w:rPr>
+          <w:lang w:val="en-US"/>
+        </w:rPr>
+      </w:pPr>
+      <w:r>
+        <w:rPr>
+          <w:lang w:val="en-US"/>
+        </w:rPr>
+        <w:t>The pattern matching must not rely on the actual AST. Only tokens should appear (AST must be used internally). For example, commutative operators may be detected and expanded as needed (the equality or inequality operators may be “normalized” internally…).</w:t>
+      </w:r>
+    </w:p>
+    <w:p>
+      <w:pPr>
+        <w:rPr>
+          <w:lang w:val="en-US"/>
+        </w:rPr>
+      </w:pPr>
       <w:bookmarkStart w:id="0" w:name="_GoBack"/>
       <w:bookmarkEnd w:id="0"/>
-      <w:r>
-        <w:rPr>
-          <w:lang w:val="en-US"/>
-        </w:rPr>
-        <w:t xml:space="preserve"> R</w:t>
-      </w:r>
-    </w:p>
-    <w:p>
-      <w:pPr>
-        <w:rPr>
-          <w:lang w:val="en-US"/>
-        </w:rPr>
-      </w:pPr>
-      <w:r>
-        <w:rPr>
-          <w:lang w:val="en-US"/>
-        </w:rPr>
-        <w:tab/>
-        <w:t xml:space="preserve">| in </w:t>
-      </w:r>
-      <w:proofErr w:type="spellStart"/>
-      <w:r>
-        <w:rPr>
-          <w:lang w:val="en-US"/>
-        </w:rPr>
-        <w:t>NodePredicate</w:t>
-      </w:r>
-      <w:proofErr w:type="spellEnd"/>
-    </w:p>
-    <w:p>
-      <w:pPr>
-        <w:rPr>
-          <w:lang w:val="en-US"/>
-        </w:rPr>
-      </w:pPr>
-      <w:r>
-        <w:rPr>
-          <w:lang w:val="en-US"/>
-        </w:rPr>
-        <w:tab/>
-        <w:t>| `&lt;token&gt;</w:t>
-      </w:r>
-    </w:p>
-    <w:p>
-      <w:pPr>
-        <w:rPr>
-          <w:lang w:val="en-US"/>
-        </w:rPr>
-      </w:pPr>
     </w:p>
     <w:p>
       <w:pPr>
@@ -975,14 +1067,30 @@
           <w:lang w:val="en-US"/>
         </w:rPr>
       </w:pPr>
-    </w:p>
-    <w:p>
-      <w:pPr>
-        <w:rPr>
-          <w:lang w:val="en-US"/>
-        </w:rPr>
-      </w:pPr>
       <w:hyperlink r:id="rId5" w:history="1">
+        <w:r>
+          <w:rPr>
+            <w:rStyle w:val="Hyperlink"/>
+            <w:lang w:val="en-US"/>
+          </w:rPr>
+          <w:t>http://coccinelle.lip6.fr/</w:t>
+        </w:r>
+      </w:hyperlink>
+    </w:p>
+    <w:p>
+      <w:pPr>
+        <w:rPr>
+          <w:lang w:val="en-US"/>
+        </w:rPr>
+      </w:pPr>
+    </w:p>
+    <w:p>
+      <w:pPr>
+        <w:rPr>
+          <w:lang w:val="en-US"/>
+        </w:rPr>
+      </w:pPr>
+      <w:hyperlink r:id="rId6" w:history="1">
         <w:r>
           <w:rPr>
             <w:rStyle w:val="Hyperlink"/>
@@ -1003,7 +1111,7 @@
           <w:lang w:val="en-US"/>
         </w:rPr>
       </w:pPr>
-      <w:hyperlink r:id="rId6" w:history="1">
+      <w:hyperlink r:id="rId7" w:history="1">
         <w:r>
           <w:rPr>
             <w:rStyle w:val="Hyperlink"/>
@@ -1024,7 +1132,7 @@
           <w:lang w:val="en-US"/>
         </w:rPr>
       </w:pPr>
-      <w:hyperlink r:id="rId7" w:history="1">
+      <w:hyperlink r:id="rId8" w:history="1">
         <w:r>
           <w:rPr>
             <w:rStyle w:val="Hyperlink"/>
@@ -1065,7 +1173,7 @@
       <w:proofErr w:type="spellEnd"/>
     </w:p>
     <w:p>
-      <w:hyperlink r:id="rId8" w:history="1">
+      <w:hyperlink r:id="rId9" w:history="1">
         <w:r>
           <w:rPr>
             <w:rStyle w:val="Hyperlink"/>

</xml_diff>

<commit_message>
Insert unparsed text around trivias (line or stat comments) work.
Next step is SimpleNodePattern for unparsed insertion and then ad column to insert into based on SimpleNodePattern.
</commit_message>
<xml_diff>
--- a/CK.SqlServer.Transform/Data Definition Manipulation Language.docx
+++ b/CK.SqlServer.Transform/Data Definition Manipulation Language.docx
@@ -501,8 +501,62 @@
           <w:lang w:val="en-US"/>
         </w:rPr>
       </w:pPr>
-      <w:bookmarkStart w:id="0" w:name="_GoBack"/>
-      <w:bookmarkEnd w:id="0"/>
+      <w:proofErr w:type="gramStart"/>
+      <w:r>
+        <w:rPr>
+          <w:lang w:val="en-US"/>
+        </w:rPr>
+        <w:t>&lt;[</w:t>
+      </w:r>
+      <w:proofErr w:type="gramEnd"/>
+      <w:r>
+        <w:rPr>
+          <w:lang w:val="en-US"/>
+        </w:rPr>
+        <w:t xml:space="preserve">select ?? from </w:t>
+      </w:r>
+      <w:proofErr w:type="spellStart"/>
+      <w:r>
+        <w:rPr>
+          <w:lang w:val="en-US"/>
+        </w:rPr>
+        <w:t>CK.tTable</w:t>
+      </w:r>
+      <w:proofErr w:type="spellEnd"/>
+      <w:r>
+        <w:rPr>
+          <w:lang w:val="en-US"/>
+        </w:rPr>
+        <w:t xml:space="preserve"> ???]&gt; (</w:t>
+      </w:r>
+      <w:proofErr w:type="spellStart"/>
+      <w:r>
+        <w:rPr>
+          <w:lang w:val="en-US"/>
+        </w:rPr>
+        <w:t>ActorId</w:t>
+      </w:r>
+      <w:proofErr w:type="spellEnd"/>
+      <w:r>
+        <w:rPr>
+          <w:lang w:val="en-US"/>
+        </w:rPr>
+        <w:t xml:space="preserve"> = </w:t>
+      </w:r>
+      <w:proofErr w:type="spellStart"/>
+      <w:r>
+        <w:rPr>
+          <w:lang w:val="en-US"/>
+        </w:rPr>
+        <w:t>k.UserId</w:t>
+      </w:r>
+      <w:proofErr w:type="spellEnd"/>
+      <w:r>
+        <w:rPr>
+          <w:lang w:val="en-US"/>
+        </w:rPr>
+        <w:t>)</w:t>
+      </w:r>
     </w:p>
     <w:p>
       <w:pPr>
@@ -1039,6 +1093,867 @@
         </w:rPr>
         <w:t>”</w:t>
       </w:r>
+    </w:p>
+    <w:p>
+      <w:pPr>
+        <w:rPr>
+          <w:lang w:val="en-US"/>
+        </w:rPr>
+      </w:pPr>
+    </w:p>
+    <w:p>
+      <w:pPr>
+        <w:rPr>
+          <w:lang w:val="en-US"/>
+        </w:rPr>
+      </w:pPr>
+    </w:p>
+    <w:p>
+      <w:pPr>
+        <w:rPr>
+          <w:rFonts w:ascii="Consolas" w:hAnsi="Consolas" w:cs="Consolas"/>
+          <w:color w:val="000000"/>
+          <w:sz w:val="19"/>
+          <w:szCs w:val="19"/>
+          <w:lang w:val="en-US"/>
+        </w:rPr>
+      </w:pPr>
+      <w:r>
+        <w:rPr>
+          <w:rFonts w:ascii="Consolas" w:hAnsi="Consolas" w:cs="Consolas"/>
+          <w:color w:val="000000"/>
+          <w:sz w:val="19"/>
+          <w:szCs w:val="19"/>
+        </w:rPr>
+        <w:sym w:font="Wingdings" w:char="F0E8"/>
+      </w:r>
+      <w:r>
+        <w:rPr>
+          <w:rFonts w:ascii="Consolas" w:hAnsi="Consolas" w:cs="Consolas"/>
+          <w:color w:val="000000"/>
+          <w:sz w:val="19"/>
+          <w:szCs w:val="19"/>
+          <w:lang w:val="en-US"/>
+        </w:rPr>
+        <w:t xml:space="preserve"> </w:t>
+      </w:r>
+    </w:p>
+    <w:tbl>
+      <w:tblPr>
+        <w:tblStyle w:val="TableGrid"/>
+        <w:tblW w:w="0" w:type="auto"/>
+        <w:tblLook w:val="04A0" w:firstRow="1" w:lastRow="0" w:firstColumn="1" w:lastColumn="0" w:noHBand="0" w:noVBand="1"/>
+      </w:tblPr>
+      <w:tblGrid>
+        <w:gridCol w:w="2405"/>
+        <w:gridCol w:w="6611"/>
+      </w:tblGrid>
+      <w:tr>
+        <w:tc>
+          <w:tcPr>
+            <w:tcW w:w="2405" w:type="dxa"/>
+          </w:tcPr>
+          <w:p>
+            <w:pPr>
+              <w:rPr>
+                <w:rFonts w:ascii="Consolas" w:hAnsi="Consolas" w:cs="Consolas"/>
+                <w:color w:val="000000"/>
+                <w:sz w:val="19"/>
+                <w:szCs w:val="19"/>
+                <w:lang w:val="en-US"/>
+              </w:rPr>
+            </w:pPr>
+            <w:proofErr w:type="spellStart"/>
+            <w:r>
+              <w:rPr>
+                <w:rFonts w:ascii="Consolas" w:hAnsi="Consolas" w:cs="Consolas"/>
+                <w:color w:val="000000"/>
+                <w:sz w:val="19"/>
+                <w:szCs w:val="19"/>
+                <w:highlight w:val="white"/>
+                <w:lang w:val="en-US"/>
+              </w:rPr>
+              <w:t>LocationSelector</w:t>
+            </w:r>
+            <w:proofErr w:type="spellEnd"/>
+          </w:p>
+        </w:tc>
+        <w:tc>
+          <w:tcPr>
+            <w:tcW w:w="6611" w:type="dxa"/>
+          </w:tcPr>
+          <w:p>
+            <w:pPr>
+              <w:rPr>
+                <w:rFonts w:ascii="Consolas" w:hAnsi="Consolas" w:cs="Consolas"/>
+                <w:color w:val="000000"/>
+                <w:sz w:val="19"/>
+                <w:szCs w:val="19"/>
+                <w:lang w:val="en-US"/>
+              </w:rPr>
+            </w:pPr>
+            <w:r>
+              <w:rPr>
+                <w:rFonts w:ascii="Consolas" w:hAnsi="Consolas" w:cs="Consolas"/>
+                <w:color w:val="000000"/>
+                <w:sz w:val="19"/>
+                <w:szCs w:val="19"/>
+                <w:lang w:val="en-US"/>
+              </w:rPr>
+              <w:t>(</w:t>
+            </w:r>
+            <w:r>
+              <w:rPr>
+                <w:rFonts w:ascii="Consolas" w:hAnsi="Consolas" w:cs="Consolas"/>
+                <w:color w:val="000000"/>
+                <w:sz w:val="19"/>
+                <w:szCs w:val="19"/>
+                <w:lang w:val="en-US"/>
+              </w:rPr>
+              <w:t>first [+ n] [out o</w:t>
+            </w:r>
+            <w:r>
+              <w:rPr>
+                <w:rFonts w:ascii="Consolas" w:hAnsi="Consolas" w:cs="Consolas"/>
+                <w:color w:val="000000"/>
+                <w:sz w:val="19"/>
+                <w:szCs w:val="19"/>
+                <w:lang w:val="en-US"/>
+              </w:rPr>
+              <w:t xml:space="preserve">f n] </w:t>
+            </w:r>
+          </w:p>
+          <w:p>
+            <w:pPr>
+              <w:rPr>
+                <w:rFonts w:ascii="Consolas" w:hAnsi="Consolas" w:cs="Consolas"/>
+                <w:color w:val="000000"/>
+                <w:sz w:val="19"/>
+                <w:szCs w:val="19"/>
+                <w:lang w:val="en-US"/>
+              </w:rPr>
+            </w:pPr>
+            <w:r>
+              <w:rPr>
+                <w:rFonts w:ascii="Consolas" w:hAnsi="Consolas" w:cs="Consolas"/>
+                <w:color w:val="000000"/>
+                <w:sz w:val="19"/>
+                <w:szCs w:val="19"/>
+                <w:lang w:val="en-US"/>
+              </w:rPr>
+              <w:t xml:space="preserve">| last [- n] [out of n] </w:t>
+            </w:r>
+          </w:p>
+          <w:p>
+            <w:pPr>
+              <w:rPr>
+                <w:rFonts w:ascii="Consolas" w:hAnsi="Consolas" w:cs="Consolas"/>
+                <w:color w:val="000000"/>
+                <w:sz w:val="19"/>
+                <w:szCs w:val="19"/>
+                <w:lang w:val="en-US"/>
+              </w:rPr>
+            </w:pPr>
+            <w:r>
+              <w:rPr>
+                <w:rFonts w:ascii="Consolas" w:hAnsi="Consolas" w:cs="Consolas"/>
+                <w:color w:val="000000"/>
+                <w:sz w:val="19"/>
+                <w:szCs w:val="19"/>
+                <w:lang w:val="en-US"/>
+              </w:rPr>
+              <w:t xml:space="preserve">| single </w:t>
+            </w:r>
+          </w:p>
+          <w:p>
+            <w:pPr>
+              <w:rPr>
+                <w:rFonts w:ascii="Consolas" w:hAnsi="Consolas" w:cs="Consolas"/>
+                <w:color w:val="000000"/>
+                <w:sz w:val="19"/>
+                <w:szCs w:val="19"/>
+                <w:lang w:val="en-US"/>
+              </w:rPr>
+            </w:pPr>
+            <w:r>
+              <w:rPr>
+                <w:rFonts w:ascii="Consolas" w:hAnsi="Consolas" w:cs="Consolas"/>
+                <w:color w:val="000000"/>
+                <w:sz w:val="19"/>
+                <w:szCs w:val="19"/>
+                <w:lang w:val="en-US"/>
+              </w:rPr>
+              <w:t>| all [[out of] n]</w:t>
+            </w:r>
+            <w:r>
+              <w:rPr>
+                <w:rFonts w:ascii="Consolas" w:hAnsi="Consolas" w:cs="Consolas"/>
+                <w:color w:val="000000"/>
+                <w:sz w:val="19"/>
+                <w:szCs w:val="19"/>
+                <w:lang w:val="en-US"/>
+              </w:rPr>
+              <w:t>) (</w:t>
+            </w:r>
+            <w:proofErr w:type="spellStart"/>
+            <w:r>
+              <w:rPr>
+                <w:rFonts w:ascii="Consolas" w:hAnsi="Consolas" w:cs="Consolas"/>
+                <w:color w:val="000000"/>
+                <w:sz w:val="19"/>
+                <w:szCs w:val="19"/>
+                <w:lang w:val="en-US"/>
+              </w:rPr>
+              <w:t>CommentStringMatch</w:t>
+            </w:r>
+            <w:proofErr w:type="spellEnd"/>
+            <w:r>
+              <w:rPr>
+                <w:rFonts w:ascii="Consolas" w:hAnsi="Consolas" w:cs="Consolas"/>
+                <w:color w:val="000000"/>
+                <w:sz w:val="19"/>
+                <w:szCs w:val="19"/>
+                <w:lang w:val="en-US"/>
+              </w:rPr>
+              <w:t xml:space="preserve"> | </w:t>
+            </w:r>
+            <w:proofErr w:type="spellStart"/>
+            <w:r>
+              <w:rPr>
+                <w:rFonts w:ascii="Consolas" w:hAnsi="Consolas" w:cs="Consolas"/>
+                <w:color w:val="000000"/>
+                <w:sz w:val="19"/>
+                <w:szCs w:val="19"/>
+                <w:lang w:val="en-US"/>
+              </w:rPr>
+              <w:t>NodeSimple</w:t>
+            </w:r>
+            <w:r>
+              <w:rPr>
+                <w:rFonts w:ascii="Consolas" w:hAnsi="Consolas" w:cs="Consolas"/>
+                <w:color w:val="000000"/>
+                <w:sz w:val="19"/>
+                <w:szCs w:val="19"/>
+                <w:lang w:val="en-US"/>
+              </w:rPr>
+              <w:t>Pattern</w:t>
+            </w:r>
+            <w:proofErr w:type="spellEnd"/>
+            <w:r>
+              <w:rPr>
+                <w:rFonts w:ascii="Consolas" w:hAnsi="Consolas" w:cs="Consolas"/>
+                <w:color w:val="000000"/>
+                <w:sz w:val="19"/>
+                <w:szCs w:val="19"/>
+                <w:lang w:val="en-US"/>
+              </w:rPr>
+              <w:t xml:space="preserve">) </w:t>
+            </w:r>
+          </w:p>
+        </w:tc>
+      </w:tr>
+      <w:tr>
+        <w:tc>
+          <w:tcPr>
+            <w:tcW w:w="2405" w:type="dxa"/>
+          </w:tcPr>
+          <w:p>
+            <w:pPr>
+              <w:rPr>
+                <w:rFonts w:ascii="Consolas" w:hAnsi="Consolas" w:cs="Consolas"/>
+                <w:color w:val="000000"/>
+                <w:sz w:val="19"/>
+                <w:szCs w:val="19"/>
+                <w:lang w:val="en-US"/>
+              </w:rPr>
+            </w:pPr>
+            <w:proofErr w:type="spellStart"/>
+            <w:r>
+              <w:rPr>
+                <w:rFonts w:ascii="Consolas" w:hAnsi="Consolas" w:cs="Consolas"/>
+                <w:color w:val="000000"/>
+                <w:sz w:val="19"/>
+                <w:szCs w:val="19"/>
+                <w:lang w:val="en-US"/>
+              </w:rPr>
+              <w:t>CommentStringMatch</w:t>
+            </w:r>
+            <w:proofErr w:type="spellEnd"/>
+          </w:p>
+        </w:tc>
+        <w:tc>
+          <w:tcPr>
+            <w:tcW w:w="6611" w:type="dxa"/>
+          </w:tcPr>
+          <w:p>
+            <w:pPr>
+              <w:rPr>
+                <w:rFonts w:ascii="Consolas" w:hAnsi="Consolas" w:cs="Consolas"/>
+                <w:color w:val="000000"/>
+                <w:sz w:val="19"/>
+                <w:szCs w:val="19"/>
+                <w:lang w:val="en-US"/>
+              </w:rPr>
+            </w:pPr>
+            <w:r>
+              <w:rPr>
+                <w:rFonts w:ascii="Consolas" w:hAnsi="Consolas" w:cs="Consolas"/>
+                <w:color w:val="000000"/>
+                <w:sz w:val="19"/>
+                <w:szCs w:val="19"/>
+                <w:lang w:val="en-US"/>
+              </w:rPr>
+              <w:t>A literal string enclosed with, quotes, double quotes or brackets that either:</w:t>
+            </w:r>
+          </w:p>
+          <w:p>
+            <w:pPr>
+              <w:rPr>
+                <w:rFonts w:ascii="Consolas" w:hAnsi="Consolas" w:cs="Consolas"/>
+                <w:color w:val="000000"/>
+                <w:sz w:val="19"/>
+                <w:szCs w:val="19"/>
+                <w:lang w:val="en-US"/>
+              </w:rPr>
+            </w:pPr>
+          </w:p>
+          <w:p>
+            <w:pPr>
+              <w:pStyle w:val="ListParagraph"/>
+              <w:numPr>
+                <w:ilvl w:val="0"/>
+                <w:numId w:val="3"/>
+              </w:numPr>
+              <w:rPr>
+                <w:rFonts w:ascii="Consolas" w:hAnsi="Consolas" w:cs="Consolas"/>
+                <w:color w:val="000000"/>
+                <w:sz w:val="19"/>
+                <w:szCs w:val="19"/>
+                <w:lang w:val="en-US"/>
+              </w:rPr>
+            </w:pPr>
+            <w:r>
+              <w:rPr>
+                <w:rFonts w:ascii="Consolas" w:hAnsi="Consolas" w:cs="Consolas"/>
+                <w:color w:val="000000"/>
+                <w:sz w:val="19"/>
+                <w:szCs w:val="19"/>
+                <w:lang w:val="en-US"/>
+              </w:rPr>
+              <w:t>S</w:t>
+            </w:r>
+            <w:r>
+              <w:rPr>
+                <w:rFonts w:ascii="Consolas" w:hAnsi="Consolas" w:cs="Consolas"/>
+                <w:color w:val="000000"/>
+                <w:sz w:val="19"/>
+                <w:szCs w:val="19"/>
+                <w:lang w:val="en-US"/>
+              </w:rPr>
+              <w:t xml:space="preserve">tarts with </w:t>
+            </w:r>
+            <w:r>
+              <w:rPr>
+                <w:rFonts w:ascii="Consolas" w:hAnsi="Consolas" w:cs="Consolas"/>
+                <w:color w:val="000000"/>
+                <w:sz w:val="19"/>
+                <w:szCs w:val="19"/>
+                <w:lang w:val="en-US"/>
+              </w:rPr>
+              <w:t xml:space="preserve">-- </w:t>
+            </w:r>
+            <w:r>
+              <w:rPr>
+                <w:rFonts w:ascii="Consolas" w:hAnsi="Consolas" w:cs="Consolas"/>
+                <w:color w:val="000000"/>
+                <w:sz w:val="19"/>
+                <w:szCs w:val="19"/>
+                <w:lang w:val="en-US"/>
+              </w:rPr>
+              <w:t>for a line comment</w:t>
+            </w:r>
+            <w:r>
+              <w:rPr>
+                <w:rFonts w:ascii="Consolas" w:hAnsi="Consolas" w:cs="Consolas"/>
+                <w:color w:val="000000"/>
+                <w:sz w:val="19"/>
+                <w:szCs w:val="19"/>
+                <w:lang w:val="en-US"/>
+              </w:rPr>
+              <w:t>:</w:t>
+            </w:r>
+          </w:p>
+          <w:p>
+            <w:pPr>
+              <w:pStyle w:val="ListParagraph"/>
+              <w:rPr>
+                <w:rFonts w:ascii="Consolas" w:hAnsi="Consolas" w:cs="Consolas"/>
+                <w:color w:val="000000"/>
+                <w:sz w:val="19"/>
+                <w:szCs w:val="19"/>
+                <w:lang w:val="en-US"/>
+              </w:rPr>
+            </w:pPr>
+            <w:r>
+              <w:rPr>
+                <w:rFonts w:ascii="Consolas" w:hAnsi="Consolas" w:cs="Consolas"/>
+                <w:color w:val="000000"/>
+                <w:sz w:val="19"/>
+                <w:szCs w:val="19"/>
+                <w:lang w:val="en-US"/>
+              </w:rPr>
+              <w:t>"--</w:t>
+            </w:r>
+            <w:r>
+              <w:rPr>
+                <w:rFonts w:ascii="Consolas" w:hAnsi="Consolas" w:cs="Consolas"/>
+                <w:color w:val="000000"/>
+                <w:sz w:val="19"/>
+                <w:szCs w:val="19"/>
+                <w:lang w:val="en-US"/>
+              </w:rPr>
+              <w:t xml:space="preserve"> prefix</w:t>
+            </w:r>
+            <w:r>
+              <w:rPr>
+                <w:rFonts w:ascii="Consolas" w:hAnsi="Consolas" w:cs="Consolas"/>
+                <w:color w:val="000000"/>
+                <w:sz w:val="19"/>
+                <w:szCs w:val="19"/>
+                <w:lang w:val="en-US"/>
+              </w:rPr>
+              <w:t>"</w:t>
+            </w:r>
+            <w:r>
+              <w:rPr>
+                <w:rFonts w:ascii="Consolas" w:hAnsi="Consolas" w:cs="Consolas"/>
+                <w:color w:val="000000"/>
+                <w:sz w:val="19"/>
+                <w:szCs w:val="19"/>
+                <w:lang w:val="en-US"/>
+              </w:rPr>
+              <w:t xml:space="preserve"> | [--</w:t>
+            </w:r>
+            <w:r>
+              <w:rPr>
+                <w:rFonts w:ascii="Consolas" w:hAnsi="Consolas" w:cs="Consolas"/>
+                <w:color w:val="000000"/>
+                <w:sz w:val="19"/>
+                <w:szCs w:val="19"/>
+                <w:lang w:val="en-US"/>
+              </w:rPr>
+              <w:t xml:space="preserve"> </w:t>
+            </w:r>
+            <w:r>
+              <w:rPr>
+                <w:rFonts w:ascii="Consolas" w:hAnsi="Consolas" w:cs="Consolas"/>
+                <w:color w:val="000000"/>
+                <w:sz w:val="19"/>
+                <w:szCs w:val="19"/>
+                <w:lang w:val="en-US"/>
+              </w:rPr>
+              <w:t>prefix</w:t>
+            </w:r>
+            <w:r>
+              <w:rPr>
+                <w:rFonts w:ascii="Consolas" w:hAnsi="Consolas" w:cs="Consolas"/>
+                <w:color w:val="000000"/>
+                <w:sz w:val="19"/>
+                <w:szCs w:val="19"/>
+                <w:lang w:val="en-US"/>
+              </w:rPr>
+              <w:t>] | '--</w:t>
+            </w:r>
+            <w:r>
+              <w:rPr>
+                <w:rFonts w:ascii="Consolas" w:hAnsi="Consolas" w:cs="Consolas"/>
+                <w:color w:val="000000"/>
+                <w:sz w:val="19"/>
+                <w:szCs w:val="19"/>
+                <w:lang w:val="en-US"/>
+              </w:rPr>
+              <w:t xml:space="preserve"> </w:t>
+            </w:r>
+            <w:r>
+              <w:rPr>
+                <w:rFonts w:ascii="Consolas" w:hAnsi="Consolas" w:cs="Consolas"/>
+                <w:color w:val="000000"/>
+                <w:sz w:val="19"/>
+                <w:szCs w:val="19"/>
+                <w:lang w:val="en-US"/>
+              </w:rPr>
+              <w:t>prefix</w:t>
+            </w:r>
+            <w:r>
+              <w:rPr>
+                <w:rFonts w:ascii="Consolas" w:hAnsi="Consolas" w:cs="Consolas"/>
+                <w:color w:val="000000"/>
+                <w:sz w:val="19"/>
+                <w:szCs w:val="19"/>
+                <w:lang w:val="en-US"/>
+              </w:rPr>
+              <w:t>'</w:t>
+            </w:r>
+          </w:p>
+          <w:p>
+            <w:pPr>
+              <w:pStyle w:val="ListParagraph"/>
+              <w:rPr>
+                <w:rFonts w:ascii="Consolas" w:hAnsi="Consolas" w:cs="Consolas"/>
+                <w:color w:val="000000"/>
+                <w:sz w:val="19"/>
+                <w:szCs w:val="19"/>
+                <w:lang w:val="en-US"/>
+              </w:rPr>
+            </w:pPr>
+            <w:r>
+              <w:rPr>
+                <w:rFonts w:ascii="Consolas" w:hAnsi="Consolas" w:cs="Consolas"/>
+                <w:color w:val="000000"/>
+                <w:sz w:val="19"/>
+                <w:szCs w:val="19"/>
+                <w:lang w:val="en-US"/>
+              </w:rPr>
+              <w:t>The trimmed prefix must start the left trimmed line comment.</w:t>
+            </w:r>
+          </w:p>
+          <w:p>
+            <w:pPr>
+              <w:rPr>
+                <w:rFonts w:ascii="Consolas" w:hAnsi="Consolas" w:cs="Consolas"/>
+                <w:color w:val="000000"/>
+                <w:sz w:val="19"/>
+                <w:szCs w:val="19"/>
+                <w:lang w:val="en-US"/>
+              </w:rPr>
+            </w:pPr>
+          </w:p>
+          <w:p>
+            <w:pPr>
+              <w:pStyle w:val="ListParagraph"/>
+              <w:numPr>
+                <w:ilvl w:val="0"/>
+                <w:numId w:val="3"/>
+              </w:numPr>
+              <w:rPr>
+                <w:rFonts w:ascii="Consolas" w:hAnsi="Consolas" w:cs="Consolas"/>
+                <w:color w:val="000000"/>
+                <w:sz w:val="19"/>
+                <w:szCs w:val="19"/>
+                <w:lang w:val="en-US"/>
+              </w:rPr>
+            </w:pPr>
+            <w:r>
+              <w:rPr>
+                <w:rFonts w:ascii="Consolas" w:hAnsi="Consolas" w:cs="Consolas"/>
+                <w:color w:val="000000"/>
+                <w:sz w:val="19"/>
+                <w:szCs w:val="19"/>
+                <w:lang w:val="en-US"/>
+              </w:rPr>
+              <w:t>Starts and ends with a star comment:</w:t>
+            </w:r>
+          </w:p>
+          <w:p>
+            <w:pPr>
+              <w:pStyle w:val="ListParagraph"/>
+              <w:rPr>
+                <w:rFonts w:ascii="Consolas" w:hAnsi="Consolas" w:cs="Consolas"/>
+                <w:color w:val="000000"/>
+                <w:sz w:val="19"/>
+                <w:szCs w:val="19"/>
+              </w:rPr>
+            </w:pPr>
+            <w:r>
+              <w:rPr>
+                <w:rFonts w:ascii="Consolas" w:hAnsi="Consolas" w:cs="Consolas"/>
+                <w:color w:val="000000"/>
+                <w:sz w:val="19"/>
+                <w:szCs w:val="19"/>
+              </w:rPr>
+              <w:t>"</w:t>
+            </w:r>
+            <w:r>
+              <w:rPr>
+                <w:rFonts w:ascii="Consolas" w:hAnsi="Consolas" w:cs="Consolas"/>
+                <w:color w:val="000000"/>
+                <w:sz w:val="19"/>
+                <w:szCs w:val="19"/>
+              </w:rPr>
+              <w:t>/* content */</w:t>
+            </w:r>
+            <w:r>
+              <w:rPr>
+                <w:rFonts w:ascii="Consolas" w:hAnsi="Consolas" w:cs="Consolas"/>
+                <w:color w:val="000000"/>
+                <w:sz w:val="19"/>
+                <w:szCs w:val="19"/>
+              </w:rPr>
+              <w:t xml:space="preserve">" | [/* </w:t>
+            </w:r>
+            <w:r>
+              <w:rPr>
+                <w:rFonts w:ascii="Consolas" w:hAnsi="Consolas" w:cs="Consolas"/>
+                <w:color w:val="000000"/>
+                <w:sz w:val="19"/>
+                <w:szCs w:val="19"/>
+              </w:rPr>
+              <w:t>content</w:t>
+            </w:r>
+            <w:r>
+              <w:rPr>
+                <w:rFonts w:ascii="Consolas" w:hAnsi="Consolas" w:cs="Consolas"/>
+                <w:color w:val="000000"/>
+                <w:sz w:val="19"/>
+                <w:szCs w:val="19"/>
+              </w:rPr>
+              <w:t xml:space="preserve"> */] | '/* </w:t>
+            </w:r>
+            <w:r>
+              <w:rPr>
+                <w:rFonts w:ascii="Consolas" w:hAnsi="Consolas" w:cs="Consolas"/>
+                <w:color w:val="000000"/>
+                <w:sz w:val="19"/>
+                <w:szCs w:val="19"/>
+              </w:rPr>
+              <w:t>content</w:t>
+            </w:r>
+            <w:r>
+              <w:rPr>
+                <w:rFonts w:ascii="Consolas" w:hAnsi="Consolas" w:cs="Consolas"/>
+                <w:color w:val="000000"/>
+                <w:sz w:val="19"/>
+                <w:szCs w:val="19"/>
+              </w:rPr>
+              <w:t xml:space="preserve"> */'</w:t>
+            </w:r>
+          </w:p>
+          <w:p>
+            <w:pPr>
+              <w:pStyle w:val="ListParagraph"/>
+              <w:rPr>
+                <w:rFonts w:ascii="Consolas" w:hAnsi="Consolas" w:cs="Consolas"/>
+                <w:color w:val="000000"/>
+                <w:sz w:val="19"/>
+                <w:szCs w:val="19"/>
+                <w:lang w:val="en-US"/>
+              </w:rPr>
+            </w:pPr>
+            <w:r>
+              <w:rPr>
+                <w:rFonts w:ascii="Consolas" w:hAnsi="Consolas" w:cs="Consolas"/>
+                <w:color w:val="000000"/>
+                <w:sz w:val="19"/>
+                <w:szCs w:val="19"/>
+                <w:lang w:val="en-US"/>
+              </w:rPr>
+              <w:t>The trimmed content must a</w:t>
+            </w:r>
+            <w:r>
+              <w:rPr>
+                <w:rFonts w:ascii="Consolas" w:hAnsi="Consolas" w:cs="Consolas"/>
+                <w:color w:val="000000"/>
+                <w:sz w:val="19"/>
+                <w:szCs w:val="19"/>
+                <w:lang w:val="en-US"/>
+              </w:rPr>
+              <w:t>ppear in the star comment.</w:t>
+            </w:r>
+          </w:p>
+          <w:p>
+            <w:pPr>
+              <w:pStyle w:val="ListParagraph"/>
+              <w:rPr>
+                <w:rFonts w:ascii="Consolas" w:hAnsi="Consolas" w:cs="Consolas"/>
+                <w:color w:val="000000"/>
+                <w:sz w:val="19"/>
+                <w:szCs w:val="19"/>
+                <w:lang w:val="en-US"/>
+              </w:rPr>
+            </w:pPr>
+          </w:p>
+        </w:tc>
+      </w:tr>
+      <w:tr>
+        <w:tc>
+          <w:tcPr>
+            <w:tcW w:w="2405" w:type="dxa"/>
+          </w:tcPr>
+          <w:p>
+            <w:pPr>
+              <w:rPr>
+                <w:rFonts w:ascii="Consolas" w:hAnsi="Consolas" w:cs="Consolas"/>
+                <w:color w:val="000000"/>
+                <w:sz w:val="19"/>
+                <w:szCs w:val="19"/>
+                <w:lang w:val="en-US"/>
+              </w:rPr>
+            </w:pPr>
+            <w:proofErr w:type="spellStart"/>
+            <w:r>
+              <w:rPr>
+                <w:rFonts w:ascii="Consolas" w:hAnsi="Consolas" w:cs="Consolas"/>
+                <w:color w:val="000000"/>
+                <w:sz w:val="19"/>
+                <w:szCs w:val="19"/>
+                <w:lang w:val="en-US"/>
+              </w:rPr>
+              <w:t>NodeSimplePattern</w:t>
+            </w:r>
+            <w:proofErr w:type="spellEnd"/>
+          </w:p>
+        </w:tc>
+        <w:tc>
+          <w:tcPr>
+            <w:tcW w:w="6611" w:type="dxa"/>
+          </w:tcPr>
+          <w:p>
+            <w:pPr>
+              <w:rPr>
+                <w:rFonts w:ascii="Consolas" w:hAnsi="Consolas" w:cs="Consolas"/>
+                <w:color w:val="000000"/>
+                <w:sz w:val="19"/>
+                <w:szCs w:val="19"/>
+                <w:lang w:val="en-US"/>
+              </w:rPr>
+            </w:pPr>
+            <w:r>
+              <w:rPr>
+                <w:rFonts w:ascii="Consolas" w:hAnsi="Consolas" w:cs="Consolas"/>
+                <w:color w:val="000000"/>
+                <w:sz w:val="19"/>
+                <w:szCs w:val="19"/>
+                <w:lang w:val="en-US"/>
+              </w:rPr>
+              <w:t>(</w:t>
+            </w:r>
+            <w:proofErr w:type="spellStart"/>
+            <w:r>
+              <w:rPr>
+                <w:rFonts w:ascii="Consolas" w:hAnsi="Consolas" w:cs="Consolas"/>
+                <w:color w:val="000000"/>
+                <w:sz w:val="19"/>
+                <w:szCs w:val="19"/>
+                <w:lang w:val="en-US"/>
+              </w:rPr>
+              <w:t>largest|deepest</w:t>
+            </w:r>
+            <w:proofErr w:type="spellEnd"/>
+            <w:r>
+              <w:rPr>
+                <w:rFonts w:ascii="Consolas" w:hAnsi="Consolas" w:cs="Consolas"/>
+                <w:color w:val="000000"/>
+                <w:sz w:val="19"/>
+                <w:szCs w:val="19"/>
+                <w:lang w:val="en-US"/>
+              </w:rPr>
+              <w:t xml:space="preserve">) nodes like </w:t>
+            </w:r>
+            <w:proofErr w:type="spellStart"/>
+            <w:r>
+              <w:rPr>
+                <w:rFonts w:ascii="Consolas" w:hAnsi="Consolas" w:cs="Consolas"/>
+                <w:color w:val="000000"/>
+                <w:sz w:val="19"/>
+                <w:szCs w:val="19"/>
+                <w:lang w:val="en-US"/>
+              </w:rPr>
+              <w:t>SimplePattern</w:t>
+            </w:r>
+            <w:proofErr w:type="spellEnd"/>
+          </w:p>
+        </w:tc>
+      </w:tr>
+      <w:tr>
+        <w:tc>
+          <w:tcPr>
+            <w:tcW w:w="2405" w:type="dxa"/>
+          </w:tcPr>
+          <w:p>
+            <w:pPr>
+              <w:rPr>
+                <w:rFonts w:ascii="Consolas" w:hAnsi="Consolas" w:cs="Consolas"/>
+                <w:color w:val="000000"/>
+                <w:sz w:val="19"/>
+                <w:szCs w:val="19"/>
+                <w:lang w:val="en-US"/>
+              </w:rPr>
+            </w:pPr>
+            <w:proofErr w:type="spellStart"/>
+            <w:r>
+              <w:rPr>
+                <w:rFonts w:ascii="Consolas" w:hAnsi="Consolas" w:cs="Consolas"/>
+                <w:color w:val="000000"/>
+                <w:sz w:val="19"/>
+                <w:szCs w:val="19"/>
+                <w:lang w:val="en-US"/>
+              </w:rPr>
+              <w:t>SimplePattern</w:t>
+            </w:r>
+            <w:proofErr w:type="spellEnd"/>
+          </w:p>
+        </w:tc>
+        <w:tc>
+          <w:tcPr>
+            <w:tcW w:w="6611" w:type="dxa"/>
+          </w:tcPr>
+          <w:p>
+            <w:pPr>
+              <w:rPr>
+                <w:rFonts w:ascii="Consolas" w:hAnsi="Consolas" w:cs="Consolas"/>
+                <w:color w:val="000000"/>
+                <w:sz w:val="19"/>
+                <w:szCs w:val="19"/>
+                <w:lang w:val="en-US"/>
+              </w:rPr>
+            </w:pPr>
+            <w:r>
+              <w:rPr>
+                <w:rFonts w:ascii="Consolas" w:hAnsi="Consolas" w:cs="Consolas"/>
+                <w:color w:val="000000"/>
+                <w:sz w:val="19"/>
+                <w:szCs w:val="19"/>
+                <w:lang w:val="en-US"/>
+              </w:rPr>
+              <w:t>Curly braces delimited literal string.</w:t>
+            </w:r>
+          </w:p>
+          <w:p>
+            <w:pPr>
+              <w:rPr>
+                <w:rFonts w:ascii="Consolas" w:hAnsi="Consolas" w:cs="Consolas"/>
+                <w:color w:val="000000"/>
+                <w:sz w:val="19"/>
+                <w:szCs w:val="19"/>
+                <w:lang w:val="en-US"/>
+              </w:rPr>
+            </w:pPr>
+            <w:r>
+              <w:rPr>
+                <w:rFonts w:ascii="Consolas" w:hAnsi="Consolas" w:cs="Consolas"/>
+                <w:color w:val="000000"/>
+                <w:sz w:val="19"/>
+                <w:szCs w:val="19"/>
+                <w:lang w:val="en-US"/>
+              </w:rPr>
+              <w:t>Whitespaces are not relevant, only tokens matter.</w:t>
+            </w:r>
+            <w:bookmarkStart w:id="0" w:name="_GoBack"/>
+            <w:bookmarkEnd w:id="0"/>
+          </w:p>
+        </w:tc>
+      </w:tr>
+    </w:tbl>
+    <w:p>
+      <w:pPr>
+        <w:rPr>
+          <w:rFonts w:ascii="Consolas" w:hAnsi="Consolas" w:cs="Consolas"/>
+          <w:color w:val="000000"/>
+          <w:sz w:val="19"/>
+          <w:szCs w:val="19"/>
+          <w:lang w:val="en-US"/>
+        </w:rPr>
+      </w:pPr>
     </w:p>
     <w:p>
       <w:pPr>
@@ -1995,6 +2910,25 @@
       <w:contextualSpacing/>
     </w:pPr>
   </w:style>
+  <w:style w:type="table" w:styleId="TableGrid">
+    <w:name w:val="Table Grid"/>
+    <w:basedOn w:val="TableNormal"/>
+    <w:uiPriority w:val="39"/>
+    <w:rsid w:val="00AF396A"/>
+    <w:pPr>
+      <w:spacing w:after="0" w:line="240" w:lineRule="auto"/>
+    </w:pPr>
+    <w:tblPr>
+      <w:tblBorders>
+        <w:top w:val="single" w:sz="4" w:space="0" w:color="auto"/>
+        <w:left w:val="single" w:sz="4" w:space="0" w:color="auto"/>
+        <w:bottom w:val="single" w:sz="4" w:space="0" w:color="auto"/>
+        <w:right w:val="single" w:sz="4" w:space="0" w:color="auto"/>
+        <w:insideH w:val="single" w:sz="4" w:space="0" w:color="auto"/>
+        <w:insideV w:val="single" w:sz="4" w:space="0" w:color="auto"/>
+      </w:tblBorders>
+    </w:tblPr>
+  </w:style>
 </w:styles>
 </file>
 

</xml_diff>

<commit_message>
Fomalized NodeSimplePattern and curly brace strings.
</commit_message>
<xml_diff>
--- a/CK.SqlServer.Transform/Data Definition Manipulation Language.docx
+++ b/CK.SqlServer.Transform/Data Definition Manipulation Language.docx
@@ -1283,17 +1283,7 @@
                 <w:szCs w:val="19"/>
                 <w:lang w:val="en-US"/>
               </w:rPr>
-              <w:t>| all [[out of] n]</w:t>
-            </w:r>
-            <w:r>
-              <w:rPr>
-                <w:rFonts w:ascii="Consolas" w:hAnsi="Consolas" w:cs="Consolas"/>
-                <w:color w:val="000000"/>
-                <w:sz w:val="19"/>
-                <w:szCs w:val="19"/>
-                <w:lang w:val="en-US"/>
-              </w:rPr>
-              <w:t>) (</w:t>
+              <w:t>| all [[out of] n]) (</w:t>
             </w:r>
             <w:proofErr w:type="spellStart"/>
             <w:r>
@@ -1522,37 +1512,17 @@
                 <w:szCs w:val="19"/>
                 <w:lang w:val="en-US"/>
               </w:rPr>
-              <w:t>"</w:t>
-            </w:r>
-            <w:r>
-              <w:rPr>
-                <w:rFonts w:ascii="Consolas" w:hAnsi="Consolas" w:cs="Consolas"/>
-                <w:color w:val="000000"/>
-                <w:sz w:val="19"/>
-                <w:szCs w:val="19"/>
-                <w:lang w:val="en-US"/>
-              </w:rPr>
-              <w:t xml:space="preserve"> | [--</w:t>
-            </w:r>
-            <w:r>
-              <w:rPr>
-                <w:rFonts w:ascii="Consolas" w:hAnsi="Consolas" w:cs="Consolas"/>
-                <w:color w:val="000000"/>
-                <w:sz w:val="19"/>
-                <w:szCs w:val="19"/>
-                <w:lang w:val="en-US"/>
-              </w:rPr>
-              <w:t xml:space="preserve"> </w:t>
-            </w:r>
-            <w:r>
-              <w:rPr>
-                <w:rFonts w:ascii="Consolas" w:hAnsi="Consolas" w:cs="Consolas"/>
-                <w:color w:val="000000"/>
-                <w:sz w:val="19"/>
-                <w:szCs w:val="19"/>
-                <w:lang w:val="en-US"/>
-              </w:rPr>
-              <w:t>prefix</w:t>
+              <w:t>" | [--</w:t>
+            </w:r>
+            <w:r>
+              <w:rPr>
+                <w:rFonts w:ascii="Consolas" w:hAnsi="Consolas" w:cs="Consolas"/>
+                <w:color w:val="000000"/>
+                <w:sz w:val="19"/>
+                <w:szCs w:val="19"/>
+                <w:lang w:val="en-US"/>
+              </w:rPr>
+              <w:t xml:space="preserve"> prefix</w:t>
             </w:r>
             <w:r>
               <w:rPr>
@@ -1572,17 +1542,7 @@
                 <w:szCs w:val="19"/>
                 <w:lang w:val="en-US"/>
               </w:rPr>
-              <w:t xml:space="preserve"> </w:t>
-            </w:r>
-            <w:r>
-              <w:rPr>
-                <w:rFonts w:ascii="Consolas" w:hAnsi="Consolas" w:cs="Consolas"/>
-                <w:color w:val="000000"/>
-                <w:sz w:val="19"/>
-                <w:szCs w:val="19"/>
-                <w:lang w:val="en-US"/>
-              </w:rPr>
-              <w:t>prefix</w:t>
+              <w:t xml:space="preserve"> prefix</w:t>
             </w:r>
             <w:r>
               <w:rPr>
@@ -1662,6 +1622,7 @@
                 <w:color w:val="000000"/>
                 <w:sz w:val="19"/>
                 <w:szCs w:val="19"/>
+                <w:lang w:val="en-US"/>
               </w:rPr>
             </w:pPr>
             <w:r>
@@ -1670,62 +1631,9 @@
                 <w:color w:val="000000"/>
                 <w:sz w:val="19"/>
                 <w:szCs w:val="19"/>
-              </w:rPr>
-              <w:t>"</w:t>
-            </w:r>
-            <w:r>
-              <w:rPr>
-                <w:rFonts w:ascii="Consolas" w:hAnsi="Consolas" w:cs="Consolas"/>
-                <w:color w:val="000000"/>
-                <w:sz w:val="19"/>
-                <w:szCs w:val="19"/>
-              </w:rPr>
-              <w:t>/* content */</w:t>
-            </w:r>
-            <w:r>
-              <w:rPr>
-                <w:rFonts w:ascii="Consolas" w:hAnsi="Consolas" w:cs="Consolas"/>
-                <w:color w:val="000000"/>
-                <w:sz w:val="19"/>
-                <w:szCs w:val="19"/>
-              </w:rPr>
-              <w:t xml:space="preserve">" | [/* </w:t>
-            </w:r>
-            <w:r>
-              <w:rPr>
-                <w:rFonts w:ascii="Consolas" w:hAnsi="Consolas" w:cs="Consolas"/>
-                <w:color w:val="000000"/>
-                <w:sz w:val="19"/>
-                <w:szCs w:val="19"/>
-              </w:rPr>
-              <w:t>content</w:t>
-            </w:r>
-            <w:r>
-              <w:rPr>
-                <w:rFonts w:ascii="Consolas" w:hAnsi="Consolas" w:cs="Consolas"/>
-                <w:color w:val="000000"/>
-                <w:sz w:val="19"/>
-                <w:szCs w:val="19"/>
-              </w:rPr>
-              <w:t xml:space="preserve"> */] | '/* </w:t>
-            </w:r>
-            <w:r>
-              <w:rPr>
-                <w:rFonts w:ascii="Consolas" w:hAnsi="Consolas" w:cs="Consolas"/>
-                <w:color w:val="000000"/>
-                <w:sz w:val="19"/>
-                <w:szCs w:val="19"/>
-              </w:rPr>
-              <w:t>content</w:t>
-            </w:r>
-            <w:r>
-              <w:rPr>
-                <w:rFonts w:ascii="Consolas" w:hAnsi="Consolas" w:cs="Consolas"/>
-                <w:color w:val="000000"/>
-                <w:sz w:val="19"/>
-                <w:szCs w:val="19"/>
-              </w:rPr>
-              <w:t xml:space="preserve"> */'</w:t>
+                <w:lang w:val="en-US"/>
+              </w:rPr>
+              <w:t>"/* content */" | [/* content */] | '/* content */'</w:t>
             </w:r>
           </w:p>
           <w:p>
@@ -1825,6 +1733,16 @@
                 <w:szCs w:val="19"/>
                 <w:lang w:val="en-US"/>
               </w:rPr>
+              <w:t>[</w:t>
+            </w:r>
+            <w:r>
+              <w:rPr>
+                <w:rFonts w:ascii="Consolas" w:hAnsi="Consolas" w:cs="Consolas"/>
+                <w:color w:val="000000"/>
+                <w:sz w:val="19"/>
+                <w:szCs w:val="19"/>
+                <w:lang w:val="en-US"/>
+              </w:rPr>
               <w:t>(</w:t>
             </w:r>
             <w:proofErr w:type="spellStart"/>
@@ -1847,7 +1765,57 @@
                 <w:szCs w:val="19"/>
                 <w:lang w:val="en-US"/>
               </w:rPr>
-              <w:t xml:space="preserve">) nodes like </w:t>
+              <w:t xml:space="preserve">) </w:t>
+            </w:r>
+            <w:r>
+              <w:rPr>
+                <w:rFonts w:ascii="Consolas" w:hAnsi="Consolas" w:cs="Consolas"/>
+                <w:color w:val="000000"/>
+                <w:sz w:val="19"/>
+                <w:szCs w:val="19"/>
+                <w:lang w:val="en-US"/>
+              </w:rPr>
+              <w:t>[</w:t>
+            </w:r>
+            <w:r>
+              <w:rPr>
+                <w:rFonts w:ascii="Consolas" w:hAnsi="Consolas" w:cs="Consolas"/>
+                <w:color w:val="000000"/>
+                <w:sz w:val="19"/>
+                <w:szCs w:val="19"/>
+                <w:lang w:val="en-US"/>
+              </w:rPr>
+              <w:t>nodes like</w:t>
+            </w:r>
+            <w:r>
+              <w:rPr>
+                <w:rFonts w:ascii="Consolas" w:hAnsi="Consolas" w:cs="Consolas"/>
+                <w:color w:val="000000"/>
+                <w:sz w:val="19"/>
+                <w:szCs w:val="19"/>
+                <w:lang w:val="en-US"/>
+              </w:rPr>
+              <w:t>]</w:t>
+            </w:r>
+            <w:r>
+              <w:rPr>
+                <w:rFonts w:ascii="Consolas" w:hAnsi="Consolas" w:cs="Consolas"/>
+                <w:color w:val="000000"/>
+                <w:sz w:val="19"/>
+                <w:szCs w:val="19"/>
+                <w:lang w:val="en-US"/>
+              </w:rPr>
+              <w:t>]</w:t>
+            </w:r>
+            <w:r>
+              <w:rPr>
+                <w:rFonts w:ascii="Consolas" w:hAnsi="Consolas" w:cs="Consolas"/>
+                <w:color w:val="000000"/>
+                <w:sz w:val="19"/>
+                <w:szCs w:val="19"/>
+                <w:lang w:val="en-US"/>
+              </w:rPr>
+              <w:t xml:space="preserve"> </w:t>
             </w:r>
             <w:proofErr w:type="spellStart"/>
             <w:r>
@@ -1858,7 +1826,7 @@
                 <w:szCs w:val="19"/>
                 <w:lang w:val="en-US"/>
               </w:rPr>
-              <w:t>SimplePattern</w:t>
+              <w:t>RawNodeList</w:t>
             </w:r>
             <w:proofErr w:type="spellEnd"/>
           </w:p>
@@ -1888,7 +1856,7 @@
                 <w:szCs w:val="19"/>
                 <w:lang w:val="en-US"/>
               </w:rPr>
-              <w:t>SimplePattern</w:t>
+              <w:t>RawNodeList</w:t>
             </w:r>
             <w:proofErr w:type="spellEnd"/>
           </w:p>
@@ -1938,8 +1906,6 @@
               </w:rPr>
               <w:t>Whitespaces are not relevant, only tokens matter.</w:t>
             </w:r>
-            <w:bookmarkStart w:id="0" w:name="_GoBack"/>
-            <w:bookmarkEnd w:id="0"/>
           </w:p>
         </w:tc>
       </w:tr>
@@ -1961,13 +1927,53 @@
           <w:lang w:val="en-US"/>
         </w:rPr>
       </w:pPr>
-    </w:p>
-    <w:p>
-      <w:pPr>
-        <w:rPr>
-          <w:lang w:val="en-US"/>
-        </w:rPr>
-      </w:pPr>
+      <w:r>
+        <w:rPr>
+          <w:lang w:val="en-US"/>
+        </w:rPr>
+        <w:t>Inject {A} and {B} around</w:t>
+      </w:r>
+    </w:p>
+    <w:p>
+      <w:pPr>
+        <w:rPr>
+          <w:lang w:val="en-US"/>
+        </w:rPr>
+      </w:pPr>
+      <w:r>
+        <w:rPr>
+          <w:lang w:val="en-US"/>
+        </w:rPr>
+        <w:t>Inject {A} after</w:t>
+      </w:r>
+    </w:p>
+    <w:p>
+      <w:pPr>
+        <w:rPr>
+          <w:lang w:val="en-US"/>
+        </w:rPr>
+      </w:pPr>
+      <w:r>
+        <w:rPr>
+          <w:lang w:val="en-US"/>
+        </w:rPr>
+        <w:t xml:space="preserve">Inject {A} </w:t>
+      </w:r>
+      <w:r>
+        <w:rPr>
+          <w:lang w:val="en-US"/>
+        </w:rPr>
+        <w:t>before</w:t>
+      </w:r>
+    </w:p>
+    <w:p>
+      <w:pPr>
+        <w:rPr>
+          <w:lang w:val="en-US"/>
+        </w:rPr>
+      </w:pPr>
+      <w:bookmarkStart w:id="0" w:name="_GoBack"/>
+      <w:bookmarkEnd w:id="0"/>
     </w:p>
     <w:p>
       <w:pPr>

</xml_diff>

<commit_message>
Works far better with statement/part/range kind...
Next step: handle the promotion of SelectSpec match to its parent SelectDecorator: users will never understand the (required!)decorator construct... :(
</commit_message>
<xml_diff>
--- a/CK.SqlServer.Transform/Data Definition Manipulation Language.docx
+++ b/CK.SqlServer.Transform/Data Definition Manipulation Language.docx
@@ -1145,13 +1145,13 @@
         <w:tblLook w:val="04A0" w:firstRow="1" w:lastRow="0" w:firstColumn="1" w:lastColumn="0" w:noHBand="0" w:noVBand="1"/>
       </w:tblPr>
       <w:tblGrid>
-        <w:gridCol w:w="2405"/>
-        <w:gridCol w:w="6611"/>
+        <w:gridCol w:w="2263"/>
+        <w:gridCol w:w="6753"/>
       </w:tblGrid>
       <w:tr>
         <w:tc>
           <w:tcPr>
-            <w:tcW w:w="2405" w:type="dxa"/>
+            <w:tcW w:w="2263" w:type="dxa"/>
           </w:tcPr>
           <w:p>
             <w:pPr>
@@ -1160,6 +1160,7 @@
                 <w:color w:val="000000"/>
                 <w:sz w:val="19"/>
                 <w:szCs w:val="19"/>
+                <w:highlight w:val="white"/>
                 <w:lang w:val="en-US"/>
               </w:rPr>
             </w:pPr>
@@ -1173,14 +1174,25 @@
                 <w:highlight w:val="white"/>
                 <w:lang w:val="en-US"/>
               </w:rPr>
-              <w:t>LocationSelector</w:t>
+              <w:t>Inject</w:t>
+            </w:r>
+            <w:r>
+              <w:rPr>
+                <w:rFonts w:ascii="Consolas" w:hAnsi="Consolas" w:cs="Consolas"/>
+                <w:color w:val="000000"/>
+                <w:sz w:val="19"/>
+                <w:szCs w:val="19"/>
+                <w:highlight w:val="white"/>
+                <w:lang w:val="en-US"/>
+              </w:rPr>
+              <w:t>er</w:t>
             </w:r>
             <w:proofErr w:type="spellEnd"/>
           </w:p>
         </w:tc>
         <w:tc>
           <w:tcPr>
-            <w:tcW w:w="6611" w:type="dxa"/>
+            <w:tcW w:w="6753" w:type="dxa"/>
           </w:tcPr>
           <w:p>
             <w:pPr>
@@ -1200,90 +1212,7 @@
                 <w:szCs w:val="19"/>
                 <w:lang w:val="en-US"/>
               </w:rPr>
-              <w:t>(</w:t>
-            </w:r>
-            <w:r>
-              <w:rPr>
-                <w:rFonts w:ascii="Consolas" w:hAnsi="Consolas" w:cs="Consolas"/>
-                <w:color w:val="000000"/>
-                <w:sz w:val="19"/>
-                <w:szCs w:val="19"/>
-                <w:lang w:val="en-US"/>
-              </w:rPr>
-              <w:t>first [+ n] [out o</w:t>
-            </w:r>
-            <w:r>
-              <w:rPr>
-                <w:rFonts w:ascii="Consolas" w:hAnsi="Consolas" w:cs="Consolas"/>
-                <w:color w:val="000000"/>
-                <w:sz w:val="19"/>
-                <w:szCs w:val="19"/>
-                <w:lang w:val="en-US"/>
-              </w:rPr>
-              <w:t xml:space="preserve">f n] </w:t>
-            </w:r>
-          </w:p>
-          <w:p>
-            <w:pPr>
-              <w:rPr>
-                <w:rFonts w:ascii="Consolas" w:hAnsi="Consolas" w:cs="Consolas"/>
-                <w:color w:val="000000"/>
-                <w:sz w:val="19"/>
-                <w:szCs w:val="19"/>
-                <w:lang w:val="en-US"/>
-              </w:rPr>
-            </w:pPr>
-            <w:r>
-              <w:rPr>
-                <w:rFonts w:ascii="Consolas" w:hAnsi="Consolas" w:cs="Consolas"/>
-                <w:color w:val="000000"/>
-                <w:sz w:val="19"/>
-                <w:szCs w:val="19"/>
-                <w:lang w:val="en-US"/>
-              </w:rPr>
-              <w:t xml:space="preserve">| last [- n] [out of n] </w:t>
-            </w:r>
-          </w:p>
-          <w:p>
-            <w:pPr>
-              <w:rPr>
-                <w:rFonts w:ascii="Consolas" w:hAnsi="Consolas" w:cs="Consolas"/>
-                <w:color w:val="000000"/>
-                <w:sz w:val="19"/>
-                <w:szCs w:val="19"/>
-                <w:lang w:val="en-US"/>
-              </w:rPr>
-            </w:pPr>
-            <w:r>
-              <w:rPr>
-                <w:rFonts w:ascii="Consolas" w:hAnsi="Consolas" w:cs="Consolas"/>
-                <w:color w:val="000000"/>
-                <w:sz w:val="19"/>
-                <w:szCs w:val="19"/>
-                <w:lang w:val="en-US"/>
-              </w:rPr>
-              <w:t xml:space="preserve">| single </w:t>
-            </w:r>
-          </w:p>
-          <w:p>
-            <w:pPr>
-              <w:rPr>
-                <w:rFonts w:ascii="Consolas" w:hAnsi="Consolas" w:cs="Consolas"/>
-                <w:color w:val="000000"/>
-                <w:sz w:val="19"/>
-                <w:szCs w:val="19"/>
-                <w:lang w:val="en-US"/>
-              </w:rPr>
-            </w:pPr>
-            <w:r>
-              <w:rPr>
-                <w:rFonts w:ascii="Consolas" w:hAnsi="Consolas" w:cs="Consolas"/>
-                <w:color w:val="000000"/>
-                <w:sz w:val="19"/>
-                <w:szCs w:val="19"/>
-                <w:lang w:val="en-US"/>
-              </w:rPr>
-              <w:t>| all [[out of] n]) (</w:t>
+              <w:t xml:space="preserve">inject </w:t>
             </w:r>
             <w:proofErr w:type="spellStart"/>
             <w:r>
@@ -1294,7 +1223,7 @@
                 <w:szCs w:val="19"/>
                 <w:lang w:val="en-US"/>
               </w:rPr>
-              <w:t>CommentStringMatch</w:t>
+              <w:t>LiteralString</w:t>
             </w:r>
             <w:proofErr w:type="spellEnd"/>
             <w:r>
@@ -1305,7 +1234,7 @@
                 <w:szCs w:val="19"/>
                 <w:lang w:val="en-US"/>
               </w:rPr>
-              <w:t xml:space="preserve"> | </w:t>
+              <w:t xml:space="preserve"> ((and </w:t>
             </w:r>
             <w:proofErr w:type="spellStart"/>
             <w:r>
@@ -1316,17 +1245,7 @@
                 <w:szCs w:val="19"/>
                 <w:lang w:val="en-US"/>
               </w:rPr>
-              <w:t>NodeSimple</w:t>
-            </w:r>
-            <w:r>
-              <w:rPr>
-                <w:rFonts w:ascii="Consolas" w:hAnsi="Consolas" w:cs="Consolas"/>
-                <w:color w:val="000000"/>
-                <w:sz w:val="19"/>
-                <w:szCs w:val="19"/>
-                <w:lang w:val="en-US"/>
-              </w:rPr>
-              <w:t>Pattern</w:t>
+              <w:t>LiteralString</w:t>
             </w:r>
             <w:proofErr w:type="spellEnd"/>
             <w:r>
@@ -1337,15 +1256,48 @@
                 <w:szCs w:val="19"/>
                 <w:lang w:val="en-US"/>
               </w:rPr>
-              <w:t xml:space="preserve">) </w:t>
-            </w:r>
+              <w:t xml:space="preserve"> </w:t>
+            </w:r>
+            <w:r>
+              <w:rPr>
+                <w:rFonts w:ascii="Consolas" w:hAnsi="Consolas" w:cs="Consolas"/>
+                <w:color w:val="000000"/>
+                <w:sz w:val="19"/>
+                <w:szCs w:val="19"/>
+                <w:lang w:val="en-US"/>
+              </w:rPr>
+              <w:t xml:space="preserve">around) | (before | after) </w:t>
+            </w:r>
+            <w:proofErr w:type="spellStart"/>
+            <w:r>
+              <w:rPr>
+                <w:rFonts w:ascii="Consolas" w:hAnsi="Consolas" w:cs="Consolas"/>
+                <w:color w:val="000000"/>
+                <w:sz w:val="19"/>
+                <w:szCs w:val="19"/>
+                <w:highlight w:val="white"/>
+                <w:lang w:val="en-US"/>
+              </w:rPr>
+              <w:t>Location</w:t>
+            </w:r>
+            <w:r>
+              <w:rPr>
+                <w:rFonts w:ascii="Consolas" w:hAnsi="Consolas" w:cs="Consolas"/>
+                <w:color w:val="000000"/>
+                <w:sz w:val="19"/>
+                <w:szCs w:val="19"/>
+                <w:lang w:val="en-US"/>
+              </w:rPr>
+              <w:t>Finder</w:t>
+            </w:r>
+            <w:proofErr w:type="spellEnd"/>
           </w:p>
         </w:tc>
       </w:tr>
       <w:tr>
         <w:tc>
           <w:tcPr>
-            <w:tcW w:w="2405" w:type="dxa"/>
+            <w:tcW w:w="2263" w:type="dxa"/>
           </w:tcPr>
           <w:p>
             <w:pPr>
@@ -1364,16 +1316,210 @@
                 <w:color w:val="000000"/>
                 <w:sz w:val="19"/>
                 <w:szCs w:val="19"/>
-                <w:lang w:val="en-US"/>
-              </w:rPr>
-              <w:t>CommentStringMatch</w:t>
+                <w:highlight w:val="white"/>
+                <w:lang w:val="en-US"/>
+              </w:rPr>
+              <w:t>Location</w:t>
+            </w:r>
+            <w:r>
+              <w:rPr>
+                <w:rFonts w:ascii="Consolas" w:hAnsi="Consolas" w:cs="Consolas"/>
+                <w:color w:val="000000"/>
+                <w:sz w:val="19"/>
+                <w:szCs w:val="19"/>
+                <w:lang w:val="en-US"/>
+              </w:rPr>
+              <w:t>Finder</w:t>
             </w:r>
             <w:proofErr w:type="spellEnd"/>
           </w:p>
         </w:tc>
         <w:tc>
           <w:tcPr>
-            <w:tcW w:w="6611" w:type="dxa"/>
+            <w:tcW w:w="6753" w:type="dxa"/>
+          </w:tcPr>
+          <w:p>
+            <w:pPr>
+              <w:rPr>
+                <w:rFonts w:ascii="Consolas" w:hAnsi="Consolas" w:cs="Consolas"/>
+                <w:color w:val="000000"/>
+                <w:sz w:val="19"/>
+                <w:szCs w:val="19"/>
+                <w:lang w:val="en-US"/>
+              </w:rPr>
+            </w:pPr>
+            <w:r>
+              <w:rPr>
+                <w:rFonts w:ascii="Consolas" w:hAnsi="Consolas" w:cs="Consolas"/>
+                <w:color w:val="000000"/>
+                <w:sz w:val="19"/>
+                <w:szCs w:val="19"/>
+                <w:lang w:val="en-US"/>
+              </w:rPr>
+              <w:t>(</w:t>
+            </w:r>
+            <w:r>
+              <w:rPr>
+                <w:rFonts w:ascii="Consolas" w:hAnsi="Consolas" w:cs="Consolas"/>
+                <w:color w:val="000000"/>
+                <w:sz w:val="19"/>
+                <w:szCs w:val="19"/>
+                <w:lang w:val="en-US"/>
+              </w:rPr>
+              <w:t>first [+ n] [out o</w:t>
+            </w:r>
+            <w:r>
+              <w:rPr>
+                <w:rFonts w:ascii="Consolas" w:hAnsi="Consolas" w:cs="Consolas"/>
+                <w:color w:val="000000"/>
+                <w:sz w:val="19"/>
+                <w:szCs w:val="19"/>
+                <w:lang w:val="en-US"/>
+              </w:rPr>
+              <w:t xml:space="preserve">f n] </w:t>
+            </w:r>
+          </w:p>
+          <w:p>
+            <w:pPr>
+              <w:rPr>
+                <w:rFonts w:ascii="Consolas" w:hAnsi="Consolas" w:cs="Consolas"/>
+                <w:color w:val="000000"/>
+                <w:sz w:val="19"/>
+                <w:szCs w:val="19"/>
+                <w:lang w:val="en-US"/>
+              </w:rPr>
+            </w:pPr>
+            <w:r>
+              <w:rPr>
+                <w:rFonts w:ascii="Consolas" w:hAnsi="Consolas" w:cs="Consolas"/>
+                <w:color w:val="000000"/>
+                <w:sz w:val="19"/>
+                <w:szCs w:val="19"/>
+                <w:lang w:val="en-US"/>
+              </w:rPr>
+              <w:t xml:space="preserve">| last [- n] [out of n] </w:t>
+            </w:r>
+          </w:p>
+          <w:p>
+            <w:pPr>
+              <w:rPr>
+                <w:rFonts w:ascii="Consolas" w:hAnsi="Consolas" w:cs="Consolas"/>
+                <w:color w:val="000000"/>
+                <w:sz w:val="19"/>
+                <w:szCs w:val="19"/>
+                <w:lang w:val="en-US"/>
+              </w:rPr>
+            </w:pPr>
+            <w:r>
+              <w:rPr>
+                <w:rFonts w:ascii="Consolas" w:hAnsi="Consolas" w:cs="Consolas"/>
+                <w:color w:val="000000"/>
+                <w:sz w:val="19"/>
+                <w:szCs w:val="19"/>
+                <w:lang w:val="en-US"/>
+              </w:rPr>
+              <w:t xml:space="preserve">| single </w:t>
+            </w:r>
+          </w:p>
+          <w:p>
+            <w:pPr>
+              <w:rPr>
+                <w:rFonts w:ascii="Consolas" w:hAnsi="Consolas" w:cs="Consolas"/>
+                <w:color w:val="000000"/>
+                <w:sz w:val="19"/>
+                <w:szCs w:val="19"/>
+                <w:lang w:val="en-US"/>
+              </w:rPr>
+            </w:pPr>
+            <w:r>
+              <w:rPr>
+                <w:rFonts w:ascii="Consolas" w:hAnsi="Consolas" w:cs="Consolas"/>
+                <w:color w:val="000000"/>
+                <w:sz w:val="19"/>
+                <w:szCs w:val="19"/>
+                <w:lang w:val="en-US"/>
+              </w:rPr>
+              <w:t>| all [[out of] n]) (</w:t>
+            </w:r>
+            <w:proofErr w:type="spellStart"/>
+            <w:r>
+              <w:rPr>
+                <w:rFonts w:ascii="Consolas" w:hAnsi="Consolas" w:cs="Consolas"/>
+                <w:color w:val="000000"/>
+                <w:sz w:val="19"/>
+                <w:szCs w:val="19"/>
+                <w:lang w:val="en-US"/>
+              </w:rPr>
+              <w:t>CommentStringMatch</w:t>
+            </w:r>
+            <w:proofErr w:type="spellEnd"/>
+            <w:r>
+              <w:rPr>
+                <w:rFonts w:ascii="Consolas" w:hAnsi="Consolas" w:cs="Consolas"/>
+                <w:color w:val="000000"/>
+                <w:sz w:val="19"/>
+                <w:szCs w:val="19"/>
+                <w:lang w:val="en-US"/>
+              </w:rPr>
+              <w:t xml:space="preserve"> | </w:t>
+            </w:r>
+            <w:proofErr w:type="spellStart"/>
+            <w:r>
+              <w:rPr>
+                <w:rFonts w:ascii="Consolas" w:hAnsi="Consolas" w:cs="Consolas"/>
+                <w:color w:val="000000"/>
+                <w:sz w:val="19"/>
+                <w:szCs w:val="19"/>
+                <w:lang w:val="en-US"/>
+              </w:rPr>
+              <w:t>NodeSimplePattern</w:t>
+            </w:r>
+            <w:proofErr w:type="spellEnd"/>
+            <w:r>
+              <w:rPr>
+                <w:rFonts w:ascii="Consolas" w:hAnsi="Consolas" w:cs="Consolas"/>
+                <w:color w:val="000000"/>
+                <w:sz w:val="19"/>
+                <w:szCs w:val="19"/>
+                <w:lang w:val="en-US"/>
+              </w:rPr>
+              <w:t xml:space="preserve">) </w:t>
+            </w:r>
+          </w:p>
+        </w:tc>
+      </w:tr>
+      <w:tr>
+        <w:tc>
+          <w:tcPr>
+            <w:tcW w:w="2263" w:type="dxa"/>
+          </w:tcPr>
+          <w:p>
+            <w:pPr>
+              <w:rPr>
+                <w:rFonts w:ascii="Consolas" w:hAnsi="Consolas" w:cs="Consolas"/>
+                <w:color w:val="000000"/>
+                <w:sz w:val="19"/>
+                <w:szCs w:val="19"/>
+                <w:lang w:val="en-US"/>
+              </w:rPr>
+            </w:pPr>
+            <w:proofErr w:type="spellStart"/>
+            <w:r>
+              <w:rPr>
+                <w:rFonts w:ascii="Consolas" w:hAnsi="Consolas" w:cs="Consolas"/>
+                <w:color w:val="000000"/>
+                <w:sz w:val="19"/>
+                <w:szCs w:val="19"/>
+                <w:lang w:val="en-US"/>
+              </w:rPr>
+              <w:t>CommentStringMatch</w:t>
+            </w:r>
+            <w:proofErr w:type="spellEnd"/>
+          </w:p>
+        </w:tc>
+        <w:tc>
+          <w:tcPr>
+            <w:tcW w:w="6753" w:type="dxa"/>
           </w:tcPr>
           <w:p>
             <w:pPr>
@@ -1430,47 +1576,7 @@
                 <w:szCs w:val="19"/>
                 <w:lang w:val="en-US"/>
               </w:rPr>
-              <w:t>S</w:t>
-            </w:r>
-            <w:r>
-              <w:rPr>
-                <w:rFonts w:ascii="Consolas" w:hAnsi="Consolas" w:cs="Consolas"/>
-                <w:color w:val="000000"/>
-                <w:sz w:val="19"/>
-                <w:szCs w:val="19"/>
-                <w:lang w:val="en-US"/>
-              </w:rPr>
-              <w:t xml:space="preserve">tarts with </w:t>
-            </w:r>
-            <w:r>
-              <w:rPr>
-                <w:rFonts w:ascii="Consolas" w:hAnsi="Consolas" w:cs="Consolas"/>
-                <w:color w:val="000000"/>
-                <w:sz w:val="19"/>
-                <w:szCs w:val="19"/>
-                <w:lang w:val="en-US"/>
-              </w:rPr>
-              <w:t xml:space="preserve">-- </w:t>
-            </w:r>
-            <w:r>
-              <w:rPr>
-                <w:rFonts w:ascii="Consolas" w:hAnsi="Consolas" w:cs="Consolas"/>
-                <w:color w:val="000000"/>
-                <w:sz w:val="19"/>
-                <w:szCs w:val="19"/>
-                <w:lang w:val="en-US"/>
-              </w:rPr>
-              <w:t>for a line comment</w:t>
-            </w:r>
-            <w:r>
-              <w:rPr>
-                <w:rFonts w:ascii="Consolas" w:hAnsi="Consolas" w:cs="Consolas"/>
-                <w:color w:val="000000"/>
-                <w:sz w:val="19"/>
-                <w:szCs w:val="19"/>
-                <w:lang w:val="en-US"/>
-              </w:rPr>
-              <w:t>:</w:t>
+              <w:t>Starts with -- for a line comment:</w:t>
             </w:r>
           </w:p>
           <w:p>
@@ -1685,7 +1791,7 @@
       <w:tr>
         <w:tc>
           <w:tcPr>
-            <w:tcW w:w="2405" w:type="dxa"/>
+            <w:tcW w:w="2263" w:type="dxa"/>
           </w:tcPr>
           <w:p>
             <w:pPr>
@@ -1713,7 +1819,7 @@
         </w:tc>
         <w:tc>
           <w:tcPr>
-            <w:tcW w:w="6611" w:type="dxa"/>
+            <w:tcW w:w="6753" w:type="dxa"/>
           </w:tcPr>
           <w:p>
             <w:pPr>
@@ -1735,16 +1841,6 @@
               </w:rPr>
               <w:t>[</w:t>
             </w:r>
-            <w:r>
-              <w:rPr>
-                <w:rFonts w:ascii="Consolas" w:hAnsi="Consolas" w:cs="Consolas"/>
-                <w:color w:val="000000"/>
-                <w:sz w:val="19"/>
-                <w:szCs w:val="19"/>
-                <w:lang w:val="en-US"/>
-              </w:rPr>
-              <w:t>(</w:t>
-            </w:r>
             <w:proofErr w:type="spellStart"/>
             <w:r>
               <w:rPr>
@@ -1754,7 +1850,27 @@
                 <w:szCs w:val="19"/>
                 <w:lang w:val="en-US"/>
               </w:rPr>
-              <w:t>largest|deepest</w:t>
+              <w:t>statement|part</w:t>
+            </w:r>
+            <w:r>
+              <w:rPr>
+                <w:rFonts w:ascii="Consolas" w:hAnsi="Consolas" w:cs="Consolas"/>
+                <w:color w:val="000000"/>
+                <w:sz w:val="19"/>
+                <w:szCs w:val="19"/>
+                <w:lang w:val="en-US"/>
+              </w:rPr>
+              <w:t>|</w:t>
+            </w:r>
+            <w:r>
+              <w:rPr>
+                <w:rFonts w:ascii="Consolas" w:hAnsi="Consolas" w:cs="Consolas"/>
+                <w:color w:val="000000"/>
+                <w:sz w:val="19"/>
+                <w:szCs w:val="19"/>
+                <w:lang w:val="en-US"/>
+              </w:rPr>
+              <w:t>range</w:t>
             </w:r>
             <w:proofErr w:type="spellEnd"/>
             <w:r>
@@ -1765,57 +1881,7 @@
                 <w:szCs w:val="19"/>
                 <w:lang w:val="en-US"/>
               </w:rPr>
-              <w:t xml:space="preserve">) </w:t>
-            </w:r>
-            <w:r>
-              <w:rPr>
-                <w:rFonts w:ascii="Consolas" w:hAnsi="Consolas" w:cs="Consolas"/>
-                <w:color w:val="000000"/>
-                <w:sz w:val="19"/>
-                <w:szCs w:val="19"/>
-                <w:lang w:val="en-US"/>
-              </w:rPr>
-              <w:t>[</w:t>
-            </w:r>
-            <w:r>
-              <w:rPr>
-                <w:rFonts w:ascii="Consolas" w:hAnsi="Consolas" w:cs="Consolas"/>
-                <w:color w:val="000000"/>
-                <w:sz w:val="19"/>
-                <w:szCs w:val="19"/>
-                <w:lang w:val="en-US"/>
-              </w:rPr>
-              <w:t>nodes like</w:t>
-            </w:r>
-            <w:r>
-              <w:rPr>
-                <w:rFonts w:ascii="Consolas" w:hAnsi="Consolas" w:cs="Consolas"/>
-                <w:color w:val="000000"/>
-                <w:sz w:val="19"/>
-                <w:szCs w:val="19"/>
-                <w:lang w:val="en-US"/>
-              </w:rPr>
-              <w:t>]</w:t>
-            </w:r>
-            <w:r>
-              <w:rPr>
-                <w:rFonts w:ascii="Consolas" w:hAnsi="Consolas" w:cs="Consolas"/>
-                <w:color w:val="000000"/>
-                <w:sz w:val="19"/>
-                <w:szCs w:val="19"/>
-                <w:lang w:val="en-US"/>
-              </w:rPr>
-              <w:t>]</w:t>
-            </w:r>
-            <w:r>
-              <w:rPr>
-                <w:rFonts w:ascii="Consolas" w:hAnsi="Consolas" w:cs="Consolas"/>
-                <w:color w:val="000000"/>
-                <w:sz w:val="19"/>
-                <w:szCs w:val="19"/>
-                <w:lang w:val="en-US"/>
-              </w:rPr>
-              <w:t xml:space="preserve"> </w:t>
+              <w:t xml:space="preserve">] </w:t>
             </w:r>
             <w:proofErr w:type="spellStart"/>
             <w:r>
@@ -1826,7 +1892,7 @@
                 <w:szCs w:val="19"/>
                 <w:lang w:val="en-US"/>
               </w:rPr>
-              <w:t>RawNodeList</w:t>
+              <w:t>CurlyBracePattern</w:t>
             </w:r>
             <w:proofErr w:type="spellEnd"/>
           </w:p>
@@ -1835,7 +1901,7 @@
       <w:tr>
         <w:tc>
           <w:tcPr>
-            <w:tcW w:w="2405" w:type="dxa"/>
+            <w:tcW w:w="2263" w:type="dxa"/>
           </w:tcPr>
           <w:p>
             <w:pPr>
@@ -1856,14 +1922,14 @@
                 <w:szCs w:val="19"/>
                 <w:lang w:val="en-US"/>
               </w:rPr>
-              <w:t>RawNodeList</w:t>
+              <w:t>CurlyBracePattern</w:t>
             </w:r>
             <w:proofErr w:type="spellEnd"/>
           </w:p>
         </w:tc>
         <w:tc>
           <w:tcPr>
-            <w:tcW w:w="6611" w:type="dxa"/>
+            <w:tcW w:w="6753" w:type="dxa"/>
           </w:tcPr>
           <w:p>
             <w:pPr>
@@ -1920,60 +1986,54 @@
           <w:lang w:val="en-US"/>
         </w:rPr>
       </w:pPr>
-    </w:p>
-    <w:p>
-      <w:pPr>
-        <w:rPr>
-          <w:lang w:val="en-US"/>
-        </w:rPr>
-      </w:pPr>
-      <w:r>
-        <w:rPr>
-          <w:lang w:val="en-US"/>
-        </w:rPr>
-        <w:t>Inject {A} and {B} around</w:t>
-      </w:r>
-    </w:p>
-    <w:p>
-      <w:pPr>
-        <w:rPr>
-          <w:lang w:val="en-US"/>
-        </w:rPr>
-      </w:pPr>
-      <w:r>
-        <w:rPr>
-          <w:lang w:val="en-US"/>
-        </w:rPr>
-        <w:t>Inject {A} after</w:t>
-      </w:r>
-    </w:p>
-    <w:p>
-      <w:pPr>
-        <w:rPr>
-          <w:lang w:val="en-US"/>
-        </w:rPr>
-      </w:pPr>
-      <w:r>
-        <w:rPr>
-          <w:lang w:val="en-US"/>
-        </w:rPr>
-        <w:t xml:space="preserve">Inject {A} </w:t>
-      </w:r>
-      <w:r>
-        <w:rPr>
-          <w:lang w:val="en-US"/>
-        </w:rPr>
-        <w:t>before</w:t>
-      </w:r>
-    </w:p>
-    <w:p>
-      <w:pPr>
-        <w:rPr>
-          <w:lang w:val="en-US"/>
-        </w:rPr>
-      </w:pPr>
       <w:bookmarkStart w:id="0" w:name="_GoBack"/>
       <w:bookmarkEnd w:id="0"/>
+    </w:p>
+    <w:p>
+      <w:pPr>
+        <w:rPr>
+          <w:lang w:val="en-US"/>
+        </w:rPr>
+      </w:pPr>
+      <w:r>
+        <w:rPr>
+          <w:lang w:val="en-US"/>
+        </w:rPr>
+        <w:t>Inject {A} and {B} around</w:t>
+      </w:r>
+    </w:p>
+    <w:p>
+      <w:pPr>
+        <w:rPr>
+          <w:lang w:val="en-US"/>
+        </w:rPr>
+      </w:pPr>
+      <w:r>
+        <w:rPr>
+          <w:lang w:val="en-US"/>
+        </w:rPr>
+        <w:t>Inject {A} after</w:t>
+      </w:r>
+    </w:p>
+    <w:p>
+      <w:pPr>
+        <w:rPr>
+          <w:lang w:val="en-US"/>
+        </w:rPr>
+      </w:pPr>
+      <w:r>
+        <w:rPr>
+          <w:lang w:val="en-US"/>
+        </w:rPr>
+        <w:t>Inject {A} before</w:t>
+      </w:r>
+    </w:p>
+    <w:p>
+      <w:pPr>
+        <w:rPr>
+          <w:lang w:val="en-US"/>
+        </w:rPr>
+      </w:pPr>
     </w:p>
     <w:p>
       <w:pPr>

</xml_diff>

<commit_message>
Injecter works for statements and parts (withe the SelecDecorator trick).
Next step: support range in inject.
</commit_message>
<xml_diff>
--- a/CK.SqlServer.Transform/Data Definition Manipulation Language.docx
+++ b/CK.SqlServer.Transform/Data Definition Manipulation Language.docx
@@ -1174,18 +1174,7 @@
                 <w:highlight w:val="white"/>
                 <w:lang w:val="en-US"/>
               </w:rPr>
-              <w:t>Inject</w:t>
-            </w:r>
-            <w:r>
-              <w:rPr>
-                <w:rFonts w:ascii="Consolas" w:hAnsi="Consolas" w:cs="Consolas"/>
-                <w:color w:val="000000"/>
-                <w:sz w:val="19"/>
-                <w:szCs w:val="19"/>
-                <w:highlight w:val="white"/>
-                <w:lang w:val="en-US"/>
-              </w:rPr>
-              <w:t>er</w:t>
+              <w:t>AddParameter</w:t>
             </w:r>
             <w:proofErr w:type="spellEnd"/>
           </w:p>
@@ -1196,6 +1185,9 @@
           </w:tcPr>
           <w:p>
             <w:pPr>
+              <w:autoSpaceDE w:val="0"/>
+              <w:autoSpaceDN w:val="0"/>
+              <w:adjustRightInd w:val="0"/>
               <w:rPr>
                 <w:rFonts w:ascii="Consolas" w:hAnsi="Consolas" w:cs="Consolas"/>
                 <w:color w:val="000000"/>
@@ -1210,9 +1202,10 @@
                 <w:color w:val="000000"/>
                 <w:sz w:val="19"/>
                 <w:szCs w:val="19"/>
-                <w:lang w:val="en-US"/>
-              </w:rPr>
-              <w:t xml:space="preserve">inject </w:t>
+                <w:highlight w:val="white"/>
+                <w:lang w:val="en-US"/>
+              </w:rPr>
+              <w:t xml:space="preserve">add parameter </w:t>
             </w:r>
             <w:proofErr w:type="spellStart"/>
             <w:r>
@@ -1221,74 +1214,330 @@
                 <w:color w:val="000000"/>
                 <w:sz w:val="19"/>
                 <w:szCs w:val="19"/>
+                <w:highlight w:val="white"/>
+                <w:lang w:val="en-US"/>
+              </w:rPr>
+              <w:t>ParameterDecl</w:t>
+            </w:r>
+            <w:proofErr w:type="spellEnd"/>
+            <w:r>
+              <w:rPr>
+                <w:rFonts w:ascii="Consolas" w:hAnsi="Consolas" w:cs="Consolas"/>
+                <w:color w:val="000000"/>
+                <w:sz w:val="19"/>
+                <w:szCs w:val="19"/>
+                <w:highlight w:val="white"/>
+                <w:lang w:val="en-US"/>
+              </w:rPr>
+              <w:t xml:space="preserve"> </w:t>
+            </w:r>
+            <w:r>
+              <w:rPr>
+                <w:rFonts w:ascii="Consolas" w:hAnsi="Consolas" w:cs="Consolas"/>
+                <w:color w:val="000000"/>
+                <w:sz w:val="19"/>
+                <w:szCs w:val="19"/>
+                <w:highlight w:val="white"/>
+                <w:lang w:val="en-US"/>
+              </w:rPr>
+              <w:t>[(</w:t>
+            </w:r>
+            <w:proofErr w:type="spellStart"/>
+            <w:r>
+              <w:rPr>
+                <w:rFonts w:ascii="Consolas" w:hAnsi="Consolas" w:cs="Consolas"/>
+                <w:color w:val="000000"/>
+                <w:sz w:val="19"/>
+                <w:szCs w:val="19"/>
+                <w:highlight w:val="white"/>
+                <w:lang w:val="en-US"/>
+              </w:rPr>
+              <w:t>before</w:t>
+            </w:r>
+            <w:r>
+              <w:rPr>
+                <w:rFonts w:ascii="Consolas" w:hAnsi="Consolas" w:cs="Consolas"/>
+                <w:color w:val="000000"/>
+                <w:sz w:val="19"/>
+                <w:szCs w:val="19"/>
+                <w:highlight w:val="white"/>
+                <w:lang w:val="en-US"/>
+              </w:rPr>
+              <w:t>|after</w:t>
+            </w:r>
+            <w:proofErr w:type="spellEnd"/>
+            <w:r>
+              <w:rPr>
+                <w:rFonts w:ascii="Consolas" w:hAnsi="Consolas" w:cs="Consolas"/>
+                <w:color w:val="000000"/>
+                <w:sz w:val="19"/>
+                <w:szCs w:val="19"/>
+                <w:highlight w:val="white"/>
+                <w:lang w:val="en-US"/>
+              </w:rPr>
+              <w:t>)</w:t>
+            </w:r>
+            <w:r>
+              <w:rPr>
+                <w:rFonts w:ascii="Consolas" w:hAnsi="Consolas" w:cs="Consolas"/>
+                <w:color w:val="000000"/>
+                <w:sz w:val="19"/>
+                <w:szCs w:val="19"/>
+                <w:highlight w:val="white"/>
+                <w:lang w:val="en-US"/>
+              </w:rPr>
+              <w:t xml:space="preserve"> </w:t>
+            </w:r>
+            <w:r>
+              <w:rPr>
+                <w:rFonts w:ascii="Consolas" w:hAnsi="Consolas" w:cs="Consolas"/>
+                <w:color w:val="000000"/>
+                <w:sz w:val="19"/>
+                <w:szCs w:val="19"/>
+                <w:lang w:val="en-US"/>
+              </w:rPr>
+              <w:t>@parameter</w:t>
+            </w:r>
+            <w:r>
+              <w:rPr>
+                <w:rFonts w:ascii="Consolas" w:hAnsi="Consolas" w:cs="Consolas"/>
+                <w:color w:val="000000"/>
+                <w:sz w:val="19"/>
+                <w:szCs w:val="19"/>
+                <w:lang w:val="en-US"/>
+              </w:rPr>
+              <w:t>]</w:t>
+            </w:r>
+          </w:p>
+        </w:tc>
+      </w:tr>
+      <w:tr>
+        <w:tc>
+          <w:tcPr>
+            <w:tcW w:w="2263" w:type="dxa"/>
+          </w:tcPr>
+          <w:p>
+            <w:pPr>
+              <w:rPr>
+                <w:rFonts w:ascii="Consolas" w:hAnsi="Consolas" w:cs="Consolas"/>
+                <w:color w:val="000000"/>
+                <w:sz w:val="19"/>
+                <w:szCs w:val="19"/>
+                <w:highlight w:val="white"/>
+                <w:lang w:val="en-US"/>
+              </w:rPr>
+            </w:pPr>
+            <w:proofErr w:type="spellStart"/>
+            <w:r>
+              <w:rPr>
+                <w:rFonts w:ascii="Consolas" w:hAnsi="Consolas" w:cs="Consolas"/>
+                <w:color w:val="000000"/>
+                <w:sz w:val="19"/>
+                <w:szCs w:val="19"/>
+                <w:highlight w:val="white"/>
+                <w:lang w:val="en-US"/>
+              </w:rPr>
+              <w:t>ParameterDecl</w:t>
+            </w:r>
+            <w:proofErr w:type="spellEnd"/>
+          </w:p>
+        </w:tc>
+        <w:tc>
+          <w:tcPr>
+            <w:tcW w:w="6753" w:type="dxa"/>
+          </w:tcPr>
+          <w:p>
+            <w:pPr>
+              <w:rPr>
+                <w:rFonts w:ascii="Consolas" w:hAnsi="Consolas" w:cs="Consolas"/>
+                <w:color w:val="000000"/>
+                <w:sz w:val="19"/>
+                <w:szCs w:val="19"/>
+                <w:lang w:val="en-US"/>
+              </w:rPr>
+            </w:pPr>
+            <w:r>
+              <w:rPr>
+                <w:rFonts w:ascii="Consolas" w:hAnsi="Consolas" w:cs="Consolas"/>
+                <w:color w:val="000000"/>
+                <w:sz w:val="19"/>
+                <w:szCs w:val="19"/>
+                <w:lang w:val="en-US"/>
+              </w:rPr>
+              <w:t>Standard T-</w:t>
+            </w:r>
+            <w:proofErr w:type="spellStart"/>
+            <w:r>
+              <w:rPr>
+                <w:rFonts w:ascii="Consolas" w:hAnsi="Consolas" w:cs="Consolas"/>
+                <w:color w:val="000000"/>
+                <w:sz w:val="19"/>
+                <w:szCs w:val="19"/>
+                <w:lang w:val="en-US"/>
+              </w:rPr>
+              <w:t>Sql</w:t>
+            </w:r>
+            <w:proofErr w:type="spellEnd"/>
+            <w:r>
+              <w:rPr>
+                <w:rFonts w:ascii="Consolas" w:hAnsi="Consolas" w:cs="Consolas"/>
+                <w:color w:val="000000"/>
+                <w:sz w:val="19"/>
+                <w:szCs w:val="19"/>
+                <w:lang w:val="en-US"/>
+              </w:rPr>
+              <w:t xml:space="preserve"> </w:t>
+            </w:r>
+            <w:r>
+              <w:rPr>
+                <w:rFonts w:ascii="Consolas" w:hAnsi="Consolas" w:cs="Consolas"/>
+                <w:color w:val="000000"/>
+                <w:sz w:val="19"/>
+                <w:szCs w:val="19"/>
+                <w:lang w:val="en-US"/>
+              </w:rPr>
+              <w:t xml:space="preserve">parameter </w:t>
+            </w:r>
+            <w:r>
+              <w:rPr>
+                <w:rFonts w:ascii="Consolas" w:hAnsi="Consolas" w:cs="Consolas"/>
+                <w:color w:val="000000"/>
+                <w:sz w:val="19"/>
+                <w:szCs w:val="19"/>
+                <w:lang w:val="en-US"/>
+              </w:rPr>
+              <w:t>declaration.</w:t>
+            </w:r>
+          </w:p>
+          <w:p>
+            <w:pPr>
+              <w:rPr>
+                <w:rFonts w:ascii="Consolas" w:hAnsi="Consolas" w:cs="Consolas"/>
+                <w:color w:val="000000"/>
+                <w:sz w:val="19"/>
+                <w:szCs w:val="19"/>
+                <w:lang w:val="en-US"/>
+              </w:rPr>
+            </w:pPr>
+            <w:bookmarkStart w:id="0" w:name="_GoBack"/>
+            <w:bookmarkEnd w:id="0"/>
+            <w:r>
+              <w:rPr>
+                <w:rFonts w:ascii="Consolas" w:hAnsi="Consolas" w:cs="Consolas"/>
+                <w:color w:val="000000"/>
+                <w:sz w:val="19"/>
+                <w:szCs w:val="19"/>
+                <w:lang w:val="en-US"/>
+              </w:rPr>
+              <w:t>Options like default value, output keywords, etc. are supported.</w:t>
+            </w:r>
+          </w:p>
+        </w:tc>
+      </w:tr>
+      <w:tr>
+        <w:tc>
+          <w:tcPr>
+            <w:tcW w:w="2263" w:type="dxa"/>
+          </w:tcPr>
+          <w:p>
+            <w:pPr>
+              <w:rPr>
+                <w:rFonts w:ascii="Consolas" w:hAnsi="Consolas" w:cs="Consolas"/>
+                <w:strike/>
+                <w:color w:val="000000"/>
+                <w:sz w:val="19"/>
+                <w:szCs w:val="19"/>
+                <w:highlight w:val="white"/>
+                <w:lang w:val="en-US"/>
+              </w:rPr>
+            </w:pPr>
+            <w:r>
+              <w:rPr>
+                <w:rFonts w:ascii="Consolas" w:hAnsi="Consolas" w:cs="Consolas"/>
+                <w:strike/>
+                <w:color w:val="000000"/>
+                <w:sz w:val="19"/>
+                <w:szCs w:val="19"/>
+                <w:highlight w:val="white"/>
+                <w:lang w:val="en-US"/>
+              </w:rPr>
+              <w:t>Replacer</w:t>
+            </w:r>
+          </w:p>
+        </w:tc>
+        <w:tc>
+          <w:tcPr>
+            <w:tcW w:w="6753" w:type="dxa"/>
+          </w:tcPr>
+          <w:p>
+            <w:pPr>
+              <w:rPr>
+                <w:rFonts w:ascii="Consolas" w:hAnsi="Consolas" w:cs="Consolas"/>
+                <w:strike/>
+                <w:color w:val="000000"/>
+                <w:sz w:val="19"/>
+                <w:szCs w:val="19"/>
+                <w:lang w:val="en-US"/>
+              </w:rPr>
+            </w:pPr>
+            <w:r>
+              <w:rPr>
+                <w:rFonts w:ascii="Consolas" w:hAnsi="Consolas" w:cs="Consolas"/>
+                <w:strike/>
+                <w:color w:val="000000"/>
+                <w:sz w:val="19"/>
+                <w:szCs w:val="19"/>
+                <w:lang w:val="en-US"/>
+              </w:rPr>
+              <w:t xml:space="preserve">replace </w:t>
+            </w:r>
+            <w:proofErr w:type="spellStart"/>
+            <w:r>
+              <w:rPr>
+                <w:rFonts w:ascii="Consolas" w:hAnsi="Consolas" w:cs="Consolas"/>
+                <w:strike/>
+                <w:color w:val="000000"/>
+                <w:sz w:val="19"/>
+                <w:szCs w:val="19"/>
+                <w:highlight w:val="white"/>
+                <w:lang w:val="en-US"/>
+              </w:rPr>
+              <w:t>Location</w:t>
+            </w:r>
+            <w:r>
+              <w:rPr>
+                <w:rFonts w:ascii="Consolas" w:hAnsi="Consolas" w:cs="Consolas"/>
+                <w:strike/>
+                <w:color w:val="000000"/>
+                <w:sz w:val="19"/>
+                <w:szCs w:val="19"/>
+                <w:lang w:val="en-US"/>
+              </w:rPr>
+              <w:t>Finder</w:t>
+            </w:r>
+            <w:proofErr w:type="spellEnd"/>
+            <w:r>
+              <w:rPr>
+                <w:rFonts w:ascii="Consolas" w:hAnsi="Consolas" w:cs="Consolas"/>
+                <w:strike/>
+                <w:color w:val="000000"/>
+                <w:sz w:val="19"/>
+                <w:szCs w:val="19"/>
+                <w:lang w:val="en-US"/>
+              </w:rPr>
+              <w:t xml:space="preserve"> with </w:t>
+            </w:r>
+            <w:proofErr w:type="spellStart"/>
+            <w:r>
+              <w:rPr>
+                <w:rFonts w:ascii="Consolas" w:hAnsi="Consolas" w:cs="Consolas"/>
+                <w:strike/>
+                <w:color w:val="000000"/>
+                <w:sz w:val="19"/>
+                <w:szCs w:val="19"/>
                 <w:lang w:val="en-US"/>
               </w:rPr>
               <w:t>LiteralString</w:t>
-            </w:r>
-            <w:proofErr w:type="spellEnd"/>
-            <w:r>
-              <w:rPr>
-                <w:rFonts w:ascii="Consolas" w:hAnsi="Consolas" w:cs="Consolas"/>
-                <w:color w:val="000000"/>
-                <w:sz w:val="19"/>
-                <w:szCs w:val="19"/>
-                <w:lang w:val="en-US"/>
-              </w:rPr>
-              <w:t xml:space="preserve"> ((and </w:t>
-            </w:r>
-            <w:proofErr w:type="spellStart"/>
-            <w:r>
-              <w:rPr>
-                <w:rFonts w:ascii="Consolas" w:hAnsi="Consolas" w:cs="Consolas"/>
-                <w:color w:val="000000"/>
-                <w:sz w:val="19"/>
-                <w:szCs w:val="19"/>
-                <w:lang w:val="en-US"/>
-              </w:rPr>
-              <w:t>LiteralString</w:t>
-            </w:r>
-            <w:proofErr w:type="spellEnd"/>
-            <w:r>
-              <w:rPr>
-                <w:rFonts w:ascii="Consolas" w:hAnsi="Consolas" w:cs="Consolas"/>
-                <w:color w:val="000000"/>
-                <w:sz w:val="19"/>
-                <w:szCs w:val="19"/>
-                <w:lang w:val="en-US"/>
-              </w:rPr>
-              <w:t xml:space="preserve"> </w:t>
-            </w:r>
-            <w:r>
-              <w:rPr>
-                <w:rFonts w:ascii="Consolas" w:hAnsi="Consolas" w:cs="Consolas"/>
-                <w:color w:val="000000"/>
-                <w:sz w:val="19"/>
-                <w:szCs w:val="19"/>
-                <w:lang w:val="en-US"/>
-              </w:rPr>
-              <w:t xml:space="preserve">around) | (before | after) </w:t>
-            </w:r>
-            <w:proofErr w:type="spellStart"/>
-            <w:r>
-              <w:rPr>
-                <w:rFonts w:ascii="Consolas" w:hAnsi="Consolas" w:cs="Consolas"/>
-                <w:color w:val="000000"/>
-                <w:sz w:val="19"/>
-                <w:szCs w:val="19"/>
-                <w:highlight w:val="white"/>
-                <w:lang w:val="en-US"/>
-              </w:rPr>
-              <w:t>Location</w:t>
-            </w:r>
-            <w:r>
-              <w:rPr>
-                <w:rFonts w:ascii="Consolas" w:hAnsi="Consolas" w:cs="Consolas"/>
-                <w:color w:val="000000"/>
-                <w:sz w:val="19"/>
-                <w:szCs w:val="19"/>
-                <w:lang w:val="en-US"/>
-              </w:rPr>
-              <w:t>Finder</w:t>
             </w:r>
             <w:proofErr w:type="spellEnd"/>
           </w:p>
@@ -1306,6 +1555,152 @@
                 <w:color w:val="000000"/>
                 <w:sz w:val="19"/>
                 <w:szCs w:val="19"/>
+                <w:highlight w:val="white"/>
+                <w:lang w:val="en-US"/>
+              </w:rPr>
+            </w:pPr>
+            <w:proofErr w:type="spellStart"/>
+            <w:r>
+              <w:rPr>
+                <w:rFonts w:ascii="Consolas" w:hAnsi="Consolas" w:cs="Consolas"/>
+                <w:color w:val="000000"/>
+                <w:sz w:val="19"/>
+                <w:szCs w:val="19"/>
+                <w:highlight w:val="white"/>
+                <w:lang w:val="en-US"/>
+              </w:rPr>
+              <w:t>Inject</w:t>
+            </w:r>
+            <w:r>
+              <w:rPr>
+                <w:rFonts w:ascii="Consolas" w:hAnsi="Consolas" w:cs="Consolas"/>
+                <w:color w:val="000000"/>
+                <w:sz w:val="19"/>
+                <w:szCs w:val="19"/>
+                <w:highlight w:val="white"/>
+                <w:lang w:val="en-US"/>
+              </w:rPr>
+              <w:t>er</w:t>
+            </w:r>
+            <w:proofErr w:type="spellEnd"/>
+          </w:p>
+        </w:tc>
+        <w:tc>
+          <w:tcPr>
+            <w:tcW w:w="6753" w:type="dxa"/>
+          </w:tcPr>
+          <w:p>
+            <w:pPr>
+              <w:rPr>
+                <w:rFonts w:ascii="Consolas" w:hAnsi="Consolas" w:cs="Consolas"/>
+                <w:color w:val="000000"/>
+                <w:sz w:val="19"/>
+                <w:szCs w:val="19"/>
+                <w:lang w:val="en-US"/>
+              </w:rPr>
+            </w:pPr>
+            <w:r>
+              <w:rPr>
+                <w:rFonts w:ascii="Consolas" w:hAnsi="Consolas" w:cs="Consolas"/>
+                <w:color w:val="000000"/>
+                <w:sz w:val="19"/>
+                <w:szCs w:val="19"/>
+                <w:lang w:val="en-US"/>
+              </w:rPr>
+              <w:t xml:space="preserve">inject </w:t>
+            </w:r>
+            <w:proofErr w:type="spellStart"/>
+            <w:r>
+              <w:rPr>
+                <w:rFonts w:ascii="Consolas" w:hAnsi="Consolas" w:cs="Consolas"/>
+                <w:color w:val="000000"/>
+                <w:sz w:val="19"/>
+                <w:szCs w:val="19"/>
+                <w:lang w:val="en-US"/>
+              </w:rPr>
+              <w:t>LiteralString</w:t>
+            </w:r>
+            <w:proofErr w:type="spellEnd"/>
+            <w:r>
+              <w:rPr>
+                <w:rFonts w:ascii="Consolas" w:hAnsi="Consolas" w:cs="Consolas"/>
+                <w:color w:val="000000"/>
+                <w:sz w:val="19"/>
+                <w:szCs w:val="19"/>
+                <w:lang w:val="en-US"/>
+              </w:rPr>
+              <w:t xml:space="preserve"> ((and </w:t>
+            </w:r>
+            <w:proofErr w:type="spellStart"/>
+            <w:r>
+              <w:rPr>
+                <w:rFonts w:ascii="Consolas" w:hAnsi="Consolas" w:cs="Consolas"/>
+                <w:color w:val="000000"/>
+                <w:sz w:val="19"/>
+                <w:szCs w:val="19"/>
+                <w:lang w:val="en-US"/>
+              </w:rPr>
+              <w:t>LiteralString</w:t>
+            </w:r>
+            <w:proofErr w:type="spellEnd"/>
+            <w:r>
+              <w:rPr>
+                <w:rFonts w:ascii="Consolas" w:hAnsi="Consolas" w:cs="Consolas"/>
+                <w:color w:val="000000"/>
+                <w:sz w:val="19"/>
+                <w:szCs w:val="19"/>
+                <w:lang w:val="en-US"/>
+              </w:rPr>
+              <w:t xml:space="preserve"> </w:t>
+            </w:r>
+            <w:r>
+              <w:rPr>
+                <w:rFonts w:ascii="Consolas" w:hAnsi="Consolas" w:cs="Consolas"/>
+                <w:color w:val="000000"/>
+                <w:sz w:val="19"/>
+                <w:szCs w:val="19"/>
+                <w:lang w:val="en-US"/>
+              </w:rPr>
+              <w:t xml:space="preserve">around) | (before | after) </w:t>
+            </w:r>
+            <w:proofErr w:type="spellStart"/>
+            <w:r>
+              <w:rPr>
+                <w:rFonts w:ascii="Consolas" w:hAnsi="Consolas" w:cs="Consolas"/>
+                <w:color w:val="000000"/>
+                <w:sz w:val="19"/>
+                <w:szCs w:val="19"/>
+                <w:highlight w:val="white"/>
+                <w:lang w:val="en-US"/>
+              </w:rPr>
+              <w:t>Location</w:t>
+            </w:r>
+            <w:r>
+              <w:rPr>
+                <w:rFonts w:ascii="Consolas" w:hAnsi="Consolas" w:cs="Consolas"/>
+                <w:color w:val="000000"/>
+                <w:sz w:val="19"/>
+                <w:szCs w:val="19"/>
+                <w:lang w:val="en-US"/>
+              </w:rPr>
+              <w:t>Finder</w:t>
+            </w:r>
+            <w:proofErr w:type="spellEnd"/>
+          </w:p>
+        </w:tc>
+      </w:tr>
+      <w:tr>
+        <w:tc>
+          <w:tcPr>
+            <w:tcW w:w="2263" w:type="dxa"/>
+          </w:tcPr>
+          <w:p>
+            <w:pPr>
+              <w:rPr>
+                <w:rFonts w:ascii="Consolas" w:hAnsi="Consolas" w:cs="Consolas"/>
+                <w:color w:val="000000"/>
+                <w:sz w:val="19"/>
+                <w:szCs w:val="19"/>
                 <w:lang w:val="en-US"/>
               </w:rPr>
             </w:pPr>
@@ -1848,9 +2243,10 @@
                 <w:color w:val="000000"/>
                 <w:sz w:val="19"/>
                 <w:szCs w:val="19"/>
-                <w:lang w:val="en-US"/>
-              </w:rPr>
-              <w:t>statement|part</w:t>
+                <w:u w:val="double"/>
+                <w:lang w:val="en-US"/>
+              </w:rPr>
+              <w:t>part</w:t>
             </w:r>
             <w:r>
               <w:rPr>
@@ -1870,7 +2266,7 @@
                 <w:szCs w:val="19"/>
                 <w:lang w:val="en-US"/>
               </w:rPr>
-              <w:t>range</w:t>
+              <w:t>statement|range</w:t>
             </w:r>
             <w:proofErr w:type="spellEnd"/>
             <w:r>
@@ -1986,47 +2382,6 @@
           <w:lang w:val="en-US"/>
         </w:rPr>
       </w:pPr>
-      <w:bookmarkStart w:id="0" w:name="_GoBack"/>
-      <w:bookmarkEnd w:id="0"/>
-    </w:p>
-    <w:p>
-      <w:pPr>
-        <w:rPr>
-          <w:lang w:val="en-US"/>
-        </w:rPr>
-      </w:pPr>
-      <w:r>
-        <w:rPr>
-          <w:lang w:val="en-US"/>
-        </w:rPr>
-        <w:t>Inject {A} and {B} around</w:t>
-      </w:r>
-    </w:p>
-    <w:p>
-      <w:pPr>
-        <w:rPr>
-          <w:lang w:val="en-US"/>
-        </w:rPr>
-      </w:pPr>
-      <w:r>
-        <w:rPr>
-          <w:lang w:val="en-US"/>
-        </w:rPr>
-        <w:t>Inject {A} after</w:t>
-      </w:r>
-    </w:p>
-    <w:p>
-      <w:pPr>
-        <w:rPr>
-          <w:lang w:val="en-US"/>
-        </w:rPr>
-      </w:pPr>
-      <w:r>
-        <w:rPr>
-          <w:lang w:val="en-US"/>
-        </w:rPr>
-        <w:t>Inject {A} before</w:t>
-      </w:r>
     </w:p>
     <w:p>
       <w:pPr>

</xml_diff>

<commit_message>
Huge commit!! New Replace With support.
Lot of things works but range {and T = 4) fails...
</commit_message>
<xml_diff>
--- a/CK.SqlServer.Transform/Data Definition Manipulation Language.docx
+++ b/CK.SqlServer.Transform/Data Definition Manipulation Language.docx
@@ -1419,8 +1419,6 @@
                 <w:lang w:val="en-US"/>
               </w:rPr>
             </w:pPr>
-            <w:bookmarkStart w:id="0" w:name="_GoBack"/>
-            <w:bookmarkEnd w:id="0"/>
             <w:r>
               <w:rPr>
                 <w:rFonts w:ascii="Consolas" w:hAnsi="Consolas" w:cs="Consolas"/>
@@ -1443,8 +1441,7 @@
             <w:pPr>
               <w:rPr>
                 <w:rFonts w:ascii="Consolas" w:hAnsi="Consolas" w:cs="Consolas"/>
-                <w:strike/>
-                <w:color w:val="000000"/>
+                <w:color w:val="FF0000"/>
                 <w:sz w:val="19"/>
                 <w:szCs w:val="19"/>
                 <w:highlight w:val="white"/>
@@ -1454,8 +1451,7 @@
             <w:r>
               <w:rPr>
                 <w:rFonts w:ascii="Consolas" w:hAnsi="Consolas" w:cs="Consolas"/>
-                <w:strike/>
-                <w:color w:val="000000"/>
+                <w:color w:val="FF0000"/>
                 <w:sz w:val="19"/>
                 <w:szCs w:val="19"/>
                 <w:highlight w:val="white"/>
@@ -1473,8 +1469,7 @@
             <w:pPr>
               <w:rPr>
                 <w:rFonts w:ascii="Consolas" w:hAnsi="Consolas" w:cs="Consolas"/>
-                <w:strike/>
-                <w:color w:val="000000"/>
+                <w:color w:val="FF0000"/>
                 <w:sz w:val="19"/>
                 <w:szCs w:val="19"/>
                 <w:lang w:val="en-US"/>
@@ -1483,8 +1478,7 @@
             <w:r>
               <w:rPr>
                 <w:rFonts w:ascii="Consolas" w:hAnsi="Consolas" w:cs="Consolas"/>
-                <w:strike/>
-                <w:color w:val="000000"/>
+                <w:color w:val="FF0000"/>
                 <w:sz w:val="19"/>
                 <w:szCs w:val="19"/>
                 <w:lang w:val="en-US"/>
@@ -1495,8 +1489,7 @@
             <w:r>
               <w:rPr>
                 <w:rFonts w:ascii="Consolas" w:hAnsi="Consolas" w:cs="Consolas"/>
-                <w:strike/>
-                <w:color w:val="000000"/>
+                <w:color w:val="FF0000"/>
                 <w:sz w:val="19"/>
                 <w:szCs w:val="19"/>
                 <w:highlight w:val="white"/>
@@ -1507,8 +1500,7 @@
             <w:r>
               <w:rPr>
                 <w:rFonts w:ascii="Consolas" w:hAnsi="Consolas" w:cs="Consolas"/>
-                <w:strike/>
-                <w:color w:val="000000"/>
+                <w:color w:val="FF0000"/>
                 <w:sz w:val="19"/>
                 <w:szCs w:val="19"/>
                 <w:lang w:val="en-US"/>
@@ -1519,8 +1511,7 @@
             <w:r>
               <w:rPr>
                 <w:rFonts w:ascii="Consolas" w:hAnsi="Consolas" w:cs="Consolas"/>
-                <w:strike/>
-                <w:color w:val="000000"/>
+                <w:color w:val="FF0000"/>
                 <w:sz w:val="19"/>
                 <w:szCs w:val="19"/>
                 <w:lang w:val="en-US"/>
@@ -1531,8 +1522,7 @@
             <w:r>
               <w:rPr>
                 <w:rFonts w:ascii="Consolas" w:hAnsi="Consolas" w:cs="Consolas"/>
-                <w:strike/>
-                <w:color w:val="000000"/>
+                <w:color w:val="FF0000"/>
                 <w:sz w:val="19"/>
                 <w:szCs w:val="19"/>
                 <w:lang w:val="en-US"/>
@@ -2223,7 +2213,6 @@
                 <w:color w:val="000000"/>
                 <w:sz w:val="19"/>
                 <w:szCs w:val="19"/>
-                <w:lang w:val="en-US"/>
               </w:rPr>
             </w:pPr>
             <w:r>
@@ -2232,11 +2221,11 @@
                 <w:color w:val="000000"/>
                 <w:sz w:val="19"/>
                 <w:szCs w:val="19"/>
-                <w:lang w:val="en-US"/>
               </w:rPr>
               <w:t>[</w:t>
             </w:r>
             <w:proofErr w:type="spellStart"/>
+            <w:proofErr w:type="gramStart"/>
             <w:r>
               <w:rPr>
                 <w:rFonts w:ascii="Consolas" w:hAnsi="Consolas" w:cs="Consolas"/>
@@ -2244,17 +2233,16 @@
                 <w:sz w:val="19"/>
                 <w:szCs w:val="19"/>
                 <w:u w:val="double"/>
-                <w:lang w:val="en-US"/>
               </w:rPr>
               <w:t>part</w:t>
             </w:r>
-            <w:r>
-              <w:rPr>
-                <w:rFonts w:ascii="Consolas" w:hAnsi="Consolas" w:cs="Consolas"/>
-                <w:color w:val="000000"/>
-                <w:sz w:val="19"/>
-                <w:szCs w:val="19"/>
-                <w:lang w:val="en-US"/>
+            <w:proofErr w:type="gramEnd"/>
+            <w:r>
+              <w:rPr>
+                <w:rFonts w:ascii="Consolas" w:hAnsi="Consolas" w:cs="Consolas"/>
+                <w:color w:val="000000"/>
+                <w:sz w:val="19"/>
+                <w:szCs w:val="19"/>
               </w:rPr>
               <w:t>|</w:t>
             </w:r>
@@ -2264,7 +2252,6 @@
                 <w:color w:val="000000"/>
                 <w:sz w:val="19"/>
                 <w:szCs w:val="19"/>
-                <w:lang w:val="en-US"/>
               </w:rPr>
               <w:t>statement|range</w:t>
             </w:r>
@@ -2275,7 +2262,6 @@
                 <w:color w:val="000000"/>
                 <w:sz w:val="19"/>
                 <w:szCs w:val="19"/>
-                <w:lang w:val="en-US"/>
               </w:rPr>
               <w:t xml:space="preserve">] </w:t>
             </w:r>
@@ -2286,11 +2272,47 @@
                 <w:color w:val="000000"/>
                 <w:sz w:val="19"/>
                 <w:szCs w:val="19"/>
-                <w:lang w:val="en-US"/>
               </w:rPr>
               <w:t>CurlyBracePattern</w:t>
             </w:r>
             <w:proofErr w:type="spellEnd"/>
+          </w:p>
+          <w:p>
+            <w:pPr>
+              <w:rPr>
+                <w:rFonts w:ascii="Consolas" w:hAnsi="Consolas" w:cs="Consolas"/>
+                <w:color w:val="000000"/>
+                <w:sz w:val="19"/>
+                <w:szCs w:val="19"/>
+              </w:rPr>
+            </w:pPr>
+            <w:r>
+              <w:rPr>
+                <w:rFonts w:ascii="Consolas" w:hAnsi="Consolas" w:cs="Consolas"/>
+                <w:color w:val="000000"/>
+                <w:sz w:val="19"/>
+                <w:szCs w:val="19"/>
+              </w:rPr>
+              <w:t>Defaults to p</w:t>
+            </w:r>
+            <w:r>
+              <w:rPr>
+                <w:rFonts w:ascii="Consolas" w:hAnsi="Consolas" w:cs="Consolas"/>
+                <w:color w:val="000000"/>
+                <w:sz w:val="19"/>
+                <w:szCs w:val="19"/>
+              </w:rPr>
+              <w:t>ar</w:t>
+            </w:r>
+            <w:r>
+              <w:rPr>
+                <w:rFonts w:ascii="Consolas" w:hAnsi="Consolas" w:cs="Consolas"/>
+                <w:color w:val="000000"/>
+                <w:sz w:val="19"/>
+                <w:szCs w:val="19"/>
+              </w:rPr>
+              <w:t>t.</w:t>
+            </w:r>
           </w:p>
         </w:tc>
       </w:tr>
@@ -2371,6 +2393,170 @@
           </w:p>
         </w:tc>
       </w:tr>
+      <w:tr>
+        <w:tc>
+          <w:tcPr>
+            <w:tcW w:w="2263" w:type="dxa"/>
+          </w:tcPr>
+          <w:p>
+            <w:pPr>
+              <w:rPr>
+                <w:rFonts w:ascii="Consolas" w:hAnsi="Consolas" w:cs="Consolas"/>
+                <w:color w:val="000000"/>
+                <w:sz w:val="19"/>
+                <w:szCs w:val="19"/>
+                <w:lang w:val="en-US"/>
+              </w:rPr>
+            </w:pPr>
+          </w:p>
+        </w:tc>
+        <w:tc>
+          <w:tcPr>
+            <w:tcW w:w="6753" w:type="dxa"/>
+          </w:tcPr>
+          <w:p>
+            <w:pPr>
+              <w:rPr>
+                <w:rFonts w:ascii="Consolas" w:hAnsi="Consolas" w:cs="Consolas"/>
+                <w:color w:val="000000"/>
+                <w:sz w:val="19"/>
+                <w:szCs w:val="19"/>
+                <w:lang w:val="en-US"/>
+              </w:rPr>
+            </w:pPr>
+            <w:proofErr w:type="spellStart"/>
+            <w:r>
+              <w:rPr>
+                <w:rFonts w:ascii="Consolas" w:hAnsi="Consolas" w:cs="Consolas"/>
+                <w:color w:val="000000"/>
+                <w:sz w:val="19"/>
+                <w:szCs w:val="19"/>
+                <w:highlight w:val="white"/>
+                <w:lang w:val="en-US"/>
+              </w:rPr>
+              <w:t>Location</w:t>
+            </w:r>
+            <w:r>
+              <w:rPr>
+                <w:rFonts w:ascii="Consolas" w:hAnsi="Consolas" w:cs="Consolas"/>
+                <w:color w:val="000000"/>
+                <w:sz w:val="19"/>
+                <w:szCs w:val="19"/>
+                <w:lang w:val="en-US"/>
+              </w:rPr>
+              <w:t>Finder</w:t>
+            </w:r>
+            <w:proofErr w:type="spellEnd"/>
+            <w:r>
+              <w:rPr>
+                <w:rFonts w:ascii="Consolas" w:hAnsi="Consolas" w:cs="Consolas"/>
+                <w:color w:val="000000"/>
+                <w:sz w:val="19"/>
+                <w:szCs w:val="19"/>
+                <w:lang w:val="en-US"/>
+              </w:rPr>
+              <w:t xml:space="preserve"> </w:t>
+            </w:r>
+            <w:r>
+              <w:rPr>
+                <w:rFonts w:ascii="Consolas" w:hAnsi="Consolas" w:cs="Consolas"/>
+                <w:color w:val="000000"/>
+                <w:sz w:val="19"/>
+                <w:szCs w:val="19"/>
+                <w:lang w:val="en-US"/>
+              </w:rPr>
+              <w:t>(&gt;</w:t>
+            </w:r>
+            <w:r>
+              <w:rPr>
+                <w:rFonts w:ascii="Consolas" w:hAnsi="Consolas" w:cs="Consolas"/>
+                <w:color w:val="000000"/>
+                <w:sz w:val="19"/>
+                <w:szCs w:val="19"/>
+                <w:lang w:val="en-US"/>
+              </w:rPr>
+              <w:t xml:space="preserve"> </w:t>
+            </w:r>
+            <w:proofErr w:type="spellStart"/>
+            <w:proofErr w:type="gramStart"/>
+            <w:r>
+              <w:rPr>
+                <w:rFonts w:ascii="Consolas" w:hAnsi="Consolas" w:cs="Consolas"/>
+                <w:color w:val="000000"/>
+                <w:sz w:val="19"/>
+                <w:szCs w:val="19"/>
+                <w:highlight w:val="white"/>
+                <w:lang w:val="en-US"/>
+              </w:rPr>
+              <w:t>Location</w:t>
+            </w:r>
+            <w:r>
+              <w:rPr>
+                <w:rFonts w:ascii="Consolas" w:hAnsi="Consolas" w:cs="Consolas"/>
+                <w:color w:val="000000"/>
+                <w:sz w:val="19"/>
+                <w:szCs w:val="19"/>
+                <w:lang w:val="en-US"/>
+              </w:rPr>
+              <w:t>Finder</w:t>
+            </w:r>
+            <w:proofErr w:type="spellEnd"/>
+            <w:r>
+              <w:rPr>
+                <w:rFonts w:ascii="Consolas" w:hAnsi="Consolas" w:cs="Consolas"/>
+                <w:color w:val="000000"/>
+                <w:sz w:val="19"/>
+                <w:szCs w:val="19"/>
+                <w:lang w:val="en-US"/>
+              </w:rPr>
+              <w:t>)*</w:t>
+            </w:r>
+            <w:proofErr w:type="gramEnd"/>
+            <w:r>
+              <w:rPr>
+                <w:rFonts w:ascii="Consolas" w:hAnsi="Consolas" w:cs="Consolas"/>
+                <w:color w:val="000000"/>
+                <w:sz w:val="19"/>
+                <w:szCs w:val="19"/>
+                <w:lang w:val="en-US"/>
+              </w:rPr>
+              <w:t xml:space="preserve"> (&lt;</w:t>
+            </w:r>
+            <w:r>
+              <w:rPr>
+                <w:rFonts w:ascii="Consolas" w:hAnsi="Consolas" w:cs="Consolas"/>
+                <w:color w:val="000000"/>
+                <w:sz w:val="19"/>
+                <w:szCs w:val="19"/>
+                <w:lang w:val="en-US"/>
+              </w:rPr>
+              <w:t xml:space="preserve"> </w:t>
+            </w:r>
+            <w:proofErr w:type="spellStart"/>
+            <w:r>
+              <w:rPr>
+                <w:rFonts w:ascii="Consolas" w:hAnsi="Consolas" w:cs="Consolas"/>
+                <w:color w:val="000000"/>
+                <w:sz w:val="19"/>
+                <w:szCs w:val="19"/>
+                <w:lang w:val="en-US"/>
+              </w:rPr>
+              <w:t>NodeSimplePattern</w:t>
+            </w:r>
+            <w:proofErr w:type="spellEnd"/>
+            <w:r>
+              <w:rPr>
+                <w:rFonts w:ascii="Consolas" w:hAnsi="Consolas" w:cs="Consolas"/>
+                <w:color w:val="000000"/>
+                <w:sz w:val="19"/>
+                <w:szCs w:val="19"/>
+                <w:lang w:val="en-US"/>
+              </w:rPr>
+              <w:t>)*</w:t>
+            </w:r>
+          </w:p>
+        </w:tc>
+      </w:tr>
     </w:tbl>
     <w:p>
       <w:pPr>
@@ -2382,13 +2568,21 @@
           <w:lang w:val="en-US"/>
         </w:rPr>
       </w:pPr>
-    </w:p>
-    <w:p>
-      <w:pPr>
-        <w:rPr>
-          <w:lang w:val="en-US"/>
-        </w:rPr>
-      </w:pPr>
+      <w:bookmarkStart w:id="0" w:name="_GoBack"/>
+      <w:bookmarkEnd w:id="0"/>
+    </w:p>
+    <w:p>
+      <w:pPr>
+        <w:rPr>
+          <w:lang w:val="en-US"/>
+        </w:rPr>
+      </w:pPr>
+      <w:r>
+        <w:rPr>
+          <w:lang w:val="en-US"/>
+        </w:rPr>
+        <w:t xml:space="preserve">Optional scope prefix. </w:t>
+      </w:r>
     </w:p>
     <w:p>
       <w:pPr>

</xml_diff>

<commit_message>
Add column, scope (with simple SqlTLocationFinder) works.
WIP: New inject "" into fragmrntName.
</commit_message>
<xml_diff>
--- a/CK.SqlServer.Transform/Data Definition Manipulation Language.docx
+++ b/CK.SqlServer.Transform/Data Definition Manipulation Language.docx
@@ -1107,8 +1107,6 @@
           <w:lang w:val="en-US"/>
         </w:rPr>
       </w:pPr>
-      <w:bookmarkStart w:id="0" w:name="_GoBack"/>
-      <w:bookmarkEnd w:id="0"/>
     </w:p>
     <w:p>
       <w:pPr>
@@ -2445,331 +2443,53 @@
                 <w:szCs w:val="19"/>
                 <w:lang w:val="en-US"/>
               </w:rPr>
-              <w:t>Supported wildcards are:</w:t>
+              <w:t>Only supported wildcard</w:t>
+            </w:r>
+            <w:r>
+              <w:rPr>
+                <w:rFonts w:ascii="Consolas" w:hAnsi="Consolas" w:cs="Consolas"/>
+                <w:color w:val="000000"/>
+                <w:sz w:val="19"/>
+                <w:szCs w:val="19"/>
+                <w:lang w:val="en-US"/>
+              </w:rPr>
+              <w:t xml:space="preserve"> </w:t>
+            </w:r>
+            <w:proofErr w:type="gramStart"/>
+            <w:r>
+              <w:rPr>
+                <w:rFonts w:ascii="Consolas" w:hAnsi="Consolas" w:cs="Consolas"/>
+                <w:color w:val="000000"/>
+                <w:sz w:val="19"/>
+                <w:szCs w:val="19"/>
+                <w:lang w:val="en-US"/>
+              </w:rPr>
+              <w:t>is ?</w:t>
+            </w:r>
+            <w:proofErr w:type="gramEnd"/>
+            <w:r>
+              <w:rPr>
+                <w:rFonts w:ascii="Consolas" w:hAnsi="Consolas" w:cs="Consolas"/>
+                <w:color w:val="000000"/>
+                <w:sz w:val="19"/>
+                <w:szCs w:val="19"/>
+                <w:lang w:val="en-US"/>
+              </w:rPr>
+              <w:t xml:space="preserve"> that replaces any </w:t>
+            </w:r>
+            <w:bookmarkStart w:id="0" w:name="_GoBack"/>
+            <w:bookmarkEnd w:id="0"/>
+            <w:r>
+              <w:rPr>
+                <w:rFonts w:ascii="Consolas" w:hAnsi="Consolas" w:cs="Consolas"/>
+                <w:color w:val="000000"/>
+                <w:sz w:val="19"/>
+                <w:szCs w:val="19"/>
+                <w:lang w:val="en-US"/>
+              </w:rPr>
+              <w:t>one token.</w:t>
             </w:r>
           </w:p>
-          <w:p>
-            <w:pPr>
-              <w:rPr>
-                <w:rFonts w:ascii="Consolas" w:hAnsi="Consolas" w:cs="Consolas"/>
-                <w:color w:val="000000"/>
-                <w:sz w:val="19"/>
-                <w:szCs w:val="19"/>
-                <w:lang w:val="en-US"/>
-              </w:rPr>
-            </w:pPr>
-          </w:p>
-          <w:tbl>
-            <w:tblPr>
-              <w:tblStyle w:val="TableGrid"/>
-              <w:tblW w:w="0" w:type="auto"/>
-              <w:tblLook w:val="04A0" w:firstRow="1" w:lastRow="0" w:firstColumn="1" w:lastColumn="0" w:noHBand="0" w:noVBand="1"/>
-            </w:tblPr>
-            <w:tblGrid>
-              <w:gridCol w:w="843"/>
-              <w:gridCol w:w="5684"/>
-            </w:tblGrid>
-            <w:tr>
-              <w:tc>
-                <w:tcPr>
-                  <w:tcW w:w="843" w:type="dxa"/>
-                </w:tcPr>
-                <w:p>
-                  <w:pPr>
-                    <w:rPr>
-                      <w:rFonts w:ascii="Consolas" w:hAnsi="Consolas" w:cs="Consolas"/>
-                      <w:color w:val="000000"/>
-                      <w:sz w:val="19"/>
-                      <w:szCs w:val="19"/>
-                      <w:lang w:val="en-US"/>
-                    </w:rPr>
-                  </w:pPr>
-                  <w:r>
-                    <w:rPr>
-                      <w:rFonts w:ascii="Consolas" w:hAnsi="Consolas" w:cs="Consolas"/>
-                      <w:color w:val="000000"/>
-                      <w:sz w:val="19"/>
-                      <w:szCs w:val="19"/>
-                      <w:lang w:val="en-US"/>
-                    </w:rPr>
-                    <w:t>Token?</w:t>
-                  </w:r>
-                </w:p>
-              </w:tc>
-              <w:tc>
-                <w:tcPr>
-                  <w:tcW w:w="5684" w:type="dxa"/>
-                </w:tcPr>
-                <w:p>
-                  <w:pPr>
-                    <w:rPr>
-                      <w:rFonts w:ascii="Consolas" w:hAnsi="Consolas" w:cs="Consolas"/>
-                      <w:color w:val="000000"/>
-                      <w:sz w:val="19"/>
-                      <w:szCs w:val="19"/>
-                      <w:lang w:val="en-US"/>
-                    </w:rPr>
-                  </w:pPr>
-                  <w:r>
-                    <w:rPr>
-                      <w:rFonts w:ascii="Consolas" w:hAnsi="Consolas" w:cs="Consolas"/>
-                      <w:color w:val="000000"/>
-                      <w:sz w:val="19"/>
-                      <w:szCs w:val="19"/>
-                      <w:lang w:val="en-US"/>
-                    </w:rPr>
-                    <w:t>An optional token: {X =? 3} Will match “X=3” as well as “X 3”.</w:t>
-                  </w:r>
-                </w:p>
-              </w:tc>
-            </w:tr>
-            <w:tr>
-              <w:tc>
-                <w:tcPr>
-                  <w:tcW w:w="843" w:type="dxa"/>
-                </w:tcPr>
-                <w:p>
-                  <w:pPr>
-                    <w:rPr>
-                      <w:rFonts w:ascii="Consolas" w:hAnsi="Consolas" w:cs="Consolas"/>
-                      <w:color w:val="000000"/>
-                      <w:sz w:val="19"/>
-                      <w:szCs w:val="19"/>
-                      <w:lang w:val="en-US"/>
-                    </w:rPr>
-                  </w:pPr>
-                  <w:r>
-                    <w:rPr>
-                      <w:rFonts w:ascii="Consolas" w:hAnsi="Consolas" w:cs="Consolas"/>
-                      <w:color w:val="000000"/>
-                      <w:sz w:val="19"/>
-                      <w:szCs w:val="19"/>
-                      <w:lang w:val="en-US"/>
-                    </w:rPr>
-                    <w:t>?</w:t>
-                  </w:r>
-                </w:p>
-              </w:tc>
-              <w:tc>
-                <w:tcPr>
-                  <w:tcW w:w="5684" w:type="dxa"/>
-                </w:tcPr>
-                <w:p>
-                  <w:pPr>
-                    <w:rPr>
-                      <w:rFonts w:ascii="Consolas" w:hAnsi="Consolas" w:cs="Consolas"/>
-                      <w:color w:val="000000"/>
-                      <w:sz w:val="19"/>
-                      <w:szCs w:val="19"/>
-                      <w:lang w:val="en-US"/>
-                    </w:rPr>
-                  </w:pPr>
-                  <w:r>
-                    <w:rPr>
-                      <w:rFonts w:ascii="Consolas" w:hAnsi="Consolas" w:cs="Consolas"/>
-                      <w:color w:val="000000"/>
-                      <w:sz w:val="19"/>
-                      <w:szCs w:val="19"/>
-                      <w:lang w:val="en-US"/>
-                    </w:rPr>
-                    <w:t>Any one token.</w:t>
-                  </w:r>
-                </w:p>
-              </w:tc>
-            </w:tr>
-            <w:tr>
-              <w:tc>
-                <w:tcPr>
-                  <w:tcW w:w="843" w:type="dxa"/>
-                </w:tcPr>
-                <w:p>
-                  <w:pPr>
-                    <w:rPr>
-                      <w:rFonts w:ascii="Consolas" w:hAnsi="Consolas" w:cs="Consolas"/>
-                      <w:color w:val="000000"/>
-                      <w:sz w:val="19"/>
-                      <w:szCs w:val="19"/>
-                      <w:lang w:val="en-US"/>
-                    </w:rPr>
-                  </w:pPr>
-                  <w:r>
-                    <w:rPr>
-                      <w:rFonts w:ascii="Consolas" w:hAnsi="Consolas" w:cs="Consolas"/>
-                      <w:color w:val="000000"/>
-                      <w:sz w:val="19"/>
-                      <w:szCs w:val="19"/>
-                      <w:lang w:val="en-US"/>
-                    </w:rPr>
-                    <w:t>??</w:t>
-                  </w:r>
-                </w:p>
-              </w:tc>
-              <w:tc>
-                <w:tcPr>
-                  <w:tcW w:w="5684" w:type="dxa"/>
-                </w:tcPr>
-                <w:p>
-                  <w:pPr>
-                    <w:rPr>
-                      <w:rFonts w:ascii="Consolas" w:hAnsi="Consolas" w:cs="Consolas"/>
-                      <w:color w:val="000000"/>
-                      <w:sz w:val="19"/>
-                      <w:szCs w:val="19"/>
-                      <w:lang w:val="en-US"/>
-                    </w:rPr>
-                  </w:pPr>
-                  <w:r>
-                    <w:rPr>
-                      <w:rFonts w:ascii="Consolas" w:hAnsi="Consolas" w:cs="Consolas"/>
-                      <w:color w:val="000000"/>
-                      <w:sz w:val="19"/>
-                      <w:szCs w:val="19"/>
-                      <w:lang w:val="en-US"/>
-                    </w:rPr>
-                    <w:t>Any token or no token.</w:t>
-                  </w:r>
-                </w:p>
-              </w:tc>
-            </w:tr>
-            <w:tr>
-              <w:tc>
-                <w:tcPr>
-                  <w:tcW w:w="843" w:type="dxa"/>
-                </w:tcPr>
-                <w:p>
-                  <w:pPr>
-                    <w:rPr>
-                      <w:rFonts w:ascii="Consolas" w:hAnsi="Consolas" w:cs="Consolas"/>
-                      <w:color w:val="000000"/>
-                      <w:sz w:val="19"/>
-                      <w:szCs w:val="19"/>
-                      <w:lang w:val="en-US"/>
-                    </w:rPr>
-                  </w:pPr>
-                  <w:r>
-                    <w:rPr>
-                      <w:rFonts w:ascii="Consolas" w:hAnsi="Consolas" w:cs="Consolas"/>
-                      <w:color w:val="000000"/>
-                      <w:sz w:val="19"/>
-                      <w:szCs w:val="19"/>
-                      <w:lang w:val="en-US"/>
-                    </w:rPr>
-                    <w:t>???</w:t>
-                  </w:r>
-                </w:p>
-              </w:tc>
-              <w:tc>
-                <w:tcPr>
-                  <w:tcW w:w="5684" w:type="dxa"/>
-                </w:tcPr>
-                <w:p>
-                  <w:pPr>
-                    <w:rPr>
-                      <w:rFonts w:ascii="Consolas" w:hAnsi="Consolas" w:cs="Consolas"/>
-                      <w:color w:val="000000"/>
-                      <w:sz w:val="19"/>
-                      <w:szCs w:val="19"/>
-                      <w:lang w:val="en-US"/>
-                    </w:rPr>
-                  </w:pPr>
-                  <w:r>
-                    <w:rPr>
-                      <w:rFonts w:ascii="Consolas" w:hAnsi="Consolas" w:cs="Consolas"/>
-                      <w:color w:val="000000"/>
-                      <w:sz w:val="19"/>
-                      <w:szCs w:val="19"/>
-                      <w:lang w:val="en-US"/>
-                    </w:rPr>
-                    <w:t>Any number of tokens (minimal length)</w:t>
-                  </w:r>
-                </w:p>
-              </w:tc>
-            </w:tr>
-            <w:tr>
-              <w:tc>
-                <w:tcPr>
-                  <w:tcW w:w="843" w:type="dxa"/>
-                </w:tcPr>
-                <w:p>
-                  <w:pPr>
-                    <w:rPr>
-                      <w:rFonts w:ascii="Consolas" w:hAnsi="Consolas" w:cs="Consolas"/>
-                      <w:color w:val="000000"/>
-                      <w:sz w:val="19"/>
-                      <w:szCs w:val="19"/>
-                      <w:lang w:val="en-US"/>
-                    </w:rPr>
-                  </w:pPr>
-                  <w:r>
-                    <w:rPr>
-                      <w:rFonts w:ascii="Consolas" w:hAnsi="Consolas" w:cs="Consolas"/>
-                      <w:color w:val="000000"/>
-                      <w:sz w:val="19"/>
-                      <w:szCs w:val="19"/>
-                      <w:lang w:val="en-US"/>
-                    </w:rPr>
-                    <w:t>???</w:t>
-                  </w:r>
-                  <w:r>
-                    <w:rPr>
-                      <w:rFonts w:ascii="Consolas" w:hAnsi="Consolas" w:cs="Consolas"/>
-                      <w:color w:val="000000"/>
-                      <w:sz w:val="19"/>
-                      <w:szCs w:val="19"/>
-                      <w:lang w:val="en-US"/>
-                    </w:rPr>
-                    <w:t>?</w:t>
-                  </w:r>
-                </w:p>
-              </w:tc>
-              <w:tc>
-                <w:tcPr>
-                  <w:tcW w:w="5684" w:type="dxa"/>
-                </w:tcPr>
-                <w:p>
-                  <w:pPr>
-                    <w:rPr>
-                      <w:rFonts w:ascii="Consolas" w:hAnsi="Consolas" w:cs="Consolas"/>
-                      <w:color w:val="000000"/>
-                      <w:sz w:val="19"/>
-                      <w:szCs w:val="19"/>
-                      <w:lang w:val="en-US"/>
-                    </w:rPr>
-                  </w:pPr>
-                  <w:r>
-                    <w:rPr>
-                      <w:rFonts w:ascii="Consolas" w:hAnsi="Consolas" w:cs="Consolas"/>
-                      <w:color w:val="000000"/>
-                      <w:sz w:val="19"/>
-                      <w:szCs w:val="19"/>
-                      <w:lang w:val="en-US"/>
-                    </w:rPr>
-                    <w:t>Any number of tokens (</w:t>
-                  </w:r>
-                  <w:r>
-                    <w:rPr>
-                      <w:rFonts w:ascii="Consolas" w:hAnsi="Consolas" w:cs="Consolas"/>
-                      <w:color w:val="000000"/>
-                      <w:sz w:val="19"/>
-                      <w:szCs w:val="19"/>
-                      <w:lang w:val="en-US"/>
-                    </w:rPr>
-                    <w:t>maximal</w:t>
-                  </w:r>
-                  <w:r>
-                    <w:rPr>
-                      <w:rFonts w:ascii="Consolas" w:hAnsi="Consolas" w:cs="Consolas"/>
-                      <w:color w:val="000000"/>
-                      <w:sz w:val="19"/>
-                      <w:szCs w:val="19"/>
-                      <w:lang w:val="en-US"/>
-                    </w:rPr>
-                    <w:t xml:space="preserve"> length)</w:t>
-                  </w:r>
-                </w:p>
-              </w:tc>
-            </w:tr>
-          </w:tbl>
           <w:p>
             <w:pPr>
               <w:rPr>
@@ -2993,13 +2713,26 @@
     </w:p>
     <w:p>
       <w:pPr>
+        <w:rPr>
+          <w:rFonts w:ascii="Consolas" w:hAnsi="Consolas" w:cs="Consolas"/>
+          <w:color w:val="000000"/>
+          <w:sz w:val="19"/>
+          <w:szCs w:val="19"/>
+          <w:lang w:val="en-US"/>
+        </w:rPr>
+      </w:pPr>
+    </w:p>
+    <w:p>
+      <w:pPr>
         <w:pStyle w:val="Heading1"/>
         <w:rPr>
-          <w:lang w:val="en-US"/>
-        </w:rPr>
-      </w:pPr>
-      <w:r>
-        <w:rPr>
+          <w:strike/>
+          <w:lang w:val="en-US"/>
+        </w:rPr>
+      </w:pPr>
+      <w:r>
+        <w:rPr>
+          <w:strike/>
           <w:lang w:val="en-US"/>
         </w:rPr>
         <w:t>Curly Braces pattern matching</w:t>
@@ -3009,15 +2742,17 @@
       <w:pPr>
         <w:rPr>
           <w:rFonts w:ascii="Consolas" w:hAnsi="Consolas" w:cs="Consolas"/>
-          <w:color w:val="000000"/>
-          <w:sz w:val="19"/>
-          <w:szCs w:val="19"/>
-          <w:lang w:val="en-US"/>
-        </w:rPr>
-      </w:pPr>
-      <w:r>
-        <w:rPr>
-          <w:rFonts w:ascii="Consolas" w:hAnsi="Consolas" w:cs="Consolas"/>
+          <w:strike/>
+          <w:color w:val="000000"/>
+          <w:sz w:val="19"/>
+          <w:szCs w:val="19"/>
+          <w:lang w:val="en-US"/>
+        </w:rPr>
+      </w:pPr>
+      <w:r>
+        <w:rPr>
+          <w:rFonts w:ascii="Consolas" w:hAnsi="Consolas" w:cs="Consolas"/>
+          <w:strike/>
           <w:color w:val="000000"/>
           <w:sz w:val="19"/>
           <w:szCs w:val="19"/>
@@ -3028,6 +2763,7 @@
       <w:r>
         <w:rPr>
           <w:rFonts w:ascii="Consolas" w:hAnsi="Consolas" w:cs="Consolas"/>
+          <w:strike/>
           <w:color w:val="000000"/>
           <w:sz w:val="19"/>
           <w:szCs w:val="19"/>
@@ -3038,6 +2774,7 @@
       <w:r>
         <w:rPr>
           <w:rFonts w:ascii="Consolas" w:hAnsi="Consolas" w:cs="Consolas"/>
+          <w:strike/>
           <w:color w:val="000000"/>
           <w:sz w:val="19"/>
           <w:szCs w:val="19"/>
@@ -3050,51 +2787,23 @@
       <w:pPr>
         <w:rPr>
           <w:rFonts w:ascii="Consolas" w:hAnsi="Consolas" w:cs="Consolas"/>
-          <w:color w:val="000000"/>
-          <w:sz w:val="19"/>
-          <w:szCs w:val="19"/>
-          <w:lang w:val="en-US"/>
-        </w:rPr>
-      </w:pPr>
-      <w:r>
-        <w:rPr>
-          <w:rFonts w:ascii="Consolas" w:hAnsi="Consolas" w:cs="Consolas"/>
-          <w:color w:val="000000"/>
-          <w:sz w:val="19"/>
-          <w:szCs w:val="19"/>
-          <w:lang w:val="en-US"/>
-        </w:rPr>
-        <w:t>The goal is</w:t>
-      </w:r>
-      <w:r>
-        <w:rPr>
-          <w:rFonts w:ascii="Consolas" w:hAnsi="Consolas" w:cs="Consolas"/>
-          <w:color w:val="000000"/>
-          <w:sz w:val="19"/>
-          <w:szCs w:val="19"/>
-          <w:lang w:val="en-US"/>
-        </w:rPr>
-        <w:t xml:space="preserve"> </w:t>
-      </w:r>
-      <w:r>
-        <w:rPr>
-          <w:rFonts w:ascii="Consolas" w:hAnsi="Consolas" w:cs="Consolas"/>
-          <w:color w:val="000000"/>
-          <w:sz w:val="19"/>
-          <w:szCs w:val="19"/>
-          <w:lang w:val="en-US"/>
-        </w:rPr>
-        <w:t>to locate range of tokens</w:t>
-      </w:r>
-      <w:r>
-        <w:rPr>
-          <w:rFonts w:ascii="Consolas" w:hAnsi="Consolas" w:cs="Consolas"/>
-          <w:color w:val="000000"/>
-          <w:sz w:val="19"/>
-          <w:szCs w:val="19"/>
-          <w:lang w:val="en-US"/>
-        </w:rPr>
-        <w:t>:</w:t>
+          <w:strike/>
+          <w:color w:val="000000"/>
+          <w:sz w:val="19"/>
+          <w:szCs w:val="19"/>
+          <w:lang w:val="en-US"/>
+        </w:rPr>
+      </w:pPr>
+      <w:r>
+        <w:rPr>
+          <w:rFonts w:ascii="Consolas" w:hAnsi="Consolas" w:cs="Consolas"/>
+          <w:strike/>
+          <w:color w:val="000000"/>
+          <w:sz w:val="19"/>
+          <w:szCs w:val="19"/>
+          <w:lang w:val="en-US"/>
+        </w:rPr>
+        <w:t>The goal is to locate range of tokens:</w:t>
       </w:r>
     </w:p>
     <w:p>
@@ -3106,15 +2815,17 @@
         </w:numPr>
         <w:rPr>
           <w:rFonts w:ascii="Consolas" w:hAnsi="Consolas" w:cs="Consolas"/>
-          <w:color w:val="000000"/>
-          <w:sz w:val="19"/>
-          <w:szCs w:val="19"/>
-          <w:lang w:val="en-US"/>
-        </w:rPr>
-      </w:pPr>
-      <w:r>
-        <w:rPr>
-          <w:rFonts w:ascii="Consolas" w:hAnsi="Consolas" w:cs="Consolas"/>
+          <w:strike/>
+          <w:color w:val="000000"/>
+          <w:sz w:val="19"/>
+          <w:szCs w:val="19"/>
+          <w:lang w:val="en-US"/>
+        </w:rPr>
+      </w:pPr>
+      <w:r>
+        <w:rPr>
+          <w:rFonts w:ascii="Consolas" w:hAnsi="Consolas" w:cs="Consolas"/>
+          <w:strike/>
           <w:color w:val="000000"/>
           <w:sz w:val="19"/>
           <w:szCs w:val="19"/>
@@ -3132,15 +2843,17 @@
         </w:numPr>
         <w:rPr>
           <w:rFonts w:ascii="Consolas" w:hAnsi="Consolas" w:cs="Consolas"/>
-          <w:color w:val="000000"/>
-          <w:sz w:val="19"/>
-          <w:szCs w:val="19"/>
-          <w:lang w:val="en-US"/>
-        </w:rPr>
-      </w:pPr>
-      <w:r>
-        <w:rPr>
-          <w:rFonts w:ascii="Consolas" w:hAnsi="Consolas" w:cs="Consolas"/>
+          <w:strike/>
+          <w:color w:val="000000"/>
+          <w:sz w:val="19"/>
+          <w:szCs w:val="19"/>
+          <w:lang w:val="en-US"/>
+        </w:rPr>
+      </w:pPr>
+      <w:r>
+        <w:rPr>
+          <w:rFonts w:ascii="Consolas" w:hAnsi="Consolas" w:cs="Consolas"/>
+          <w:strike/>
           <w:color w:val="000000"/>
           <w:sz w:val="19"/>
           <w:szCs w:val="19"/>
@@ -3158,15 +2871,17 @@
         </w:numPr>
         <w:rPr>
           <w:rFonts w:ascii="Consolas" w:hAnsi="Consolas" w:cs="Consolas"/>
-          <w:color w:val="000000"/>
-          <w:sz w:val="19"/>
-          <w:szCs w:val="19"/>
-          <w:lang w:val="en-US"/>
-        </w:rPr>
-      </w:pPr>
-      <w:r>
-        <w:rPr>
-          <w:rFonts w:ascii="Consolas" w:hAnsi="Consolas" w:cs="Consolas"/>
+          <w:strike/>
+          <w:color w:val="000000"/>
+          <w:sz w:val="19"/>
+          <w:szCs w:val="19"/>
+          <w:lang w:val="en-US"/>
+        </w:rPr>
+      </w:pPr>
+      <w:r>
+        <w:rPr>
+          <w:rFonts w:ascii="Consolas" w:hAnsi="Consolas" w:cs="Consolas"/>
+          <w:strike/>
           <w:color w:val="000000"/>
           <w:sz w:val="19"/>
           <w:szCs w:val="19"/>
@@ -3178,6 +2893,7 @@
       <w:r>
         <w:rPr>
           <w:rFonts w:ascii="Consolas" w:hAnsi="Consolas" w:cs="Consolas"/>
+          <w:strike/>
           <w:color w:val="000000"/>
           <w:sz w:val="19"/>
           <w:szCs w:val="19"/>
@@ -3189,37 +2905,30 @@
       <w:r>
         <w:rPr>
           <w:rFonts w:ascii="Consolas" w:hAnsi="Consolas" w:cs="Consolas"/>
-          <w:color w:val="000000"/>
-          <w:sz w:val="19"/>
-          <w:szCs w:val="19"/>
-          <w:lang w:val="en-US"/>
-        </w:rPr>
-        <w:t xml:space="preserve">) like regular expressions </w:t>
-      </w:r>
-      <w:r>
-        <w:rPr>
-          <w:rFonts w:ascii="Consolas" w:hAnsi="Consolas" w:cs="Consolas"/>
-          <w:color w:val="000000"/>
-          <w:sz w:val="19"/>
-          <w:szCs w:val="19"/>
-          <w:lang w:val="en-US"/>
-        </w:rPr>
-        <w:t>do.</w:t>
-      </w:r>
-    </w:p>
-    <w:p>
-      <w:pPr>
-        <w:rPr>
-          <w:rFonts w:ascii="Consolas" w:hAnsi="Consolas" w:cs="Consolas"/>
-          <w:color w:val="000000"/>
-          <w:sz w:val="19"/>
-          <w:szCs w:val="19"/>
-          <w:lang w:val="en-US"/>
-        </w:rPr>
-      </w:pPr>
-      <w:r>
-        <w:rPr>
-          <w:rFonts w:ascii="Consolas" w:hAnsi="Consolas" w:cs="Consolas"/>
+          <w:strike/>
+          <w:color w:val="000000"/>
+          <w:sz w:val="19"/>
+          <w:szCs w:val="19"/>
+          <w:lang w:val="en-US"/>
+        </w:rPr>
+        <w:t>) like regular expressions do.</w:t>
+      </w:r>
+    </w:p>
+    <w:p>
+      <w:pPr>
+        <w:rPr>
+          <w:rFonts w:ascii="Consolas" w:hAnsi="Consolas" w:cs="Consolas"/>
+          <w:strike/>
+          <w:color w:val="000000"/>
+          <w:sz w:val="19"/>
+          <w:szCs w:val="19"/>
+          <w:lang w:val="en-US"/>
+        </w:rPr>
+      </w:pPr>
+      <w:r>
+        <w:rPr>
+          <w:rFonts w:ascii="Consolas" w:hAnsi="Consolas" w:cs="Consolas"/>
+          <w:strike/>
           <w:color w:val="000000"/>
           <w:sz w:val="19"/>
           <w:szCs w:val="19"/>
@@ -3232,15 +2941,17 @@
       <w:pPr>
         <w:rPr>
           <w:rFonts w:ascii="Consolas" w:hAnsi="Consolas" w:cs="Consolas"/>
-          <w:color w:val="000000"/>
-          <w:sz w:val="19"/>
-          <w:szCs w:val="19"/>
-          <w:lang w:val="en-US"/>
-        </w:rPr>
-      </w:pPr>
-      <w:r>
-        <w:rPr>
-          <w:rFonts w:ascii="Consolas" w:hAnsi="Consolas" w:cs="Consolas"/>
+          <w:strike/>
+          <w:color w:val="000000"/>
+          <w:sz w:val="19"/>
+          <w:szCs w:val="19"/>
+          <w:lang w:val="en-US"/>
+        </w:rPr>
+      </w:pPr>
+      <w:r>
+        <w:rPr>
+          <w:rFonts w:ascii="Consolas" w:hAnsi="Consolas" w:cs="Consolas"/>
+          <w:strike/>
           <w:color w:val="000000"/>
           <w:sz w:val="19"/>
           <w:szCs w:val="19"/>
@@ -3268,6 +2979,7 @@
             <w:pPr>
               <w:rPr>
                 <w:rFonts w:ascii="Consolas" w:hAnsi="Consolas" w:cs="Consolas"/>
+                <w:strike/>
                 <w:color w:val="000000"/>
                 <w:sz w:val="19"/>
                 <w:szCs w:val="19"/>
@@ -3277,12 +2989,12 @@
             <w:r>
               <w:rPr>
                 <w:rFonts w:ascii="Consolas" w:hAnsi="Consolas" w:cs="Consolas"/>
-                <w:color w:val="000000"/>
-                <w:sz w:val="19"/>
-                <w:szCs w:val="19"/>
-                <w:lang w:val="en-US"/>
-              </w:rPr>
-              <w:lastRenderedPageBreak/>
+                <w:strike/>
+                <w:color w:val="000000"/>
+                <w:sz w:val="19"/>
+                <w:szCs w:val="19"/>
+                <w:lang w:val="en-US"/>
+              </w:rPr>
               <w:t>Token?</w:t>
             </w:r>
           </w:p>
@@ -3295,6 +3007,7 @@
             <w:pPr>
               <w:rPr>
                 <w:rFonts w:ascii="Consolas" w:hAnsi="Consolas" w:cs="Consolas"/>
+                <w:strike/>
                 <w:color w:val="000000"/>
                 <w:sz w:val="19"/>
                 <w:szCs w:val="19"/>
@@ -3304,6 +3017,7 @@
             <w:r>
               <w:rPr>
                 <w:rFonts w:ascii="Consolas" w:hAnsi="Consolas" w:cs="Consolas"/>
+                <w:strike/>
                 <w:color w:val="000000"/>
                 <w:sz w:val="19"/>
                 <w:szCs w:val="19"/>
@@ -3323,6 +3037,7 @@
             <w:pPr>
               <w:rPr>
                 <w:rFonts w:ascii="Consolas" w:hAnsi="Consolas" w:cs="Consolas"/>
+                <w:strike/>
                 <w:color w:val="000000"/>
                 <w:sz w:val="19"/>
                 <w:szCs w:val="19"/>
@@ -3332,6 +3047,7 @@
             <w:r>
               <w:rPr>
                 <w:rFonts w:ascii="Consolas" w:hAnsi="Consolas" w:cs="Consolas"/>
+                <w:strike/>
                 <w:color w:val="000000"/>
                 <w:sz w:val="19"/>
                 <w:szCs w:val="19"/>
@@ -3349,6 +3065,7 @@
             <w:pPr>
               <w:rPr>
                 <w:rFonts w:ascii="Consolas" w:hAnsi="Consolas" w:cs="Consolas"/>
+                <w:strike/>
                 <w:color w:val="000000"/>
                 <w:sz w:val="19"/>
                 <w:szCs w:val="19"/>
@@ -3358,6 +3075,7 @@
             <w:r>
               <w:rPr>
                 <w:rFonts w:ascii="Consolas" w:hAnsi="Consolas" w:cs="Consolas"/>
+                <w:strike/>
                 <w:color w:val="000000"/>
                 <w:sz w:val="19"/>
                 <w:szCs w:val="19"/>
@@ -3377,6 +3095,7 @@
             <w:pPr>
               <w:rPr>
                 <w:rFonts w:ascii="Consolas" w:hAnsi="Consolas" w:cs="Consolas"/>
+                <w:strike/>
                 <w:color w:val="000000"/>
                 <w:sz w:val="19"/>
                 <w:szCs w:val="19"/>
@@ -3386,6 +3105,7 @@
             <w:r>
               <w:rPr>
                 <w:rFonts w:ascii="Consolas" w:hAnsi="Consolas" w:cs="Consolas"/>
+                <w:strike/>
                 <w:color w:val="000000"/>
                 <w:sz w:val="19"/>
                 <w:szCs w:val="19"/>
@@ -3403,6 +3123,7 @@
             <w:pPr>
               <w:rPr>
                 <w:rFonts w:ascii="Consolas" w:hAnsi="Consolas" w:cs="Consolas"/>
+                <w:strike/>
                 <w:color w:val="000000"/>
                 <w:sz w:val="19"/>
                 <w:szCs w:val="19"/>
@@ -3412,6 +3133,7 @@
             <w:r>
               <w:rPr>
                 <w:rFonts w:ascii="Consolas" w:hAnsi="Consolas" w:cs="Consolas"/>
+                <w:strike/>
                 <w:color w:val="000000"/>
                 <w:sz w:val="19"/>
                 <w:szCs w:val="19"/>
@@ -3431,6 +3153,7 @@
             <w:pPr>
               <w:rPr>
                 <w:rFonts w:ascii="Consolas" w:hAnsi="Consolas" w:cs="Consolas"/>
+                <w:strike/>
                 <w:color w:val="000000"/>
                 <w:sz w:val="19"/>
                 <w:szCs w:val="19"/>
@@ -3440,11 +3163,13 @@
             <w:r>
               <w:rPr>
                 <w:rFonts w:ascii="Consolas" w:hAnsi="Consolas" w:cs="Consolas"/>
-                <w:color w:val="000000"/>
-                <w:sz w:val="19"/>
-                <w:szCs w:val="19"/>
-                <w:lang w:val="en-US"/>
-              </w:rPr>
+                <w:strike/>
+                <w:color w:val="000000"/>
+                <w:sz w:val="19"/>
+                <w:szCs w:val="19"/>
+                <w:lang w:val="en-US"/>
+              </w:rPr>
+              <w:lastRenderedPageBreak/>
               <w:t>???</w:t>
             </w:r>
           </w:p>
@@ -3457,6 +3182,7 @@
             <w:pPr>
               <w:rPr>
                 <w:rFonts w:ascii="Consolas" w:hAnsi="Consolas" w:cs="Consolas"/>
+                <w:strike/>
                 <w:color w:val="000000"/>
                 <w:sz w:val="19"/>
                 <w:szCs w:val="19"/>
@@ -3466,6 +3192,7 @@
             <w:r>
               <w:rPr>
                 <w:rFonts w:ascii="Consolas" w:hAnsi="Consolas" w:cs="Consolas"/>
+                <w:strike/>
                 <w:color w:val="000000"/>
                 <w:sz w:val="19"/>
                 <w:szCs w:val="19"/>
@@ -3485,6 +3212,7 @@
             <w:pPr>
               <w:rPr>
                 <w:rFonts w:ascii="Consolas" w:hAnsi="Consolas" w:cs="Consolas"/>
+                <w:strike/>
                 <w:color w:val="000000"/>
                 <w:sz w:val="19"/>
                 <w:szCs w:val="19"/>
@@ -3494,6 +3222,7 @@
             <w:r>
               <w:rPr>
                 <w:rFonts w:ascii="Consolas" w:hAnsi="Consolas" w:cs="Consolas"/>
+                <w:strike/>
                 <w:color w:val="000000"/>
                 <w:sz w:val="19"/>
                 <w:szCs w:val="19"/>
@@ -3511,6 +3240,7 @@
             <w:pPr>
               <w:rPr>
                 <w:rFonts w:ascii="Consolas" w:hAnsi="Consolas" w:cs="Consolas"/>
+                <w:strike/>
                 <w:color w:val="000000"/>
                 <w:sz w:val="19"/>
                 <w:szCs w:val="19"/>
@@ -3520,6 +3250,7 @@
             <w:r>
               <w:rPr>
                 <w:rFonts w:ascii="Consolas" w:hAnsi="Consolas" w:cs="Consolas"/>
+                <w:strike/>
                 <w:color w:val="000000"/>
                 <w:sz w:val="19"/>
                 <w:szCs w:val="19"/>
@@ -3535,26 +3266,29 @@
       <w:pPr>
         <w:rPr>
           <w:rFonts w:ascii="Consolas" w:hAnsi="Consolas" w:cs="Consolas"/>
-          <w:color w:val="000000"/>
-          <w:sz w:val="19"/>
-          <w:szCs w:val="19"/>
-          <w:lang w:val="en-US"/>
-        </w:rPr>
-      </w:pPr>
-    </w:p>
-    <w:p>
-      <w:pPr>
-        <w:rPr>
-          <w:rFonts w:ascii="Consolas" w:hAnsi="Consolas" w:cs="Consolas"/>
-          <w:color w:val="000000"/>
-          <w:sz w:val="19"/>
-          <w:szCs w:val="19"/>
-          <w:lang w:val="en-US"/>
-        </w:rPr>
-      </w:pPr>
-      <w:r>
-        <w:rPr>
-          <w:rFonts w:ascii="Consolas" w:hAnsi="Consolas" w:cs="Consolas"/>
+          <w:strike/>
+          <w:color w:val="000000"/>
+          <w:sz w:val="19"/>
+          <w:szCs w:val="19"/>
+          <w:lang w:val="en-US"/>
+        </w:rPr>
+      </w:pPr>
+    </w:p>
+    <w:p>
+      <w:pPr>
+        <w:rPr>
+          <w:rFonts w:ascii="Consolas" w:hAnsi="Consolas" w:cs="Consolas"/>
+          <w:strike/>
+          <w:color w:val="000000"/>
+          <w:sz w:val="19"/>
+          <w:szCs w:val="19"/>
+          <w:lang w:val="en-US"/>
+        </w:rPr>
+      </w:pPr>
+      <w:r>
+        <w:rPr>
+          <w:rFonts w:ascii="Consolas" w:hAnsi="Consolas" w:cs="Consolas"/>
+          <w:strike/>
           <w:color w:val="000000"/>
           <w:sz w:val="19"/>
           <w:szCs w:val="19"/>
@@ -3566,6 +3300,7 @@
       <w:r>
         <w:rPr>
           <w:rFonts w:ascii="Consolas" w:hAnsi="Consolas" w:cs="Consolas"/>
+          <w:strike/>
           <w:color w:val="000000"/>
           <w:sz w:val="19"/>
           <w:szCs w:val="19"/>
@@ -3577,6 +3312,7 @@
       <w:r>
         <w:rPr>
           <w:rFonts w:ascii="Consolas" w:hAnsi="Consolas" w:cs="Consolas"/>
+          <w:strike/>
           <w:color w:val="000000"/>
           <w:sz w:val="19"/>
           <w:szCs w:val="19"/>
@@ -3587,6 +3323,7 @@
       <w:r>
         <w:rPr>
           <w:rFonts w:ascii="Consolas" w:hAnsi="Consolas" w:cs="Consolas"/>
+          <w:strike/>
           <w:color w:val="000000"/>
           <w:sz w:val="19"/>
           <w:szCs w:val="19"/>
@@ -3597,6 +3334,7 @@
       <w:r>
         <w:rPr>
           <w:rFonts w:ascii="Consolas" w:hAnsi="Consolas" w:cs="Consolas"/>
+          <w:strike/>
           <w:color w:val="000000"/>
           <w:sz w:val="19"/>
           <w:szCs w:val="19"/>
@@ -3608,6 +3346,7 @@
       <w:r>
         <w:rPr>
           <w:rFonts w:ascii="Consolas" w:hAnsi="Consolas" w:cs="Consolas"/>
+          <w:strike/>
           <w:color w:val="000000"/>
           <w:sz w:val="19"/>
           <w:szCs w:val="19"/>
@@ -3619,16 +3358,63 @@
       <w:r>
         <w:rPr>
           <w:rFonts w:ascii="Consolas" w:hAnsi="Consolas" w:cs="Consolas"/>
-          <w:color w:val="000000"/>
-          <w:sz w:val="19"/>
-          <w:szCs w:val="19"/>
-          <w:lang w:val="en-US"/>
-        </w:rPr>
-        <w:t>.</w:t>
-      </w:r>
-      <w:r>
-        <w:rPr>
-          <w:rFonts w:ascii="Consolas" w:hAnsi="Consolas" w:cs="Consolas"/>
+          <w:strike/>
+          <w:color w:val="000000"/>
+          <w:sz w:val="19"/>
+          <w:szCs w:val="19"/>
+          <w:lang w:val="en-US"/>
+        </w:rPr>
+        <w:t xml:space="preserve">. </w:t>
+      </w:r>
+    </w:p>
+    <w:p>
+      <w:pPr>
+        <w:rPr>
+          <w:rFonts w:ascii="Consolas" w:hAnsi="Consolas" w:cs="Consolas"/>
+          <w:strike/>
+          <w:color w:val="000000"/>
+          <w:sz w:val="19"/>
+          <w:szCs w:val="19"/>
+          <w:lang w:val="en-US"/>
+        </w:rPr>
+      </w:pPr>
+      <w:r>
+        <w:rPr>
+          <w:rFonts w:ascii="Consolas" w:hAnsi="Consolas" w:cs="Consolas"/>
+          <w:strike/>
+          <w:color w:val="000000"/>
+          <w:sz w:val="19"/>
+          <w:szCs w:val="19"/>
+          <w:lang w:val="en-US"/>
+        </w:rPr>
+        <w:t xml:space="preserve">Support for ??? and ???? </w:t>
+      </w:r>
+      <w:r>
+        <w:rPr>
+          <w:rFonts w:ascii="Consolas" w:hAnsi="Consolas" w:cs="Consolas"/>
+          <w:strike/>
+          <w:color w:val="000000"/>
+          <w:sz w:val="19"/>
+          <w:szCs w:val="19"/>
+          <w:lang w:val="en-US"/>
+        </w:rPr>
+        <w:t xml:space="preserve">led us to </w:t>
+      </w:r>
+      <w:r>
+        <w:rPr>
+          <w:rFonts w:ascii="Consolas" w:hAnsi="Consolas" w:cs="Consolas"/>
+          <w:strike/>
+          <w:color w:val="000000"/>
+          <w:sz w:val="19"/>
+          <w:szCs w:val="19"/>
+          <w:lang w:val="en-US"/>
+        </w:rPr>
+        <w:t>the following</w:t>
+      </w:r>
+      <w:r>
+        <w:rPr>
+          <w:rFonts w:ascii="Consolas" w:hAnsi="Consolas" w:cs="Consolas"/>
+          <w:strike/>
           <w:color w:val="000000"/>
           <w:sz w:val="19"/>
           <w:szCs w:val="19"/>
@@ -3636,50 +3422,69 @@
         </w:rPr>
         <w:t xml:space="preserve"> </w:t>
       </w:r>
-    </w:p>
-    <w:p>
-      <w:pPr>
-        <w:rPr>
-          <w:rFonts w:ascii="Consolas" w:hAnsi="Consolas" w:cs="Consolas"/>
-          <w:color w:val="000000"/>
-          <w:sz w:val="19"/>
-          <w:szCs w:val="19"/>
-          <w:lang w:val="en-US"/>
-        </w:rPr>
-      </w:pPr>
-      <w:r>
-        <w:rPr>
-          <w:rFonts w:ascii="Consolas" w:hAnsi="Consolas" w:cs="Consolas"/>
-          <w:color w:val="000000"/>
-          <w:sz w:val="19"/>
-          <w:szCs w:val="19"/>
-          <w:lang w:val="en-US"/>
-        </w:rPr>
-        <w:t xml:space="preserve">Support for ??? and ???? </w:t>
-      </w:r>
-      <w:r>
-        <w:rPr>
-          <w:rFonts w:ascii="Consolas" w:hAnsi="Consolas" w:cs="Consolas"/>
-          <w:color w:val="000000"/>
-          <w:sz w:val="19"/>
-          <w:szCs w:val="19"/>
-          <w:lang w:val="en-US"/>
-        </w:rPr>
-        <w:t xml:space="preserve">led us to </w:t>
-      </w:r>
-      <w:r>
-        <w:rPr>
-          <w:rFonts w:ascii="Consolas" w:hAnsi="Consolas" w:cs="Consolas"/>
-          <w:color w:val="000000"/>
-          <w:sz w:val="19"/>
-          <w:szCs w:val="19"/>
-          <w:lang w:val="en-US"/>
-        </w:rPr>
-        <w:t>the following</w:t>
-      </w:r>
-      <w:r>
-        <w:rPr>
-          <w:rFonts w:ascii="Consolas" w:hAnsi="Consolas" w:cs="Consolas"/>
+      <w:r>
+        <w:rPr>
+          <w:rFonts w:ascii="Consolas" w:hAnsi="Consolas" w:cs="Consolas"/>
+          <w:strike/>
+          <w:color w:val="000000"/>
+          <w:sz w:val="19"/>
+          <w:szCs w:val="19"/>
+          <w:lang w:val="en-US"/>
+        </w:rPr>
+        <w:t>grammar</w:t>
+      </w:r>
+      <w:r>
+        <w:rPr>
+          <w:rFonts w:ascii="Consolas" w:hAnsi="Consolas" w:cs="Consolas"/>
+          <w:strike/>
+          <w:color w:val="000000"/>
+          <w:sz w:val="19"/>
+          <w:szCs w:val="19"/>
+          <w:lang w:val="en-US"/>
+        </w:rPr>
+        <w:t>:</w:t>
+      </w:r>
+    </w:p>
+    <w:p>
+      <w:pPr>
+        <w:ind w:firstLine="708"/>
+        <w:rPr>
+          <w:rFonts w:ascii="Consolas" w:hAnsi="Consolas" w:cs="Consolas"/>
+          <w:strike/>
+          <w:color w:val="000000"/>
+          <w:sz w:val="19"/>
+          <w:szCs w:val="19"/>
+          <w:lang w:val="en-US"/>
+        </w:rPr>
+      </w:pPr>
+      <w:r>
+        <w:rPr>
+          <w:rFonts w:ascii="Consolas" w:hAnsi="Consolas" w:cs="Consolas"/>
+          <w:strike/>
+          <w:color w:val="000000"/>
+          <w:sz w:val="19"/>
+          <w:szCs w:val="19"/>
+          <w:lang w:val="en-US"/>
+        </w:rPr>
+        <w:t xml:space="preserve">Pattern: </w:t>
+      </w:r>
+      <w:proofErr w:type="spellStart"/>
+      <w:r>
+        <w:rPr>
+          <w:rFonts w:ascii="Consolas" w:hAnsi="Consolas" w:cs="Consolas"/>
+          <w:strike/>
+          <w:color w:val="000000"/>
+          <w:sz w:val="19"/>
+          <w:szCs w:val="19"/>
+          <w:lang w:val="en-US"/>
+        </w:rPr>
+        <w:t>PatternHead</w:t>
+      </w:r>
+      <w:proofErr w:type="spellEnd"/>
+      <w:r>
+        <w:rPr>
+          <w:rFonts w:ascii="Consolas" w:hAnsi="Consolas" w:cs="Consolas"/>
+          <w:strike/>
           <w:color w:val="000000"/>
           <w:sz w:val="19"/>
           <w:szCs w:val="19"/>
@@ -3690,70 +3495,7 @@
       <w:r>
         <w:rPr>
           <w:rFonts w:ascii="Consolas" w:hAnsi="Consolas" w:cs="Consolas"/>
-          <w:color w:val="000000"/>
-          <w:sz w:val="19"/>
-          <w:szCs w:val="19"/>
-          <w:lang w:val="en-US"/>
-        </w:rPr>
-        <w:t>grammar</w:t>
-      </w:r>
-      <w:r>
-        <w:rPr>
-          <w:rFonts w:ascii="Consolas" w:hAnsi="Consolas" w:cs="Consolas"/>
-          <w:color w:val="000000"/>
-          <w:sz w:val="19"/>
-          <w:szCs w:val="19"/>
-          <w:lang w:val="en-US"/>
-        </w:rPr>
-        <w:t>:</w:t>
-      </w:r>
-    </w:p>
-    <w:p>
-      <w:pPr>
-        <w:ind w:firstLine="708"/>
-        <w:rPr>
-          <w:rFonts w:ascii="Consolas" w:hAnsi="Consolas" w:cs="Consolas"/>
-          <w:color w:val="000000"/>
-          <w:sz w:val="19"/>
-          <w:szCs w:val="19"/>
-          <w:lang w:val="en-US"/>
-        </w:rPr>
-      </w:pPr>
-      <w:r>
-        <w:rPr>
-          <w:rFonts w:ascii="Consolas" w:hAnsi="Consolas" w:cs="Consolas"/>
-          <w:color w:val="000000"/>
-          <w:sz w:val="19"/>
-          <w:szCs w:val="19"/>
-          <w:lang w:val="en-US"/>
-        </w:rPr>
-        <w:t xml:space="preserve">Pattern: </w:t>
-      </w:r>
-      <w:proofErr w:type="spellStart"/>
-      <w:r>
-        <w:rPr>
-          <w:rFonts w:ascii="Consolas" w:hAnsi="Consolas" w:cs="Consolas"/>
-          <w:color w:val="000000"/>
-          <w:sz w:val="19"/>
-          <w:szCs w:val="19"/>
-          <w:lang w:val="en-US"/>
-        </w:rPr>
-        <w:t>PatternHead</w:t>
-      </w:r>
-      <w:proofErr w:type="spellEnd"/>
-      <w:r>
-        <w:rPr>
-          <w:rFonts w:ascii="Consolas" w:hAnsi="Consolas" w:cs="Consolas"/>
-          <w:color w:val="000000"/>
-          <w:sz w:val="19"/>
-          <w:szCs w:val="19"/>
-          <w:lang w:val="en-US"/>
-        </w:rPr>
-        <w:t xml:space="preserve"> </w:t>
-      </w:r>
-      <w:r>
-        <w:rPr>
-          <w:rFonts w:ascii="Consolas" w:hAnsi="Consolas" w:cs="Consolas"/>
+          <w:strike/>
           <w:color w:val="000000"/>
           <w:sz w:val="19"/>
           <w:szCs w:val="19"/>
@@ -3766,6 +3508,7 @@
       <w:r>
         <w:rPr>
           <w:rFonts w:ascii="Consolas" w:hAnsi="Consolas" w:cs="Consolas"/>
+          <w:strike/>
           <w:color w:val="000000"/>
           <w:sz w:val="19"/>
           <w:szCs w:val="19"/>
@@ -3777,6 +3520,7 @@
       <w:r>
         <w:rPr>
           <w:rFonts w:ascii="Consolas" w:hAnsi="Consolas" w:cs="Consolas"/>
+          <w:strike/>
           <w:color w:val="000000"/>
           <w:sz w:val="19"/>
           <w:szCs w:val="19"/>
@@ -3787,6 +3531,7 @@
       <w:r>
         <w:rPr>
           <w:rFonts w:ascii="Consolas" w:hAnsi="Consolas" w:cs="Consolas"/>
+          <w:strike/>
           <w:color w:val="000000"/>
           <w:sz w:val="19"/>
           <w:szCs w:val="19"/>
@@ -3798,6 +3543,7 @@
       <w:r>
         <w:rPr>
           <w:rFonts w:ascii="Consolas" w:hAnsi="Consolas" w:cs="Consolas"/>
+          <w:strike/>
           <w:color w:val="000000"/>
           <w:sz w:val="19"/>
           <w:szCs w:val="19"/>
@@ -3809,6 +3555,7 @@
       <w:r>
         <w:rPr>
           <w:rFonts w:ascii="Consolas" w:hAnsi="Consolas" w:cs="Consolas"/>
+          <w:strike/>
           <w:color w:val="000000"/>
           <w:sz w:val="19"/>
           <w:szCs w:val="19"/>
@@ -3822,15 +3569,17 @@
       <w:pPr>
         <w:rPr>
           <w:rFonts w:ascii="Consolas" w:hAnsi="Consolas" w:cs="Consolas"/>
-          <w:color w:val="000000"/>
-          <w:sz w:val="19"/>
-          <w:szCs w:val="19"/>
-          <w:lang w:val="en-US"/>
-        </w:rPr>
-      </w:pPr>
-      <w:r>
-        <w:rPr>
-          <w:rFonts w:ascii="Consolas" w:hAnsi="Consolas" w:cs="Consolas"/>
+          <w:strike/>
+          <w:color w:val="000000"/>
+          <w:sz w:val="19"/>
+          <w:szCs w:val="19"/>
+          <w:lang w:val="en-US"/>
+        </w:rPr>
+      </w:pPr>
+      <w:r>
+        <w:rPr>
+          <w:rFonts w:ascii="Consolas" w:hAnsi="Consolas" w:cs="Consolas"/>
+          <w:strike/>
           <w:color w:val="000000"/>
           <w:sz w:val="19"/>
           <w:szCs w:val="19"/>
@@ -3844,6 +3593,7 @@
         <w:ind w:firstLine="708"/>
         <w:rPr>
           <w:rFonts w:ascii="Consolas" w:hAnsi="Consolas" w:cs="Consolas"/>
+          <w:strike/>
           <w:color w:val="000000"/>
           <w:sz w:val="19"/>
           <w:szCs w:val="19"/>
@@ -3854,6 +3604,7 @@
       <w:r>
         <w:rPr>
           <w:rFonts w:ascii="Consolas" w:hAnsi="Consolas" w:cs="Consolas"/>
+          <w:strike/>
           <w:color w:val="000000"/>
           <w:sz w:val="19"/>
           <w:szCs w:val="19"/>
@@ -3865,6 +3616,7 @@
       <w:r>
         <w:rPr>
           <w:rFonts w:ascii="Consolas" w:hAnsi="Consolas" w:cs="Consolas"/>
+          <w:strike/>
           <w:color w:val="000000"/>
           <w:sz w:val="19"/>
           <w:szCs w:val="19"/>
@@ -3876,6 +3628,7 @@
       <w:r>
         <w:rPr>
           <w:rFonts w:ascii="Consolas" w:hAnsi="Consolas" w:cs="Consolas"/>
+          <w:strike/>
           <w:color w:val="000000"/>
           <w:sz w:val="19"/>
           <w:szCs w:val="19"/>
@@ -3887,6 +3640,7 @@
       <w:r>
         <w:rPr>
           <w:rFonts w:ascii="Consolas" w:hAnsi="Consolas" w:cs="Consolas"/>
+          <w:strike/>
           <w:color w:val="000000"/>
           <w:sz w:val="19"/>
           <w:szCs w:val="19"/>
@@ -3899,6 +3653,7 @@
       <w:r>
         <w:rPr>
           <w:rFonts w:ascii="Consolas" w:hAnsi="Consolas" w:cs="Consolas"/>
+          <w:strike/>
           <w:color w:val="000000"/>
           <w:sz w:val="19"/>
           <w:szCs w:val="19"/>
@@ -3910,6 +3665,7 @@
       <w:r>
         <w:rPr>
           <w:rFonts w:ascii="Consolas" w:hAnsi="Consolas" w:cs="Consolas"/>
+          <w:strike/>
           <w:color w:val="000000"/>
           <w:sz w:val="19"/>
           <w:szCs w:val="19"/>
@@ -3924,303 +3680,268 @@
         <w:ind w:firstLine="708"/>
         <w:rPr>
           <w:rFonts w:ascii="Consolas" w:hAnsi="Consolas" w:cs="Consolas"/>
-          <w:color w:val="000000"/>
-          <w:sz w:val="19"/>
-          <w:szCs w:val="19"/>
-        </w:rPr>
-      </w:pPr>
+          <w:strike/>
+          <w:color w:val="000000"/>
+          <w:sz w:val="19"/>
+          <w:szCs w:val="19"/>
+          <w:lang w:val="en-US"/>
+        </w:rPr>
+      </w:pPr>
+      <w:proofErr w:type="spellStart"/>
+      <w:r>
+        <w:rPr>
+          <w:rFonts w:ascii="Consolas" w:hAnsi="Consolas" w:cs="Consolas"/>
+          <w:strike/>
+          <w:color w:val="000000"/>
+          <w:sz w:val="19"/>
+          <w:szCs w:val="19"/>
+          <w:lang w:val="en-US"/>
+        </w:rPr>
+        <w:t>PatternTail</w:t>
+      </w:r>
+      <w:proofErr w:type="spellEnd"/>
+      <w:r>
+        <w:rPr>
+          <w:rFonts w:ascii="Consolas" w:hAnsi="Consolas" w:cs="Consolas"/>
+          <w:strike/>
+          <w:color w:val="000000"/>
+          <w:sz w:val="19"/>
+          <w:szCs w:val="19"/>
+          <w:lang w:val="en-US"/>
+        </w:rPr>
+        <w:t xml:space="preserve">: </w:t>
+      </w:r>
+      <w:proofErr w:type="spellStart"/>
+      <w:r>
+        <w:rPr>
+          <w:rFonts w:ascii="Consolas" w:hAnsi="Consolas" w:cs="Consolas"/>
+          <w:strike/>
+          <w:color w:val="000000"/>
+          <w:sz w:val="19"/>
+          <w:szCs w:val="19"/>
+          <w:lang w:val="en-US"/>
+        </w:rPr>
+        <w:t>PatternContent</w:t>
+      </w:r>
+      <w:proofErr w:type="spellEnd"/>
+      <w:r>
+        <w:rPr>
+          <w:rFonts w:ascii="Consolas" w:hAnsi="Consolas" w:cs="Consolas"/>
+          <w:strike/>
+          <w:color w:val="000000"/>
+          <w:sz w:val="19"/>
+          <w:szCs w:val="19"/>
+          <w:lang w:val="en-US"/>
+        </w:rPr>
+        <w:t xml:space="preserve">? </w:t>
+      </w:r>
+      <w:proofErr w:type="spellStart"/>
+      <w:r>
+        <w:rPr>
+          <w:rFonts w:ascii="Consolas" w:hAnsi="Consolas" w:cs="Consolas"/>
+          <w:strike/>
+          <w:color w:val="000000"/>
+          <w:sz w:val="19"/>
+          <w:szCs w:val="19"/>
+          <w:lang w:val="en-US"/>
+        </w:rPr>
+        <w:t>PatternTokenList</w:t>
+      </w:r>
+      <w:proofErr w:type="spellEnd"/>
+    </w:p>
+    <w:p>
+      <w:pPr>
+        <w:ind w:firstLine="708"/>
+        <w:rPr>
+          <w:rFonts w:ascii="Consolas" w:hAnsi="Consolas" w:cs="Consolas"/>
+          <w:strike/>
+          <w:color w:val="000000"/>
+          <w:sz w:val="19"/>
+          <w:szCs w:val="19"/>
+          <w:lang w:val="en-US"/>
+        </w:rPr>
+      </w:pPr>
+      <w:proofErr w:type="spellStart"/>
+      <w:r>
+        <w:rPr>
+          <w:rFonts w:ascii="Consolas" w:hAnsi="Consolas" w:cs="Consolas"/>
+          <w:strike/>
+          <w:color w:val="000000"/>
+          <w:sz w:val="19"/>
+          <w:szCs w:val="19"/>
+          <w:lang w:val="en-US"/>
+        </w:rPr>
+        <w:t>PatternContent</w:t>
+      </w:r>
+      <w:proofErr w:type="spellEnd"/>
+      <w:r>
+        <w:rPr>
+          <w:rFonts w:ascii="Consolas" w:hAnsi="Consolas" w:cs="Consolas"/>
+          <w:strike/>
+          <w:color w:val="000000"/>
+          <w:sz w:val="19"/>
+          <w:szCs w:val="19"/>
+          <w:lang w:val="en-US"/>
+        </w:rPr>
+        <w:t xml:space="preserve">: </w:t>
+      </w:r>
+      <w:proofErr w:type="spellStart"/>
+      <w:r>
+        <w:rPr>
+          <w:rFonts w:ascii="Consolas" w:hAnsi="Consolas" w:cs="Consolas"/>
+          <w:strike/>
+          <w:color w:val="000000"/>
+          <w:sz w:val="19"/>
+          <w:szCs w:val="19"/>
+          <w:lang w:val="en-US"/>
+        </w:rPr>
+        <w:t>PatternTokenList</w:t>
+      </w:r>
+      <w:proofErr w:type="spellEnd"/>
+      <w:r>
+        <w:rPr>
+          <w:rFonts w:ascii="Consolas" w:hAnsi="Consolas" w:cs="Consolas"/>
+          <w:strike/>
+          <w:color w:val="000000"/>
+          <w:sz w:val="19"/>
+          <w:szCs w:val="19"/>
+          <w:lang w:val="en-US"/>
+        </w:rPr>
+        <w:t xml:space="preserve"> ((???|????) </w:t>
+      </w:r>
       <w:proofErr w:type="spellStart"/>
       <w:proofErr w:type="gramStart"/>
       <w:r>
         <w:rPr>
           <w:rFonts w:ascii="Consolas" w:hAnsi="Consolas" w:cs="Consolas"/>
-          <w:color w:val="000000"/>
-          <w:sz w:val="19"/>
-          <w:szCs w:val="19"/>
-        </w:rPr>
-        <w:t>PatternTail</w:t>
+          <w:strike/>
+          <w:color w:val="000000"/>
+          <w:sz w:val="19"/>
+          <w:szCs w:val="19"/>
+          <w:lang w:val="en-US"/>
+        </w:rPr>
+        <w:t>PatternTokenList</w:t>
       </w:r>
       <w:proofErr w:type="spellEnd"/>
       <w:r>
         <w:rPr>
           <w:rFonts w:ascii="Consolas" w:hAnsi="Consolas" w:cs="Consolas"/>
-          <w:color w:val="000000"/>
-          <w:sz w:val="19"/>
-          <w:szCs w:val="19"/>
-        </w:rPr>
-        <w:t>:</w:t>
+          <w:strike/>
+          <w:color w:val="000000"/>
+          <w:sz w:val="19"/>
+          <w:szCs w:val="19"/>
+          <w:lang w:val="en-US"/>
+        </w:rPr>
+        <w:t>)*</w:t>
       </w:r>
       <w:proofErr w:type="gramEnd"/>
-      <w:r>
-        <w:rPr>
-          <w:rFonts w:ascii="Consolas" w:hAnsi="Consolas" w:cs="Consolas"/>
-          <w:color w:val="000000"/>
-          <w:sz w:val="19"/>
-          <w:szCs w:val="19"/>
-        </w:rPr>
-        <w:t xml:space="preserve"> </w:t>
+    </w:p>
+    <w:p>
+      <w:pPr>
+        <w:rPr>
+          <w:rFonts w:ascii="Consolas" w:hAnsi="Consolas" w:cs="Consolas"/>
+          <w:strike/>
+          <w:color w:val="000000"/>
+          <w:sz w:val="19"/>
+          <w:szCs w:val="19"/>
+          <w:lang w:val="en-US"/>
+        </w:rPr>
+      </w:pPr>
+      <w:r>
+        <w:rPr>
+          <w:rFonts w:ascii="Consolas" w:hAnsi="Consolas" w:cs="Consolas"/>
+          <w:strike/>
+          <w:color w:val="000000"/>
+          <w:sz w:val="19"/>
+          <w:szCs w:val="19"/>
+          <w:lang w:val="en-US"/>
+        </w:rPr>
+        <w:t xml:space="preserve">There are other ways to express this grammar. The idea is that the first ???? implies a match of the last </w:t>
       </w:r>
       <w:proofErr w:type="spellStart"/>
       <w:r>
         <w:rPr>
           <w:rFonts w:ascii="Consolas" w:hAnsi="Consolas" w:cs="Consolas"/>
-          <w:color w:val="000000"/>
-          <w:sz w:val="19"/>
-          <w:szCs w:val="19"/>
-        </w:rPr>
-        <w:t>PatternContent</w:t>
+          <w:strike/>
+          <w:color w:val="000000"/>
+          <w:sz w:val="19"/>
+          <w:szCs w:val="19"/>
+          <w:lang w:val="en-US"/>
+        </w:rPr>
+        <w:t>PatternTokenList</w:t>
       </w:r>
       <w:proofErr w:type="spellEnd"/>
       <w:r>
         <w:rPr>
           <w:rFonts w:ascii="Consolas" w:hAnsi="Consolas" w:cs="Consolas"/>
-          <w:color w:val="000000"/>
-          <w:sz w:val="19"/>
-          <w:szCs w:val="19"/>
-        </w:rPr>
-        <w:t xml:space="preserve">? </w:t>
+          <w:strike/>
+          <w:color w:val="000000"/>
+          <w:sz w:val="19"/>
+          <w:szCs w:val="19"/>
+          <w:lang w:val="en-US"/>
+        </w:rPr>
+        <w:t xml:space="preserve"> from the tail of the tokens to match. Every other </w:t>
       </w:r>
       <w:proofErr w:type="spellStart"/>
       <w:r>
         <w:rPr>
           <w:rFonts w:ascii="Consolas" w:hAnsi="Consolas" w:cs="Consolas"/>
-          <w:color w:val="000000"/>
-          <w:sz w:val="19"/>
-          <w:szCs w:val="19"/>
+          <w:strike/>
+          <w:color w:val="000000"/>
+          <w:sz w:val="19"/>
+          <w:szCs w:val="19"/>
+          <w:lang w:val="en-US"/>
         </w:rPr>
         <w:t>PatternTokenList</w:t>
       </w:r>
       <w:proofErr w:type="spellEnd"/>
-    </w:p>
-    <w:p>
-      <w:pPr>
-        <w:ind w:firstLine="708"/>
-        <w:rPr>
-          <w:rFonts w:ascii="Consolas" w:hAnsi="Consolas" w:cs="Consolas"/>
-          <w:color w:val="000000"/>
-          <w:sz w:val="19"/>
-          <w:szCs w:val="19"/>
-        </w:rPr>
-      </w:pPr>
+      <w:r>
+        <w:rPr>
+          <w:rFonts w:ascii="Consolas" w:hAnsi="Consolas" w:cs="Consolas"/>
+          <w:strike/>
+          <w:color w:val="000000"/>
+          <w:sz w:val="19"/>
+          <w:szCs w:val="19"/>
+          <w:lang w:val="en-US"/>
+        </w:rPr>
+        <w:t xml:space="preserve"> between the first ???? and the last </w:t>
+      </w:r>
       <w:proofErr w:type="spellStart"/>
-      <w:proofErr w:type="gramStart"/>
-      <w:r>
-        <w:rPr>
-          <w:rFonts w:ascii="Consolas" w:hAnsi="Consolas" w:cs="Consolas"/>
-          <w:color w:val="000000"/>
-          <w:sz w:val="19"/>
-          <w:szCs w:val="19"/>
-        </w:rPr>
-        <w:t>PatternContent</w:t>
+      <w:r>
+        <w:rPr>
+          <w:rFonts w:ascii="Consolas" w:hAnsi="Consolas" w:cs="Consolas"/>
+          <w:strike/>
+          <w:color w:val="000000"/>
+          <w:sz w:val="19"/>
+          <w:szCs w:val="19"/>
+          <w:lang w:val="en-US"/>
+        </w:rPr>
+        <w:t>PatternTokenList</w:t>
       </w:r>
       <w:proofErr w:type="spellEnd"/>
       <w:r>
         <w:rPr>
           <w:rFonts w:ascii="Consolas" w:hAnsi="Consolas" w:cs="Consolas"/>
-          <w:color w:val="000000"/>
-          <w:sz w:val="19"/>
-          <w:szCs w:val="19"/>
-        </w:rPr>
-        <w:t>:</w:t>
-      </w:r>
-      <w:proofErr w:type="gramEnd"/>
-      <w:r>
-        <w:rPr>
-          <w:rFonts w:ascii="Consolas" w:hAnsi="Consolas" w:cs="Consolas"/>
-          <w:color w:val="000000"/>
-          <w:sz w:val="19"/>
-          <w:szCs w:val="19"/>
-        </w:rPr>
-        <w:t xml:space="preserve"> </w:t>
-      </w:r>
-      <w:proofErr w:type="spellStart"/>
-      <w:r>
-        <w:rPr>
-          <w:rFonts w:ascii="Consolas" w:hAnsi="Consolas" w:cs="Consolas"/>
-          <w:color w:val="000000"/>
-          <w:sz w:val="19"/>
-          <w:szCs w:val="19"/>
-        </w:rPr>
-        <w:t>PatternTokenList</w:t>
-      </w:r>
-      <w:proofErr w:type="spellEnd"/>
-      <w:r>
-        <w:rPr>
-          <w:rFonts w:ascii="Consolas" w:hAnsi="Consolas" w:cs="Consolas"/>
-          <w:color w:val="000000"/>
-          <w:sz w:val="19"/>
-          <w:szCs w:val="19"/>
-        </w:rPr>
-        <w:t xml:space="preserve"> </w:t>
-      </w:r>
-      <w:r>
-        <w:rPr>
-          <w:rFonts w:ascii="Consolas" w:hAnsi="Consolas" w:cs="Consolas"/>
-          <w:color w:val="000000"/>
-          <w:sz w:val="19"/>
-          <w:szCs w:val="19"/>
-        </w:rPr>
-        <w:t xml:space="preserve">((???|????) </w:t>
-      </w:r>
-      <w:proofErr w:type="spellStart"/>
-      <w:proofErr w:type="gramStart"/>
-      <w:r>
-        <w:rPr>
-          <w:rFonts w:ascii="Consolas" w:hAnsi="Consolas" w:cs="Consolas"/>
-          <w:color w:val="000000"/>
-          <w:sz w:val="19"/>
-          <w:szCs w:val="19"/>
-        </w:rPr>
-        <w:t>PatternTokenList</w:t>
-      </w:r>
-      <w:proofErr w:type="spellEnd"/>
-      <w:r>
-        <w:rPr>
-          <w:rFonts w:ascii="Consolas" w:hAnsi="Consolas" w:cs="Consolas"/>
-          <w:color w:val="000000"/>
-          <w:sz w:val="19"/>
-          <w:szCs w:val="19"/>
-        </w:rPr>
-        <w:t>)*</w:t>
-      </w:r>
-      <w:proofErr w:type="gramEnd"/>
-    </w:p>
-    <w:p>
-      <w:pPr>
-        <w:rPr>
-          <w:rFonts w:ascii="Consolas" w:hAnsi="Consolas" w:cs="Consolas"/>
-          <w:color w:val="000000"/>
-          <w:sz w:val="19"/>
-          <w:szCs w:val="19"/>
-          <w:lang w:val="en-US"/>
-        </w:rPr>
-      </w:pPr>
-      <w:r>
-        <w:rPr>
-          <w:rFonts w:ascii="Consolas" w:hAnsi="Consolas" w:cs="Consolas"/>
-          <w:color w:val="000000"/>
-          <w:sz w:val="19"/>
-          <w:szCs w:val="19"/>
-          <w:lang w:val="en-US"/>
-        </w:rPr>
-        <w:t>There are other ways t</w:t>
-      </w:r>
-      <w:r>
-        <w:rPr>
-          <w:rFonts w:ascii="Consolas" w:hAnsi="Consolas" w:cs="Consolas"/>
-          <w:color w:val="000000"/>
-          <w:sz w:val="19"/>
-          <w:szCs w:val="19"/>
-          <w:lang w:val="en-US"/>
-        </w:rPr>
-        <w:t xml:space="preserve">o express this grammar. The idea is that the first ???? implies a match </w:t>
-      </w:r>
-      <w:r>
-        <w:rPr>
-          <w:rFonts w:ascii="Consolas" w:hAnsi="Consolas" w:cs="Consolas"/>
-          <w:color w:val="000000"/>
-          <w:sz w:val="19"/>
-          <w:szCs w:val="19"/>
-          <w:lang w:val="en-US"/>
-        </w:rPr>
-        <w:t xml:space="preserve">of the last </w:t>
-      </w:r>
-      <w:proofErr w:type="spellStart"/>
-      <w:r>
-        <w:rPr>
-          <w:rFonts w:ascii="Consolas" w:hAnsi="Consolas" w:cs="Consolas"/>
-          <w:color w:val="000000"/>
-          <w:sz w:val="19"/>
-          <w:szCs w:val="19"/>
-          <w:lang w:val="en-US"/>
-        </w:rPr>
-        <w:t>PatternTokenList</w:t>
-      </w:r>
-      <w:proofErr w:type="spellEnd"/>
-      <w:r>
-        <w:rPr>
-          <w:rFonts w:ascii="Consolas" w:hAnsi="Consolas" w:cs="Consolas"/>
-          <w:color w:val="000000"/>
-          <w:sz w:val="19"/>
-          <w:szCs w:val="19"/>
-          <w:lang w:val="en-US"/>
-        </w:rPr>
-        <w:t xml:space="preserve"> from the tail of the tokens to match. Every other </w:t>
-      </w:r>
-      <w:proofErr w:type="spellStart"/>
-      <w:r>
-        <w:rPr>
-          <w:rFonts w:ascii="Consolas" w:hAnsi="Consolas" w:cs="Consolas"/>
-          <w:color w:val="000000"/>
-          <w:sz w:val="19"/>
-          <w:szCs w:val="19"/>
-          <w:lang w:val="en-US"/>
-        </w:rPr>
-        <w:t>PatternTokenList</w:t>
-      </w:r>
-      <w:proofErr w:type="spellEnd"/>
-      <w:r>
-        <w:rPr>
-          <w:rFonts w:ascii="Consolas" w:hAnsi="Consolas" w:cs="Consolas"/>
-          <w:color w:val="000000"/>
-          <w:sz w:val="19"/>
-          <w:szCs w:val="19"/>
-          <w:lang w:val="en-US"/>
-        </w:rPr>
-        <w:t xml:space="preserve"> between the f</w:t>
-      </w:r>
-      <w:r>
-        <w:rPr>
-          <w:rFonts w:ascii="Consolas" w:hAnsi="Consolas" w:cs="Consolas"/>
-          <w:color w:val="000000"/>
-          <w:sz w:val="19"/>
-          <w:szCs w:val="19"/>
-          <w:lang w:val="en-US"/>
-        </w:rPr>
-        <w:t xml:space="preserve">irst ???? and the last </w:t>
-      </w:r>
-      <w:proofErr w:type="spellStart"/>
-      <w:r>
-        <w:rPr>
-          <w:rFonts w:ascii="Consolas" w:hAnsi="Consolas" w:cs="Consolas"/>
-          <w:color w:val="000000"/>
-          <w:sz w:val="19"/>
-          <w:szCs w:val="19"/>
-          <w:lang w:val="en-US"/>
-        </w:rPr>
-        <w:t>PatternTokenList</w:t>
-      </w:r>
-      <w:proofErr w:type="spellEnd"/>
-      <w:r>
-        <w:rPr>
-          <w:rFonts w:ascii="Consolas" w:hAnsi="Consolas" w:cs="Consolas"/>
-          <w:color w:val="000000"/>
-          <w:sz w:val="19"/>
-          <w:szCs w:val="19"/>
-          <w:lang w:val="en-US"/>
-        </w:rPr>
-        <w:t xml:space="preserve"> must appear in order</w:t>
-      </w:r>
-      <w:r>
-        <w:rPr>
-          <w:rFonts w:ascii="Consolas" w:hAnsi="Consolas" w:cs="Consolas"/>
-          <w:color w:val="000000"/>
-          <w:sz w:val="19"/>
-          <w:szCs w:val="19"/>
-          <w:lang w:val="en-US"/>
-        </w:rPr>
-        <w:t>.</w:t>
+          <w:strike/>
+          <w:color w:val="000000"/>
+          <w:sz w:val="19"/>
+          <w:szCs w:val="19"/>
+          <w:lang w:val="en-US"/>
+        </w:rPr>
+        <w:t xml:space="preserve"> must appear in order.</w:t>
       </w:r>
     </w:p>
     <w:p>
       <w:pPr>
         <w:pStyle w:val="Heading2"/>
         <w:rPr>
-          <w:lang w:val="en-US"/>
-        </w:rPr>
-      </w:pPr>
-      <w:r>
-        <w:rPr>
+          <w:strike/>
+          <w:lang w:val="en-US"/>
+        </w:rPr>
+      </w:pPr>
+      <w:r>
+        <w:rPr>
+          <w:strike/>
           <w:lang w:val="en-US"/>
         </w:rPr>
         <w:t>Range matching</w:t>
@@ -4230,15 +3951,17 @@
       <w:pPr>
         <w:rPr>
           <w:rFonts w:ascii="Consolas" w:hAnsi="Consolas" w:cs="Consolas"/>
-          <w:color w:val="000000"/>
-          <w:sz w:val="19"/>
-          <w:szCs w:val="19"/>
-          <w:lang w:val="en-US"/>
-        </w:rPr>
-      </w:pPr>
-      <w:r>
-        <w:rPr>
-          <w:rFonts w:ascii="Consolas" w:hAnsi="Consolas" w:cs="Consolas"/>
+          <w:strike/>
+          <w:color w:val="000000"/>
+          <w:sz w:val="19"/>
+          <w:szCs w:val="19"/>
+          <w:lang w:val="en-US"/>
+        </w:rPr>
+      </w:pPr>
+      <w:r>
+        <w:rPr>
+          <w:rFonts w:ascii="Consolas" w:hAnsi="Consolas" w:cs="Consolas"/>
+          <w:strike/>
           <w:color w:val="000000"/>
           <w:sz w:val="19"/>
           <w:szCs w:val="19"/>
@@ -4249,36 +3972,18 @@
       <w:r>
         <w:rPr>
           <w:rFonts w:ascii="Consolas" w:hAnsi="Consolas" w:cs="Consolas"/>
-          <w:color w:val="000000"/>
-          <w:sz w:val="19"/>
-          <w:szCs w:val="19"/>
-          <w:lang w:val="en-US"/>
-        </w:rPr>
-        <w:t xml:space="preserve">, </w:t>
-      </w:r>
-      <w:r>
-        <w:rPr>
-          <w:rFonts w:ascii="Consolas" w:hAnsi="Consolas" w:cs="Consolas"/>
-          <w:color w:val="000000"/>
-          <w:sz w:val="19"/>
-          <w:szCs w:val="19"/>
-          <w:lang w:val="en-US"/>
-        </w:rPr>
-        <w:t>if the pattern starts with ???</w:t>
-      </w:r>
-      <w:r>
-        <w:rPr>
-          <w:rFonts w:ascii="Consolas" w:hAnsi="Consolas" w:cs="Consolas"/>
-          <w:color w:val="000000"/>
-          <w:sz w:val="19"/>
-          <w:szCs w:val="19"/>
-          <w:lang w:val="en-US"/>
-        </w:rPr>
-        <w:t xml:space="preserve"> the starting tokens </w:t>
-      </w:r>
-      <w:r>
-        <w:rPr>
-          <w:rFonts w:ascii="Consolas" w:hAnsi="Consolas" w:cs="Consolas"/>
+          <w:strike/>
+          <w:color w:val="000000"/>
+          <w:sz w:val="19"/>
+          <w:szCs w:val="19"/>
+          <w:lang w:val="en-US"/>
+        </w:rPr>
+        <w:t xml:space="preserve">, if the pattern starts with ??? the starting tokens </w:t>
+      </w:r>
+      <w:r>
+        <w:rPr>
+          <w:rFonts w:ascii="Consolas" w:hAnsi="Consolas" w:cs="Consolas"/>
+          <w:strike/>
           <w:color w:val="000000"/>
           <w:sz w:val="19"/>
           <w:szCs w:val="19"/>
@@ -4289,6 +3994,7 @@
       <w:r>
         <w:rPr>
           <w:rFonts w:ascii="Consolas" w:hAnsi="Consolas" w:cs="Consolas"/>
+          <w:strike/>
           <w:color w:val="000000"/>
           <w:sz w:val="19"/>
           <w:szCs w:val="19"/>
@@ -4299,6 +4005,7 @@
       <w:r>
         <w:rPr>
           <w:rFonts w:ascii="Consolas" w:hAnsi="Consolas" w:cs="Consolas"/>
+          <w:strike/>
           <w:color w:val="000000"/>
           <w:sz w:val="19"/>
           <w:szCs w:val="19"/>
@@ -4326,6 +4033,7 @@
             <w:pPr>
               <w:rPr>
                 <w:rFonts w:ascii="Consolas" w:hAnsi="Consolas" w:cs="Consolas"/>
+                <w:strike/>
                 <w:color w:val="000000"/>
                 <w:sz w:val="19"/>
                 <w:szCs w:val="19"/>
@@ -4335,6 +4043,7 @@
             <w:r>
               <w:rPr>
                 <w:rFonts w:ascii="Consolas" w:hAnsi="Consolas" w:cs="Consolas"/>
+                <w:strike/>
                 <w:color w:val="000000"/>
                 <w:sz w:val="19"/>
                 <w:szCs w:val="19"/>
@@ -4346,6 +4055,7 @@
             <w:r>
               <w:rPr>
                 <w:rFonts w:ascii="Consolas" w:hAnsi="Consolas" w:cs="Consolas"/>
+                <w:strike/>
                 <w:color w:val="000000"/>
                 <w:sz w:val="19"/>
                 <w:szCs w:val="19"/>
@@ -4357,6 +4067,7 @@
             <w:r>
               <w:rPr>
                 <w:rFonts w:ascii="Consolas" w:hAnsi="Consolas" w:cs="Consolas"/>
+                <w:strike/>
                 <w:color w:val="000000"/>
                 <w:sz w:val="19"/>
                 <w:szCs w:val="19"/>
@@ -4369,6 +4080,7 @@
             <w:pPr>
               <w:rPr>
                 <w:rFonts w:ascii="Consolas" w:hAnsi="Consolas" w:cs="Consolas"/>
+                <w:strike/>
                 <w:color w:val="000000"/>
                 <w:sz w:val="19"/>
                 <w:szCs w:val="19"/>
@@ -4385,6 +4097,7 @@
             <w:pPr>
               <w:rPr>
                 <w:rFonts w:ascii="Consolas" w:hAnsi="Consolas" w:cs="Consolas"/>
+                <w:strike/>
                 <w:color w:val="000000"/>
                 <w:sz w:val="19"/>
                 <w:szCs w:val="19"/>
@@ -4394,6 +4107,7 @@
             <w:r>
               <w:rPr>
                 <w:rFonts w:ascii="Consolas" w:hAnsi="Consolas" w:cs="Consolas"/>
+                <w:strike/>
                 <w:color w:val="000000"/>
                 <w:sz w:val="19"/>
                 <w:szCs w:val="19"/>
@@ -4407,6 +4121,7 @@
             <w:r>
               <w:rPr>
                 <w:rFonts w:ascii="Consolas" w:hAnsi="Consolas" w:cs="Consolas"/>
+                <w:strike/>
                 <w:color w:val="000000"/>
                 <w:sz w:val="19"/>
                 <w:szCs w:val="19"/>
@@ -4420,6 +4135,7 @@
             <w:r>
               <w:rPr>
                 <w:rFonts w:ascii="Consolas" w:hAnsi="Consolas" w:cs="Consolas"/>
+                <w:strike/>
                 <w:color w:val="000000"/>
                 <w:sz w:val="19"/>
                 <w:szCs w:val="19"/>
@@ -4432,6 +4148,7 @@
             <w:pPr>
               <w:rPr>
                 <w:rFonts w:ascii="Consolas" w:hAnsi="Consolas" w:cs="Consolas"/>
+                <w:strike/>
                 <w:color w:val="000000"/>
                 <w:sz w:val="19"/>
                 <w:szCs w:val="19"/>
@@ -4441,6 +4158,7 @@
             <w:r>
               <w:rPr>
                 <w:rFonts w:ascii="Consolas" w:hAnsi="Consolas" w:cs="Consolas"/>
+                <w:strike/>
                 <w:color w:val="000000"/>
                 <w:sz w:val="19"/>
                 <w:szCs w:val="19"/>
@@ -4452,6 +4170,7 @@
             <w:r>
               <w:rPr>
                 <w:rFonts w:ascii="Consolas" w:hAnsi="Consolas" w:cs="Consolas"/>
+                <w:strike/>
                 <w:color w:val="000000"/>
                 <w:sz w:val="19"/>
                 <w:szCs w:val="19"/>
@@ -4463,6 +4182,7 @@
             <w:r>
               <w:rPr>
                 <w:rFonts w:ascii="Consolas" w:hAnsi="Consolas" w:cs="Consolas"/>
+                <w:strike/>
                 <w:color w:val="000000"/>
                 <w:sz w:val="19"/>
                 <w:szCs w:val="19"/>
@@ -4482,6 +4202,7 @@
             <w:pPr>
               <w:rPr>
                 <w:rFonts w:ascii="Consolas" w:hAnsi="Consolas" w:cs="Consolas"/>
+                <w:strike/>
                 <w:color w:val="000000"/>
                 <w:sz w:val="19"/>
                 <w:szCs w:val="19"/>
@@ -4491,6 +4212,7 @@
             <w:r>
               <w:rPr>
                 <w:rFonts w:ascii="Consolas" w:hAnsi="Consolas" w:cs="Consolas"/>
+                <w:strike/>
                 <w:color w:val="000000"/>
                 <w:sz w:val="19"/>
                 <w:szCs w:val="19"/>
@@ -4502,6 +4224,7 @@
             <w:r>
               <w:rPr>
                 <w:rFonts w:ascii="Consolas" w:hAnsi="Consolas" w:cs="Consolas"/>
+                <w:strike/>
                 <w:color w:val="000000"/>
                 <w:sz w:val="19"/>
                 <w:szCs w:val="19"/>
@@ -4513,6 +4236,7 @@
             <w:r>
               <w:rPr>
                 <w:rFonts w:ascii="Consolas" w:hAnsi="Consolas" w:cs="Consolas"/>
+                <w:strike/>
                 <w:color w:val="000000"/>
                 <w:sz w:val="19"/>
                 <w:szCs w:val="19"/>
@@ -4525,6 +4249,7 @@
             <w:pPr>
               <w:rPr>
                 <w:rFonts w:ascii="Consolas" w:hAnsi="Consolas" w:cs="Consolas"/>
+                <w:strike/>
                 <w:color w:val="000000"/>
                 <w:sz w:val="19"/>
                 <w:szCs w:val="19"/>
@@ -4541,6 +4266,7 @@
             <w:pPr>
               <w:rPr>
                 <w:rFonts w:ascii="Consolas" w:hAnsi="Consolas" w:cs="Consolas"/>
+                <w:strike/>
                 <w:color w:val="000000"/>
                 <w:sz w:val="19"/>
                 <w:szCs w:val="19"/>
@@ -4550,6 +4276,7 @@
             <w:r>
               <w:rPr>
                 <w:rFonts w:ascii="Consolas" w:hAnsi="Consolas" w:cs="Consolas"/>
+                <w:strike/>
                 <w:color w:val="000000"/>
                 <w:sz w:val="19"/>
                 <w:szCs w:val="19"/>
@@ -4561,6 +4288,7 @@
             <w:r>
               <w:rPr>
                 <w:rFonts w:ascii="Consolas" w:hAnsi="Consolas" w:cs="Consolas"/>
+                <w:strike/>
                 <w:color w:val="000000"/>
                 <w:sz w:val="19"/>
                 <w:szCs w:val="19"/>
@@ -4572,6 +4300,7 @@
             <w:r>
               <w:rPr>
                 <w:rFonts w:ascii="Consolas" w:hAnsi="Consolas" w:cs="Consolas"/>
+                <w:strike/>
                 <w:color w:val="000000"/>
                 <w:sz w:val="19"/>
                 <w:szCs w:val="19"/>
@@ -4586,6 +4315,7 @@
             <w:pPr>
               <w:rPr>
                 <w:rFonts w:ascii="Consolas" w:hAnsi="Consolas" w:cs="Consolas"/>
+                <w:strike/>
                 <w:color w:val="000000"/>
                 <w:sz w:val="19"/>
                 <w:szCs w:val="19"/>
@@ -4595,6 +4325,7 @@
             <w:r>
               <w:rPr>
                 <w:rFonts w:ascii="Consolas" w:hAnsi="Consolas" w:cs="Consolas"/>
+                <w:strike/>
                 <w:color w:val="000000"/>
                 <w:sz w:val="19"/>
                 <w:szCs w:val="19"/>
@@ -4608,6 +4339,7 @@
             <w:r>
               <w:rPr>
                 <w:rFonts w:ascii="Consolas" w:hAnsi="Consolas" w:cs="Consolas"/>
+                <w:strike/>
                 <w:color w:val="000000"/>
                 <w:sz w:val="19"/>
                 <w:szCs w:val="19"/>
@@ -4621,6 +4353,7 @@
             <w:r>
               <w:rPr>
                 <w:rFonts w:ascii="Consolas" w:hAnsi="Consolas" w:cs="Consolas"/>
+                <w:strike/>
                 <w:color w:val="000000"/>
                 <w:sz w:val="19"/>
                 <w:szCs w:val="19"/>
@@ -4640,6 +4373,7 @@
             <w:pPr>
               <w:rPr>
                 <w:rFonts w:ascii="Consolas" w:hAnsi="Consolas" w:cs="Consolas"/>
+                <w:strike/>
                 <w:color w:val="000000"/>
                 <w:sz w:val="19"/>
                 <w:szCs w:val="19"/>
@@ -4649,6 +4383,7 @@
             <w:r>
               <w:rPr>
                 <w:rFonts w:ascii="Consolas" w:hAnsi="Consolas" w:cs="Consolas"/>
+                <w:strike/>
                 <w:color w:val="000000"/>
                 <w:sz w:val="19"/>
                 <w:szCs w:val="19"/>
@@ -4660,6 +4395,7 @@
             <w:r>
               <w:rPr>
                 <w:rFonts w:ascii="Consolas" w:hAnsi="Consolas" w:cs="Consolas"/>
+                <w:strike/>
                 <w:color w:val="000000"/>
                 <w:sz w:val="19"/>
                 <w:szCs w:val="19"/>
@@ -4671,6 +4407,7 @@
             <w:r>
               <w:rPr>
                 <w:rFonts w:ascii="Consolas" w:hAnsi="Consolas" w:cs="Consolas"/>
+                <w:strike/>
                 <w:color w:val="000000"/>
                 <w:sz w:val="19"/>
                 <w:szCs w:val="19"/>
@@ -4688,6 +4425,7 @@
             <w:pPr>
               <w:rPr>
                 <w:rFonts w:ascii="Consolas" w:hAnsi="Consolas" w:cs="Consolas"/>
+                <w:strike/>
                 <w:color w:val="000000"/>
                 <w:sz w:val="19"/>
                 <w:szCs w:val="19"/>
@@ -4697,6 +4435,7 @@
             <w:r>
               <w:rPr>
                 <w:rFonts w:ascii="Consolas" w:hAnsi="Consolas" w:cs="Consolas"/>
+                <w:strike/>
                 <w:color w:val="000000"/>
                 <w:sz w:val="19"/>
                 <w:szCs w:val="19"/>
@@ -4708,6 +4447,7 @@
             <w:r>
               <w:rPr>
                 <w:rFonts w:ascii="Consolas" w:hAnsi="Consolas" w:cs="Consolas"/>
+                <w:strike/>
                 <w:color w:val="000000"/>
                 <w:sz w:val="19"/>
                 <w:szCs w:val="19"/>
@@ -4721,6 +4461,7 @@
             <w:r>
               <w:rPr>
                 <w:rFonts w:ascii="Consolas" w:hAnsi="Consolas" w:cs="Consolas"/>
+                <w:strike/>
                 <w:color w:val="000000"/>
                 <w:sz w:val="19"/>
                 <w:szCs w:val="19"/>
@@ -4733,6 +4474,7 @@
             <w:pPr>
               <w:rPr>
                 <w:rFonts w:ascii="Consolas" w:hAnsi="Consolas" w:cs="Consolas"/>
+                <w:strike/>
                 <w:color w:val="000000"/>
                 <w:sz w:val="19"/>
                 <w:szCs w:val="19"/>
@@ -4742,6 +4484,7 @@
             <w:r>
               <w:rPr>
                 <w:rFonts w:ascii="Consolas" w:hAnsi="Consolas" w:cs="Consolas"/>
+                <w:strike/>
                 <w:color w:val="000000"/>
                 <w:sz w:val="19"/>
                 <w:szCs w:val="19"/>
@@ -4753,6 +4496,7 @@
             <w:r>
               <w:rPr>
                 <w:rFonts w:ascii="Consolas" w:hAnsi="Consolas" w:cs="Consolas"/>
+                <w:strike/>
                 <w:color w:val="000000"/>
                 <w:sz w:val="19"/>
                 <w:szCs w:val="19"/>
@@ -4764,6 +4508,7 @@
             <w:r>
               <w:rPr>
                 <w:rFonts w:ascii="Consolas" w:hAnsi="Consolas" w:cs="Consolas"/>
+                <w:strike/>
                 <w:color w:val="000000"/>
                 <w:sz w:val="19"/>
                 <w:szCs w:val="19"/>
@@ -4783,6 +4528,7 @@
             <w:pPr>
               <w:rPr>
                 <w:rFonts w:ascii="Consolas" w:hAnsi="Consolas" w:cs="Consolas"/>
+                <w:strike/>
                 <w:color w:val="000000"/>
                 <w:sz w:val="19"/>
                 <w:szCs w:val="19"/>
@@ -4792,6 +4538,7 @@
             <w:r>
               <w:rPr>
                 <w:rFonts w:ascii="Consolas" w:hAnsi="Consolas" w:cs="Consolas"/>
+                <w:strike/>
                 <w:color w:val="000000"/>
                 <w:sz w:val="19"/>
                 <w:szCs w:val="19"/>
@@ -4803,6 +4550,7 @@
             <w:r>
               <w:rPr>
                 <w:rFonts w:ascii="Consolas" w:hAnsi="Consolas" w:cs="Consolas"/>
+                <w:strike/>
                 <w:color w:val="000000"/>
                 <w:sz w:val="19"/>
                 <w:szCs w:val="19"/>
@@ -4814,6 +4562,7 @@
             <w:r>
               <w:rPr>
                 <w:rFonts w:ascii="Consolas" w:hAnsi="Consolas" w:cs="Consolas"/>
+                <w:strike/>
                 <w:color w:val="000000"/>
                 <w:sz w:val="19"/>
                 <w:szCs w:val="19"/>
@@ -4826,6 +4575,7 @@
             <w:pPr>
               <w:rPr>
                 <w:rFonts w:ascii="Consolas" w:hAnsi="Consolas" w:cs="Consolas"/>
+                <w:strike/>
                 <w:color w:val="000000"/>
                 <w:sz w:val="19"/>
                 <w:szCs w:val="19"/>
@@ -4842,6 +4592,7 @@
             <w:pPr>
               <w:rPr>
                 <w:rFonts w:ascii="Consolas" w:hAnsi="Consolas" w:cs="Consolas"/>
+                <w:strike/>
                 <w:color w:val="000000"/>
                 <w:sz w:val="19"/>
                 <w:szCs w:val="19"/>
@@ -4851,6 +4602,7 @@
             <w:r>
               <w:rPr>
                 <w:rFonts w:ascii="Consolas" w:hAnsi="Consolas" w:cs="Consolas"/>
+                <w:strike/>
                 <w:color w:val="000000"/>
                 <w:sz w:val="19"/>
                 <w:szCs w:val="19"/>
@@ -4862,6 +4614,7 @@
             <w:r>
               <w:rPr>
                 <w:rFonts w:ascii="Consolas" w:hAnsi="Consolas" w:cs="Consolas"/>
+                <w:strike/>
                 <w:color w:val="000000"/>
                 <w:sz w:val="19"/>
                 <w:szCs w:val="19"/>
@@ -4875,6 +4628,7 @@
             <w:r>
               <w:rPr>
                 <w:rFonts w:ascii="Consolas" w:hAnsi="Consolas" w:cs="Consolas"/>
+                <w:strike/>
                 <w:color w:val="000000"/>
                 <w:sz w:val="19"/>
                 <w:szCs w:val="19"/>
@@ -4887,6 +4641,7 @@
             <w:pPr>
               <w:rPr>
                 <w:rFonts w:ascii="Consolas" w:hAnsi="Consolas" w:cs="Consolas"/>
+                <w:strike/>
                 <w:color w:val="000000"/>
                 <w:sz w:val="19"/>
                 <w:szCs w:val="19"/>
@@ -4896,6 +4651,7 @@
             <w:r>
               <w:rPr>
                 <w:rFonts w:ascii="Consolas" w:hAnsi="Consolas" w:cs="Consolas"/>
+                <w:strike/>
                 <w:color w:val="000000"/>
                 <w:sz w:val="19"/>
                 <w:szCs w:val="19"/>
@@ -4907,6 +4663,7 @@
             <w:r>
               <w:rPr>
                 <w:rFonts w:ascii="Consolas" w:hAnsi="Consolas" w:cs="Consolas"/>
+                <w:strike/>
                 <w:color w:val="000000"/>
                 <w:sz w:val="19"/>
                 <w:szCs w:val="19"/>
@@ -4920,6 +4677,7 @@
             <w:r>
               <w:rPr>
                 <w:rFonts w:ascii="Consolas" w:hAnsi="Consolas" w:cs="Consolas"/>
+                <w:strike/>
                 <w:color w:val="000000"/>
                 <w:sz w:val="19"/>
                 <w:szCs w:val="19"/>
@@ -4935,26 +4693,29 @@
       <w:pPr>
         <w:rPr>
           <w:rFonts w:ascii="Consolas" w:hAnsi="Consolas" w:cs="Consolas"/>
-          <w:color w:val="000000"/>
-          <w:sz w:val="19"/>
-          <w:szCs w:val="19"/>
-          <w:lang w:val="en-US"/>
-        </w:rPr>
-      </w:pPr>
-    </w:p>
-    <w:p>
-      <w:pPr>
-        <w:rPr>
-          <w:rFonts w:ascii="Consolas" w:hAnsi="Consolas" w:cs="Consolas"/>
-          <w:color w:val="000000"/>
-          <w:sz w:val="19"/>
-          <w:szCs w:val="19"/>
-          <w:lang w:val="en-US"/>
-        </w:rPr>
-      </w:pPr>
-      <w:r>
-        <w:rPr>
-          <w:rFonts w:ascii="Consolas" w:hAnsi="Consolas" w:cs="Consolas"/>
+          <w:strike/>
+          <w:color w:val="000000"/>
+          <w:sz w:val="19"/>
+          <w:szCs w:val="19"/>
+          <w:lang w:val="en-US"/>
+        </w:rPr>
+      </w:pPr>
+    </w:p>
+    <w:p>
+      <w:pPr>
+        <w:rPr>
+          <w:rFonts w:ascii="Consolas" w:hAnsi="Consolas" w:cs="Consolas"/>
+          <w:strike/>
+          <w:color w:val="000000"/>
+          <w:sz w:val="19"/>
+          <w:szCs w:val="19"/>
+          <w:lang w:val="en-US"/>
+        </w:rPr>
+      </w:pPr>
+      <w:r>
+        <w:rPr>
+          <w:rFonts w:ascii="Consolas" w:hAnsi="Consolas" w:cs="Consolas"/>
+          <w:strike/>
           <w:color w:val="000000"/>
           <w:sz w:val="19"/>
           <w:szCs w:val="19"/>
@@ -4967,15 +4728,17 @@
       <w:pPr>
         <w:rPr>
           <w:rFonts w:ascii="Consolas" w:hAnsi="Consolas" w:cs="Consolas"/>
-          <w:color w:val="000000"/>
-          <w:sz w:val="19"/>
-          <w:szCs w:val="19"/>
-          <w:lang w:val="en-US"/>
-        </w:rPr>
-      </w:pPr>
-      <w:r>
-        <w:rPr>
-          <w:rFonts w:ascii="Consolas" w:hAnsi="Consolas" w:cs="Consolas"/>
+          <w:strike/>
+          <w:color w:val="000000"/>
+          <w:sz w:val="19"/>
+          <w:szCs w:val="19"/>
+          <w:lang w:val="en-US"/>
+        </w:rPr>
+      </w:pPr>
+      <w:r>
+        <w:rPr>
+          <w:rFonts w:ascii="Consolas" w:hAnsi="Consolas" w:cs="Consolas"/>
+          <w:strike/>
           <w:color w:val="000000"/>
           <w:sz w:val="19"/>
           <w:szCs w:val="19"/>
@@ -4988,137 +4751,63 @@
       <w:pPr>
         <w:rPr>
           <w:rFonts w:ascii="Consolas" w:hAnsi="Consolas" w:cs="Consolas"/>
-          <w:color w:val="000000"/>
-          <w:sz w:val="19"/>
-          <w:szCs w:val="19"/>
-          <w:lang w:val="en-US"/>
-        </w:rPr>
-      </w:pPr>
-      <w:r>
-        <w:rPr>
-          <w:rFonts w:ascii="Consolas" w:hAnsi="Consolas" w:cs="Consolas"/>
-          <w:color w:val="000000"/>
-          <w:sz w:val="19"/>
-          <w:szCs w:val="19"/>
-          <w:lang w:val="en-US"/>
-        </w:rPr>
-        <w:t>If the pattern starts with ????, there is</w:t>
-      </w:r>
-      <w:r>
-        <w:rPr>
-          <w:rFonts w:ascii="Consolas" w:hAnsi="Consolas" w:cs="Consolas"/>
-          <w:color w:val="000000"/>
-          <w:sz w:val="19"/>
-          <w:szCs w:val="19"/>
-          <w:lang w:val="en-US"/>
-        </w:rPr>
-        <w:t xml:space="preserve"> at most one match that, if it exists, </w:t>
-      </w:r>
-      <w:r>
-        <w:rPr>
-          <w:rFonts w:ascii="Consolas" w:hAnsi="Consolas" w:cs="Consolas"/>
-          <w:color w:val="000000"/>
-          <w:sz w:val="19"/>
-          <w:szCs w:val="19"/>
-          <w:lang w:val="en-US"/>
-        </w:rPr>
-        <w:t>starts on the first token up to the end of the last match.</w:t>
-      </w:r>
-    </w:p>
-    <w:p>
-      <w:pPr>
-        <w:rPr>
-          <w:rFonts w:ascii="Consolas" w:hAnsi="Consolas" w:cs="Consolas"/>
-          <w:color w:val="000000"/>
-          <w:sz w:val="19"/>
-          <w:szCs w:val="19"/>
-          <w:lang w:val="en-US"/>
-        </w:rPr>
-      </w:pPr>
-      <w:r>
-        <w:rPr>
-          <w:rFonts w:ascii="Consolas" w:hAnsi="Consolas" w:cs="Consolas"/>
-          <w:color w:val="000000"/>
-          <w:sz w:val="19"/>
-          <w:szCs w:val="19"/>
-          <w:lang w:val="en-US"/>
-        </w:rPr>
-        <w:t xml:space="preserve">If the pattern </w:t>
-      </w:r>
-      <w:r>
-        <w:rPr>
-          <w:rFonts w:ascii="Consolas" w:hAnsi="Consolas" w:cs="Consolas"/>
-          <w:color w:val="000000"/>
-          <w:sz w:val="19"/>
-          <w:szCs w:val="19"/>
-          <w:lang w:val="en-US"/>
-        </w:rPr>
-        <w:t>ends</w:t>
-      </w:r>
-      <w:r>
-        <w:rPr>
-          <w:rFonts w:ascii="Consolas" w:hAnsi="Consolas" w:cs="Consolas"/>
-          <w:color w:val="000000"/>
-          <w:sz w:val="19"/>
-          <w:szCs w:val="19"/>
-          <w:lang w:val="en-US"/>
-        </w:rPr>
-        <w:t xml:space="preserve"> with ????, there is at most one match that, if it exists, starts on the first token </w:t>
-      </w:r>
-      <w:r>
-        <w:rPr>
-          <w:rFonts w:ascii="Consolas" w:hAnsi="Consolas" w:cs="Consolas"/>
-          <w:color w:val="000000"/>
-          <w:sz w:val="19"/>
-          <w:szCs w:val="19"/>
-          <w:lang w:val="en-US"/>
-        </w:rPr>
-        <w:t xml:space="preserve">of the first match </w:t>
-      </w:r>
-      <w:r>
-        <w:rPr>
-          <w:rFonts w:ascii="Consolas" w:hAnsi="Consolas" w:cs="Consolas"/>
-          <w:color w:val="000000"/>
-          <w:sz w:val="19"/>
-          <w:szCs w:val="19"/>
-          <w:lang w:val="en-US"/>
-        </w:rPr>
-        <w:t xml:space="preserve">up to the end of the </w:t>
-      </w:r>
-      <w:r>
-        <w:rPr>
-          <w:rFonts w:ascii="Consolas" w:hAnsi="Consolas" w:cs="Consolas"/>
-          <w:color w:val="000000"/>
-          <w:sz w:val="19"/>
-          <w:szCs w:val="19"/>
-          <w:lang w:val="en-US"/>
-        </w:rPr>
-        <w:t>tokens to match</w:t>
-      </w:r>
-      <w:r>
-        <w:rPr>
-          <w:rFonts w:ascii="Consolas" w:hAnsi="Consolas" w:cs="Consolas"/>
-          <w:color w:val="000000"/>
-          <w:sz w:val="19"/>
-          <w:szCs w:val="19"/>
-          <w:lang w:val="en-US"/>
-        </w:rPr>
-        <w:t>.</w:t>
-      </w:r>
-    </w:p>
-    <w:p>
-      <w:pPr>
-        <w:rPr>
-          <w:rFonts w:ascii="Consolas" w:hAnsi="Consolas" w:cs="Consolas"/>
-          <w:color w:val="000000"/>
-          <w:sz w:val="19"/>
-          <w:szCs w:val="19"/>
-          <w:lang w:val="en-US"/>
-        </w:rPr>
-      </w:pPr>
-      <w:r>
-        <w:rPr>
-          <w:rFonts w:ascii="Consolas" w:hAnsi="Consolas" w:cs="Consolas"/>
+          <w:strike/>
+          <w:color w:val="000000"/>
+          <w:sz w:val="19"/>
+          <w:szCs w:val="19"/>
+          <w:lang w:val="en-US"/>
+        </w:rPr>
+      </w:pPr>
+      <w:r>
+        <w:rPr>
+          <w:rFonts w:ascii="Consolas" w:hAnsi="Consolas" w:cs="Consolas"/>
+          <w:strike/>
+          <w:color w:val="000000"/>
+          <w:sz w:val="19"/>
+          <w:szCs w:val="19"/>
+          <w:lang w:val="en-US"/>
+        </w:rPr>
+        <w:t>If the pattern starts with ????, there is at most one match that, if it exists, starts on the first token up to the end of the last match.</w:t>
+      </w:r>
+    </w:p>
+    <w:p>
+      <w:pPr>
+        <w:rPr>
+          <w:rFonts w:ascii="Consolas" w:hAnsi="Consolas" w:cs="Consolas"/>
+          <w:strike/>
+          <w:color w:val="000000"/>
+          <w:sz w:val="19"/>
+          <w:szCs w:val="19"/>
+          <w:lang w:val="en-US"/>
+        </w:rPr>
+      </w:pPr>
+      <w:r>
+        <w:rPr>
+          <w:rFonts w:ascii="Consolas" w:hAnsi="Consolas" w:cs="Consolas"/>
+          <w:strike/>
+          <w:color w:val="000000"/>
+          <w:sz w:val="19"/>
+          <w:szCs w:val="19"/>
+          <w:lang w:val="en-US"/>
+        </w:rPr>
+        <w:t>If the pattern ends with ????, there is at most one match that, if it exists, starts on the first token of the first match up to the end of the tokens to match.</w:t>
+      </w:r>
+    </w:p>
+    <w:p>
+      <w:pPr>
+        <w:rPr>
+          <w:rFonts w:ascii="Consolas" w:hAnsi="Consolas" w:cs="Consolas"/>
+          <w:strike/>
+          <w:color w:val="000000"/>
+          <w:sz w:val="19"/>
+          <w:szCs w:val="19"/>
+          <w:lang w:val="en-US"/>
+        </w:rPr>
+      </w:pPr>
+      <w:r>
+        <w:rPr>
+          <w:rFonts w:ascii="Consolas" w:hAnsi="Consolas" w:cs="Consolas"/>
+          <w:strike/>
           <w:color w:val="000000"/>
           <w:sz w:val="19"/>
           <w:szCs w:val="19"/>
@@ -5129,6 +4818,7 @@
       <w:r>
         <w:rPr>
           <w:rFonts w:ascii="Consolas" w:hAnsi="Consolas" w:cs="Consolas"/>
+          <w:strike/>
           <w:color w:val="000000"/>
           <w:sz w:val="19"/>
           <w:szCs w:val="19"/>
@@ -5139,6 +4829,7 @@
       <w:r>
         <w:rPr>
           <w:rFonts w:ascii="Consolas" w:hAnsi="Consolas" w:cs="Consolas"/>
+          <w:strike/>
           <w:color w:val="000000"/>
           <w:sz w:val="19"/>
           <w:szCs w:val="19"/>
@@ -5149,6 +4840,7 @@
       <w:r>
         <w:rPr>
           <w:rFonts w:ascii="Consolas" w:hAnsi="Consolas" w:cs="Consolas"/>
+          <w:strike/>
           <w:color w:val="000000"/>
           <w:sz w:val="19"/>
           <w:szCs w:val="19"/>
@@ -5159,6 +4851,7 @@
       <w:r>
         <w:rPr>
           <w:rFonts w:ascii="Consolas" w:hAnsi="Consolas" w:cs="Consolas"/>
+          <w:strike/>
           <w:color w:val="000000"/>
           <w:sz w:val="19"/>
           <w:szCs w:val="19"/>
@@ -5169,6 +4862,7 @@
       <w:r>
         <w:rPr>
           <w:rFonts w:ascii="Consolas" w:hAnsi="Consolas" w:cs="Consolas"/>
+          <w:strike/>
           <w:color w:val="000000"/>
           <w:sz w:val="19"/>
           <w:szCs w:val="19"/>
@@ -5179,6 +4873,7 @@
       <w:r>
         <w:rPr>
           <w:rFonts w:ascii="Consolas" w:hAnsi="Consolas" w:cs="Consolas"/>
+          <w:strike/>
           <w:color w:val="000000"/>
           <w:sz w:val="19"/>
           <w:szCs w:val="19"/>
@@ -5191,11 +4886,13 @@
       <w:pPr>
         <w:pStyle w:val="Heading2"/>
         <w:rPr>
-          <w:lang w:val="en-US"/>
-        </w:rPr>
-      </w:pPr>
-      <w:r>
-        <w:rPr>
+          <w:strike/>
+          <w:lang w:val="en-US"/>
+        </w:rPr>
+      </w:pPr>
+      <w:r>
+        <w:rPr>
+          <w:strike/>
           <w:lang w:val="en-US"/>
         </w:rPr>
         <w:t>Statement and Part matching</w:t>
@@ -5205,15 +4902,17 @@
       <w:pPr>
         <w:rPr>
           <w:rFonts w:ascii="Consolas" w:hAnsi="Consolas" w:cs="Consolas"/>
-          <w:color w:val="000000"/>
-          <w:sz w:val="19"/>
-          <w:szCs w:val="19"/>
-          <w:lang w:val="en-US"/>
-        </w:rPr>
-      </w:pPr>
-      <w:r>
-        <w:rPr>
-          <w:rFonts w:ascii="Consolas" w:hAnsi="Consolas" w:cs="Consolas"/>
+          <w:strike/>
+          <w:color w:val="000000"/>
+          <w:sz w:val="19"/>
+          <w:szCs w:val="19"/>
+          <w:lang w:val="en-US"/>
+        </w:rPr>
+      </w:pPr>
+      <w:r>
+        <w:rPr>
+          <w:rFonts w:ascii="Consolas" w:hAnsi="Consolas" w:cs="Consolas"/>
+          <w:strike/>
           <w:color w:val="000000"/>
           <w:sz w:val="19"/>
           <w:szCs w:val="19"/>
@@ -5224,6 +4923,7 @@
       <w:r>
         <w:rPr>
           <w:rFonts w:ascii="Consolas" w:hAnsi="Consolas" w:cs="Consolas"/>
+          <w:strike/>
           <w:color w:val="000000"/>
           <w:sz w:val="19"/>
           <w:szCs w:val="19"/>
@@ -5234,37 +4934,30 @@
       <w:r>
         <w:rPr>
           <w:rFonts w:ascii="Consolas" w:hAnsi="Consolas" w:cs="Consolas"/>
-          <w:color w:val="000000"/>
-          <w:sz w:val="19"/>
-          <w:szCs w:val="19"/>
-          <w:lang w:val="en-US"/>
-        </w:rPr>
-        <w:t>t</w:t>
-      </w:r>
-      <w:r>
-        <w:rPr>
-          <w:rFonts w:ascii="Consolas" w:hAnsi="Consolas" w:cs="Consolas"/>
-          <w:color w:val="000000"/>
-          <w:sz w:val="19"/>
-          <w:szCs w:val="19"/>
-          <w:lang w:val="en-US"/>
-        </w:rPr>
-        <w:t xml:space="preserve">he result of the match is the ‘part’ or the ‘statement’ node regardless of the match location or the number of matches. </w:t>
-      </w:r>
-    </w:p>
-    <w:p>
-      <w:pPr>
-        <w:rPr>
-          <w:rFonts w:ascii="Consolas" w:hAnsi="Consolas" w:cs="Consolas"/>
-          <w:color w:val="000000"/>
-          <w:sz w:val="19"/>
-          <w:szCs w:val="19"/>
-          <w:lang w:val="en-US"/>
-        </w:rPr>
-      </w:pPr>
-      <w:r>
-        <w:rPr>
-          <w:rFonts w:ascii="Consolas" w:hAnsi="Consolas" w:cs="Consolas"/>
+          <w:strike/>
+          <w:color w:val="000000"/>
+          <w:sz w:val="19"/>
+          <w:szCs w:val="19"/>
+          <w:lang w:val="en-US"/>
+        </w:rPr>
+        <w:t xml:space="preserve">the result of the match is the ‘part’ or the ‘statement’ node regardless of the match location or the number of matches. </w:t>
+      </w:r>
+    </w:p>
+    <w:p>
+      <w:pPr>
+        <w:rPr>
+          <w:rFonts w:ascii="Consolas" w:hAnsi="Consolas" w:cs="Consolas"/>
+          <w:strike/>
+          <w:color w:val="000000"/>
+          <w:sz w:val="19"/>
+          <w:szCs w:val="19"/>
+          <w:lang w:val="en-US"/>
+        </w:rPr>
+      </w:pPr>
+      <w:r>
+        <w:rPr>
+          <w:rFonts w:ascii="Consolas" w:hAnsi="Consolas" w:cs="Consolas"/>
+          <w:strike/>
           <w:color w:val="000000"/>
           <w:sz w:val="19"/>
           <w:szCs w:val="19"/>
@@ -5275,16 +4968,75 @@
       <w:r>
         <w:rPr>
           <w:rFonts w:ascii="Consolas" w:hAnsi="Consolas" w:cs="Consolas"/>
-          <w:color w:val="000000"/>
-          <w:sz w:val="19"/>
-          <w:szCs w:val="19"/>
-          <w:lang w:val="en-US"/>
-        </w:rPr>
-        <w:t>f the pattern starts with ???</w:t>
-      </w:r>
-      <w:r>
-        <w:rPr>
-          <w:rFonts w:ascii="Consolas" w:hAnsi="Consolas" w:cs="Consolas"/>
+          <w:strike/>
+          <w:color w:val="000000"/>
+          <w:sz w:val="19"/>
+          <w:szCs w:val="19"/>
+          <w:lang w:val="en-US"/>
+        </w:rPr>
+        <w:t xml:space="preserve">f the pattern starts with ??? </w:t>
+      </w:r>
+      <w:proofErr w:type="gramStart"/>
+      <w:r>
+        <w:rPr>
+          <w:rFonts w:ascii="Consolas" w:hAnsi="Consolas" w:cs="Consolas"/>
+          <w:strike/>
+          <w:color w:val="000000"/>
+          <w:sz w:val="19"/>
+          <w:szCs w:val="19"/>
+          <w:lang w:val="en-US"/>
+        </w:rPr>
+        <w:t>or ????</w:t>
+      </w:r>
+      <w:proofErr w:type="gramEnd"/>
+      <w:r>
+        <w:rPr>
+          <w:rFonts w:ascii="Consolas" w:hAnsi="Consolas" w:cs="Consolas"/>
+          <w:strike/>
+          <w:color w:val="000000"/>
+          <w:sz w:val="19"/>
+          <w:szCs w:val="19"/>
+          <w:lang w:val="en-US"/>
+        </w:rPr>
+        <w:t xml:space="preserve"> (and these two are equivalent)</w:t>
+      </w:r>
+      <w:r>
+        <w:rPr>
+          <w:rFonts w:ascii="Consolas" w:hAnsi="Consolas" w:cs="Consolas"/>
+          <w:strike/>
+          <w:color w:val="000000"/>
+          <w:sz w:val="19"/>
+          <w:szCs w:val="19"/>
+          <w:lang w:val="en-US"/>
+        </w:rPr>
+        <w:t xml:space="preserve"> the match can occur anywhere otherwise the match must </w:t>
+      </w:r>
+      <w:r>
+        <w:rPr>
+          <w:rFonts w:ascii="Consolas" w:hAnsi="Consolas" w:cs="Consolas"/>
+          <w:strike/>
+          <w:color w:val="000000"/>
+          <w:sz w:val="19"/>
+          <w:szCs w:val="19"/>
+          <w:lang w:val="en-US"/>
+        </w:rPr>
+        <w:t>occur</w:t>
+      </w:r>
+      <w:r>
+        <w:rPr>
+          <w:rFonts w:ascii="Consolas" w:hAnsi="Consolas" w:cs="Consolas"/>
+          <w:strike/>
+          <w:color w:val="000000"/>
+          <w:sz w:val="19"/>
+          <w:szCs w:val="19"/>
+          <w:lang w:val="en-US"/>
+        </w:rPr>
+        <w:t xml:space="preserve"> on the first token of the node.</w:t>
+      </w:r>
+      <w:r>
+        <w:rPr>
+          <w:rFonts w:ascii="Consolas" w:hAnsi="Consolas" w:cs="Consolas"/>
+          <w:strike/>
           <w:color w:val="000000"/>
           <w:sz w:val="19"/>
           <w:szCs w:val="19"/>
@@ -5292,161 +5044,97 @@
         </w:rPr>
         <w:t xml:space="preserve"> </w:t>
       </w:r>
-      <w:proofErr w:type="gramStart"/>
-      <w:r>
-        <w:rPr>
-          <w:rFonts w:ascii="Consolas" w:hAnsi="Consolas" w:cs="Consolas"/>
-          <w:color w:val="000000"/>
-          <w:sz w:val="19"/>
-          <w:szCs w:val="19"/>
-          <w:lang w:val="en-US"/>
-        </w:rPr>
-        <w:t>or ????</w:t>
-      </w:r>
-      <w:proofErr w:type="gramEnd"/>
-      <w:r>
-        <w:rPr>
-          <w:rFonts w:ascii="Consolas" w:hAnsi="Consolas" w:cs="Consolas"/>
-          <w:color w:val="000000"/>
-          <w:sz w:val="19"/>
-          <w:szCs w:val="19"/>
-          <w:lang w:val="en-US"/>
-        </w:rPr>
-        <w:t xml:space="preserve"> (and these two are equivalent)</w:t>
-      </w:r>
-      <w:r>
-        <w:rPr>
-          <w:rFonts w:ascii="Consolas" w:hAnsi="Consolas" w:cs="Consolas"/>
-          <w:color w:val="000000"/>
-          <w:sz w:val="19"/>
-          <w:szCs w:val="19"/>
-          <w:lang w:val="en-US"/>
-        </w:rPr>
-        <w:t xml:space="preserve"> </w:t>
-      </w:r>
-      <w:r>
-        <w:rPr>
-          <w:rFonts w:ascii="Consolas" w:hAnsi="Consolas" w:cs="Consolas"/>
-          <w:color w:val="000000"/>
-          <w:sz w:val="19"/>
-          <w:szCs w:val="19"/>
-          <w:lang w:val="en-US"/>
-        </w:rPr>
-        <w:t xml:space="preserve">the match can occur anywhere otherwise the match must </w:t>
-      </w:r>
-      <w:r>
-        <w:rPr>
-          <w:rFonts w:ascii="Consolas" w:hAnsi="Consolas" w:cs="Consolas"/>
-          <w:color w:val="000000"/>
-          <w:sz w:val="19"/>
-          <w:szCs w:val="19"/>
-          <w:lang w:val="en-US"/>
-        </w:rPr>
-        <w:t>occur</w:t>
-      </w:r>
-      <w:r>
-        <w:rPr>
-          <w:rFonts w:ascii="Consolas" w:hAnsi="Consolas" w:cs="Consolas"/>
-          <w:color w:val="000000"/>
-          <w:sz w:val="19"/>
-          <w:szCs w:val="19"/>
-          <w:lang w:val="en-US"/>
-        </w:rPr>
-        <w:t xml:space="preserve"> on the first token of the node.</w:t>
-      </w:r>
-      <w:r>
-        <w:rPr>
-          <w:rFonts w:ascii="Consolas" w:hAnsi="Consolas" w:cs="Consolas"/>
-          <w:color w:val="000000"/>
-          <w:sz w:val="19"/>
-          <w:szCs w:val="19"/>
-          <w:lang w:val="en-US"/>
-        </w:rPr>
-        <w:t xml:space="preserve"> </w:t>
-      </w:r>
-    </w:p>
-    <w:p>
-      <w:pPr>
-        <w:rPr>
-          <w:rFonts w:ascii="Consolas" w:hAnsi="Consolas" w:cs="Consolas"/>
-          <w:color w:val="000000"/>
-          <w:sz w:val="19"/>
-          <w:szCs w:val="19"/>
-          <w:lang w:val="en-US"/>
-        </w:rPr>
-      </w:pPr>
-      <w:r>
-        <w:rPr>
-          <w:rFonts w:ascii="Consolas" w:hAnsi="Consolas" w:cs="Consolas"/>
+    </w:p>
+    <w:p>
+      <w:pPr>
+        <w:rPr>
+          <w:rFonts w:ascii="Consolas" w:hAnsi="Consolas" w:cs="Consolas"/>
+          <w:strike/>
+          <w:color w:val="000000"/>
+          <w:sz w:val="19"/>
+          <w:szCs w:val="19"/>
+          <w:lang w:val="en-US"/>
+        </w:rPr>
+      </w:pPr>
+      <w:r>
+        <w:rPr>
+          <w:rFonts w:ascii="Consolas" w:hAnsi="Consolas" w:cs="Consolas"/>
+          <w:strike/>
+          <w:color w:val="000000"/>
+          <w:sz w:val="19"/>
+          <w:szCs w:val="19"/>
+          <w:lang w:val="en-US"/>
+        </w:rPr>
+        <w:t xml:space="preserve">In ‘statement’ or ‘part’, </w:t>
+      </w:r>
+      <w:r>
+        <w:rPr>
+          <w:rFonts w:ascii="Consolas" w:hAnsi="Consolas" w:cs="Consolas"/>
+          <w:strike/>
+          <w:color w:val="000000"/>
+          <w:sz w:val="19"/>
+          <w:szCs w:val="19"/>
+          <w:lang w:val="en-US"/>
+        </w:rPr>
+        <w:t xml:space="preserve">internal </w:t>
+      </w:r>
+      <w:r>
+        <w:rPr>
+          <w:rFonts w:ascii="Consolas" w:hAnsi="Consolas" w:cs="Consolas"/>
+          <w:strike/>
+          <w:color w:val="000000"/>
+          <w:sz w:val="19"/>
+          <w:szCs w:val="19"/>
+          <w:lang w:val="en-US"/>
+        </w:rPr>
+        <w:t xml:space="preserve">??? and ???? have exactly the same effect: the sequence of </w:t>
+      </w:r>
+      <w:proofErr w:type="spellStart"/>
+      <w:r>
+        <w:rPr>
+          <w:rFonts w:ascii="Consolas" w:hAnsi="Consolas" w:cs="Consolas"/>
+          <w:strike/>
+          <w:color w:val="000000"/>
+          <w:sz w:val="19"/>
+          <w:szCs w:val="19"/>
+          <w:lang w:val="en-US"/>
+        </w:rPr>
+        <w:t>PatternTokenList</w:t>
+      </w:r>
+      <w:proofErr w:type="spellEnd"/>
+      <w:r>
+        <w:rPr>
+          <w:rFonts w:ascii="Consolas" w:hAnsi="Consolas" w:cs="Consolas"/>
+          <w:strike/>
+          <w:color w:val="000000"/>
+          <w:sz w:val="19"/>
+          <w:szCs w:val="19"/>
+          <w:lang w:val="en-US"/>
+        </w:rPr>
+        <w:t xml:space="preserve"> must be found in order to succeed regardless of the match location.</w:t>
+      </w:r>
+    </w:p>
+    <w:p>
+      <w:pPr>
+        <w:rPr>
+          <w:rFonts w:ascii="Consolas" w:hAnsi="Consolas" w:cs="Consolas"/>
+          <w:strike/>
+          <w:color w:val="000000"/>
+          <w:sz w:val="19"/>
+          <w:szCs w:val="19"/>
+          <w:lang w:val="en-US"/>
+        </w:rPr>
+      </w:pPr>
+      <w:r>
+        <w:rPr>
+          <w:rFonts w:ascii="Consolas" w:hAnsi="Consolas" w:cs="Consolas"/>
+          <w:strike/>
           <w:color w:val="000000"/>
           <w:sz w:val="19"/>
           <w:szCs w:val="19"/>
           <w:lang w:val="en-US"/>
         </w:rPr>
         <w:lastRenderedPageBreak/>
-        <w:t xml:space="preserve">In ‘statement’ or ‘part’, </w:t>
-      </w:r>
-      <w:r>
-        <w:rPr>
-          <w:rFonts w:ascii="Consolas" w:hAnsi="Consolas" w:cs="Consolas"/>
-          <w:color w:val="000000"/>
-          <w:sz w:val="19"/>
-          <w:szCs w:val="19"/>
-          <w:lang w:val="en-US"/>
-        </w:rPr>
-        <w:t xml:space="preserve">internal </w:t>
-      </w:r>
-      <w:r>
-        <w:rPr>
-          <w:rFonts w:ascii="Consolas" w:hAnsi="Consolas" w:cs="Consolas"/>
-          <w:color w:val="000000"/>
-          <w:sz w:val="19"/>
-          <w:szCs w:val="19"/>
-          <w:lang w:val="en-US"/>
-        </w:rPr>
-        <w:t xml:space="preserve">??? and ???? have exactly the same effect: the sequence of </w:t>
-      </w:r>
-      <w:proofErr w:type="spellStart"/>
-      <w:r>
-        <w:rPr>
-          <w:rFonts w:ascii="Consolas" w:hAnsi="Consolas" w:cs="Consolas"/>
-          <w:color w:val="000000"/>
-          <w:sz w:val="19"/>
-          <w:szCs w:val="19"/>
-          <w:lang w:val="en-US"/>
-        </w:rPr>
-        <w:t>PatternTokenList</w:t>
-      </w:r>
-      <w:proofErr w:type="spellEnd"/>
-      <w:r>
-        <w:rPr>
-          <w:rFonts w:ascii="Consolas" w:hAnsi="Consolas" w:cs="Consolas"/>
-          <w:color w:val="000000"/>
-          <w:sz w:val="19"/>
-          <w:szCs w:val="19"/>
-          <w:lang w:val="en-US"/>
-        </w:rPr>
-        <w:t xml:space="preserve"> must be found in order to succeed regardless of the match location.</w:t>
-      </w:r>
-    </w:p>
-    <w:p>
-      <w:pPr>
-        <w:rPr>
-          <w:rFonts w:ascii="Consolas" w:hAnsi="Consolas" w:cs="Consolas"/>
-          <w:color w:val="000000"/>
-          <w:sz w:val="19"/>
-          <w:szCs w:val="19"/>
-          <w:lang w:val="en-US"/>
-        </w:rPr>
-      </w:pPr>
-      <w:r>
-        <w:rPr>
-          <w:rFonts w:ascii="Consolas" w:hAnsi="Consolas" w:cs="Consolas"/>
-          <w:color w:val="000000"/>
-          <w:sz w:val="19"/>
-          <w:szCs w:val="19"/>
-          <w:lang w:val="en-US"/>
-        </w:rPr>
         <w:t xml:space="preserve">Trailing ??? or ???? are simply ignored since this is the default: to locate first insert into statement we do not want to use: </w:t>
       </w:r>
     </w:p>
@@ -5455,15 +5143,17 @@
         <w:ind w:firstLine="708"/>
         <w:rPr>
           <w:rFonts w:ascii="Consolas" w:hAnsi="Consolas" w:cs="Consolas"/>
-          <w:color w:val="000000"/>
-          <w:sz w:val="19"/>
-          <w:szCs w:val="19"/>
-          <w:lang w:val="en-US"/>
-        </w:rPr>
-      </w:pPr>
-      <w:r>
-        <w:rPr>
-          <w:rFonts w:ascii="Consolas" w:hAnsi="Consolas" w:cs="Consolas"/>
+          <w:strike/>
+          <w:color w:val="000000"/>
+          <w:sz w:val="19"/>
+          <w:szCs w:val="19"/>
+          <w:lang w:val="en-US"/>
+        </w:rPr>
+      </w:pPr>
+      <w:r>
+        <w:rPr>
+          <w:rFonts w:ascii="Consolas" w:hAnsi="Consolas" w:cs="Consolas"/>
+          <w:strike/>
           <w:color w:val="000000"/>
           <w:sz w:val="19"/>
           <w:szCs w:val="19"/>
@@ -5476,15 +5166,17 @@
       <w:pPr>
         <w:rPr>
           <w:rFonts w:ascii="Consolas" w:hAnsi="Consolas" w:cs="Consolas"/>
-          <w:color w:val="000000"/>
-          <w:sz w:val="19"/>
-          <w:szCs w:val="19"/>
-          <w:lang w:val="en-US"/>
-        </w:rPr>
-      </w:pPr>
-      <w:r>
-        <w:rPr>
-          <w:rFonts w:ascii="Consolas" w:hAnsi="Consolas" w:cs="Consolas"/>
+          <w:strike/>
+          <w:color w:val="000000"/>
+          <w:sz w:val="19"/>
+          <w:szCs w:val="19"/>
+          <w:lang w:val="en-US"/>
+        </w:rPr>
+      </w:pPr>
+      <w:r>
+        <w:rPr>
+          <w:rFonts w:ascii="Consolas" w:hAnsi="Consolas" w:cs="Consolas"/>
+          <w:strike/>
           <w:color w:val="000000"/>
           <w:sz w:val="19"/>
           <w:szCs w:val="19"/>
@@ -5498,66 +5190,40 @@
         <w:ind w:firstLine="708"/>
         <w:rPr>
           <w:rFonts w:ascii="Consolas" w:hAnsi="Consolas" w:cs="Consolas"/>
-          <w:color w:val="000000"/>
-          <w:sz w:val="19"/>
-          <w:szCs w:val="19"/>
-          <w:lang w:val="en-US"/>
-        </w:rPr>
-      </w:pPr>
-      <w:r>
-        <w:rPr>
-          <w:rFonts w:ascii="Consolas" w:hAnsi="Consolas" w:cs="Consolas"/>
-          <w:color w:val="000000"/>
-          <w:sz w:val="19"/>
-          <w:szCs w:val="19"/>
-          <w:lang w:val="en-US"/>
-        </w:rPr>
-        <w:t xml:space="preserve">first </w:t>
-      </w:r>
-      <w:r>
-        <w:rPr>
-          <w:rFonts w:ascii="Consolas" w:hAnsi="Consolas" w:cs="Consolas"/>
-          <w:color w:val="000000"/>
-          <w:sz w:val="19"/>
-          <w:szCs w:val="19"/>
-          <w:lang w:val="en-US"/>
-        </w:rPr>
-        <w:t>statement {insert into</w:t>
-      </w:r>
-      <w:r>
-        <w:rPr>
-          <w:rFonts w:ascii="Consolas" w:hAnsi="Consolas" w:cs="Consolas"/>
-          <w:color w:val="000000"/>
-          <w:sz w:val="19"/>
-          <w:szCs w:val="19"/>
-          <w:lang w:val="en-US"/>
-        </w:rPr>
-        <w:t>}</w:t>
-      </w:r>
-      <w:r>
-        <w:rPr>
-          <w:rFonts w:ascii="Consolas" w:hAnsi="Consolas" w:cs="Consolas"/>
-          <w:color w:val="000000"/>
-          <w:sz w:val="19"/>
-          <w:szCs w:val="19"/>
-          <w:lang w:val="en-US"/>
-        </w:rPr>
-        <w:t>.</w:t>
-      </w:r>
-    </w:p>
-    <w:p>
-      <w:pPr>
-        <w:rPr>
-          <w:rFonts w:ascii="Consolas" w:hAnsi="Consolas" w:cs="Consolas"/>
-          <w:color w:val="000000"/>
-          <w:sz w:val="19"/>
-          <w:szCs w:val="19"/>
-          <w:lang w:val="en-US"/>
-        </w:rPr>
-      </w:pPr>
-      <w:r>
-        <w:rPr>
-          <w:rFonts w:ascii="Consolas" w:hAnsi="Consolas" w:cs="Consolas"/>
+          <w:strike/>
+          <w:color w:val="000000"/>
+          <w:sz w:val="19"/>
+          <w:szCs w:val="19"/>
+          <w:lang w:val="en-US"/>
+        </w:rPr>
+      </w:pPr>
+      <w:r>
+        <w:rPr>
+          <w:rFonts w:ascii="Consolas" w:hAnsi="Consolas" w:cs="Consolas"/>
+          <w:strike/>
+          <w:color w:val="000000"/>
+          <w:sz w:val="19"/>
+          <w:szCs w:val="19"/>
+          <w:lang w:val="en-US"/>
+        </w:rPr>
+        <w:t>first statement {insert into}.</w:t>
+      </w:r>
+    </w:p>
+    <w:p>
+      <w:pPr>
+        <w:rPr>
+          <w:rFonts w:ascii="Consolas" w:hAnsi="Consolas" w:cs="Consolas"/>
+          <w:strike/>
+          <w:color w:val="000000"/>
+          <w:sz w:val="19"/>
+          <w:szCs w:val="19"/>
+          <w:lang w:val="en-US"/>
+        </w:rPr>
+      </w:pPr>
+      <w:r>
+        <w:rPr>
+          <w:rFonts w:ascii="Consolas" w:hAnsi="Consolas" w:cs="Consolas"/>
+          <w:strike/>
           <w:color w:val="000000"/>
           <w:sz w:val="19"/>
           <w:szCs w:val="19"/>
@@ -5568,6 +5234,7 @@
       <w:r>
         <w:rPr>
           <w:rFonts w:ascii="Consolas" w:hAnsi="Consolas" w:cs="Consolas"/>
+          <w:strike/>
           <w:color w:val="000000"/>
           <w:sz w:val="19"/>
           <w:szCs w:val="19"/>
@@ -5578,6 +5245,7 @@
       <w:r>
         <w:rPr>
           <w:rFonts w:ascii="Consolas" w:hAnsi="Consolas" w:cs="Consolas"/>
+          <w:strike/>
           <w:color w:val="000000"/>
           <w:sz w:val="19"/>
           <w:szCs w:val="19"/>
@@ -5588,6 +5256,7 @@
       <w:r>
         <w:rPr>
           <w:rFonts w:ascii="Consolas" w:hAnsi="Consolas" w:cs="Consolas"/>
+          <w:strike/>
           <w:color w:val="000000"/>
           <w:sz w:val="19"/>
           <w:szCs w:val="19"/>
@@ -5598,6 +5267,7 @@
       <w:r>
         <w:rPr>
           <w:rFonts w:ascii="Consolas" w:hAnsi="Consolas" w:cs="Consolas"/>
+          <w:strike/>
           <w:color w:val="000000"/>
           <w:sz w:val="19"/>
           <w:szCs w:val="19"/>
@@ -5608,6 +5278,7 @@
       <w:r>
         <w:rPr>
           <w:rFonts w:ascii="Consolas" w:hAnsi="Consolas" w:cs="Consolas"/>
+          <w:strike/>
           <w:color w:val="000000"/>
           <w:sz w:val="19"/>
           <w:szCs w:val="19"/>

</xml_diff>

<commit_message>
Changed default match kind to part instead of range.
</commit_message>
<xml_diff>
--- a/CK.SqlServer.Transform/Data Definition Manipulation Language.docx
+++ b/CK.SqlServer.Transform/Data Definition Manipulation Language.docx
@@ -1251,21 +1251,7 @@
         <w:rPr>
           <w:lang w:val="en-US"/>
         </w:rPr>
-        <w:t>are both optional: a transformer can be a named one or an ano</w:t>
-      </w:r>
-      <w:r>
-        <w:rPr>
-          <w:lang w:val="en-US"/>
-        </w:rPr>
-        <w:t>n</w:t>
-      </w:r>
-      <w:bookmarkStart w:id="0" w:name="_GoBack"/>
-      <w:bookmarkEnd w:id="0"/>
-      <w:r>
-        <w:rPr>
-          <w:lang w:val="en-US"/>
-        </w:rPr>
-        <w:t xml:space="preserve">ymous one and when a Target is defined it is said to be “scoped”. </w:t>
+        <w:t xml:space="preserve">are both optional: a transformer can be a named one or an anonymous one and when a Target is defined it is said to be “scoped”. </w:t>
       </w:r>
     </w:p>
     <w:p>
@@ -1431,8 +1417,9 @@
                 <w:highlight w:val="white"/>
                 <w:lang w:val="en-US"/>
               </w:rPr>
-              <w:t xml:space="preserve"> |</w:t>
-            </w:r>
+              <w:t xml:space="preserve"> | </w:t>
+            </w:r>
+            <w:proofErr w:type="spellStart"/>
             <w:r>
               <w:rPr>
                 <w:rFonts w:ascii="Consolas" w:hAnsi="Consolas" w:cs="Consolas"/>
@@ -1442,9 +1429,9 @@
                 <w:highlight w:val="white"/>
                 <w:lang w:val="en-US"/>
               </w:rPr>
-              <w:t xml:space="preserve"> </w:t>
-            </w:r>
-            <w:proofErr w:type="spellStart"/>
+              <w:t>AddColumn</w:t>
+            </w:r>
+            <w:proofErr w:type="spellEnd"/>
             <w:r>
               <w:rPr>
                 <w:rFonts w:ascii="Consolas" w:hAnsi="Consolas" w:cs="Consolas"/>
@@ -1454,41 +1441,7 @@
                 <w:highlight w:val="white"/>
                 <w:lang w:val="en-US"/>
               </w:rPr>
-              <w:t>Add</w:t>
-            </w:r>
-            <w:r>
-              <w:rPr>
-                <w:rFonts w:ascii="Consolas" w:hAnsi="Consolas" w:cs="Consolas"/>
-                <w:color w:val="000000"/>
-                <w:sz w:val="19"/>
-                <w:szCs w:val="19"/>
-                <w:highlight w:val="white"/>
-                <w:lang w:val="en-US"/>
-              </w:rPr>
-              <w:t>Column</w:t>
-            </w:r>
-            <w:proofErr w:type="spellEnd"/>
-            <w:r>
-              <w:rPr>
-                <w:rFonts w:ascii="Consolas" w:hAnsi="Consolas" w:cs="Consolas"/>
-                <w:color w:val="000000"/>
-                <w:sz w:val="19"/>
-                <w:szCs w:val="19"/>
-                <w:highlight w:val="white"/>
-                <w:lang w:val="en-US"/>
-              </w:rPr>
-              <w:t xml:space="preserve"> |</w:t>
-            </w:r>
-            <w:r>
-              <w:rPr>
-                <w:rFonts w:ascii="Consolas" w:hAnsi="Consolas" w:cs="Consolas"/>
-                <w:color w:val="000000"/>
-                <w:sz w:val="19"/>
-                <w:szCs w:val="19"/>
-                <w:highlight w:val="white"/>
-                <w:lang w:val="en-US"/>
-              </w:rPr>
-              <w:t xml:space="preserve"> </w:t>
+              <w:t xml:space="preserve"> | </w:t>
             </w:r>
             <w:proofErr w:type="spellStart"/>
             <w:r>
@@ -2987,7 +2940,27 @@
                 <w:szCs w:val="19"/>
                 <w:lang w:val="en-US"/>
               </w:rPr>
-              <w:t>Defaults to part.</w:t>
+              <w:t xml:space="preserve">Defaults to </w:t>
+            </w:r>
+            <w:r>
+              <w:rPr>
+                <w:rFonts w:ascii="Consolas" w:hAnsi="Consolas" w:cs="Consolas"/>
+                <w:color w:val="000000"/>
+                <w:sz w:val="19"/>
+                <w:szCs w:val="19"/>
+                <w:lang w:val="en-US"/>
+              </w:rPr>
+              <w:t>range</w:t>
+            </w:r>
+            <w:r>
+              <w:rPr>
+                <w:rFonts w:ascii="Consolas" w:hAnsi="Consolas" w:cs="Consolas"/>
+                <w:color w:val="000000"/>
+                <w:sz w:val="19"/>
+                <w:szCs w:val="19"/>
+                <w:lang w:val="en-US"/>
+              </w:rPr>
+              <w:t>.</w:t>
             </w:r>
           </w:p>
           <w:p>
@@ -3008,7 +2981,29 @@
                 <w:szCs w:val="19"/>
                 <w:lang w:val="en-US"/>
               </w:rPr>
-              <w:t>The ‘range’ applies to individual tokens whereas ‘part’ or ‘statement’ apply to structural items of the parse tree.</w:t>
+              <w:t xml:space="preserve">The </w:t>
+            </w:r>
+            <w:r>
+              <w:rPr>
+                <w:rFonts w:ascii="Consolas" w:hAnsi="Consolas" w:cs="Consolas"/>
+                <w:color w:val="000000"/>
+                <w:sz w:val="19"/>
+                <w:szCs w:val="19"/>
+                <w:lang w:val="en-US"/>
+              </w:rPr>
+              <w:t xml:space="preserve">default </w:t>
+            </w:r>
+            <w:bookmarkStart w:id="0" w:name="_GoBack"/>
+            <w:bookmarkEnd w:id="0"/>
+            <w:r>
+              <w:rPr>
+                <w:rFonts w:ascii="Consolas" w:hAnsi="Consolas" w:cs="Consolas"/>
+                <w:color w:val="000000"/>
+                <w:sz w:val="19"/>
+                <w:szCs w:val="19"/>
+                <w:lang w:val="en-US"/>
+              </w:rPr>
+              <w:t>‘range’ applies to individual tokens whereas ‘part’ or ‘statement’ apply to structural items of the parse tree.</w:t>
             </w:r>
           </w:p>
           <w:p>
@@ -5179,13 +5174,15 @@
           <w:rFonts w:ascii="Courier New" w:hAnsi="Courier New" w:cs="Courier New"/>
           <w:sz w:val="17"/>
           <w:szCs w:val="17"/>
-        </w:rPr>
-      </w:pPr>
-      <w:r>
-        <w:rPr>
-          <w:rFonts w:ascii="Courier New" w:hAnsi="Courier New" w:cs="Courier New"/>
-          <w:sz w:val="17"/>
-          <w:szCs w:val="17"/>
+          <w:lang w:val="en-US"/>
+        </w:rPr>
+      </w:pPr>
+      <w:r>
+        <w:rPr>
+          <w:rFonts w:ascii="Courier New" w:hAnsi="Courier New" w:cs="Courier New"/>
+          <w:sz w:val="17"/>
+          <w:szCs w:val="17"/>
+          <w:lang w:val="en-US"/>
         </w:rPr>
         <w:t xml:space="preserve">      </w:t>
       </w:r>
@@ -5200,13 +5197,15 @@
           <w:rFonts w:ascii="Courier New" w:hAnsi="Courier New" w:cs="Courier New"/>
           <w:sz w:val="17"/>
           <w:szCs w:val="17"/>
-        </w:rPr>
-      </w:pPr>
-      <w:r>
-        <w:rPr>
-          <w:rFonts w:ascii="Courier New" w:hAnsi="Courier New" w:cs="Courier New"/>
-          <w:sz w:val="17"/>
-          <w:szCs w:val="17"/>
+          <w:lang w:val="en-US"/>
+        </w:rPr>
+      </w:pPr>
+      <w:r>
+        <w:rPr>
+          <w:rFonts w:ascii="Courier New" w:hAnsi="Courier New" w:cs="Courier New"/>
+          <w:sz w:val="17"/>
+          <w:szCs w:val="17"/>
+          <w:lang w:val="en-US"/>
         </w:rPr>
         <w:t xml:space="preserve">  --[</w:t>
       </w:r>
@@ -5216,6 +5215,7 @@
           <w:rFonts w:ascii="Courier New" w:hAnsi="Courier New" w:cs="Courier New"/>
           <w:sz w:val="17"/>
           <w:szCs w:val="17"/>
+          <w:lang w:val="en-US"/>
         </w:rPr>
         <w:t>endsp</w:t>
       </w:r>
@@ -5225,6 +5225,7 @@
           <w:rFonts w:ascii="Courier New" w:hAnsi="Courier New" w:cs="Courier New"/>
           <w:sz w:val="17"/>
           <w:szCs w:val="17"/>
+          <w:lang w:val="en-US"/>
         </w:rPr>
         <w:t>]</w:t>
       </w:r>
@@ -5239,36 +5240,37 @@
           <w:rFonts w:ascii="Courier New" w:hAnsi="Courier New" w:cs="Courier New"/>
           <w:sz w:val="17"/>
           <w:szCs w:val="17"/>
-        </w:rPr>
-      </w:pPr>
-      <w:proofErr w:type="gramStart"/>
-      <w:r>
-        <w:rPr>
-          <w:rFonts w:ascii="Courier New" w:hAnsi="Courier New" w:cs="Courier New"/>
-          <w:sz w:val="17"/>
-          <w:szCs w:val="17"/>
+          <w:lang w:val="en-US"/>
+        </w:rPr>
+      </w:pPr>
+      <w:r>
+        <w:rPr>
+          <w:rFonts w:ascii="Courier New" w:hAnsi="Courier New" w:cs="Courier New"/>
+          <w:sz w:val="17"/>
+          <w:szCs w:val="17"/>
+          <w:lang w:val="en-US"/>
         </w:rPr>
         <w:t>end</w:t>
       </w:r>
-      <w:proofErr w:type="gramEnd"/>
-    </w:p>
-    <w:p>
-      <w:pPr>
-        <w:rPr>
-          <w:lang w:val="en-US"/>
-        </w:rPr>
-      </w:pPr>
-    </w:p>
-    <w:p>
-      <w:pPr>
-        <w:rPr>
-          <w:lang w:val="en-US"/>
-        </w:rPr>
-      </w:pPr>
-      <w:r>
-        <w:rPr>
-          <w:lang w:val="en-US"/>
-        </w:rPr>
+    </w:p>
+    <w:p>
+      <w:pPr>
+        <w:rPr>
+          <w:lang w:val="en-US"/>
+        </w:rPr>
+      </w:pPr>
+    </w:p>
+    <w:p>
+      <w:pPr>
+        <w:rPr>
+          <w:lang w:val="en-US"/>
+        </w:rPr>
+      </w:pPr>
+      <w:r>
+        <w:rPr>
+          <w:lang w:val="en-US"/>
+        </w:rPr>
+        <w:lastRenderedPageBreak/>
         <w:t>Into this:</w:t>
       </w:r>
     </w:p>
@@ -5292,7 +5294,6 @@
           <w:szCs w:val="17"/>
           <w:lang w:val="en-US"/>
         </w:rPr>
-        <w:lastRenderedPageBreak/>
         <w:t xml:space="preserve">create procedure </w:t>
       </w:r>
       <w:proofErr w:type="spellStart"/>
@@ -7718,6 +7719,7 @@
           <w:szCs w:val="19"/>
           <w:lang w:val="en-US"/>
         </w:rPr>
+        <w:lastRenderedPageBreak/>
         <w:t>PatternTail</w:t>
       </w:r>
       <w:proofErr w:type="spellEnd"/>
@@ -7792,7 +7794,6 @@
           <w:szCs w:val="19"/>
           <w:lang w:val="en-US"/>
         </w:rPr>
-        <w:lastRenderedPageBreak/>
         <w:t>PatternContent</w:t>
       </w:r>
       <w:proofErr w:type="spellEnd"/>
@@ -9954,15 +9955,6 @@
   </w:num>
   <w:num w:numId="5">
     <w:abstractNumId w:val="2"/>
-    <w:lvlOverride w:ilvl="0"/>
-    <w:lvlOverride w:ilvl="1"/>
-    <w:lvlOverride w:ilvl="2"/>
-    <w:lvlOverride w:ilvl="3"/>
-    <w:lvlOverride w:ilvl="4"/>
-    <w:lvlOverride w:ilvl="5"/>
-    <w:lvlOverride w:ilvl="6"/>
-    <w:lvlOverride w:ilvl="7"/>
-    <w:lvlOverride w:ilvl="8"/>
   </w:num>
 </w:numbering>
 </file>

</xml_diff>

<commit_message>
Added doc for extension point and changed the reverse="true" to simply be "revert".
</commit_message>
<xml_diff>
--- a/CK.SqlServer.Transform/Data Definition Manipulation Language.docx
+++ b/CK.SqlServer.Transform/Data Definition Manipulation Language.docx
@@ -1252,19 +1252,6 @@
           <w:lang w:val="en-US"/>
         </w:rPr>
         <w:t xml:space="preserve">are both optional: a transformer can be a named one or an anonymous one and when a Target is defined it is said to be “scoped”. </w:t>
-      </w:r>
-    </w:p>
-    <w:p>
-      <w:pPr>
-        <w:rPr>
-          <w:lang w:val="en-US"/>
-        </w:rPr>
-      </w:pPr>
-      <w:r>
-        <w:rPr>
-          <w:lang w:val="en-US"/>
-        </w:rPr>
-        <w:t>Currently supported transform statements are:</w:t>
       </w:r>
     </w:p>
     <w:p>
@@ -2259,7 +2246,17 @@
                 <w:szCs w:val="19"/>
                 <w:lang w:val="en-US"/>
               </w:rPr>
-              <w:t xml:space="preserve">around) | (before | after) </w:t>
+              <w:t xml:space="preserve">around) | </w:t>
+            </w:r>
+            <w:r>
+              <w:rPr>
+                <w:rFonts w:ascii="Consolas" w:hAnsi="Consolas" w:cs="Consolas"/>
+                <w:color w:val="000000"/>
+                <w:sz w:val="19"/>
+                <w:szCs w:val="19"/>
+                <w:lang w:val="en-US"/>
+              </w:rPr>
+              <w:t xml:space="preserve">before | after) </w:t>
             </w:r>
             <w:proofErr w:type="spellStart"/>
             <w:r>
@@ -2284,6 +2281,580 @@
               <w:t>Finder</w:t>
             </w:r>
             <w:proofErr w:type="spellEnd"/>
+          </w:p>
+          <w:p>
+            <w:pPr>
+              <w:rPr>
+                <w:rFonts w:ascii="Consolas" w:hAnsi="Consolas" w:cs="Consolas"/>
+                <w:color w:val="000000"/>
+                <w:sz w:val="19"/>
+                <w:szCs w:val="19"/>
+                <w:lang w:val="en-US"/>
+              </w:rPr>
+            </w:pPr>
+          </w:p>
+          <w:p>
+            <w:pPr>
+              <w:rPr>
+                <w:rFonts w:ascii="Consolas" w:hAnsi="Consolas" w:cs="Consolas"/>
+                <w:color w:val="000000"/>
+                <w:sz w:val="19"/>
+                <w:szCs w:val="19"/>
+                <w:lang w:val="en-US"/>
+              </w:rPr>
+            </w:pPr>
+            <w:r>
+              <w:rPr>
+                <w:rFonts w:ascii="Consolas" w:hAnsi="Consolas" w:cs="Consolas"/>
+                <w:color w:val="000000"/>
+                <w:sz w:val="19"/>
+                <w:szCs w:val="19"/>
+                <w:lang w:val="en-US"/>
+              </w:rPr>
+              <w:t>O</w:t>
+            </w:r>
+            <w:r>
+              <w:rPr>
+                <w:rFonts w:ascii="Consolas" w:hAnsi="Consolas" w:cs="Consolas"/>
+                <w:color w:val="000000"/>
+                <w:sz w:val="19"/>
+                <w:szCs w:val="19"/>
+                <w:lang w:val="en-US"/>
+              </w:rPr>
+              <w:t xml:space="preserve">r </w:t>
+            </w:r>
+            <w:r>
+              <w:rPr>
+                <w:rFonts w:ascii="Consolas" w:hAnsi="Consolas" w:cs="Consolas"/>
+                <w:color w:val="000000"/>
+                <w:sz w:val="19"/>
+                <w:szCs w:val="19"/>
+                <w:lang w:val="en-US"/>
+              </w:rPr>
+              <w:t>for extension point</w:t>
+            </w:r>
+            <w:r>
+              <w:rPr>
+                <w:rFonts w:ascii="Consolas" w:hAnsi="Consolas" w:cs="Consolas"/>
+                <w:color w:val="000000"/>
+                <w:sz w:val="19"/>
+                <w:szCs w:val="19"/>
+                <w:lang w:val="en-US"/>
+              </w:rPr>
+              <w:t>:</w:t>
+            </w:r>
+          </w:p>
+          <w:p>
+            <w:pPr>
+              <w:rPr>
+                <w:rFonts w:ascii="Consolas" w:hAnsi="Consolas" w:cs="Consolas"/>
+                <w:color w:val="000000"/>
+                <w:sz w:val="19"/>
+                <w:szCs w:val="19"/>
+                <w:lang w:val="en-US"/>
+              </w:rPr>
+            </w:pPr>
+          </w:p>
+          <w:p>
+            <w:pPr>
+              <w:rPr>
+                <w:rFonts w:ascii="Consolas" w:hAnsi="Consolas" w:cs="Consolas"/>
+                <w:color w:val="000000"/>
+                <w:sz w:val="19"/>
+                <w:szCs w:val="19"/>
+                <w:lang w:val="en-US"/>
+              </w:rPr>
+            </w:pPr>
+            <w:r>
+              <w:rPr>
+                <w:rFonts w:ascii="Consolas" w:hAnsi="Consolas" w:cs="Consolas"/>
+                <w:color w:val="000000"/>
+                <w:sz w:val="19"/>
+                <w:szCs w:val="19"/>
+                <w:lang w:val="en-US"/>
+              </w:rPr>
+              <w:t xml:space="preserve">inject </w:t>
+            </w:r>
+            <w:proofErr w:type="spellStart"/>
+            <w:r>
+              <w:rPr>
+                <w:rFonts w:ascii="Consolas" w:hAnsi="Consolas" w:cs="Consolas"/>
+                <w:color w:val="000000"/>
+                <w:sz w:val="19"/>
+                <w:szCs w:val="19"/>
+                <w:lang w:val="en-US"/>
+              </w:rPr>
+              <w:t>LiteralString</w:t>
+            </w:r>
+            <w:proofErr w:type="spellEnd"/>
+            <w:r>
+              <w:rPr>
+                <w:rFonts w:ascii="Consolas" w:hAnsi="Consolas" w:cs="Consolas"/>
+                <w:color w:val="000000"/>
+                <w:sz w:val="19"/>
+                <w:szCs w:val="19"/>
+                <w:lang w:val="en-US"/>
+              </w:rPr>
+              <w:t xml:space="preserve"> into </w:t>
+            </w:r>
+            <w:proofErr w:type="spellStart"/>
+            <w:r>
+              <w:rPr>
+                <w:rFonts w:ascii="Consolas" w:hAnsi="Consolas" w:cs="Consolas"/>
+                <w:color w:val="000000"/>
+                <w:sz w:val="19"/>
+                <w:szCs w:val="19"/>
+                <w:lang w:val="en-US"/>
+              </w:rPr>
+              <w:t>LiteralString</w:t>
+            </w:r>
+            <w:proofErr w:type="spellEnd"/>
+          </w:p>
+          <w:p>
+            <w:pPr>
+              <w:rPr>
+                <w:rFonts w:ascii="Consolas" w:hAnsi="Consolas" w:cs="Consolas"/>
+                <w:color w:val="000000"/>
+                <w:sz w:val="19"/>
+                <w:szCs w:val="19"/>
+                <w:lang w:val="en-US"/>
+              </w:rPr>
+            </w:pPr>
+          </w:p>
+          <w:p>
+            <w:pPr>
+              <w:rPr>
+                <w:rFonts w:ascii="Consolas" w:hAnsi="Consolas" w:cs="Consolas"/>
+                <w:color w:val="000000"/>
+                <w:sz w:val="19"/>
+                <w:szCs w:val="19"/>
+                <w:lang w:val="en-US"/>
+              </w:rPr>
+            </w:pPr>
+            <w:r>
+              <w:rPr>
+                <w:rFonts w:ascii="Consolas" w:hAnsi="Consolas" w:cs="Consolas"/>
+                <w:color w:val="000000"/>
+                <w:sz w:val="19"/>
+                <w:szCs w:val="19"/>
+                <w:lang w:val="en-US"/>
+              </w:rPr>
+              <w:t>Where the target is an extension point defined with a line comment:</w:t>
+            </w:r>
+          </w:p>
+          <w:p>
+            <w:pPr>
+              <w:rPr>
+                <w:rFonts w:ascii="Consolas" w:hAnsi="Consolas" w:cs="Consolas"/>
+                <w:color w:val="000000"/>
+                <w:sz w:val="19"/>
+                <w:szCs w:val="19"/>
+                <w:lang w:val="en-US"/>
+              </w:rPr>
+            </w:pPr>
+          </w:p>
+          <w:p>
+            <w:pPr>
+              <w:rPr>
+                <w:rFonts w:ascii="Consolas" w:hAnsi="Consolas" w:cs="Consolas"/>
+                <w:color w:val="000000"/>
+                <w:sz w:val="19"/>
+                <w:szCs w:val="19"/>
+                <w:lang w:val="en-US"/>
+              </w:rPr>
+            </w:pPr>
+            <w:r>
+              <w:rPr>
+                <w:rFonts w:ascii="Consolas" w:hAnsi="Consolas" w:cs="Consolas"/>
+                <w:color w:val="000000"/>
+                <w:sz w:val="19"/>
+                <w:szCs w:val="19"/>
+                <w:lang w:val="en-US"/>
+              </w:rPr>
+              <w:t xml:space="preserve">    --&lt;</w:t>
+            </w:r>
+            <w:proofErr w:type="spellStart"/>
+            <w:r>
+              <w:rPr>
+                <w:rFonts w:ascii="Consolas" w:hAnsi="Consolas" w:cs="Consolas"/>
+                <w:color w:val="000000"/>
+                <w:sz w:val="19"/>
+                <w:szCs w:val="19"/>
+                <w:lang w:val="en-US"/>
+              </w:rPr>
+              <w:t>P</w:t>
+            </w:r>
+            <w:r>
+              <w:rPr>
+                <w:rFonts w:ascii="Consolas" w:hAnsi="Consolas" w:cs="Consolas"/>
+                <w:color w:val="000000"/>
+                <w:sz w:val="19"/>
+                <w:szCs w:val="19"/>
+                <w:lang w:val="en-US"/>
+              </w:rPr>
+              <w:t>ost</w:t>
+            </w:r>
+            <w:r>
+              <w:rPr>
+                <w:rFonts w:ascii="Consolas" w:hAnsi="Consolas" w:cs="Consolas"/>
+                <w:color w:val="000000"/>
+                <w:sz w:val="19"/>
+                <w:szCs w:val="19"/>
+                <w:lang w:val="en-US"/>
+              </w:rPr>
+              <w:t>Create</w:t>
+            </w:r>
+            <w:proofErr w:type="spellEnd"/>
+            <w:r>
+              <w:rPr>
+                <w:rFonts w:ascii="Consolas" w:hAnsi="Consolas" w:cs="Consolas"/>
+                <w:color w:val="000000"/>
+                <w:sz w:val="19"/>
+                <w:szCs w:val="19"/>
+                <w:lang w:val="en-US"/>
+              </w:rPr>
+              <w:t xml:space="preserve">/&gt; </w:t>
+            </w:r>
+          </w:p>
+          <w:p>
+            <w:pPr>
+              <w:rPr>
+                <w:rFonts w:ascii="Consolas" w:hAnsi="Consolas" w:cs="Consolas"/>
+                <w:color w:val="000000"/>
+                <w:sz w:val="19"/>
+                <w:szCs w:val="19"/>
+                <w:lang w:val="en-US"/>
+              </w:rPr>
+            </w:pPr>
+          </w:p>
+          <w:p>
+            <w:pPr>
+              <w:rPr>
+                <w:rFonts w:ascii="Consolas" w:hAnsi="Consolas" w:cs="Consolas"/>
+                <w:color w:val="000000"/>
+                <w:sz w:val="19"/>
+                <w:szCs w:val="19"/>
+                <w:lang w:val="en-US"/>
+              </w:rPr>
+            </w:pPr>
+            <w:r>
+              <w:rPr>
+                <w:rFonts w:ascii="Consolas" w:hAnsi="Consolas" w:cs="Consolas"/>
+                <w:color w:val="000000"/>
+                <w:sz w:val="19"/>
+                <w:szCs w:val="19"/>
+                <w:lang w:val="en-US"/>
+              </w:rPr>
+              <w:t>Or if the extension point has already been opened:</w:t>
+            </w:r>
+          </w:p>
+          <w:p>
+            <w:pPr>
+              <w:rPr>
+                <w:rFonts w:ascii="Consolas" w:hAnsi="Consolas" w:cs="Consolas"/>
+                <w:color w:val="000000"/>
+                <w:sz w:val="19"/>
+                <w:szCs w:val="19"/>
+                <w:lang w:val="en-US"/>
+              </w:rPr>
+            </w:pPr>
+          </w:p>
+          <w:p>
+            <w:pPr>
+              <w:rPr>
+                <w:rFonts w:ascii="Consolas" w:hAnsi="Consolas" w:cs="Consolas"/>
+                <w:color w:val="000000"/>
+                <w:sz w:val="19"/>
+                <w:szCs w:val="19"/>
+                <w:lang w:val="en-US"/>
+              </w:rPr>
+            </w:pPr>
+            <w:r>
+              <w:rPr>
+                <w:rFonts w:ascii="Consolas" w:hAnsi="Consolas" w:cs="Consolas"/>
+                <w:color w:val="000000"/>
+                <w:sz w:val="19"/>
+                <w:szCs w:val="19"/>
+                <w:lang w:val="en-US"/>
+              </w:rPr>
+              <w:t xml:space="preserve">    --&lt;</w:t>
+            </w:r>
+            <w:proofErr w:type="spellStart"/>
+            <w:r>
+              <w:rPr>
+                <w:rFonts w:ascii="Consolas" w:hAnsi="Consolas" w:cs="Consolas"/>
+                <w:color w:val="000000"/>
+                <w:sz w:val="19"/>
+                <w:szCs w:val="19"/>
+                <w:lang w:val="en-US"/>
+              </w:rPr>
+              <w:t>PostCreate</w:t>
+            </w:r>
+            <w:proofErr w:type="spellEnd"/>
+            <w:r>
+              <w:rPr>
+                <w:rFonts w:ascii="Consolas" w:hAnsi="Consolas" w:cs="Consolas"/>
+                <w:color w:val="000000"/>
+                <w:sz w:val="19"/>
+                <w:szCs w:val="19"/>
+                <w:lang w:val="en-US"/>
+              </w:rPr>
+              <w:t>&gt;</w:t>
+            </w:r>
+          </w:p>
+          <w:p>
+            <w:pPr>
+              <w:rPr>
+                <w:rFonts w:ascii="Consolas" w:hAnsi="Consolas" w:cs="Consolas"/>
+                <w:color w:val="000000"/>
+                <w:sz w:val="19"/>
+                <w:szCs w:val="19"/>
+                <w:lang w:val="en-US"/>
+              </w:rPr>
+            </w:pPr>
+            <w:r>
+              <w:rPr>
+                <w:rFonts w:ascii="Consolas" w:hAnsi="Consolas" w:cs="Consolas"/>
+                <w:color w:val="000000"/>
+                <w:sz w:val="19"/>
+                <w:szCs w:val="19"/>
+                <w:lang w:val="en-US"/>
+              </w:rPr>
+              <w:t xml:space="preserve">    …</w:t>
+            </w:r>
+          </w:p>
+          <w:p>
+            <w:pPr>
+              <w:rPr>
+                <w:rFonts w:ascii="Consolas" w:hAnsi="Consolas" w:cs="Consolas"/>
+                <w:color w:val="000000"/>
+                <w:sz w:val="19"/>
+                <w:szCs w:val="19"/>
+                <w:lang w:val="en-US"/>
+              </w:rPr>
+            </w:pPr>
+            <w:r>
+              <w:rPr>
+                <w:rFonts w:ascii="Consolas" w:hAnsi="Consolas" w:cs="Consolas"/>
+                <w:color w:val="000000"/>
+                <w:sz w:val="19"/>
+                <w:szCs w:val="19"/>
+                <w:lang w:val="en-US"/>
+              </w:rPr>
+              <w:t xml:space="preserve">    --&lt;/</w:t>
+            </w:r>
+            <w:proofErr w:type="spellStart"/>
+            <w:r>
+              <w:rPr>
+                <w:rFonts w:ascii="Consolas" w:hAnsi="Consolas" w:cs="Consolas"/>
+                <w:color w:val="000000"/>
+                <w:sz w:val="19"/>
+                <w:szCs w:val="19"/>
+                <w:lang w:val="en-US"/>
+              </w:rPr>
+              <w:t>PostCreate</w:t>
+            </w:r>
+            <w:proofErr w:type="spellEnd"/>
+            <w:r>
+              <w:rPr>
+                <w:rFonts w:ascii="Consolas" w:hAnsi="Consolas" w:cs="Consolas"/>
+                <w:color w:val="000000"/>
+                <w:sz w:val="19"/>
+                <w:szCs w:val="19"/>
+                <w:lang w:val="en-US"/>
+              </w:rPr>
+              <w:t>&gt;</w:t>
+            </w:r>
+          </w:p>
+          <w:p>
+            <w:pPr>
+              <w:rPr>
+                <w:rFonts w:ascii="Consolas" w:hAnsi="Consolas" w:cs="Consolas"/>
+                <w:color w:val="000000"/>
+                <w:sz w:val="19"/>
+                <w:szCs w:val="19"/>
+                <w:lang w:val="en-US"/>
+              </w:rPr>
+            </w:pPr>
+          </w:p>
+          <w:p>
+            <w:pPr>
+              <w:rPr>
+                <w:rFonts w:ascii="Consolas" w:hAnsi="Consolas" w:cs="Consolas"/>
+                <w:color w:val="000000"/>
+                <w:sz w:val="19"/>
+                <w:szCs w:val="19"/>
+                <w:lang w:val="en-US"/>
+              </w:rPr>
+            </w:pPr>
+            <w:r>
+              <w:rPr>
+                <w:rFonts w:ascii="Consolas" w:hAnsi="Consolas" w:cs="Consolas"/>
+                <w:color w:val="000000"/>
+                <w:sz w:val="19"/>
+                <w:szCs w:val="19"/>
+                <w:lang w:val="en-US"/>
+              </w:rPr>
+              <w:t>Note that this extension point may be “rever</w:t>
+            </w:r>
+            <w:r>
+              <w:rPr>
+                <w:rFonts w:ascii="Consolas" w:hAnsi="Consolas" w:cs="Consolas"/>
+                <w:color w:val="000000"/>
+                <w:sz w:val="19"/>
+                <w:szCs w:val="19"/>
+                <w:lang w:val="en-US"/>
+              </w:rPr>
+              <w:t>t</w:t>
+            </w:r>
+            <w:r>
+              <w:rPr>
+                <w:rFonts w:ascii="Consolas" w:hAnsi="Consolas" w:cs="Consolas"/>
+                <w:color w:val="000000"/>
+                <w:sz w:val="19"/>
+                <w:szCs w:val="19"/>
+                <w:lang w:val="en-US"/>
+              </w:rPr>
+              <w:t>ed”:</w:t>
+            </w:r>
+          </w:p>
+          <w:p>
+            <w:pPr>
+              <w:rPr>
+                <w:rFonts w:ascii="Consolas" w:hAnsi="Consolas" w:cs="Consolas"/>
+                <w:color w:val="000000"/>
+                <w:sz w:val="19"/>
+                <w:szCs w:val="19"/>
+                <w:lang w:val="en-US"/>
+              </w:rPr>
+            </w:pPr>
+            <w:bookmarkStart w:id="0" w:name="_GoBack"/>
+            <w:bookmarkEnd w:id="0"/>
+          </w:p>
+          <w:p>
+            <w:pPr>
+              <w:rPr>
+                <w:rFonts w:ascii="Consolas" w:hAnsi="Consolas" w:cs="Consolas"/>
+                <w:color w:val="000000"/>
+                <w:sz w:val="19"/>
+                <w:szCs w:val="19"/>
+                <w:lang w:val="en-US"/>
+              </w:rPr>
+            </w:pPr>
+            <w:r>
+              <w:rPr>
+                <w:rFonts w:ascii="Consolas" w:hAnsi="Consolas" w:cs="Consolas"/>
+                <w:color w:val="000000"/>
+                <w:sz w:val="19"/>
+                <w:szCs w:val="19"/>
+                <w:lang w:val="en-US"/>
+              </w:rPr>
+              <w:t xml:space="preserve">   </w:t>
+            </w:r>
+            <w:r>
+              <w:rPr>
+                <w:rFonts w:ascii="Consolas" w:hAnsi="Consolas" w:cs="Consolas"/>
+                <w:color w:val="000000"/>
+                <w:sz w:val="19"/>
+                <w:szCs w:val="19"/>
+                <w:lang w:val="en-US"/>
+              </w:rPr>
+              <w:t>--&lt;</w:t>
+            </w:r>
+            <w:proofErr w:type="spellStart"/>
+            <w:r>
+              <w:rPr>
+                <w:rFonts w:ascii="Consolas" w:hAnsi="Consolas" w:cs="Consolas"/>
+                <w:color w:val="000000"/>
+                <w:sz w:val="19"/>
+                <w:szCs w:val="19"/>
+                <w:lang w:val="en-US"/>
+              </w:rPr>
+              <w:t>P</w:t>
+            </w:r>
+            <w:r>
+              <w:rPr>
+                <w:rFonts w:ascii="Consolas" w:hAnsi="Consolas" w:cs="Consolas"/>
+                <w:color w:val="000000"/>
+                <w:sz w:val="19"/>
+                <w:szCs w:val="19"/>
+                <w:lang w:val="en-US"/>
+              </w:rPr>
+              <w:t>re</w:t>
+            </w:r>
+            <w:r>
+              <w:rPr>
+                <w:rFonts w:ascii="Consolas" w:hAnsi="Consolas" w:cs="Consolas"/>
+                <w:color w:val="000000"/>
+                <w:sz w:val="19"/>
+                <w:szCs w:val="19"/>
+                <w:lang w:val="en-US"/>
+              </w:rPr>
+              <w:t>Create</w:t>
+            </w:r>
+            <w:proofErr w:type="spellEnd"/>
+            <w:r>
+              <w:rPr>
+                <w:rFonts w:ascii="Consolas" w:hAnsi="Consolas" w:cs="Consolas"/>
+                <w:color w:val="000000"/>
+                <w:sz w:val="19"/>
+                <w:szCs w:val="19"/>
+                <w:lang w:val="en-US"/>
+              </w:rPr>
+              <w:t xml:space="preserve"> rever</w:t>
+            </w:r>
+            <w:r>
+              <w:rPr>
+                <w:rFonts w:ascii="Consolas" w:hAnsi="Consolas" w:cs="Consolas"/>
+                <w:color w:val="000000"/>
+                <w:sz w:val="19"/>
+                <w:szCs w:val="19"/>
+                <w:lang w:val="en-US"/>
+              </w:rPr>
+              <w:t>t</w:t>
+            </w:r>
+            <w:r>
+              <w:rPr>
+                <w:rFonts w:ascii="Consolas" w:hAnsi="Consolas" w:cs="Consolas"/>
+                <w:color w:val="000000"/>
+                <w:sz w:val="19"/>
+                <w:szCs w:val="19"/>
+                <w:lang w:val="en-US"/>
+              </w:rPr>
+              <w:t xml:space="preserve">/&gt; </w:t>
+            </w:r>
+          </w:p>
+          <w:p>
+            <w:pPr>
+              <w:rPr>
+                <w:rFonts w:ascii="Consolas" w:hAnsi="Consolas" w:cs="Consolas"/>
+                <w:color w:val="000000"/>
+                <w:sz w:val="19"/>
+                <w:szCs w:val="19"/>
+                <w:lang w:val="en-US"/>
+              </w:rPr>
+            </w:pPr>
+          </w:p>
+          <w:p>
+            <w:pPr>
+              <w:rPr>
+                <w:rFonts w:ascii="Consolas" w:hAnsi="Consolas" w:cs="Consolas"/>
+                <w:color w:val="000000"/>
+                <w:sz w:val="19"/>
+                <w:szCs w:val="19"/>
+                <w:lang w:val="en-US"/>
+              </w:rPr>
+            </w:pPr>
+            <w:r>
+              <w:rPr>
+                <w:rFonts w:ascii="Consolas" w:hAnsi="Consolas" w:cs="Consolas"/>
+                <w:color w:val="000000"/>
+                <w:sz w:val="19"/>
+                <w:szCs w:val="19"/>
+                <w:lang w:val="en-US"/>
+              </w:rPr>
+              <w:t>The extension point must be unique in the current scope otherwise an error is raised.</w:t>
+            </w:r>
           </w:p>
           <w:p>
             <w:pPr>
@@ -2422,6 +2993,7 @@
                 <w:szCs w:val="19"/>
                 <w:lang w:val="en-US"/>
               </w:rPr>
+              <w:lastRenderedPageBreak/>
               <w:t xml:space="preserve">| single </w:t>
             </w:r>
           </w:p>
@@ -2537,6 +3109,7 @@
                 <w:szCs w:val="19"/>
                 <w:lang w:val="en-US"/>
               </w:rPr>
+              <w:lastRenderedPageBreak/>
               <w:t>CommentStringMatch</w:t>
             </w:r>
             <w:proofErr w:type="spellEnd"/>
@@ -2993,8 +3566,6 @@
               </w:rPr>
               <w:t xml:space="preserve">default </w:t>
             </w:r>
-            <w:bookmarkStart w:id="0" w:name="_GoBack"/>
-            <w:bookmarkEnd w:id="0"/>
             <w:r>
               <w:rPr>
                 <w:rFonts w:ascii="Consolas" w:hAnsi="Consolas" w:cs="Consolas"/>
@@ -3043,7 +3614,6 @@
                 <w:szCs w:val="19"/>
                 <w:lang w:val="en-US"/>
               </w:rPr>
-              <w:lastRenderedPageBreak/>
               <w:t>CurlyBracePattern</w:t>
             </w:r>
             <w:proofErr w:type="spellEnd"/>
@@ -4485,6 +5055,7 @@
           <w:szCs w:val="17"/>
           <w:lang w:val="en-US"/>
         </w:rPr>
+        <w:lastRenderedPageBreak/>
         <w:t xml:space="preserve">create procedure </w:t>
       </w:r>
       <w:proofErr w:type="spellStart"/>
@@ -5270,7 +5841,6 @@
         <w:rPr>
           <w:lang w:val="en-US"/>
         </w:rPr>
-        <w:lastRenderedPageBreak/>
         <w:t>Into this:</w:t>
       </w:r>
     </w:p>
@@ -6957,6 +7527,7 @@
           <w:szCs w:val="19"/>
           <w:lang w:val="en-US"/>
         </w:rPr>
+        <w:lastRenderedPageBreak/>
         <w:t>Given this goal, there is no alternative, only wild cards:</w:t>
       </w:r>
     </w:p>
@@ -7719,7 +8290,6 @@
           <w:szCs w:val="19"/>
           <w:lang w:val="en-US"/>
         </w:rPr>
-        <w:lastRenderedPageBreak/>
         <w:t>PatternTail</w:t>
       </w:r>
       <w:proofErr w:type="spellEnd"/>
@@ -8986,6 +9556,7 @@
           <w:szCs w:val="19"/>
           <w:lang w:val="en-US"/>
         </w:rPr>
+        <w:lastRenderedPageBreak/>
         <w:t>i</w:t>
       </w:r>
       <w:r>

</xml_diff>

<commit_message>
Fix: SqlView forgot to support ISqlFullNameHolder.
</commit_message>
<xml_diff>
--- a/CK.SqlServer.Transform/Data Definition Manipulation Language.docx
+++ b/CK.SqlServer.Transform/Data Definition Manipulation Language.docx
@@ -2728,8 +2728,6 @@
                 <w:lang w:val="en-US"/>
               </w:rPr>
             </w:pPr>
-            <w:bookmarkStart w:id="0" w:name="_GoBack"/>
-            <w:bookmarkEnd w:id="0"/>
           </w:p>
           <w:p>
             <w:pPr>
@@ -2749,17 +2747,7 @@
                 <w:szCs w:val="19"/>
                 <w:lang w:val="en-US"/>
               </w:rPr>
-              <w:t xml:space="preserve">   </w:t>
-            </w:r>
-            <w:r>
-              <w:rPr>
-                <w:rFonts w:ascii="Consolas" w:hAnsi="Consolas" w:cs="Consolas"/>
-                <w:color w:val="000000"/>
-                <w:sz w:val="19"/>
-                <w:szCs w:val="19"/>
-                <w:lang w:val="en-US"/>
-              </w:rPr>
-              <w:t>--&lt;</w:t>
+              <w:t xml:space="preserve">   --&lt;</w:t>
             </w:r>
             <w:proofErr w:type="spellStart"/>
             <w:r>
@@ -3675,6 +3663,8 @@
                 <w:lang w:val="en-US"/>
               </w:rPr>
             </w:pPr>
+            <w:bookmarkStart w:id="0" w:name="_GoBack"/>
+            <w:bookmarkEnd w:id="0"/>
             <w:r>
               <w:rPr>
                 <w:rFonts w:ascii="Consolas" w:hAnsi="Consolas" w:cs="Consolas"/>
@@ -3865,6 +3855,17 @@
               </w:rPr>
               <w:t xml:space="preserve"> </w:t>
             </w:r>
+          </w:p>
+          <w:p>
+            <w:pPr>
+              <w:rPr>
+                <w:rFonts w:ascii="Consolas" w:hAnsi="Consolas" w:cs="Consolas"/>
+                <w:color w:val="000000"/>
+                <w:sz w:val="19"/>
+                <w:szCs w:val="19"/>
+                <w:lang w:val="en-US"/>
+              </w:rPr>
+            </w:pPr>
             <w:r>
               <w:rPr>
                 <w:rFonts w:ascii="Consolas" w:hAnsi="Consolas" w:cs="Consolas"/>
@@ -3875,6 +3876,28 @@
               </w:rPr>
               <w:t xml:space="preserve">begin </w:t>
             </w:r>
+          </w:p>
+          <w:p>
+            <w:pPr>
+              <w:rPr>
+                <w:rFonts w:ascii="Consolas" w:hAnsi="Consolas" w:cs="Consolas"/>
+                <w:color w:val="000000"/>
+                <w:sz w:val="19"/>
+                <w:szCs w:val="19"/>
+                <w:lang w:val="en-US"/>
+              </w:rPr>
+            </w:pPr>
+            <w:r>
+              <w:rPr>
+                <w:rFonts w:ascii="Consolas" w:hAnsi="Consolas" w:cs="Consolas"/>
+                <w:color w:val="000000"/>
+                <w:sz w:val="19"/>
+                <w:szCs w:val="19"/>
+                <w:highlight w:val="white"/>
+                <w:lang w:val="en-US"/>
+              </w:rPr>
+              <w:t xml:space="preserve">   </w:t>
+            </w:r>
             <w:proofErr w:type="spellStart"/>
             <w:r>
               <w:rPr>
@@ -3896,7 +3919,28 @@
                 <w:szCs w:val="19"/>
                 <w:lang w:val="en-US"/>
               </w:rPr>
-              <w:t>* end</w:t>
+              <w:t xml:space="preserve">* </w:t>
+            </w:r>
+          </w:p>
+          <w:p>
+            <w:pPr>
+              <w:rPr>
+                <w:rFonts w:ascii="Consolas" w:hAnsi="Consolas" w:cs="Consolas"/>
+                <w:color w:val="000000"/>
+                <w:sz w:val="19"/>
+                <w:szCs w:val="19"/>
+                <w:lang w:val="en-US"/>
+              </w:rPr>
+            </w:pPr>
+            <w:r>
+              <w:rPr>
+                <w:rFonts w:ascii="Consolas" w:hAnsi="Consolas" w:cs="Consolas"/>
+                <w:color w:val="000000"/>
+                <w:sz w:val="19"/>
+                <w:szCs w:val="19"/>
+                <w:lang w:val="en-US"/>
+              </w:rPr>
+              <w:t>end</w:t>
             </w:r>
           </w:p>
         </w:tc>
@@ -5032,6 +5076,7 @@
         <w:rPr>
           <w:lang w:val="en-US"/>
         </w:rPr>
+        <w:lastRenderedPageBreak/>
         <w:t>This transformer will transform this:</w:t>
       </w:r>
     </w:p>
@@ -5055,7 +5100,6 @@
           <w:szCs w:val="17"/>
           <w:lang w:val="en-US"/>
         </w:rPr>
-        <w:lastRenderedPageBreak/>
         <w:t xml:space="preserve">create procedure </w:t>
       </w:r>
       <w:proofErr w:type="spellStart"/>
@@ -7480,6 +7524,7 @@
           <w:szCs w:val="19"/>
           <w:lang w:val="en-US"/>
         </w:rPr>
+        <w:lastRenderedPageBreak/>
         <w:t>and not to capture part(s) of the match(</w:t>
       </w:r>
       <w:proofErr w:type="spellStart"/>
@@ -7527,7 +7572,6 @@
           <w:szCs w:val="19"/>
           <w:lang w:val="en-US"/>
         </w:rPr>
-        <w:lastRenderedPageBreak/>
         <w:t>Given this goal, there is no alternative, only wild cards:</w:t>
       </w:r>
     </w:p>
@@ -9488,6 +9532,7 @@
           <w:strike/>
           <w:lang w:val="en-US"/>
         </w:rPr>
+        <w:lastRenderedPageBreak/>
         <w:t>Statement and Part matching</w:t>
       </w:r>
     </w:p>
@@ -9556,7 +9601,6 @@
           <w:szCs w:val="19"/>
           <w:lang w:val="en-US"/>
         </w:rPr>
-        <w:lastRenderedPageBreak/>
         <w:t>i</w:t>
       </w:r>
       <w:r>

</xml_diff>

<commit_message>
Added test and TODO....
</commit_message>
<xml_diff>
--- a/CK.SqlServer.Transform/Data Definition Manipulation Language.docx
+++ b/CK.SqlServer.Transform/Data Definition Manipulation Language.docx
@@ -2479,6 +2479,8 @@
               </w:rPr>
               <w:t>Create</w:t>
             </w:r>
+            <w:bookmarkStart w:id="0" w:name="_GoBack"/>
+            <w:bookmarkEnd w:id="0"/>
             <w:proofErr w:type="spellEnd"/>
             <w:r>
               <w:rPr>
@@ -2797,7 +2799,17 @@
                 <w:szCs w:val="19"/>
                 <w:lang w:val="en-US"/>
               </w:rPr>
-              <w:t>PreCreate</w:t>
+              <w:t>Pre</w:t>
+            </w:r>
+            <w:r>
+              <w:rPr>
+                <w:rFonts w:ascii="Consolas" w:hAnsi="Consolas" w:cs="Consolas"/>
+                <w:color w:val="000000"/>
+                <w:sz w:val="19"/>
+                <w:szCs w:val="19"/>
+                <w:lang w:val="en-US"/>
+              </w:rPr>
+              <w:t>Destroy</w:t>
             </w:r>
             <w:proofErr w:type="spellEnd"/>
             <w:r>
@@ -2821,8 +2833,6 @@
                 <w:lang w:val="en-US"/>
               </w:rPr>
             </w:pPr>
-            <w:bookmarkStart w:id="0" w:name="_GoBack"/>
-            <w:bookmarkEnd w:id="0"/>
           </w:p>
           <w:p>
             <w:pPr>
@@ -4345,27 +4355,7 @@
           <w:szCs w:val="17"/>
           <w:lang w:val="en-US"/>
         </w:rPr>
-        <w:t xml:space="preserve"> </w:t>
-      </w:r>
-      <w:proofErr w:type="spellStart"/>
-      <w:r>
-        <w:rPr>
-          <w:rFonts w:ascii="Courier New" w:hAnsi="Courier New" w:cs="Courier New"/>
-          <w:sz w:val="17"/>
-          <w:szCs w:val="17"/>
-          <w:lang w:val="en-US"/>
-        </w:rPr>
-        <w:t>int</w:t>
-      </w:r>
-      <w:proofErr w:type="spellEnd"/>
-      <w:r>
-        <w:rPr>
-          <w:rFonts w:ascii="Courier New" w:hAnsi="Courier New" w:cs="Courier New"/>
-          <w:sz w:val="17"/>
-          <w:szCs w:val="17"/>
-          <w:lang w:val="en-US"/>
-        </w:rPr>
-        <w:t xml:space="preserve"> = 0 before @</w:t>
+        <w:t xml:space="preserve"> int = 0 before @</w:t>
       </w:r>
       <w:proofErr w:type="spellStart"/>
       <w:r>
@@ -5019,27 +5009,7 @@
           <w:szCs w:val="17"/>
           <w:lang w:val="en-US"/>
         </w:rPr>
-        <w:t xml:space="preserve">( </w:t>
-      </w:r>
-      <w:proofErr w:type="spellStart"/>
-      <w:r>
-        <w:rPr>
-          <w:rFonts w:ascii="Courier New" w:hAnsi="Courier New" w:cs="Courier New"/>
-          <w:sz w:val="17"/>
-          <w:szCs w:val="17"/>
-          <w:lang w:val="en-US"/>
-        </w:rPr>
-        <w:t>Msg</w:t>
-      </w:r>
-      <w:proofErr w:type="spellEnd"/>
-      <w:r>
-        <w:rPr>
-          <w:rFonts w:ascii="Courier New" w:hAnsi="Courier New" w:cs="Courier New"/>
-          <w:sz w:val="17"/>
-          <w:szCs w:val="17"/>
-          <w:lang w:val="en-US"/>
-        </w:rPr>
-        <w:t xml:space="preserve"> ) values( </w:t>
+        <w:t xml:space="preserve">( Msg ) values( </w:t>
       </w:r>
       <w:proofErr w:type="spellStart"/>
       <w:r>
@@ -5125,27 +5095,7 @@
           <w:szCs w:val="17"/>
           <w:lang w:val="en-US"/>
         </w:rPr>
-        <w:t xml:space="preserve">( </w:t>
-      </w:r>
-      <w:proofErr w:type="spellStart"/>
-      <w:r>
-        <w:rPr>
-          <w:rFonts w:ascii="Courier New" w:hAnsi="Courier New" w:cs="Courier New"/>
-          <w:sz w:val="17"/>
-          <w:szCs w:val="17"/>
-          <w:lang w:val="en-US"/>
-        </w:rPr>
-        <w:t>Msg</w:t>
-      </w:r>
-      <w:proofErr w:type="spellEnd"/>
-      <w:r>
-        <w:rPr>
-          <w:rFonts w:ascii="Courier New" w:hAnsi="Courier New" w:cs="Courier New"/>
-          <w:sz w:val="17"/>
-          <w:szCs w:val="17"/>
-          <w:lang w:val="en-US"/>
-        </w:rPr>
-        <w:t xml:space="preserve"> ) values( </w:t>
+        <w:t xml:space="preserve">( Msg ) values( </w:t>
       </w:r>
       <w:proofErr w:type="spellStart"/>
       <w:r>
@@ -5330,27 +5280,7 @@
           <w:szCs w:val="17"/>
           <w:lang w:val="en-US"/>
         </w:rPr>
-        <w:t xml:space="preserve"> </w:t>
-      </w:r>
-      <w:proofErr w:type="spellStart"/>
-      <w:r>
-        <w:rPr>
-          <w:rFonts w:ascii="Courier New" w:hAnsi="Courier New" w:cs="Courier New"/>
-          <w:sz w:val="17"/>
-          <w:szCs w:val="17"/>
-          <w:lang w:val="en-US"/>
-        </w:rPr>
-        <w:t>int</w:t>
-      </w:r>
-      <w:proofErr w:type="spellEnd"/>
-      <w:r>
-        <w:rPr>
-          <w:rFonts w:ascii="Courier New" w:hAnsi="Courier New" w:cs="Courier New"/>
-          <w:sz w:val="17"/>
-          <w:szCs w:val="17"/>
-          <w:lang w:val="en-US"/>
-        </w:rPr>
-        <w:t>,</w:t>
+        <w:t xml:space="preserve"> int,</w:t>
       </w:r>
     </w:p>
     <w:p>
@@ -5393,27 +5323,7 @@
           <w:szCs w:val="17"/>
           <w:lang w:val="en-US"/>
         </w:rPr>
-        <w:t xml:space="preserve"> </w:t>
-      </w:r>
-      <w:proofErr w:type="spellStart"/>
-      <w:r>
-        <w:rPr>
-          <w:rFonts w:ascii="Courier New" w:hAnsi="Courier New" w:cs="Courier New"/>
-          <w:sz w:val="17"/>
-          <w:szCs w:val="17"/>
-          <w:lang w:val="en-US"/>
-        </w:rPr>
-        <w:t>int</w:t>
-      </w:r>
-      <w:proofErr w:type="spellEnd"/>
-      <w:r>
-        <w:rPr>
-          <w:rFonts w:ascii="Courier New" w:hAnsi="Courier New" w:cs="Courier New"/>
-          <w:sz w:val="17"/>
-          <w:szCs w:val="17"/>
-          <w:lang w:val="en-US"/>
-        </w:rPr>
-        <w:t xml:space="preserve"> output</w:t>
+        <w:t xml:space="preserve"> int output</w:t>
       </w:r>
     </w:p>
     <w:p>
@@ -6138,27 +6048,7 @@
           <w:szCs w:val="17"/>
           <w:lang w:val="en-US"/>
         </w:rPr>
-        <w:t xml:space="preserve"> </w:t>
-      </w:r>
-      <w:proofErr w:type="spellStart"/>
-      <w:r>
-        <w:rPr>
-          <w:rFonts w:ascii="Courier New" w:hAnsi="Courier New" w:cs="Courier New"/>
-          <w:sz w:val="17"/>
-          <w:szCs w:val="17"/>
-          <w:lang w:val="en-US"/>
-        </w:rPr>
-        <w:t>int</w:t>
-      </w:r>
-      <w:proofErr w:type="spellEnd"/>
-      <w:r>
-        <w:rPr>
-          <w:rFonts w:ascii="Courier New" w:hAnsi="Courier New" w:cs="Courier New"/>
-          <w:sz w:val="17"/>
-          <w:szCs w:val="17"/>
-          <w:lang w:val="en-US"/>
-        </w:rPr>
-        <w:t>,</w:t>
+        <w:t xml:space="preserve"> int,</w:t>
       </w:r>
     </w:p>
     <w:p>
@@ -6201,27 +6091,7 @@
           <w:szCs w:val="17"/>
           <w:lang w:val="en-US"/>
         </w:rPr>
-        <w:t xml:space="preserve"> </w:t>
-      </w:r>
-      <w:proofErr w:type="spellStart"/>
-      <w:r>
-        <w:rPr>
-          <w:rFonts w:ascii="Courier New" w:hAnsi="Courier New" w:cs="Courier New"/>
-          <w:sz w:val="17"/>
-          <w:szCs w:val="17"/>
-          <w:lang w:val="en-US"/>
-        </w:rPr>
-        <w:t>int</w:t>
-      </w:r>
-      <w:proofErr w:type="spellEnd"/>
-      <w:r>
-        <w:rPr>
-          <w:rFonts w:ascii="Courier New" w:hAnsi="Courier New" w:cs="Courier New"/>
-          <w:sz w:val="17"/>
-          <w:szCs w:val="17"/>
-          <w:lang w:val="en-US"/>
-        </w:rPr>
-        <w:t xml:space="preserve"> = 0,</w:t>
+        <w:t xml:space="preserve"> int = 0,</w:t>
       </w:r>
     </w:p>
     <w:p>
@@ -6264,27 +6134,7 @@
           <w:szCs w:val="17"/>
           <w:lang w:val="en-US"/>
         </w:rPr>
-        <w:t xml:space="preserve"> </w:t>
-      </w:r>
-      <w:proofErr w:type="spellStart"/>
-      <w:r>
-        <w:rPr>
-          <w:rFonts w:ascii="Courier New" w:hAnsi="Courier New" w:cs="Courier New"/>
-          <w:sz w:val="17"/>
-          <w:szCs w:val="17"/>
-          <w:lang w:val="en-US"/>
-        </w:rPr>
-        <w:t>int</w:t>
-      </w:r>
-      <w:proofErr w:type="spellEnd"/>
-      <w:r>
-        <w:rPr>
-          <w:rFonts w:ascii="Courier New" w:hAnsi="Courier New" w:cs="Courier New"/>
-          <w:sz w:val="17"/>
-          <w:szCs w:val="17"/>
-          <w:lang w:val="en-US"/>
-        </w:rPr>
-        <w:t xml:space="preserve"> output</w:t>
+        <w:t xml:space="preserve"> int output</w:t>
       </w:r>
     </w:p>
     <w:p>
@@ -7183,27 +7033,7 @@
           <w:szCs w:val="17"/>
           <w:lang w:val="en-US"/>
         </w:rPr>
-        <w:t xml:space="preserve">( </w:t>
-      </w:r>
-      <w:proofErr w:type="spellStart"/>
-      <w:r>
-        <w:rPr>
-          <w:rFonts w:ascii="Courier New" w:hAnsi="Courier New" w:cs="Courier New"/>
-          <w:sz w:val="17"/>
-          <w:szCs w:val="17"/>
-          <w:lang w:val="en-US"/>
-        </w:rPr>
-        <w:t>Msg</w:t>
-      </w:r>
-      <w:proofErr w:type="spellEnd"/>
-      <w:r>
-        <w:rPr>
-          <w:rFonts w:ascii="Courier New" w:hAnsi="Courier New" w:cs="Courier New"/>
-          <w:sz w:val="17"/>
-          <w:szCs w:val="17"/>
-          <w:lang w:val="en-US"/>
-        </w:rPr>
-        <w:t xml:space="preserve"> ) values( </w:t>
+        <w:t xml:space="preserve">( Msg ) values( </w:t>
       </w:r>
       <w:proofErr w:type="spellStart"/>
       <w:r>
@@ -7268,27 +7098,7 @@
           <w:szCs w:val="17"/>
           <w:lang w:val="en-US"/>
         </w:rPr>
-        <w:t xml:space="preserve">( </w:t>
-      </w:r>
-      <w:proofErr w:type="spellStart"/>
-      <w:r>
-        <w:rPr>
-          <w:rFonts w:ascii="Courier New" w:hAnsi="Courier New" w:cs="Courier New"/>
-          <w:sz w:val="17"/>
-          <w:szCs w:val="17"/>
-          <w:lang w:val="en-US"/>
-        </w:rPr>
-        <w:t>Msg</w:t>
-      </w:r>
-      <w:proofErr w:type="spellEnd"/>
-      <w:r>
-        <w:rPr>
-          <w:rFonts w:ascii="Courier New" w:hAnsi="Courier New" w:cs="Courier New"/>
-          <w:sz w:val="17"/>
-          <w:szCs w:val="17"/>
-          <w:lang w:val="en-US"/>
-        </w:rPr>
-        <w:t xml:space="preserve"> ) values( </w:t>
+        <w:t xml:space="preserve">( Msg ) values( </w:t>
       </w:r>
       <w:proofErr w:type="spellStart"/>
       <w:r>
@@ -7676,31 +7486,7 @@
           <w:szCs w:val="19"/>
           <w:lang w:val="en-US"/>
         </w:rPr>
-        <w:t>and not to capture part(s) of the match(</w:t>
-      </w:r>
-      <w:proofErr w:type="spellStart"/>
-      <w:r>
-        <w:rPr>
-          <w:rFonts w:ascii="Consolas" w:hAnsi="Consolas" w:cs="Consolas"/>
-          <w:strike/>
-          <w:color w:val="000000"/>
-          <w:sz w:val="19"/>
-          <w:szCs w:val="19"/>
-          <w:lang w:val="en-US"/>
-        </w:rPr>
-        <w:t>es</w:t>
-      </w:r>
-      <w:proofErr w:type="spellEnd"/>
-      <w:r>
-        <w:rPr>
-          <w:rFonts w:ascii="Consolas" w:hAnsi="Consolas" w:cs="Consolas"/>
-          <w:strike/>
-          <w:color w:val="000000"/>
-          <w:sz w:val="19"/>
-          <w:szCs w:val="19"/>
-          <w:lang w:val="en-US"/>
-        </w:rPr>
-        <w:t>) like regular expressions do.</w:t>
+        <w:t>and not to capture part(s) of the match(es) like regular expressions do.</w:t>
       </w:r>
     </w:p>
     <w:p>
@@ -10734,7 +10520,7 @@
       </w:pPr>
     </w:pPrDefault>
   </w:docDefaults>
-  <w:latentStyles w:defLockedState="0" w:defUIPriority="99" w:defSemiHidden="0" w:defUnhideWhenUsed="0" w:defQFormat="0" w:count="375">
+  <w:latentStyles w:defLockedState="0" w:defUIPriority="99" w:defSemiHidden="0" w:defUnhideWhenUsed="0" w:defQFormat="0" w:count="376">
     <w:lsdException w:name="Normal" w:uiPriority="0" w:qFormat="1"/>
     <w:lsdException w:name="heading 1" w:uiPriority="9" w:qFormat="1"/>
     <w:lsdException w:name="heading 2" w:semiHidden="1" w:uiPriority="9" w:unhideWhenUsed="1" w:qFormat="1"/>
@@ -10885,7 +10671,7 @@
     <w:lsdException w:name="Table Subtle 1" w:semiHidden="1" w:unhideWhenUsed="1"/>
     <w:lsdException w:name="Table Subtle 2" w:semiHidden="1" w:unhideWhenUsed="1"/>
     <w:lsdException w:name="Table Web 1" w:semiHidden="1" w:unhideWhenUsed="1"/>
-    <w:lsdException w:name="Table Web 3" w:semiHidden="1" w:unhideWhenUsed="1"/>
+    <w:lsdException w:name="Table Web 2" w:semiHidden="1" w:unhideWhenUsed="1"/>
     <w:lsdException w:name="Balloon Text" w:semiHidden="1" w:unhideWhenUsed="1"/>
     <w:lsdException w:name="Table Grid" w:uiPriority="39"/>
     <w:lsdException w:name="Placeholder Text" w:semiHidden="1"/>
@@ -11107,6 +10893,7 @@
     <w:lsdException w:name="Smart Hyperlink" w:semiHidden="1" w:unhideWhenUsed="1"/>
     <w:lsdException w:name="Hashtag" w:semiHidden="1" w:unhideWhenUsed="1"/>
     <w:lsdException w:name="Unresolved Mention" w:semiHidden="1" w:unhideWhenUsed="1"/>
+    <w:lsdException w:name="Smart Link" w:semiHidden="1" w:unhideWhenUsed="1"/>
   </w:latentStyles>
   <w:style w:type="paragraph" w:default="1" w:styleId="Normal">
     <w:name w:val="Normal"/>

</xml_diff>

<commit_message>
Applied settings.(...) Unit tests use vs tests.
</commit_message>
<xml_diff>
--- a/CK.SqlServer.Transform/Data Definition Manipulation Language.docx
+++ b/CK.SqlServer.Transform/Data Definition Manipulation Language.docx
@@ -2479,8 +2479,6 @@
               </w:rPr>
               <w:t>Create</w:t>
             </w:r>
-            <w:bookmarkStart w:id="0" w:name="_GoBack"/>
-            <w:bookmarkEnd w:id="0"/>
             <w:proofErr w:type="spellEnd"/>
             <w:r>
               <w:rPr>
@@ -2883,6 +2881,7 @@
                 <w:lang w:val="en-US"/>
               </w:rPr>
             </w:pPr>
+            <w:bookmarkStart w:id="0" w:name="_GoBack"/>
             <w:proofErr w:type="spellStart"/>
             <w:r>
               <w:rPr>
@@ -2894,6 +2893,17 @@
                 <w:lang w:val="en-US"/>
               </w:rPr>
               <w:lastRenderedPageBreak/>
+              <w:t>One</w:t>
+            </w:r>
+            <w:r>
+              <w:rPr>
+                <w:rFonts w:ascii="Consolas" w:hAnsi="Consolas" w:cs="Consolas"/>
+                <w:color w:val="000000"/>
+                <w:sz w:val="19"/>
+                <w:szCs w:val="19"/>
+                <w:highlight w:val="white"/>
+                <w:lang w:val="en-US"/>
+              </w:rPr>
               <w:t>Location</w:t>
             </w:r>
             <w:r>
@@ -2993,28 +3003,7 @@
                 <w:szCs w:val="19"/>
                 <w:lang w:val="en-US"/>
               </w:rPr>
-              <w:t xml:space="preserve">| single </w:t>
-            </w:r>
-          </w:p>
-          <w:p>
-            <w:pPr>
-              <w:rPr>
-                <w:rFonts w:ascii="Consolas" w:hAnsi="Consolas" w:cs="Consolas"/>
-                <w:color w:val="000000"/>
-                <w:sz w:val="19"/>
-                <w:szCs w:val="19"/>
-                <w:lang w:val="en-US"/>
-              </w:rPr>
-            </w:pPr>
-            <w:r>
-              <w:rPr>
-                <w:rFonts w:ascii="Consolas" w:hAnsi="Consolas" w:cs="Consolas"/>
-                <w:color w:val="000000"/>
-                <w:sz w:val="19"/>
-                <w:szCs w:val="19"/>
-                <w:lang w:val="en-US"/>
-              </w:rPr>
-              <w:t>| all [[out of] n]) (</w:t>
+              <w:t>| single) (</w:t>
             </w:r>
             <w:proofErr w:type="spellStart"/>
             <w:r>
@@ -3096,9 +3085,10 @@
                 <w:color w:val="000000"/>
                 <w:sz w:val="19"/>
                 <w:szCs w:val="19"/>
-                <w:lang w:val="en-US"/>
-              </w:rPr>
-              <w:t>Each</w:t>
+                <w:highlight w:val="white"/>
+                <w:lang w:val="en-US"/>
+              </w:rPr>
+              <w:t>Location</w:t>
             </w:r>
             <w:r>
               <w:rPr>
@@ -3127,26 +3117,6 @@
                 <w:lang w:val="en-US"/>
               </w:rPr>
             </w:pPr>
-            <w:r>
-              <w:rPr>
-                <w:rFonts w:ascii="Consolas" w:hAnsi="Consolas" w:cs="Consolas"/>
-                <w:color w:val="000000"/>
-                <w:sz w:val="19"/>
-                <w:szCs w:val="19"/>
-                <w:lang w:val="en-US"/>
-              </w:rPr>
-              <w:t>each [[out of] n]</w:t>
-            </w:r>
-            <w:r>
-              <w:rPr>
-                <w:rFonts w:ascii="Consolas" w:hAnsi="Consolas" w:cs="Consolas"/>
-                <w:color w:val="000000"/>
-                <w:sz w:val="19"/>
-                <w:szCs w:val="19"/>
-                <w:lang w:val="en-US"/>
-              </w:rPr>
-              <w:t xml:space="preserve"> (</w:t>
-            </w:r>
             <w:proofErr w:type="spellStart"/>
             <w:r>
               <w:rPr>
@@ -3154,19 +3124,74 @@
                 <w:color w:val="000000"/>
                 <w:sz w:val="19"/>
                 <w:szCs w:val="19"/>
-                <w:lang w:val="en-US"/>
-              </w:rPr>
-              <w:t>CommentS</w:t>
-            </w:r>
-            <w:r>
-              <w:rPr>
-                <w:rFonts w:ascii="Consolas" w:hAnsi="Consolas" w:cs="Consolas"/>
-                <w:color w:val="000000"/>
-                <w:sz w:val="19"/>
-                <w:szCs w:val="19"/>
-                <w:lang w:val="en-US"/>
-              </w:rPr>
-              <w:t>tringMatch</w:t>
+                <w:highlight w:val="white"/>
+                <w:lang w:val="en-US"/>
+              </w:rPr>
+              <w:t>One</w:t>
+            </w:r>
+            <w:r>
+              <w:rPr>
+                <w:rFonts w:ascii="Consolas" w:hAnsi="Consolas" w:cs="Consolas"/>
+                <w:color w:val="000000"/>
+                <w:sz w:val="19"/>
+                <w:szCs w:val="19"/>
+                <w:highlight w:val="white"/>
+                <w:lang w:val="en-US"/>
+              </w:rPr>
+              <w:t>Location</w:t>
+            </w:r>
+            <w:r>
+              <w:rPr>
+                <w:rFonts w:ascii="Consolas" w:hAnsi="Consolas" w:cs="Consolas"/>
+                <w:color w:val="000000"/>
+                <w:sz w:val="19"/>
+                <w:szCs w:val="19"/>
+                <w:lang w:val="en-US"/>
+              </w:rPr>
+              <w:t>Finder</w:t>
+            </w:r>
+            <w:proofErr w:type="spellEnd"/>
+            <w:r>
+              <w:rPr>
+                <w:rFonts w:ascii="Consolas" w:hAnsi="Consolas" w:cs="Consolas"/>
+                <w:color w:val="000000"/>
+                <w:sz w:val="19"/>
+                <w:szCs w:val="19"/>
+                <w:lang w:val="en-US"/>
+              </w:rPr>
+              <w:t xml:space="preserve"> |</w:t>
+            </w:r>
+          </w:p>
+          <w:p>
+            <w:pPr>
+              <w:rPr>
+                <w:rFonts w:ascii="Consolas" w:hAnsi="Consolas" w:cs="Consolas"/>
+                <w:color w:val="000000"/>
+                <w:sz w:val="19"/>
+                <w:szCs w:val="19"/>
+                <w:lang w:val="en-US"/>
+              </w:rPr>
+            </w:pPr>
+            <w:r>
+              <w:rPr>
+                <w:rFonts w:ascii="Consolas" w:hAnsi="Consolas" w:cs="Consolas"/>
+                <w:color w:val="000000"/>
+                <w:sz w:val="19"/>
+                <w:szCs w:val="19"/>
+                <w:lang w:val="en-US"/>
+              </w:rPr>
+              <w:t>(all [[out of] n]) (</w:t>
+            </w:r>
+            <w:proofErr w:type="spellStart"/>
+            <w:r>
+              <w:rPr>
+                <w:rFonts w:ascii="Consolas" w:hAnsi="Consolas" w:cs="Consolas"/>
+                <w:color w:val="000000"/>
+                <w:sz w:val="19"/>
+                <w:szCs w:val="19"/>
+                <w:lang w:val="en-US"/>
+              </w:rPr>
+              <w:t>CommentStringMatch</w:t>
             </w:r>
             <w:proofErr w:type="spellEnd"/>
             <w:r>
@@ -3237,9 +3262,31 @@
                 <w:color w:val="000000"/>
                 <w:sz w:val="19"/>
                 <w:szCs w:val="19"/>
-                <w:lang w:val="en-US"/>
-              </w:rPr>
-              <w:t>CommentStringMatch</w:t>
+                <w:highlight w:val="white"/>
+                <w:lang w:val="en-US"/>
+              </w:rPr>
+              <w:t>Range</w:t>
+            </w:r>
+            <w:r>
+              <w:rPr>
+                <w:rFonts w:ascii="Consolas" w:hAnsi="Consolas" w:cs="Consolas"/>
+                <w:color w:val="000000"/>
+                <w:sz w:val="19"/>
+                <w:szCs w:val="19"/>
+                <w:highlight w:val="white"/>
+                <w:lang w:val="en-US"/>
+              </w:rPr>
+              <w:t>Location</w:t>
+            </w:r>
+            <w:r>
+              <w:rPr>
+                <w:rFonts w:ascii="Consolas" w:hAnsi="Consolas" w:cs="Consolas"/>
+                <w:color w:val="000000"/>
+                <w:sz w:val="19"/>
+                <w:szCs w:val="19"/>
+                <w:lang w:val="en-US"/>
+              </w:rPr>
+              <w:t>Finder</w:t>
             </w:r>
             <w:proofErr w:type="spellEnd"/>
           </w:p>
@@ -3266,7 +3313,73 @@
                 <w:szCs w:val="19"/>
                 <w:lang w:val="en-US"/>
               </w:rPr>
-              <w:t>A literal string enclosed with, quotes, double quotes or brackets that either:</w:t>
+              <w:t>(</w:t>
+            </w:r>
+            <w:proofErr w:type="spellStart"/>
+            <w:r>
+              <w:rPr>
+                <w:rFonts w:ascii="Consolas" w:hAnsi="Consolas" w:cs="Consolas"/>
+                <w:color w:val="000000"/>
+                <w:sz w:val="19"/>
+                <w:szCs w:val="19"/>
+                <w:lang w:val="en-US"/>
+              </w:rPr>
+              <w:t>after|before</w:t>
+            </w:r>
+            <w:proofErr w:type="spellEnd"/>
+            <w:r>
+              <w:rPr>
+                <w:rFonts w:ascii="Consolas" w:hAnsi="Consolas" w:cs="Consolas"/>
+                <w:color w:val="000000"/>
+                <w:sz w:val="19"/>
+                <w:szCs w:val="19"/>
+                <w:lang w:val="en-US"/>
+              </w:rPr>
+              <w:t xml:space="preserve">) </w:t>
+            </w:r>
+            <w:proofErr w:type="spellStart"/>
+            <w:r>
+              <w:rPr>
+                <w:rFonts w:ascii="Consolas" w:hAnsi="Consolas" w:cs="Consolas"/>
+                <w:color w:val="000000"/>
+                <w:sz w:val="19"/>
+                <w:szCs w:val="19"/>
+                <w:highlight w:val="white"/>
+                <w:lang w:val="en-US"/>
+              </w:rPr>
+              <w:t>One</w:t>
+            </w:r>
+            <w:r>
+              <w:rPr>
+                <w:rFonts w:ascii="Consolas" w:hAnsi="Consolas" w:cs="Consolas"/>
+                <w:color w:val="000000"/>
+                <w:sz w:val="19"/>
+                <w:szCs w:val="19"/>
+                <w:highlight w:val="white"/>
+                <w:lang w:val="en-US"/>
+              </w:rPr>
+              <w:t>Location</w:t>
+            </w:r>
+            <w:r>
+              <w:rPr>
+                <w:rFonts w:ascii="Consolas" w:hAnsi="Consolas" w:cs="Consolas"/>
+                <w:color w:val="000000"/>
+                <w:sz w:val="19"/>
+                <w:szCs w:val="19"/>
+                <w:lang w:val="en-US"/>
+              </w:rPr>
+              <w:t>Finder</w:t>
+            </w:r>
+            <w:proofErr w:type="spellEnd"/>
+            <w:r>
+              <w:rPr>
+                <w:rFonts w:ascii="Consolas" w:hAnsi="Consolas" w:cs="Consolas"/>
+                <w:color w:val="000000"/>
+                <w:sz w:val="19"/>
+                <w:szCs w:val="19"/>
+                <w:lang w:val="en-US"/>
+              </w:rPr>
+              <w:t xml:space="preserve"> </w:t>
             </w:r>
           </w:p>
           <w:p>
@@ -3279,231 +3392,97 @@
                 <w:lang w:val="en-US"/>
               </w:rPr>
             </w:pPr>
+            <w:r>
+              <w:rPr>
+                <w:rFonts w:ascii="Consolas" w:hAnsi="Consolas" w:cs="Consolas"/>
+                <w:color w:val="000000"/>
+                <w:sz w:val="19"/>
+                <w:szCs w:val="19"/>
+                <w:lang w:val="en-US"/>
+              </w:rPr>
+              <w:t xml:space="preserve">| between </w:t>
+            </w:r>
+            <w:proofErr w:type="spellStart"/>
+            <w:r>
+              <w:rPr>
+                <w:rFonts w:ascii="Consolas" w:hAnsi="Consolas" w:cs="Consolas"/>
+                <w:color w:val="000000"/>
+                <w:sz w:val="19"/>
+                <w:szCs w:val="19"/>
+                <w:highlight w:val="white"/>
+                <w:lang w:val="en-US"/>
+              </w:rPr>
+              <w:t>One</w:t>
+            </w:r>
+            <w:r>
+              <w:rPr>
+                <w:rFonts w:ascii="Consolas" w:hAnsi="Consolas" w:cs="Consolas"/>
+                <w:color w:val="000000"/>
+                <w:sz w:val="19"/>
+                <w:szCs w:val="19"/>
+                <w:highlight w:val="white"/>
+                <w:lang w:val="en-US"/>
+              </w:rPr>
+              <w:t>Location</w:t>
+            </w:r>
+            <w:r>
+              <w:rPr>
+                <w:rFonts w:ascii="Consolas" w:hAnsi="Consolas" w:cs="Consolas"/>
+                <w:color w:val="000000"/>
+                <w:sz w:val="19"/>
+                <w:szCs w:val="19"/>
+                <w:lang w:val="en-US"/>
+              </w:rPr>
+              <w:t>Finder</w:t>
+            </w:r>
+            <w:proofErr w:type="spellEnd"/>
+            <w:r>
+              <w:rPr>
+                <w:rFonts w:ascii="Consolas" w:hAnsi="Consolas" w:cs="Consolas"/>
+                <w:color w:val="000000"/>
+                <w:sz w:val="19"/>
+                <w:szCs w:val="19"/>
+                <w:lang w:val="en-US"/>
+              </w:rPr>
+              <w:t xml:space="preserve"> and </w:t>
+            </w:r>
+            <w:proofErr w:type="spellStart"/>
+            <w:r>
+              <w:rPr>
+                <w:rFonts w:ascii="Consolas" w:hAnsi="Consolas" w:cs="Consolas"/>
+                <w:color w:val="000000"/>
+                <w:sz w:val="19"/>
+                <w:szCs w:val="19"/>
+                <w:highlight w:val="white"/>
+                <w:lang w:val="en-US"/>
+              </w:rPr>
+              <w:t>One</w:t>
+            </w:r>
+            <w:r>
+              <w:rPr>
+                <w:rFonts w:ascii="Consolas" w:hAnsi="Consolas" w:cs="Consolas"/>
+                <w:color w:val="000000"/>
+                <w:sz w:val="19"/>
+                <w:szCs w:val="19"/>
+                <w:highlight w:val="white"/>
+                <w:lang w:val="en-US"/>
+              </w:rPr>
+              <w:t>Location</w:t>
+            </w:r>
+            <w:r>
+              <w:rPr>
+                <w:rFonts w:ascii="Consolas" w:hAnsi="Consolas" w:cs="Consolas"/>
+                <w:color w:val="000000"/>
+                <w:sz w:val="19"/>
+                <w:szCs w:val="19"/>
+                <w:lang w:val="en-US"/>
+              </w:rPr>
+              <w:t>Finder</w:t>
+            </w:r>
+            <w:proofErr w:type="spellEnd"/>
           </w:p>
           <w:p>
             <w:pPr>
-              <w:pStyle w:val="ListParagraph"/>
-              <w:numPr>
-                <w:ilvl w:val="0"/>
-                <w:numId w:val="3"/>
-              </w:numPr>
-              <w:rPr>
-                <w:rFonts w:ascii="Consolas" w:hAnsi="Consolas" w:cs="Consolas"/>
-                <w:color w:val="000000"/>
-                <w:sz w:val="19"/>
-                <w:szCs w:val="19"/>
-                <w:lang w:val="en-US"/>
-              </w:rPr>
-            </w:pPr>
-            <w:r>
-              <w:rPr>
-                <w:rFonts w:ascii="Consolas" w:hAnsi="Consolas" w:cs="Consolas"/>
-                <w:color w:val="000000"/>
-                <w:sz w:val="19"/>
-                <w:szCs w:val="19"/>
-                <w:lang w:val="en-US"/>
-              </w:rPr>
-              <w:t>Starts with -- for a line comment:</w:t>
-            </w:r>
-          </w:p>
-          <w:p>
-            <w:pPr>
-              <w:pStyle w:val="ListParagraph"/>
-              <w:rPr>
-                <w:rFonts w:ascii="Consolas" w:hAnsi="Consolas" w:cs="Consolas"/>
-                <w:color w:val="000000"/>
-                <w:sz w:val="19"/>
-                <w:szCs w:val="19"/>
-                <w:lang w:val="en-US"/>
-              </w:rPr>
-            </w:pPr>
-            <w:r>
-              <w:rPr>
-                <w:rFonts w:ascii="Consolas" w:hAnsi="Consolas" w:cs="Consolas"/>
-                <w:color w:val="000000"/>
-                <w:sz w:val="19"/>
-                <w:szCs w:val="19"/>
-                <w:lang w:val="en-US"/>
-              </w:rPr>
-              <w:t>"--</w:t>
-            </w:r>
-            <w:r>
-              <w:rPr>
-                <w:rFonts w:ascii="Consolas" w:hAnsi="Consolas" w:cs="Consolas"/>
-                <w:color w:val="000000"/>
-                <w:sz w:val="19"/>
-                <w:szCs w:val="19"/>
-                <w:lang w:val="en-US"/>
-              </w:rPr>
-              <w:t xml:space="preserve"> prefix</w:t>
-            </w:r>
-            <w:r>
-              <w:rPr>
-                <w:rFonts w:ascii="Consolas" w:hAnsi="Consolas" w:cs="Consolas"/>
-                <w:color w:val="000000"/>
-                <w:sz w:val="19"/>
-                <w:szCs w:val="19"/>
-                <w:lang w:val="en-US"/>
-              </w:rPr>
-              <w:t>" | [--</w:t>
-            </w:r>
-            <w:r>
-              <w:rPr>
-                <w:rFonts w:ascii="Consolas" w:hAnsi="Consolas" w:cs="Consolas"/>
-                <w:color w:val="000000"/>
-                <w:sz w:val="19"/>
-                <w:szCs w:val="19"/>
-                <w:lang w:val="en-US"/>
-              </w:rPr>
-              <w:t xml:space="preserve"> prefix</w:t>
-            </w:r>
-            <w:r>
-              <w:rPr>
-                <w:rFonts w:ascii="Consolas" w:hAnsi="Consolas" w:cs="Consolas"/>
-                <w:color w:val="000000"/>
-                <w:sz w:val="19"/>
-                <w:szCs w:val="19"/>
-                <w:lang w:val="en-US"/>
-              </w:rPr>
-              <w:t>] | '--</w:t>
-            </w:r>
-            <w:r>
-              <w:rPr>
-                <w:rFonts w:ascii="Consolas" w:hAnsi="Consolas" w:cs="Consolas"/>
-                <w:color w:val="000000"/>
-                <w:sz w:val="19"/>
-                <w:szCs w:val="19"/>
-                <w:lang w:val="en-US"/>
-              </w:rPr>
-              <w:t xml:space="preserve"> prefix</w:t>
-            </w:r>
-            <w:r>
-              <w:rPr>
-                <w:rFonts w:ascii="Consolas" w:hAnsi="Consolas" w:cs="Consolas"/>
-                <w:color w:val="000000"/>
-                <w:sz w:val="19"/>
-                <w:szCs w:val="19"/>
-                <w:lang w:val="en-US"/>
-              </w:rPr>
-              <w:t>'</w:t>
-            </w:r>
-          </w:p>
-          <w:p>
-            <w:pPr>
-              <w:pStyle w:val="ListParagraph"/>
-              <w:rPr>
-                <w:rFonts w:ascii="Consolas" w:hAnsi="Consolas" w:cs="Consolas"/>
-                <w:color w:val="000000"/>
-                <w:sz w:val="19"/>
-                <w:szCs w:val="19"/>
-                <w:lang w:val="en-US"/>
-              </w:rPr>
-            </w:pPr>
-            <w:r>
-              <w:rPr>
-                <w:rFonts w:ascii="Consolas" w:hAnsi="Consolas" w:cs="Consolas"/>
-                <w:color w:val="000000"/>
-                <w:sz w:val="19"/>
-                <w:szCs w:val="19"/>
-                <w:lang w:val="en-US"/>
-              </w:rPr>
-              <w:t>The trimmed prefix must start the left trimmed line comment.</w:t>
-            </w:r>
-          </w:p>
-          <w:p>
-            <w:pPr>
-              <w:rPr>
-                <w:rFonts w:ascii="Consolas" w:hAnsi="Consolas" w:cs="Consolas"/>
-                <w:color w:val="000000"/>
-                <w:sz w:val="19"/>
-                <w:szCs w:val="19"/>
-                <w:lang w:val="en-US"/>
-              </w:rPr>
-            </w:pPr>
-          </w:p>
-          <w:p>
-            <w:pPr>
-              <w:pStyle w:val="ListParagraph"/>
-              <w:numPr>
-                <w:ilvl w:val="0"/>
-                <w:numId w:val="3"/>
-              </w:numPr>
-              <w:rPr>
-                <w:rFonts w:ascii="Consolas" w:hAnsi="Consolas" w:cs="Consolas"/>
-                <w:color w:val="000000"/>
-                <w:sz w:val="19"/>
-                <w:szCs w:val="19"/>
-                <w:lang w:val="en-US"/>
-              </w:rPr>
-            </w:pPr>
-            <w:r>
-              <w:rPr>
-                <w:rFonts w:ascii="Consolas" w:hAnsi="Consolas" w:cs="Consolas"/>
-                <w:color w:val="000000"/>
-                <w:sz w:val="19"/>
-                <w:szCs w:val="19"/>
-                <w:lang w:val="en-US"/>
-              </w:rPr>
-              <w:t>Starts and ends with a star comment:</w:t>
-            </w:r>
-          </w:p>
-          <w:p>
-            <w:pPr>
-              <w:pStyle w:val="ListParagraph"/>
-              <w:rPr>
-                <w:rFonts w:ascii="Consolas" w:hAnsi="Consolas" w:cs="Consolas"/>
-                <w:color w:val="000000"/>
-                <w:sz w:val="19"/>
-                <w:szCs w:val="19"/>
-                <w:lang w:val="en-US"/>
-              </w:rPr>
-            </w:pPr>
-            <w:r>
-              <w:rPr>
-                <w:rFonts w:ascii="Consolas" w:hAnsi="Consolas" w:cs="Consolas"/>
-                <w:color w:val="000000"/>
-                <w:sz w:val="19"/>
-                <w:szCs w:val="19"/>
-                <w:lang w:val="en-US"/>
-              </w:rPr>
-              <w:t>"/* content */" | [/* content */] | '/* content */'</w:t>
-            </w:r>
-          </w:p>
-          <w:p>
-            <w:pPr>
-              <w:pStyle w:val="ListParagraph"/>
-              <w:rPr>
-                <w:rFonts w:ascii="Consolas" w:hAnsi="Consolas" w:cs="Consolas"/>
-                <w:color w:val="000000"/>
-                <w:sz w:val="19"/>
-                <w:szCs w:val="19"/>
-                <w:lang w:val="en-US"/>
-              </w:rPr>
-            </w:pPr>
-            <w:r>
-              <w:rPr>
-                <w:rFonts w:ascii="Consolas" w:hAnsi="Consolas" w:cs="Consolas"/>
-                <w:color w:val="000000"/>
-                <w:sz w:val="19"/>
-                <w:szCs w:val="19"/>
-                <w:lang w:val="en-US"/>
-              </w:rPr>
-              <w:t>The trimmed content must a</w:t>
-            </w:r>
-            <w:r>
-              <w:rPr>
-                <w:rFonts w:ascii="Consolas" w:hAnsi="Consolas" w:cs="Consolas"/>
-                <w:color w:val="000000"/>
-                <w:sz w:val="19"/>
-                <w:szCs w:val="19"/>
-                <w:lang w:val="en-US"/>
-              </w:rPr>
-              <w:t>ppear in the star comment.</w:t>
-            </w:r>
-          </w:p>
-          <w:p>
-            <w:pPr>
-              <w:pStyle w:val="ListParagraph"/>
               <w:rPr>
                 <w:rFonts w:ascii="Consolas" w:hAnsi="Consolas" w:cs="Consolas"/>
                 <w:color w:val="000000"/>
@@ -3539,7 +3518,17 @@
                 <w:szCs w:val="19"/>
                 <w:lang w:val="en-US"/>
               </w:rPr>
-              <w:t>NodeSimplePattern</w:t>
+              <w:t>Each</w:t>
+            </w:r>
+            <w:r>
+              <w:rPr>
+                <w:rFonts w:ascii="Consolas" w:hAnsi="Consolas" w:cs="Consolas"/>
+                <w:color w:val="000000"/>
+                <w:sz w:val="19"/>
+                <w:szCs w:val="19"/>
+                <w:lang w:val="en-US"/>
+              </w:rPr>
+              <w:t>Finder</w:t>
             </w:r>
             <w:proofErr w:type="spellEnd"/>
           </w:p>
@@ -3566,7 +3555,17 @@
                 <w:szCs w:val="19"/>
                 <w:lang w:val="en-US"/>
               </w:rPr>
-              <w:t>[</w:t>
+              <w:t>each [[out of] n]</w:t>
+            </w:r>
+            <w:r>
+              <w:rPr>
+                <w:rFonts w:ascii="Consolas" w:hAnsi="Consolas" w:cs="Consolas"/>
+                <w:color w:val="000000"/>
+                <w:sz w:val="19"/>
+                <w:szCs w:val="19"/>
+                <w:lang w:val="en-US"/>
+              </w:rPr>
+              <w:t xml:space="preserve"> (</w:t>
             </w:r>
             <w:proofErr w:type="spellStart"/>
             <w:r>
@@ -3575,30 +3574,19 @@
                 <w:color w:val="000000"/>
                 <w:sz w:val="19"/>
                 <w:szCs w:val="19"/>
-                <w:u w:val="double"/>
-                <w:lang w:val="en-US"/>
-              </w:rPr>
-              <w:t>part</w:t>
-            </w:r>
-            <w:r>
-              <w:rPr>
-                <w:rFonts w:ascii="Consolas" w:hAnsi="Consolas" w:cs="Consolas"/>
-                <w:color w:val="000000"/>
-                <w:sz w:val="19"/>
-                <w:szCs w:val="19"/>
-                <w:lang w:val="en-US"/>
-              </w:rPr>
-              <w:t>|</w:t>
-            </w:r>
-            <w:r>
-              <w:rPr>
-                <w:rFonts w:ascii="Consolas" w:hAnsi="Consolas" w:cs="Consolas"/>
-                <w:color w:val="000000"/>
-                <w:sz w:val="19"/>
-                <w:szCs w:val="19"/>
-                <w:lang w:val="en-US"/>
-              </w:rPr>
-              <w:t>statement|range</w:t>
+                <w:lang w:val="en-US"/>
+              </w:rPr>
+              <w:t>CommentS</w:t>
+            </w:r>
+            <w:r>
+              <w:rPr>
+                <w:rFonts w:ascii="Consolas" w:hAnsi="Consolas" w:cs="Consolas"/>
+                <w:color w:val="000000"/>
+                <w:sz w:val="19"/>
+                <w:szCs w:val="19"/>
+                <w:lang w:val="en-US"/>
+              </w:rPr>
+              <w:t>tringMatch</w:t>
             </w:r>
             <w:proofErr w:type="spellEnd"/>
             <w:r>
@@ -3609,7 +3597,7 @@
                 <w:szCs w:val="19"/>
                 <w:lang w:val="en-US"/>
               </w:rPr>
-              <w:t xml:space="preserve">] </w:t>
+              <w:t xml:space="preserve"> | </w:t>
             </w:r>
             <w:proofErr w:type="spellStart"/>
             <w:r>
@@ -3620,90 +3608,18 @@
                 <w:szCs w:val="19"/>
                 <w:lang w:val="en-US"/>
               </w:rPr>
-              <w:t>CurlyBracePattern</w:t>
+              <w:t>NodeSimplePattern</w:t>
             </w:r>
             <w:proofErr w:type="spellEnd"/>
-          </w:p>
-          <w:p>
-            <w:pPr>
-              <w:rPr>
-                <w:rFonts w:ascii="Consolas" w:hAnsi="Consolas" w:cs="Consolas"/>
-                <w:color w:val="000000"/>
-                <w:sz w:val="19"/>
-                <w:szCs w:val="19"/>
-                <w:lang w:val="en-US"/>
-              </w:rPr>
-            </w:pPr>
-            <w:r>
-              <w:rPr>
-                <w:rFonts w:ascii="Consolas" w:hAnsi="Consolas" w:cs="Consolas"/>
-                <w:color w:val="000000"/>
-                <w:sz w:val="19"/>
-                <w:szCs w:val="19"/>
-                <w:lang w:val="en-US"/>
-              </w:rPr>
-              <w:t xml:space="preserve">Defaults to </w:t>
-            </w:r>
-            <w:r>
-              <w:rPr>
-                <w:rFonts w:ascii="Consolas" w:hAnsi="Consolas" w:cs="Consolas"/>
-                <w:color w:val="000000"/>
-                <w:sz w:val="19"/>
-                <w:szCs w:val="19"/>
-                <w:lang w:val="en-US"/>
-              </w:rPr>
-              <w:t>range</w:t>
-            </w:r>
-            <w:r>
-              <w:rPr>
-                <w:rFonts w:ascii="Consolas" w:hAnsi="Consolas" w:cs="Consolas"/>
-                <w:color w:val="000000"/>
-                <w:sz w:val="19"/>
-                <w:szCs w:val="19"/>
-                <w:lang w:val="en-US"/>
-              </w:rPr>
-              <w:t>.</w:t>
-            </w:r>
-          </w:p>
-          <w:p>
-            <w:pPr>
-              <w:rPr>
-                <w:rFonts w:ascii="Consolas" w:hAnsi="Consolas" w:cs="Consolas"/>
-                <w:color w:val="000000"/>
-                <w:sz w:val="19"/>
-                <w:szCs w:val="19"/>
-                <w:lang w:val="en-US"/>
-              </w:rPr>
-            </w:pPr>
-            <w:r>
-              <w:rPr>
-                <w:rFonts w:ascii="Consolas" w:hAnsi="Consolas" w:cs="Consolas"/>
-                <w:color w:val="000000"/>
-                <w:sz w:val="19"/>
-                <w:szCs w:val="19"/>
-                <w:lang w:val="en-US"/>
-              </w:rPr>
-              <w:t xml:space="preserve">The </w:t>
-            </w:r>
-            <w:r>
-              <w:rPr>
-                <w:rFonts w:ascii="Consolas" w:hAnsi="Consolas" w:cs="Consolas"/>
-                <w:color w:val="000000"/>
-                <w:sz w:val="19"/>
-                <w:szCs w:val="19"/>
-                <w:lang w:val="en-US"/>
-              </w:rPr>
-              <w:t xml:space="preserve">default </w:t>
-            </w:r>
-            <w:r>
-              <w:rPr>
-                <w:rFonts w:ascii="Consolas" w:hAnsi="Consolas" w:cs="Consolas"/>
-                <w:color w:val="000000"/>
-                <w:sz w:val="19"/>
-                <w:szCs w:val="19"/>
-                <w:lang w:val="en-US"/>
-              </w:rPr>
-              <w:t>‘range’ applies to individual tokens whereas ‘part’ or ‘statement’ apply to structural items of the parse tree.</w:t>
+            <w:r>
+              <w:rPr>
+                <w:rFonts w:ascii="Consolas" w:hAnsi="Consolas" w:cs="Consolas"/>
+                <w:color w:val="000000"/>
+                <w:sz w:val="19"/>
+                <w:szCs w:val="19"/>
+                <w:lang w:val="en-US"/>
+              </w:rPr>
+              <w:t>)</w:t>
             </w:r>
           </w:p>
           <w:p>
@@ -3743,7 +3659,7 @@
                 <w:szCs w:val="19"/>
                 <w:lang w:val="en-US"/>
               </w:rPr>
-              <w:t>CurlyBracePattern</w:t>
+              <w:t>CommentStringMatch</w:t>
             </w:r>
             <w:proofErr w:type="spellEnd"/>
           </w:p>
@@ -3770,49 +3686,7 @@
                 <w:szCs w:val="19"/>
                 <w:lang w:val="en-US"/>
               </w:rPr>
-              <w:t>Curly braces delimited literal string.</w:t>
-            </w:r>
-          </w:p>
-          <w:p>
-            <w:pPr>
-              <w:rPr>
-                <w:rFonts w:ascii="Consolas" w:hAnsi="Consolas" w:cs="Consolas"/>
-                <w:color w:val="000000"/>
-                <w:sz w:val="19"/>
-                <w:szCs w:val="19"/>
-                <w:lang w:val="en-US"/>
-              </w:rPr>
-            </w:pPr>
-            <w:r>
-              <w:rPr>
-                <w:rFonts w:ascii="Consolas" w:hAnsi="Consolas" w:cs="Consolas"/>
-                <w:color w:val="000000"/>
-                <w:sz w:val="19"/>
-                <w:szCs w:val="19"/>
-                <w:lang w:val="en-US"/>
-              </w:rPr>
-              <w:t>Whitespaces are not relevant, only tokens matter.</w:t>
-            </w:r>
-          </w:p>
-          <w:p>
-            <w:pPr>
-              <w:rPr>
-                <w:rFonts w:ascii="Consolas" w:hAnsi="Consolas" w:cs="Consolas"/>
-                <w:color w:val="000000"/>
-                <w:sz w:val="19"/>
-                <w:szCs w:val="19"/>
-                <w:lang w:val="en-US"/>
-              </w:rPr>
-            </w:pPr>
-            <w:r>
-              <w:rPr>
-                <w:rFonts w:ascii="Consolas" w:hAnsi="Consolas" w:cs="Consolas"/>
-                <w:color w:val="000000"/>
-                <w:sz w:val="19"/>
-                <w:szCs w:val="19"/>
-                <w:lang w:val="en-US"/>
-              </w:rPr>
-              <w:t>Internal opening or curly braces must be doubled.</w:t>
+              <w:t>A literal string enclosed with, quotes, double quotes or brackets that either:</w:t>
             </w:r>
           </w:p>
           <w:p>
@@ -3828,6 +3702,11 @@
           </w:p>
           <w:p>
             <w:pPr>
+              <w:pStyle w:val="ListParagraph"/>
+              <w:numPr>
+                <w:ilvl w:val="0"/>
+                <w:numId w:val="3"/>
+              </w:numPr>
               <w:rPr>
                 <w:rFonts w:ascii="Consolas" w:hAnsi="Consolas" w:cs="Consolas"/>
                 <w:color w:val="000000"/>
@@ -3844,43 +3723,207 @@
                 <w:szCs w:val="19"/>
                 <w:lang w:val="en-US"/>
               </w:rPr>
-              <w:t>Only supported wildcard</w:t>
-            </w:r>
-            <w:r>
-              <w:rPr>
-                <w:rFonts w:ascii="Consolas" w:hAnsi="Consolas" w:cs="Consolas"/>
-                <w:color w:val="000000"/>
-                <w:sz w:val="19"/>
-                <w:szCs w:val="19"/>
-                <w:lang w:val="en-US"/>
-              </w:rPr>
-              <w:t xml:space="preserve"> </w:t>
-            </w:r>
-            <w:proofErr w:type="gramStart"/>
-            <w:r>
-              <w:rPr>
-                <w:rFonts w:ascii="Consolas" w:hAnsi="Consolas" w:cs="Consolas"/>
-                <w:color w:val="000000"/>
-                <w:sz w:val="19"/>
-                <w:szCs w:val="19"/>
-                <w:lang w:val="en-US"/>
-              </w:rPr>
-              <w:t>is ?</w:t>
-            </w:r>
-            <w:proofErr w:type="gramEnd"/>
-            <w:r>
-              <w:rPr>
-                <w:rFonts w:ascii="Consolas" w:hAnsi="Consolas" w:cs="Consolas"/>
-                <w:color w:val="000000"/>
-                <w:sz w:val="19"/>
-                <w:szCs w:val="19"/>
-                <w:lang w:val="en-US"/>
-              </w:rPr>
-              <w:t xml:space="preserve"> that replaces any one token.</w:t>
+              <w:t>Starts with -- for a line comment:</w:t>
             </w:r>
           </w:p>
           <w:p>
             <w:pPr>
+              <w:pStyle w:val="ListParagraph"/>
+              <w:rPr>
+                <w:rFonts w:ascii="Consolas" w:hAnsi="Consolas" w:cs="Consolas"/>
+                <w:color w:val="000000"/>
+                <w:sz w:val="19"/>
+                <w:szCs w:val="19"/>
+                <w:lang w:val="en-US"/>
+              </w:rPr>
+            </w:pPr>
+            <w:r>
+              <w:rPr>
+                <w:rFonts w:ascii="Consolas" w:hAnsi="Consolas" w:cs="Consolas"/>
+                <w:color w:val="000000"/>
+                <w:sz w:val="19"/>
+                <w:szCs w:val="19"/>
+                <w:lang w:val="en-US"/>
+              </w:rPr>
+              <w:t>"--</w:t>
+            </w:r>
+            <w:r>
+              <w:rPr>
+                <w:rFonts w:ascii="Consolas" w:hAnsi="Consolas" w:cs="Consolas"/>
+                <w:color w:val="000000"/>
+                <w:sz w:val="19"/>
+                <w:szCs w:val="19"/>
+                <w:lang w:val="en-US"/>
+              </w:rPr>
+              <w:t xml:space="preserve"> prefix</w:t>
+            </w:r>
+            <w:r>
+              <w:rPr>
+                <w:rFonts w:ascii="Consolas" w:hAnsi="Consolas" w:cs="Consolas"/>
+                <w:color w:val="000000"/>
+                <w:sz w:val="19"/>
+                <w:szCs w:val="19"/>
+                <w:lang w:val="en-US"/>
+              </w:rPr>
+              <w:t>" | [--</w:t>
+            </w:r>
+            <w:r>
+              <w:rPr>
+                <w:rFonts w:ascii="Consolas" w:hAnsi="Consolas" w:cs="Consolas"/>
+                <w:color w:val="000000"/>
+                <w:sz w:val="19"/>
+                <w:szCs w:val="19"/>
+                <w:lang w:val="en-US"/>
+              </w:rPr>
+              <w:t xml:space="preserve"> prefix</w:t>
+            </w:r>
+            <w:r>
+              <w:rPr>
+                <w:rFonts w:ascii="Consolas" w:hAnsi="Consolas" w:cs="Consolas"/>
+                <w:color w:val="000000"/>
+                <w:sz w:val="19"/>
+                <w:szCs w:val="19"/>
+                <w:lang w:val="en-US"/>
+              </w:rPr>
+              <w:t>] | '--</w:t>
+            </w:r>
+            <w:r>
+              <w:rPr>
+                <w:rFonts w:ascii="Consolas" w:hAnsi="Consolas" w:cs="Consolas"/>
+                <w:color w:val="000000"/>
+                <w:sz w:val="19"/>
+                <w:szCs w:val="19"/>
+                <w:lang w:val="en-US"/>
+              </w:rPr>
+              <w:t xml:space="preserve"> prefix</w:t>
+            </w:r>
+            <w:r>
+              <w:rPr>
+                <w:rFonts w:ascii="Consolas" w:hAnsi="Consolas" w:cs="Consolas"/>
+                <w:color w:val="000000"/>
+                <w:sz w:val="19"/>
+                <w:szCs w:val="19"/>
+                <w:lang w:val="en-US"/>
+              </w:rPr>
+              <w:t>'</w:t>
+            </w:r>
+          </w:p>
+          <w:p>
+            <w:pPr>
+              <w:pStyle w:val="ListParagraph"/>
+              <w:rPr>
+                <w:rFonts w:ascii="Consolas" w:hAnsi="Consolas" w:cs="Consolas"/>
+                <w:color w:val="000000"/>
+                <w:sz w:val="19"/>
+                <w:szCs w:val="19"/>
+                <w:lang w:val="en-US"/>
+              </w:rPr>
+            </w:pPr>
+            <w:r>
+              <w:rPr>
+                <w:rFonts w:ascii="Consolas" w:hAnsi="Consolas" w:cs="Consolas"/>
+                <w:color w:val="000000"/>
+                <w:sz w:val="19"/>
+                <w:szCs w:val="19"/>
+                <w:lang w:val="en-US"/>
+              </w:rPr>
+              <w:t>The trimmed prefix must start the left trimmed line comment.</w:t>
+            </w:r>
+          </w:p>
+          <w:p>
+            <w:pPr>
+              <w:rPr>
+                <w:rFonts w:ascii="Consolas" w:hAnsi="Consolas" w:cs="Consolas"/>
+                <w:color w:val="000000"/>
+                <w:sz w:val="19"/>
+                <w:szCs w:val="19"/>
+                <w:lang w:val="en-US"/>
+              </w:rPr>
+            </w:pPr>
+          </w:p>
+          <w:p>
+            <w:pPr>
+              <w:pStyle w:val="ListParagraph"/>
+              <w:numPr>
+                <w:ilvl w:val="0"/>
+                <w:numId w:val="3"/>
+              </w:numPr>
+              <w:rPr>
+                <w:rFonts w:ascii="Consolas" w:hAnsi="Consolas" w:cs="Consolas"/>
+                <w:color w:val="000000"/>
+                <w:sz w:val="19"/>
+                <w:szCs w:val="19"/>
+                <w:lang w:val="en-US"/>
+              </w:rPr>
+            </w:pPr>
+            <w:r>
+              <w:rPr>
+                <w:rFonts w:ascii="Consolas" w:hAnsi="Consolas" w:cs="Consolas"/>
+                <w:color w:val="000000"/>
+                <w:sz w:val="19"/>
+                <w:szCs w:val="19"/>
+                <w:lang w:val="en-US"/>
+              </w:rPr>
+              <w:t>Starts and ends with a star comment:</w:t>
+            </w:r>
+          </w:p>
+          <w:p>
+            <w:pPr>
+              <w:pStyle w:val="ListParagraph"/>
+              <w:rPr>
+                <w:rFonts w:ascii="Consolas" w:hAnsi="Consolas" w:cs="Consolas"/>
+                <w:color w:val="000000"/>
+                <w:sz w:val="19"/>
+                <w:szCs w:val="19"/>
+                <w:lang w:val="en-US"/>
+              </w:rPr>
+            </w:pPr>
+            <w:r>
+              <w:rPr>
+                <w:rFonts w:ascii="Consolas" w:hAnsi="Consolas" w:cs="Consolas"/>
+                <w:color w:val="000000"/>
+                <w:sz w:val="19"/>
+                <w:szCs w:val="19"/>
+                <w:lang w:val="en-US"/>
+              </w:rPr>
+              <w:t>"/* content */" | [/* content */] | '/* content */'</w:t>
+            </w:r>
+          </w:p>
+          <w:p>
+            <w:pPr>
+              <w:pStyle w:val="ListParagraph"/>
+              <w:rPr>
+                <w:rFonts w:ascii="Consolas" w:hAnsi="Consolas" w:cs="Consolas"/>
+                <w:color w:val="000000"/>
+                <w:sz w:val="19"/>
+                <w:szCs w:val="19"/>
+                <w:lang w:val="en-US"/>
+              </w:rPr>
+            </w:pPr>
+            <w:r>
+              <w:rPr>
+                <w:rFonts w:ascii="Consolas" w:hAnsi="Consolas" w:cs="Consolas"/>
+                <w:color w:val="000000"/>
+                <w:sz w:val="19"/>
+                <w:szCs w:val="19"/>
+                <w:lang w:val="en-US"/>
+              </w:rPr>
+              <w:t>The trimmed content must a</w:t>
+            </w:r>
+            <w:r>
+              <w:rPr>
+                <w:rFonts w:ascii="Consolas" w:hAnsi="Consolas" w:cs="Consolas"/>
+                <w:color w:val="000000"/>
+                <w:sz w:val="19"/>
+                <w:szCs w:val="19"/>
+                <w:lang w:val="en-US"/>
+              </w:rPr>
+              <w:t>ppear in the star comment.</w:t>
+            </w:r>
+          </w:p>
+          <w:p>
+            <w:pPr>
+              <w:pStyle w:val="ListParagraph"/>
               <w:rPr>
                 <w:rFonts w:ascii="Consolas" w:hAnsi="Consolas" w:cs="Consolas"/>
                 <w:color w:val="000000"/>
@@ -3900,6 +3943,383 @@
           <w:p>
             <w:pPr>
               <w:rPr>
+                <w:rFonts w:ascii="Consolas" w:hAnsi="Consolas" w:cs="Consolas"/>
+                <w:color w:val="000000"/>
+                <w:sz w:val="19"/>
+                <w:szCs w:val="19"/>
+                <w:lang w:val="en-US"/>
+              </w:rPr>
+            </w:pPr>
+            <w:proofErr w:type="spellStart"/>
+            <w:r>
+              <w:rPr>
+                <w:rFonts w:ascii="Consolas" w:hAnsi="Consolas" w:cs="Consolas"/>
+                <w:color w:val="000000"/>
+                <w:sz w:val="19"/>
+                <w:szCs w:val="19"/>
+                <w:lang w:val="en-US"/>
+              </w:rPr>
+              <w:t>NodeSimplePattern</w:t>
+            </w:r>
+            <w:proofErr w:type="spellEnd"/>
+          </w:p>
+        </w:tc>
+        <w:tc>
+          <w:tcPr>
+            <w:tcW w:w="6753" w:type="dxa"/>
+          </w:tcPr>
+          <w:p>
+            <w:pPr>
+              <w:rPr>
+                <w:rFonts w:ascii="Consolas" w:hAnsi="Consolas" w:cs="Consolas"/>
+                <w:color w:val="000000"/>
+                <w:sz w:val="19"/>
+                <w:szCs w:val="19"/>
+                <w:lang w:val="en-US"/>
+              </w:rPr>
+            </w:pPr>
+            <w:r>
+              <w:rPr>
+                <w:rFonts w:ascii="Consolas" w:hAnsi="Consolas" w:cs="Consolas"/>
+                <w:color w:val="000000"/>
+                <w:sz w:val="19"/>
+                <w:szCs w:val="19"/>
+                <w:lang w:val="en-US"/>
+              </w:rPr>
+              <w:t>[</w:t>
+            </w:r>
+            <w:proofErr w:type="spellStart"/>
+            <w:r>
+              <w:rPr>
+                <w:rFonts w:ascii="Consolas" w:hAnsi="Consolas" w:cs="Consolas"/>
+                <w:color w:val="000000"/>
+                <w:sz w:val="19"/>
+                <w:szCs w:val="19"/>
+                <w:u w:val="double"/>
+                <w:lang w:val="en-US"/>
+              </w:rPr>
+              <w:t>part</w:t>
+            </w:r>
+            <w:r>
+              <w:rPr>
+                <w:rFonts w:ascii="Consolas" w:hAnsi="Consolas" w:cs="Consolas"/>
+                <w:color w:val="000000"/>
+                <w:sz w:val="19"/>
+                <w:szCs w:val="19"/>
+                <w:lang w:val="en-US"/>
+              </w:rPr>
+              <w:t>|</w:t>
+            </w:r>
+            <w:r>
+              <w:rPr>
+                <w:rFonts w:ascii="Consolas" w:hAnsi="Consolas" w:cs="Consolas"/>
+                <w:color w:val="000000"/>
+                <w:sz w:val="19"/>
+                <w:szCs w:val="19"/>
+                <w:lang w:val="en-US"/>
+              </w:rPr>
+              <w:t>statement|range</w:t>
+            </w:r>
+            <w:proofErr w:type="spellEnd"/>
+            <w:r>
+              <w:rPr>
+                <w:rFonts w:ascii="Consolas" w:hAnsi="Consolas" w:cs="Consolas"/>
+                <w:color w:val="000000"/>
+                <w:sz w:val="19"/>
+                <w:szCs w:val="19"/>
+                <w:lang w:val="en-US"/>
+              </w:rPr>
+              <w:t xml:space="preserve">] </w:t>
+            </w:r>
+            <w:proofErr w:type="spellStart"/>
+            <w:r>
+              <w:rPr>
+                <w:rFonts w:ascii="Consolas" w:hAnsi="Consolas" w:cs="Consolas"/>
+                <w:color w:val="000000"/>
+                <w:sz w:val="19"/>
+                <w:szCs w:val="19"/>
+                <w:lang w:val="en-US"/>
+              </w:rPr>
+              <w:t>CurlyBracePattern</w:t>
+            </w:r>
+            <w:proofErr w:type="spellEnd"/>
+          </w:p>
+          <w:p>
+            <w:pPr>
+              <w:rPr>
+                <w:rFonts w:ascii="Consolas" w:hAnsi="Consolas" w:cs="Consolas"/>
+                <w:color w:val="000000"/>
+                <w:sz w:val="19"/>
+                <w:szCs w:val="19"/>
+                <w:lang w:val="en-US"/>
+              </w:rPr>
+            </w:pPr>
+            <w:r>
+              <w:rPr>
+                <w:rFonts w:ascii="Consolas" w:hAnsi="Consolas" w:cs="Consolas"/>
+                <w:color w:val="000000"/>
+                <w:sz w:val="19"/>
+                <w:szCs w:val="19"/>
+                <w:lang w:val="en-US"/>
+              </w:rPr>
+              <w:t xml:space="preserve">Defaults to </w:t>
+            </w:r>
+            <w:r>
+              <w:rPr>
+                <w:rFonts w:ascii="Consolas" w:hAnsi="Consolas" w:cs="Consolas"/>
+                <w:color w:val="000000"/>
+                <w:sz w:val="19"/>
+                <w:szCs w:val="19"/>
+                <w:lang w:val="en-US"/>
+              </w:rPr>
+              <w:t>range</w:t>
+            </w:r>
+            <w:r>
+              <w:rPr>
+                <w:rFonts w:ascii="Consolas" w:hAnsi="Consolas" w:cs="Consolas"/>
+                <w:color w:val="000000"/>
+                <w:sz w:val="19"/>
+                <w:szCs w:val="19"/>
+                <w:lang w:val="en-US"/>
+              </w:rPr>
+              <w:t>.</w:t>
+            </w:r>
+          </w:p>
+          <w:p>
+            <w:pPr>
+              <w:rPr>
+                <w:rFonts w:ascii="Consolas" w:hAnsi="Consolas" w:cs="Consolas"/>
+                <w:color w:val="000000"/>
+                <w:sz w:val="19"/>
+                <w:szCs w:val="19"/>
+                <w:lang w:val="en-US"/>
+              </w:rPr>
+            </w:pPr>
+            <w:r>
+              <w:rPr>
+                <w:rFonts w:ascii="Consolas" w:hAnsi="Consolas" w:cs="Consolas"/>
+                <w:color w:val="000000"/>
+                <w:sz w:val="19"/>
+                <w:szCs w:val="19"/>
+                <w:lang w:val="en-US"/>
+              </w:rPr>
+              <w:t xml:space="preserve">The </w:t>
+            </w:r>
+            <w:r>
+              <w:rPr>
+                <w:rFonts w:ascii="Consolas" w:hAnsi="Consolas" w:cs="Consolas"/>
+                <w:color w:val="000000"/>
+                <w:sz w:val="19"/>
+                <w:szCs w:val="19"/>
+                <w:lang w:val="en-US"/>
+              </w:rPr>
+              <w:t xml:space="preserve">default </w:t>
+            </w:r>
+            <w:r>
+              <w:rPr>
+                <w:rFonts w:ascii="Consolas" w:hAnsi="Consolas" w:cs="Consolas"/>
+                <w:color w:val="000000"/>
+                <w:sz w:val="19"/>
+                <w:szCs w:val="19"/>
+                <w:lang w:val="en-US"/>
+              </w:rPr>
+              <w:t>‘range’ applies to individual tokens whereas ‘part’ or ‘statement’ apply to structural items of the parse tree.</w:t>
+            </w:r>
+          </w:p>
+          <w:p>
+            <w:pPr>
+              <w:rPr>
+                <w:rFonts w:ascii="Consolas" w:hAnsi="Consolas" w:cs="Consolas"/>
+                <w:color w:val="000000"/>
+                <w:sz w:val="19"/>
+                <w:szCs w:val="19"/>
+                <w:lang w:val="en-US"/>
+              </w:rPr>
+            </w:pPr>
+          </w:p>
+        </w:tc>
+      </w:tr>
+      <w:tr>
+        <w:tc>
+          <w:tcPr>
+            <w:tcW w:w="2263" w:type="dxa"/>
+          </w:tcPr>
+          <w:p>
+            <w:pPr>
+              <w:rPr>
+                <w:rFonts w:ascii="Consolas" w:hAnsi="Consolas" w:cs="Consolas"/>
+                <w:color w:val="000000"/>
+                <w:sz w:val="19"/>
+                <w:szCs w:val="19"/>
+                <w:lang w:val="en-US"/>
+              </w:rPr>
+            </w:pPr>
+            <w:proofErr w:type="spellStart"/>
+            <w:r>
+              <w:rPr>
+                <w:rFonts w:ascii="Consolas" w:hAnsi="Consolas" w:cs="Consolas"/>
+                <w:color w:val="000000"/>
+                <w:sz w:val="19"/>
+                <w:szCs w:val="19"/>
+                <w:lang w:val="en-US"/>
+              </w:rPr>
+              <w:t>CurlyBracePattern</w:t>
+            </w:r>
+            <w:proofErr w:type="spellEnd"/>
+          </w:p>
+        </w:tc>
+        <w:tc>
+          <w:tcPr>
+            <w:tcW w:w="6753" w:type="dxa"/>
+          </w:tcPr>
+          <w:p>
+            <w:pPr>
+              <w:rPr>
+                <w:rFonts w:ascii="Consolas" w:hAnsi="Consolas" w:cs="Consolas"/>
+                <w:color w:val="000000"/>
+                <w:sz w:val="19"/>
+                <w:szCs w:val="19"/>
+                <w:lang w:val="en-US"/>
+              </w:rPr>
+            </w:pPr>
+            <w:r>
+              <w:rPr>
+                <w:rFonts w:ascii="Consolas" w:hAnsi="Consolas" w:cs="Consolas"/>
+                <w:color w:val="000000"/>
+                <w:sz w:val="19"/>
+                <w:szCs w:val="19"/>
+                <w:lang w:val="en-US"/>
+              </w:rPr>
+              <w:t>Curly braces delimited literal string.</w:t>
+            </w:r>
+          </w:p>
+          <w:p>
+            <w:pPr>
+              <w:rPr>
+                <w:rFonts w:ascii="Consolas" w:hAnsi="Consolas" w:cs="Consolas"/>
+                <w:color w:val="000000"/>
+                <w:sz w:val="19"/>
+                <w:szCs w:val="19"/>
+                <w:lang w:val="en-US"/>
+              </w:rPr>
+            </w:pPr>
+            <w:r>
+              <w:rPr>
+                <w:rFonts w:ascii="Consolas" w:hAnsi="Consolas" w:cs="Consolas"/>
+                <w:color w:val="000000"/>
+                <w:sz w:val="19"/>
+                <w:szCs w:val="19"/>
+                <w:lang w:val="en-US"/>
+              </w:rPr>
+              <w:t>Whitespaces are not relevant, only tokens matter.</w:t>
+            </w:r>
+          </w:p>
+          <w:p>
+            <w:pPr>
+              <w:rPr>
+                <w:rFonts w:ascii="Consolas" w:hAnsi="Consolas" w:cs="Consolas"/>
+                <w:color w:val="000000"/>
+                <w:sz w:val="19"/>
+                <w:szCs w:val="19"/>
+                <w:lang w:val="en-US"/>
+              </w:rPr>
+            </w:pPr>
+            <w:r>
+              <w:rPr>
+                <w:rFonts w:ascii="Consolas" w:hAnsi="Consolas" w:cs="Consolas"/>
+                <w:color w:val="000000"/>
+                <w:sz w:val="19"/>
+                <w:szCs w:val="19"/>
+                <w:lang w:val="en-US"/>
+              </w:rPr>
+              <w:t>Internal opening or curly braces must be doubled.</w:t>
+            </w:r>
+          </w:p>
+          <w:p>
+            <w:pPr>
+              <w:rPr>
+                <w:rFonts w:ascii="Consolas" w:hAnsi="Consolas" w:cs="Consolas"/>
+                <w:color w:val="000000"/>
+                <w:sz w:val="19"/>
+                <w:szCs w:val="19"/>
+                <w:lang w:val="en-US"/>
+              </w:rPr>
+            </w:pPr>
+          </w:p>
+          <w:p>
+            <w:pPr>
+              <w:rPr>
+                <w:rFonts w:ascii="Consolas" w:hAnsi="Consolas" w:cs="Consolas"/>
+                <w:color w:val="000000"/>
+                <w:sz w:val="19"/>
+                <w:szCs w:val="19"/>
+                <w:lang w:val="en-US"/>
+              </w:rPr>
+            </w:pPr>
+            <w:r>
+              <w:rPr>
+                <w:rFonts w:ascii="Consolas" w:hAnsi="Consolas" w:cs="Consolas"/>
+                <w:color w:val="000000"/>
+                <w:sz w:val="19"/>
+                <w:szCs w:val="19"/>
+                <w:lang w:val="en-US"/>
+              </w:rPr>
+              <w:t>Only supported wildcard</w:t>
+            </w:r>
+            <w:r>
+              <w:rPr>
+                <w:rFonts w:ascii="Consolas" w:hAnsi="Consolas" w:cs="Consolas"/>
+                <w:color w:val="000000"/>
+                <w:sz w:val="19"/>
+                <w:szCs w:val="19"/>
+                <w:lang w:val="en-US"/>
+              </w:rPr>
+              <w:t xml:space="preserve"> </w:t>
+            </w:r>
+            <w:proofErr w:type="gramStart"/>
+            <w:r>
+              <w:rPr>
+                <w:rFonts w:ascii="Consolas" w:hAnsi="Consolas" w:cs="Consolas"/>
+                <w:color w:val="000000"/>
+                <w:sz w:val="19"/>
+                <w:szCs w:val="19"/>
+                <w:lang w:val="en-US"/>
+              </w:rPr>
+              <w:t>is ?</w:t>
+            </w:r>
+            <w:proofErr w:type="gramEnd"/>
+            <w:r>
+              <w:rPr>
+                <w:rFonts w:ascii="Consolas" w:hAnsi="Consolas" w:cs="Consolas"/>
+                <w:color w:val="000000"/>
+                <w:sz w:val="19"/>
+                <w:szCs w:val="19"/>
+                <w:lang w:val="en-US"/>
+              </w:rPr>
+              <w:t xml:space="preserve"> that replaces any one token.</w:t>
+            </w:r>
+          </w:p>
+          <w:p>
+            <w:pPr>
+              <w:rPr>
+                <w:rFonts w:ascii="Consolas" w:hAnsi="Consolas" w:cs="Consolas"/>
+                <w:color w:val="000000"/>
+                <w:sz w:val="19"/>
+                <w:szCs w:val="19"/>
+                <w:lang w:val="en-US"/>
+              </w:rPr>
+            </w:pPr>
+          </w:p>
+        </w:tc>
+      </w:tr>
+      <w:tr>
+        <w:tc>
+          <w:tcPr>
+            <w:tcW w:w="2263" w:type="dxa"/>
+          </w:tcPr>
+          <w:p>
+            <w:pPr>
+              <w:rPr>
                 <w:lang w:val="en-US"/>
               </w:rPr>
             </w:pPr>
@@ -3971,6 +4391,62 @@
                 <w:highlight w:val="white"/>
                 <w:lang w:val="en-US"/>
               </w:rPr>
+              <w:t>Range</w:t>
+            </w:r>
+            <w:r>
+              <w:rPr>
+                <w:rFonts w:ascii="Consolas" w:hAnsi="Consolas" w:cs="Consolas"/>
+                <w:color w:val="000000"/>
+                <w:sz w:val="19"/>
+                <w:szCs w:val="19"/>
+                <w:highlight w:val="white"/>
+                <w:lang w:val="en-US"/>
+              </w:rPr>
+              <w:t>Location</w:t>
+            </w:r>
+            <w:r>
+              <w:rPr>
+                <w:rFonts w:ascii="Consolas" w:hAnsi="Consolas" w:cs="Consolas"/>
+                <w:color w:val="000000"/>
+                <w:sz w:val="19"/>
+                <w:szCs w:val="19"/>
+                <w:lang w:val="en-US"/>
+              </w:rPr>
+              <w:t>Finder</w:t>
+            </w:r>
+            <w:proofErr w:type="spellEnd"/>
+            <w:r>
+              <w:rPr>
+                <w:rFonts w:ascii="Consolas" w:hAnsi="Consolas" w:cs="Consolas"/>
+                <w:color w:val="000000"/>
+                <w:sz w:val="19"/>
+                <w:szCs w:val="19"/>
+                <w:highlight w:val="white"/>
+                <w:lang w:val="en-US"/>
+              </w:rPr>
+              <w:t xml:space="preserve"> </w:t>
+            </w:r>
+            <w:r>
+              <w:rPr>
+                <w:rFonts w:ascii="Consolas" w:hAnsi="Consolas" w:cs="Consolas"/>
+                <w:color w:val="000000"/>
+                <w:sz w:val="19"/>
+                <w:szCs w:val="19"/>
+                <w:highlight w:val="white"/>
+                <w:lang w:val="en-US"/>
+              </w:rPr>
+              <w:t xml:space="preserve">| </w:t>
+            </w:r>
+            <w:proofErr w:type="spellStart"/>
+            <w:r>
+              <w:rPr>
+                <w:rFonts w:ascii="Consolas" w:hAnsi="Consolas" w:cs="Consolas"/>
+                <w:color w:val="000000"/>
+                <w:sz w:val="19"/>
+                <w:szCs w:val="19"/>
+                <w:highlight w:val="white"/>
+                <w:lang w:val="en-US"/>
+              </w:rPr>
               <w:t>Location</w:t>
             </w:r>
             <w:r>
@@ -4106,6 +4582,7 @@
           </w:p>
         </w:tc>
       </w:tr>
+      <w:bookmarkEnd w:id="0"/>
     </w:tbl>
     <w:p>
       <w:pPr>
@@ -4801,6 +5278,7 @@
           <w:szCs w:val="17"/>
           <w:lang w:val="en-US"/>
         </w:rPr>
+        <w:lastRenderedPageBreak/>
         <w:t xml:space="preserve">  end</w:t>
       </w:r>
     </w:p>
@@ -5072,7 +5550,6 @@
           <w:szCs w:val="17"/>
           <w:lang w:val="en-US"/>
         </w:rPr>
-        <w:lastRenderedPageBreak/>
         <w:t xml:space="preserve">  inject "insert into </w:t>
       </w:r>
       <w:proofErr w:type="spellStart"/>
@@ -7333,6 +7810,7 @@
           <w:strike/>
           <w:lang w:val="en-US"/>
         </w:rPr>
+        <w:lastRenderedPageBreak/>
         <w:t>Curly Braces pattern matching</w:t>
       </w:r>
     </w:p>
@@ -7401,7 +7879,6 @@
           <w:szCs w:val="19"/>
           <w:lang w:val="en-US"/>
         </w:rPr>
-        <w:lastRenderedPageBreak/>
         <w:t>The goal is to locate range of tokens:</w:t>
       </w:r>
     </w:p>
@@ -9364,6 +9841,7 @@
           <w:szCs w:val="19"/>
           <w:lang w:val="en-US"/>
         </w:rPr>
+        <w:lastRenderedPageBreak/>
         <w:t>If the pattern ends with ????, there is at most one match that, if it exists, starts on the first token of the first match up to the end of the tokens to match.</w:t>
       </w:r>
     </w:p>
@@ -9387,7 +9865,6 @@
           <w:szCs w:val="19"/>
           <w:lang w:val="en-US"/>
         </w:rPr>
-        <w:lastRenderedPageBreak/>
         <w:t>Note that {??? X ????}, {???? X ???} and {???? X ????} are actually the same: they all match once</w:t>
       </w:r>
       <w:r>
@@ -10626,6 +11103,7 @@
     <w:lsdException w:name="HTML Sample" w:semiHidden="1" w:unhideWhenUsed="1"/>
     <w:lsdException w:name="HTML Typewriter" w:semiHidden="1" w:unhideWhenUsed="1"/>
     <w:lsdException w:name="HTML Variable" w:semiHidden="1" w:unhideWhenUsed="1"/>
+    <w:lsdException w:name="Normal Table" w:semiHidden="1" w:unhideWhenUsed="1"/>
     <w:lsdException w:name="annotation subject" w:semiHidden="1" w:unhideWhenUsed="1"/>
     <w:lsdException w:name="No List" w:semiHidden="1" w:unhideWhenUsed="1"/>
     <w:lsdException w:name="Outline List 1" w:semiHidden="1" w:unhideWhenUsed="1"/>
@@ -10672,8 +11150,10 @@
     <w:lsdException w:name="Table Subtle 2" w:semiHidden="1" w:unhideWhenUsed="1"/>
     <w:lsdException w:name="Table Web 1" w:semiHidden="1" w:unhideWhenUsed="1"/>
     <w:lsdException w:name="Table Web 2" w:semiHidden="1" w:unhideWhenUsed="1"/>
+    <w:lsdException w:name="Table Web 3" w:semiHidden="1" w:unhideWhenUsed="1"/>
     <w:lsdException w:name="Balloon Text" w:semiHidden="1" w:unhideWhenUsed="1"/>
     <w:lsdException w:name="Table Grid" w:uiPriority="39"/>
+    <w:lsdException w:name="Table Theme" w:semiHidden="1" w:unhideWhenUsed="1"/>
     <w:lsdException w:name="Placeholder Text" w:semiHidden="1"/>
     <w:lsdException w:name="No Spacing" w:uiPriority="1" w:qFormat="1"/>
     <w:lsdException w:name="Light Shading" w:uiPriority="60"/>

</xml_diff>

<commit_message>
New Location parse nodes.
</commit_message>
<xml_diff>
--- a/CK.SqlServer.Transform/Data Definition Manipulation Language.docx
+++ b/CK.SqlServer.Transform/Data Definition Manipulation Language.docx
@@ -2881,7 +2881,6 @@
                 <w:lang w:val="en-US"/>
               </w:rPr>
             </w:pPr>
-            <w:bookmarkStart w:id="0" w:name="_GoBack"/>
             <w:proofErr w:type="spellStart"/>
             <w:r>
               <w:rPr>
@@ -3088,6 +3087,17 @@
                 <w:highlight w:val="white"/>
                 <w:lang w:val="en-US"/>
               </w:rPr>
+              <w:t>Range</w:t>
+            </w:r>
+            <w:r>
+              <w:rPr>
+                <w:rFonts w:ascii="Consolas" w:hAnsi="Consolas" w:cs="Consolas"/>
+                <w:color w:val="000000"/>
+                <w:sz w:val="19"/>
+                <w:szCs w:val="19"/>
+                <w:highlight w:val="white"/>
+                <w:lang w:val="en-US"/>
+              </w:rPr>
               <w:t>Location</w:t>
             </w:r>
             <w:r>
@@ -3117,6 +3127,16 @@
                 <w:lang w:val="en-US"/>
               </w:rPr>
             </w:pPr>
+            <w:r>
+              <w:rPr>
+                <w:rFonts w:ascii="Consolas" w:hAnsi="Consolas" w:cs="Consolas"/>
+                <w:color w:val="000000"/>
+                <w:sz w:val="19"/>
+                <w:szCs w:val="19"/>
+                <w:lang w:val="en-US"/>
+              </w:rPr>
+              <w:t>(</w:t>
+            </w:r>
             <w:proofErr w:type="spellStart"/>
             <w:r>
               <w:rPr>
@@ -3124,6 +3144,28 @@
                 <w:color w:val="000000"/>
                 <w:sz w:val="19"/>
                 <w:szCs w:val="19"/>
+                <w:lang w:val="en-US"/>
+              </w:rPr>
+              <w:t>after|before</w:t>
+            </w:r>
+            <w:proofErr w:type="spellEnd"/>
+            <w:r>
+              <w:rPr>
+                <w:rFonts w:ascii="Consolas" w:hAnsi="Consolas" w:cs="Consolas"/>
+                <w:color w:val="000000"/>
+                <w:sz w:val="19"/>
+                <w:szCs w:val="19"/>
+                <w:lang w:val="en-US"/>
+              </w:rPr>
+              <w:t xml:space="preserve">) </w:t>
+            </w:r>
+            <w:proofErr w:type="spellStart"/>
+            <w:r>
+              <w:rPr>
+                <w:rFonts w:ascii="Consolas" w:hAnsi="Consolas" w:cs="Consolas"/>
+                <w:color w:val="000000"/>
+                <w:sz w:val="19"/>
+                <w:szCs w:val="19"/>
                 <w:highlight w:val="white"/>
                 <w:lang w:val="en-US"/>
               </w:rPr>
@@ -3159,7 +3201,7 @@
                 <w:szCs w:val="19"/>
                 <w:lang w:val="en-US"/>
               </w:rPr>
-              <w:t xml:space="preserve"> |</w:t>
+              <w:t xml:space="preserve"> </w:t>
             </w:r>
           </w:p>
           <w:p>
@@ -3180,7 +3222,7 @@
                 <w:szCs w:val="19"/>
                 <w:lang w:val="en-US"/>
               </w:rPr>
-              <w:t>(all [[out of] n]) (</w:t>
+              <w:t xml:space="preserve">| between </w:t>
             </w:r>
             <w:proofErr w:type="spellStart"/>
             <w:r>
@@ -3189,9 +3231,31 @@
                 <w:color w:val="000000"/>
                 <w:sz w:val="19"/>
                 <w:szCs w:val="19"/>
-                <w:lang w:val="en-US"/>
-              </w:rPr>
-              <w:t>CommentStringMatch</w:t>
+                <w:highlight w:val="white"/>
+                <w:lang w:val="en-US"/>
+              </w:rPr>
+              <w:t>One</w:t>
+            </w:r>
+            <w:r>
+              <w:rPr>
+                <w:rFonts w:ascii="Consolas" w:hAnsi="Consolas" w:cs="Consolas"/>
+                <w:color w:val="000000"/>
+                <w:sz w:val="19"/>
+                <w:szCs w:val="19"/>
+                <w:highlight w:val="white"/>
+                <w:lang w:val="en-US"/>
+              </w:rPr>
+              <w:t>Location</w:t>
+            </w:r>
+            <w:r>
+              <w:rPr>
+                <w:rFonts w:ascii="Consolas" w:hAnsi="Consolas" w:cs="Consolas"/>
+                <w:color w:val="000000"/>
+                <w:sz w:val="19"/>
+                <w:szCs w:val="19"/>
+                <w:lang w:val="en-US"/>
+              </w:rPr>
+              <w:t>Finder</w:t>
             </w:r>
             <w:proofErr w:type="spellEnd"/>
             <w:r>
@@ -3202,7 +3266,7 @@
                 <w:szCs w:val="19"/>
                 <w:lang w:val="en-US"/>
               </w:rPr>
-              <w:t xml:space="preserve"> | </w:t>
+              <w:t xml:space="preserve"> and </w:t>
             </w:r>
             <w:proofErr w:type="spellStart"/>
             <w:r>
@@ -3211,21 +3275,33 @@
                 <w:color w:val="000000"/>
                 <w:sz w:val="19"/>
                 <w:szCs w:val="19"/>
-                <w:lang w:val="en-US"/>
-              </w:rPr>
-              <w:t>NodeSimplePattern</w:t>
+                <w:highlight w:val="white"/>
+                <w:lang w:val="en-US"/>
+              </w:rPr>
+              <w:t>One</w:t>
+            </w:r>
+            <w:r>
+              <w:rPr>
+                <w:rFonts w:ascii="Consolas" w:hAnsi="Consolas" w:cs="Consolas"/>
+                <w:color w:val="000000"/>
+                <w:sz w:val="19"/>
+                <w:szCs w:val="19"/>
+                <w:highlight w:val="white"/>
+                <w:lang w:val="en-US"/>
+              </w:rPr>
+              <w:t>Location</w:t>
+            </w:r>
+            <w:r>
+              <w:rPr>
+                <w:rFonts w:ascii="Consolas" w:hAnsi="Consolas" w:cs="Consolas"/>
+                <w:color w:val="000000"/>
+                <w:sz w:val="19"/>
+                <w:szCs w:val="19"/>
+                <w:lang w:val="en-US"/>
+              </w:rPr>
+              <w:t>Finder</w:t>
             </w:r>
             <w:proofErr w:type="spellEnd"/>
-            <w:r>
-              <w:rPr>
-                <w:rFonts w:ascii="Consolas" w:hAnsi="Consolas" w:cs="Consolas"/>
-                <w:color w:val="000000"/>
-                <w:sz w:val="19"/>
-                <w:szCs w:val="19"/>
-                <w:lang w:val="en-US"/>
-              </w:rPr>
-              <w:t>)</w:t>
-            </w:r>
           </w:p>
           <w:p>
             <w:pPr>
@@ -3262,21 +3338,9 @@
                 <w:color w:val="000000"/>
                 <w:sz w:val="19"/>
                 <w:szCs w:val="19"/>
-                <w:highlight w:val="white"/>
-                <w:lang w:val="en-US"/>
-              </w:rPr>
-              <w:t>Range</w:t>
-            </w:r>
-            <w:r>
-              <w:rPr>
-                <w:rFonts w:ascii="Consolas" w:hAnsi="Consolas" w:cs="Consolas"/>
-                <w:color w:val="000000"/>
-                <w:sz w:val="19"/>
-                <w:szCs w:val="19"/>
-                <w:highlight w:val="white"/>
-                <w:lang w:val="en-US"/>
-              </w:rPr>
-              <w:t>Location</w:t>
+                <w:lang w:val="en-US"/>
+              </w:rPr>
+              <w:t>MultiLocation</w:t>
             </w:r>
             <w:r>
               <w:rPr>
@@ -3324,7 +3388,7 @@
                 <w:szCs w:val="19"/>
                 <w:lang w:val="en-US"/>
               </w:rPr>
-              <w:t>after|before</w:t>
+              <w:t>each|all</w:t>
             </w:r>
             <w:proofErr w:type="spellEnd"/>
             <w:r>
@@ -3335,7 +3399,17 @@
                 <w:szCs w:val="19"/>
                 <w:lang w:val="en-US"/>
               </w:rPr>
-              <w:t xml:space="preserve">) </w:t>
+              <w:t>) [n]</w:t>
+            </w:r>
+            <w:r>
+              <w:rPr>
+                <w:rFonts w:ascii="Consolas" w:hAnsi="Consolas" w:cs="Consolas"/>
+                <w:color w:val="000000"/>
+                <w:sz w:val="19"/>
+                <w:szCs w:val="19"/>
+                <w:lang w:val="en-US"/>
+              </w:rPr>
+              <w:t xml:space="preserve"> (</w:t>
             </w:r>
             <w:proofErr w:type="spellStart"/>
             <w:r>
@@ -3344,31 +3418,19 @@
                 <w:color w:val="000000"/>
                 <w:sz w:val="19"/>
                 <w:szCs w:val="19"/>
-                <w:highlight w:val="white"/>
-                <w:lang w:val="en-US"/>
-              </w:rPr>
-              <w:t>One</w:t>
-            </w:r>
-            <w:r>
-              <w:rPr>
-                <w:rFonts w:ascii="Consolas" w:hAnsi="Consolas" w:cs="Consolas"/>
-                <w:color w:val="000000"/>
-                <w:sz w:val="19"/>
-                <w:szCs w:val="19"/>
-                <w:highlight w:val="white"/>
-                <w:lang w:val="en-US"/>
-              </w:rPr>
-              <w:t>Location</w:t>
-            </w:r>
-            <w:r>
-              <w:rPr>
-                <w:rFonts w:ascii="Consolas" w:hAnsi="Consolas" w:cs="Consolas"/>
-                <w:color w:val="000000"/>
-                <w:sz w:val="19"/>
-                <w:szCs w:val="19"/>
-                <w:lang w:val="en-US"/>
-              </w:rPr>
-              <w:t>Finder</w:t>
+                <w:lang w:val="en-US"/>
+              </w:rPr>
+              <w:t>CommentS</w:t>
+            </w:r>
+            <w:r>
+              <w:rPr>
+                <w:rFonts w:ascii="Consolas" w:hAnsi="Consolas" w:cs="Consolas"/>
+                <w:color w:val="000000"/>
+                <w:sz w:val="19"/>
+                <w:szCs w:val="19"/>
+                <w:lang w:val="en-US"/>
+              </w:rPr>
+              <w:t>tringMatch</w:t>
             </w:r>
             <w:proofErr w:type="spellEnd"/>
             <w:r>
@@ -3379,28 +3441,7 @@
                 <w:szCs w:val="19"/>
                 <w:lang w:val="en-US"/>
               </w:rPr>
-              <w:t xml:space="preserve"> </w:t>
-            </w:r>
-          </w:p>
-          <w:p>
-            <w:pPr>
-              <w:rPr>
-                <w:rFonts w:ascii="Consolas" w:hAnsi="Consolas" w:cs="Consolas"/>
-                <w:color w:val="000000"/>
-                <w:sz w:val="19"/>
-                <w:szCs w:val="19"/>
-                <w:lang w:val="en-US"/>
-              </w:rPr>
-            </w:pPr>
-            <w:r>
-              <w:rPr>
-                <w:rFonts w:ascii="Consolas" w:hAnsi="Consolas" w:cs="Consolas"/>
-                <w:color w:val="000000"/>
-                <w:sz w:val="19"/>
-                <w:szCs w:val="19"/>
-                <w:lang w:val="en-US"/>
-              </w:rPr>
-              <w:t xml:space="preserve">| between </w:t>
+              <w:t xml:space="preserve"> | </w:t>
             </w:r>
             <w:proofErr w:type="spellStart"/>
             <w:r>
@@ -3409,31 +3450,9 @@
                 <w:color w:val="000000"/>
                 <w:sz w:val="19"/>
                 <w:szCs w:val="19"/>
-                <w:highlight w:val="white"/>
-                <w:lang w:val="en-US"/>
-              </w:rPr>
-              <w:t>One</w:t>
-            </w:r>
-            <w:r>
-              <w:rPr>
-                <w:rFonts w:ascii="Consolas" w:hAnsi="Consolas" w:cs="Consolas"/>
-                <w:color w:val="000000"/>
-                <w:sz w:val="19"/>
-                <w:szCs w:val="19"/>
-                <w:highlight w:val="white"/>
-                <w:lang w:val="en-US"/>
-              </w:rPr>
-              <w:t>Location</w:t>
-            </w:r>
-            <w:r>
-              <w:rPr>
-                <w:rFonts w:ascii="Consolas" w:hAnsi="Consolas" w:cs="Consolas"/>
-                <w:color w:val="000000"/>
-                <w:sz w:val="19"/>
-                <w:szCs w:val="19"/>
-                <w:lang w:val="en-US"/>
-              </w:rPr>
-              <w:t>Finder</w:t>
+                <w:lang w:val="en-US"/>
+              </w:rPr>
+              <w:t>NodeSimplePattern</w:t>
             </w:r>
             <w:proofErr w:type="spellEnd"/>
             <w:r>
@@ -3444,42 +3463,8 @@
                 <w:szCs w:val="19"/>
                 <w:lang w:val="en-US"/>
               </w:rPr>
-              <w:t xml:space="preserve"> and </w:t>
-            </w:r>
-            <w:proofErr w:type="spellStart"/>
-            <w:r>
-              <w:rPr>
-                <w:rFonts w:ascii="Consolas" w:hAnsi="Consolas" w:cs="Consolas"/>
-                <w:color w:val="000000"/>
-                <w:sz w:val="19"/>
-                <w:szCs w:val="19"/>
-                <w:highlight w:val="white"/>
-                <w:lang w:val="en-US"/>
-              </w:rPr>
-              <w:t>One</w:t>
-            </w:r>
-            <w:r>
-              <w:rPr>
-                <w:rFonts w:ascii="Consolas" w:hAnsi="Consolas" w:cs="Consolas"/>
-                <w:color w:val="000000"/>
-                <w:sz w:val="19"/>
-                <w:szCs w:val="19"/>
-                <w:highlight w:val="white"/>
-                <w:lang w:val="en-US"/>
-              </w:rPr>
-              <w:t>Location</w:t>
-            </w:r>
-            <w:r>
-              <w:rPr>
-                <w:rFonts w:ascii="Consolas" w:hAnsi="Consolas" w:cs="Consolas"/>
-                <w:color w:val="000000"/>
-                <w:sz w:val="19"/>
-                <w:szCs w:val="19"/>
-                <w:lang w:val="en-US"/>
-              </w:rPr>
-              <w:t>Finder</w:t>
-            </w:r>
-            <w:proofErr w:type="spellEnd"/>
+              <w:t>)</w:t>
+            </w:r>
           </w:p>
           <w:p>
             <w:pPr>
@@ -3516,9 +3501,10 @@
                 <w:color w:val="000000"/>
                 <w:sz w:val="19"/>
                 <w:szCs w:val="19"/>
-                <w:lang w:val="en-US"/>
-              </w:rPr>
-              <w:t>Each</w:t>
+                <w:highlight w:val="white"/>
+                <w:lang w:val="en-US"/>
+              </w:rPr>
+              <w:t>Location</w:t>
             </w:r>
             <w:r>
               <w:rPr>
@@ -3547,26 +3533,6 @@
                 <w:lang w:val="en-US"/>
               </w:rPr>
             </w:pPr>
-            <w:r>
-              <w:rPr>
-                <w:rFonts w:ascii="Consolas" w:hAnsi="Consolas" w:cs="Consolas"/>
-                <w:color w:val="000000"/>
-                <w:sz w:val="19"/>
-                <w:szCs w:val="19"/>
-                <w:lang w:val="en-US"/>
-              </w:rPr>
-              <w:t>each [[out of] n]</w:t>
-            </w:r>
-            <w:r>
-              <w:rPr>
-                <w:rFonts w:ascii="Consolas" w:hAnsi="Consolas" w:cs="Consolas"/>
-                <w:color w:val="000000"/>
-                <w:sz w:val="19"/>
-                <w:szCs w:val="19"/>
-                <w:lang w:val="en-US"/>
-              </w:rPr>
-              <w:t xml:space="preserve"> (</w:t>
-            </w:r>
             <w:proofErr w:type="spellStart"/>
             <w:r>
               <w:rPr>
@@ -3574,19 +3540,31 @@
                 <w:color w:val="000000"/>
                 <w:sz w:val="19"/>
                 <w:szCs w:val="19"/>
-                <w:lang w:val="en-US"/>
-              </w:rPr>
-              <w:t>CommentS</w:t>
-            </w:r>
-            <w:r>
-              <w:rPr>
-                <w:rFonts w:ascii="Consolas" w:hAnsi="Consolas" w:cs="Consolas"/>
-                <w:color w:val="000000"/>
-                <w:sz w:val="19"/>
-                <w:szCs w:val="19"/>
-                <w:lang w:val="en-US"/>
-              </w:rPr>
-              <w:t>tringMatch</w:t>
+                <w:highlight w:val="white"/>
+                <w:lang w:val="en-US"/>
+              </w:rPr>
+              <w:t>One</w:t>
+            </w:r>
+            <w:r>
+              <w:rPr>
+                <w:rFonts w:ascii="Consolas" w:hAnsi="Consolas" w:cs="Consolas"/>
+                <w:color w:val="000000"/>
+                <w:sz w:val="19"/>
+                <w:szCs w:val="19"/>
+                <w:highlight w:val="white"/>
+                <w:lang w:val="en-US"/>
+              </w:rPr>
+              <w:t>Location</w:t>
+            </w:r>
+            <w:r>
+              <w:rPr>
+                <w:rFonts w:ascii="Consolas" w:hAnsi="Consolas" w:cs="Consolas"/>
+                <w:color w:val="000000"/>
+                <w:sz w:val="19"/>
+                <w:szCs w:val="19"/>
+                <w:lang w:val="en-US"/>
+              </w:rPr>
+              <w:t>Finder</w:t>
             </w:r>
             <w:proofErr w:type="spellEnd"/>
             <w:r>
@@ -3608,19 +3586,20 @@
                 <w:szCs w:val="19"/>
                 <w:lang w:val="en-US"/>
               </w:rPr>
-              <w:t>NodeSimplePattern</w:t>
+              <w:t>MultiLocationFinder</w:t>
             </w:r>
             <w:proofErr w:type="spellEnd"/>
-            <w:r>
-              <w:rPr>
-                <w:rFonts w:ascii="Consolas" w:hAnsi="Consolas" w:cs="Consolas"/>
-                <w:color w:val="000000"/>
-                <w:sz w:val="19"/>
-                <w:szCs w:val="19"/>
-                <w:lang w:val="en-US"/>
-              </w:rPr>
-              <w:t>)</w:t>
-            </w:r>
+          </w:p>
+          <w:p>
+            <w:pPr>
+              <w:rPr>
+                <w:rFonts w:ascii="Consolas" w:hAnsi="Consolas" w:cs="Consolas"/>
+                <w:color w:val="000000"/>
+                <w:sz w:val="19"/>
+                <w:szCs w:val="19"/>
+                <w:lang w:val="en-US"/>
+              </w:rPr>
+            </w:pPr>
           </w:p>
           <w:p>
             <w:pPr>
@@ -4123,7 +4102,27 @@
                 <w:szCs w:val="19"/>
                 <w:lang w:val="en-US"/>
               </w:rPr>
-              <w:t>‘range’ applies to individual tokens whereas ‘part’ or ‘statement’ apply to structural items of the parse tree.</w:t>
+              <w:t xml:space="preserve">‘range’ applies to individual tokens whereas ‘part’ or ‘statement’ </w:t>
+            </w:r>
+            <w:r>
+              <w:rPr>
+                <w:rFonts w:ascii="Consolas" w:hAnsi="Consolas" w:cs="Consolas"/>
+                <w:color w:val="000000"/>
+                <w:sz w:val="19"/>
+                <w:szCs w:val="19"/>
+                <w:lang w:val="en-US"/>
+              </w:rPr>
+              <w:t>extend the coverage to</w:t>
+            </w:r>
+            <w:r>
+              <w:rPr>
+                <w:rFonts w:ascii="Consolas" w:hAnsi="Consolas" w:cs="Consolas"/>
+                <w:color w:val="000000"/>
+                <w:sz w:val="19"/>
+                <w:szCs w:val="19"/>
+                <w:lang w:val="en-US"/>
+              </w:rPr>
+              <w:t xml:space="preserve"> structural items of the parse tree.</w:t>
             </w:r>
           </w:p>
           <w:p>
@@ -4459,38 +4458,8 @@
               </w:rPr>
               <w:t>Finder</w:t>
             </w:r>
-            <w:proofErr w:type="spellEnd"/>
-            <w:r>
-              <w:rPr>
-                <w:rFonts w:ascii="Consolas" w:hAnsi="Consolas" w:cs="Consolas"/>
-                <w:color w:val="000000"/>
-                <w:sz w:val="19"/>
-                <w:szCs w:val="19"/>
-                <w:lang w:val="en-US"/>
-              </w:rPr>
-              <w:t xml:space="preserve"> </w:t>
-            </w:r>
-            <w:r>
-              <w:rPr>
-                <w:rFonts w:ascii="Consolas" w:hAnsi="Consolas" w:cs="Consolas"/>
-                <w:color w:val="000000"/>
-                <w:sz w:val="19"/>
-                <w:szCs w:val="19"/>
-                <w:lang w:val="en-US"/>
-              </w:rPr>
-              <w:t xml:space="preserve">| </w:t>
-            </w:r>
-            <w:proofErr w:type="spellStart"/>
-            <w:r>
-              <w:rPr>
-                <w:rFonts w:ascii="Consolas" w:hAnsi="Consolas" w:cs="Consolas"/>
-                <w:color w:val="000000"/>
-                <w:sz w:val="19"/>
-                <w:szCs w:val="19"/>
-                <w:lang w:val="en-US"/>
-              </w:rPr>
-              <w:t>EachFinder</w:t>
-            </w:r>
+            <w:bookmarkStart w:id="0" w:name="_GoBack"/>
+            <w:bookmarkEnd w:id="0"/>
             <w:proofErr w:type="spellEnd"/>
           </w:p>
           <w:p>
@@ -4582,7 +4551,6 @@
           </w:p>
         </w:tc>
       </w:tr>
-      <w:bookmarkEnd w:id="0"/>
     </w:tbl>
     <w:p>
       <w:pPr>
@@ -10997,7 +10965,7 @@
       </w:pPr>
     </w:pPrDefault>
   </w:docDefaults>
-  <w:latentStyles w:defLockedState="0" w:defUIPriority="99" w:defSemiHidden="0" w:defUnhideWhenUsed="0" w:defQFormat="0" w:count="376">
+  <w:latentStyles w:defLockedState="0" w:defUIPriority="99" w:defSemiHidden="0" w:defUnhideWhenUsed="0" w:defQFormat="0" w:count="375">
     <w:lsdException w:name="Normal" w:uiPriority="0" w:qFormat="1"/>
     <w:lsdException w:name="heading 1" w:uiPriority="9" w:qFormat="1"/>
     <w:lsdException w:name="heading 2" w:semiHidden="1" w:uiPriority="9" w:unhideWhenUsed="1" w:qFormat="1"/>
@@ -11373,7 +11341,6 @@
     <w:lsdException w:name="Smart Hyperlink" w:semiHidden="1" w:unhideWhenUsed="1"/>
     <w:lsdException w:name="Hashtag" w:semiHidden="1" w:unhideWhenUsed="1"/>
     <w:lsdException w:name="Unresolved Mention" w:semiHidden="1" w:unhideWhenUsed="1"/>
-    <w:lsdException w:name="Smart Link" w:semiHidden="1" w:unhideWhenUsed="1"/>
   </w:latentStyles>
   <w:style w:type="paragraph" w:default="1" w:styleId="Normal">
     <w:name w:val="Normal"/>

</xml_diff>

<commit_message>
Seems to work. Needs more tests.
</commit_message>
<xml_diff>
--- a/CK.SqlServer.Transform/Data Definition Manipulation Language.docx
+++ b/CK.SqlServer.Transform/Data Definition Manipulation Language.docx
@@ -398,7 +398,6 @@
         <w:t xml:space="preserve">(select ?? from </w:t>
       </w:r>
       <w:proofErr w:type="spellStart"/>
-      <w:proofErr w:type="gramStart"/>
       <w:r>
         <w:rPr>
           <w:lang w:val="en-US"/>
@@ -406,7 +405,6 @@
         <w:t>CK.tTable</w:t>
       </w:r>
       <w:proofErr w:type="spellEnd"/>
-      <w:proofErr w:type="gramEnd"/>
       <w:r>
         <w:rPr>
           <w:lang w:val="en-US"/>
@@ -428,7 +426,6 @@
         <w:t xml:space="preserve"> = </w:t>
       </w:r>
       <w:proofErr w:type="spellStart"/>
-      <w:proofErr w:type="gramStart"/>
       <w:r>
         <w:rPr>
           <w:lang w:val="en-US"/>
@@ -436,7 +433,6 @@
         <w:t>k.UserId</w:t>
       </w:r>
       <w:proofErr w:type="spellEnd"/>
-      <w:proofErr w:type="gramEnd"/>
       <w:r>
         <w:rPr>
           <w:lang w:val="en-US"/>
@@ -476,19 +472,11 @@
           <w:lang w:val="en-US"/>
         </w:rPr>
       </w:pPr>
-      <w:proofErr w:type="gramStart"/>
-      <w:r>
-        <w:rPr>
-          <w:lang w:val="en-US"/>
-        </w:rPr>
-        <w:t>&lt;[</w:t>
-      </w:r>
-      <w:proofErr w:type="gramEnd"/>
-      <w:r>
-        <w:rPr>
-          <w:lang w:val="en-US"/>
-        </w:rPr>
-        <w:t xml:space="preserve">select ?? from </w:t>
+      <w:r>
+        <w:rPr>
+          <w:lang w:val="en-US"/>
+        </w:rPr>
+        <w:t xml:space="preserve">&lt;[select ?? from </w:t>
       </w:r>
       <w:proofErr w:type="spellStart"/>
       <w:r>
@@ -593,19 +581,11 @@
           <w:lang w:val="en-US"/>
         </w:rPr>
       </w:pPr>
-      <w:proofErr w:type="gramStart"/>
-      <w:r>
-        <w:rPr>
-          <w:lang w:val="en-US"/>
-        </w:rPr>
-        <w:t>I :</w:t>
-      </w:r>
-      <w:proofErr w:type="gramEnd"/>
-      <w:r>
-        <w:rPr>
-          <w:lang w:val="en-US"/>
-        </w:rPr>
-        <w:t xml:space="preserve">= </w:t>
+      <w:r>
+        <w:rPr>
+          <w:lang w:val="en-US"/>
+        </w:rPr>
+        <w:t xml:space="preserve">I := </w:t>
       </w:r>
       <w:r>
         <w:rPr>
@@ -685,19 +665,11 @@
           <w:lang w:val="en-US"/>
         </w:rPr>
       </w:pPr>
-      <w:proofErr w:type="gramStart"/>
-      <w:r>
-        <w:rPr>
-          <w:lang w:val="en-US"/>
-        </w:rPr>
-        <w:t>Card :</w:t>
-      </w:r>
-      <w:proofErr w:type="gramEnd"/>
-      <w:r>
-        <w:rPr>
-          <w:lang w:val="en-US"/>
-        </w:rPr>
-        <w:t>= first[+N] | last[</w:t>
+      <w:r>
+        <w:rPr>
+          <w:lang w:val="en-US"/>
+        </w:rPr>
+        <w:t>Card := first[+N] | last[</w:t>
       </w:r>
       <w:r>
         <w:rPr>
@@ -741,19 +713,11 @@
           <w:lang w:val="en-US"/>
         </w:rPr>
       </w:pPr>
-      <w:proofErr w:type="gramStart"/>
-      <w:r>
-        <w:rPr>
-          <w:lang w:val="en-US"/>
-        </w:rPr>
-        <w:t>W :</w:t>
-      </w:r>
-      <w:proofErr w:type="gramEnd"/>
-      <w:r>
-        <w:rPr>
-          <w:lang w:val="en-US"/>
-        </w:rPr>
-        <w:t xml:space="preserve">= </w:t>
+      <w:r>
+        <w:rPr>
+          <w:lang w:val="en-US"/>
+        </w:rPr>
+        <w:t xml:space="preserve">W := </w:t>
       </w:r>
       <w:r>
         <w:rPr>
@@ -2033,8 +1997,6 @@
               </w:rPr>
               <w:t xml:space="preserve"> keyword</w:t>
             </w:r>
-            <w:bookmarkStart w:id="0" w:name="_GoBack"/>
-            <w:bookmarkEnd w:id="0"/>
             <w:r>
               <w:rPr>
                 <w:rFonts w:ascii="Consolas" w:hAnsi="Consolas" w:cs="Consolas"/>
@@ -2720,6 +2682,8 @@
               </w:rPr>
               <w:t>&gt;</w:t>
             </w:r>
+            <w:bookmarkStart w:id="0" w:name="_GoBack"/>
+            <w:bookmarkEnd w:id="0"/>
           </w:p>
           <w:p>
             <w:pPr>
@@ -3489,7 +3453,7 @@
                 <w:szCs w:val="19"/>
                 <w:lang w:val="en-US"/>
               </w:rPr>
-              <w:t xml:space="preserve"> (</w:t>
+              <w:t xml:space="preserve"> </w:t>
             </w:r>
             <w:proofErr w:type="spellStart"/>
             <w:r>
@@ -3500,51 +3464,9 @@
                 <w:szCs w:val="19"/>
                 <w:lang w:val="en-US"/>
               </w:rPr>
-              <w:t>CommentS</w:t>
-            </w:r>
-            <w:r>
-              <w:rPr>
-                <w:rFonts w:ascii="Consolas" w:hAnsi="Consolas" w:cs="Consolas"/>
-                <w:color w:val="000000"/>
-                <w:sz w:val="19"/>
-                <w:szCs w:val="19"/>
-                <w:lang w:val="en-US"/>
-              </w:rPr>
-              <w:t>tringMatch</w:t>
+              <w:t>NodeSimplePattern</w:t>
             </w:r>
             <w:proofErr w:type="spellEnd"/>
-            <w:r>
-              <w:rPr>
-                <w:rFonts w:ascii="Consolas" w:hAnsi="Consolas" w:cs="Consolas"/>
-                <w:color w:val="000000"/>
-                <w:sz w:val="19"/>
-                <w:szCs w:val="19"/>
-                <w:lang w:val="en-US"/>
-              </w:rPr>
-              <w:t xml:space="preserve"> | </w:t>
-            </w:r>
-            <w:proofErr w:type="spellStart"/>
-            <w:r>
-              <w:rPr>
-                <w:rFonts w:ascii="Consolas" w:hAnsi="Consolas" w:cs="Consolas"/>
-                <w:color w:val="000000"/>
-                <w:sz w:val="19"/>
-                <w:szCs w:val="19"/>
-                <w:lang w:val="en-US"/>
-              </w:rPr>
-              <w:t>NodeSimplePattern</w:t>
-            </w:r>
-            <w:proofErr w:type="spellEnd"/>
-            <w:r>
-              <w:rPr>
-                <w:rFonts w:ascii="Consolas" w:hAnsi="Consolas" w:cs="Consolas"/>
-                <w:color w:val="000000"/>
-                <w:sz w:val="19"/>
-                <w:szCs w:val="19"/>
-                <w:lang w:val="en-US"/>
-              </w:rPr>
-              <w:t>)</w:t>
-            </w:r>
           </w:p>
           <w:p>
             <w:pPr>

</xml_diff>